<commit_message>
updating Section 1 and Section 2
</commit_message>
<xml_diff>
--- a/DOCUMENTS/Assessment_2_report.docx
+++ b/DOCUMENTS/Assessment_2_report.docx
@@ -1222,6 +1222,8 @@
       <w:sdtPr>
         <w:rPr>
           <w:rFonts w:asciiTheme="minorHAnsi" w:eastAsiaTheme="minorHAnsi" w:hAnsiTheme="minorHAnsi" w:cstheme="minorBidi"/>
+          <w:b w:val="0"/>
+          <w:bCs w:val="0"/>
           <w:color w:val="auto"/>
           <w:kern w:val="2"/>
           <w:sz w:val="22"/>
@@ -3380,14 +3382,2285 @@
       </w:r>
     </w:p>
     <w:p>
+      <w:r>
+        <w:br w:type="page"/>
+      </w:r>
+    </w:p>
+    <w:p>
       <w:pPr>
         <w:pStyle w:val="Heading1"/>
+        <w:numPr>
+          <w:ilvl w:val="0"/>
+          <w:numId w:val="18"/>
+        </w:numPr>
       </w:pPr>
       <w:bookmarkStart w:id="1" w:name="_Toc238803231"/>
       <w:r>
-        <w:t>1. Introduction</w:t>
+        <w:lastRenderedPageBreak/>
+        <w:t>Introduction</w:t>
       </w:r>
       <w:bookmarkEnd w:id="1"/>
+      <w:r>
+        <w:t> </w:t>
+      </w:r>
+    </w:p>
+    <w:p>
+      <w:r>
+        <w:t>MedTalk Connect, the interoperability layer developed by FAZ Australis, at present, there is no method to reliably test and validate FHIR-enabled data exchange and clinical terminology mapping with the EMRs that MedTalk Connect interfaces with, prior to implementation into production (FAZ Australia, 2026b). This gap presents a direct cybersecurity, privacy and clinical-safety issue because as systems change, connector and terminology-mapping changes are informally tested with systems near to or overlapping with real clinical data; this is not in line with obligations under the Privacy Act 1988 (Cth) and the My Health Records Act 2012 (Cth).</w:t>
+      </w:r>
+    </w:p>
+    <w:p/>
+    <w:p>
+      <w:r>
+        <w:t>This is important because MedTalk Connect is located between an AI-generated clinical note and a patient's medical record any error in FHIR exchange or in the translation of the clinical note from SNOMED CT-AU to ICD-10-AM/MBS could lead to incorrect clinical documentation or billing, while any chance of real patient data being accidentally exposed during testing constitutes a reportable privacy breach. Addressing this, the Healthcare Integration &amp; Clinical Terminology Test Harness project will be designing and subsequently build, a fully synthetic FHIR R4 test environment aligned with the AU Core Implementation Guide (HL7 Australia, 2025) that enables safe and repeatable testing of interoperability and terminology mapping.</w:t>
+      </w:r>
+    </w:p>
+    <w:p/>
+    <w:p>
+      <w:r>
+        <w:t>As part of this, the project directly lowers the cybersecurity and compliance risk for FAZ Australia, elevates MedTalk Connect's security stance in the context of data exchange, enhances operational efficiency by eliminating reliance on production adjacent testing, and builds business resilience by providing the FAZ Australia with a reusable validation asset before it begins with new EMR connectors and practices.</w:t>
+      </w:r>
+    </w:p>
+    <w:p/>
+    <w:p>
+      <w:pPr>
+        <w:rPr>
+          <w:rFonts w:asciiTheme="majorHAnsi" w:eastAsiaTheme="majorEastAsia" w:hAnsiTheme="majorHAnsi" w:cstheme="majorBidi"/>
+          <w:color w:val="0F4761" w:themeColor="accent1" w:themeShade="BF"/>
+          <w:sz w:val="32"/>
+          <w:szCs w:val="32"/>
+        </w:rPr>
+      </w:pPr>
+      <w:bookmarkStart w:id="2" w:name="_Toc238803232"/>
+      <w:r>
+        <w:br w:type="page"/>
+      </w:r>
+    </w:p>
+    <w:p>
+      <w:pPr>
+        <w:pStyle w:val="Heading2"/>
+      </w:pPr>
+      <w:r>
+        <w:lastRenderedPageBreak/>
+        <w:t xml:space="preserve">1.1 </w:t>
+      </w:r>
+      <w:r>
+        <w:t>Business Context and Problem Statement</w:t>
+      </w:r>
+      <w:bookmarkEnd w:id="2"/>
+      <w:r>
+        <w:t> </w:t>
+      </w:r>
+      <w:r>
+        <w:t xml:space="preserve"> </w:t>
+      </w:r>
+    </w:p>
+    <w:p>
+      <w:bookmarkStart w:id="3" w:name="_Toc238803233"/>
+      <w:r>
+        <w:t xml:space="preserve">FAZ Australia is a Canberra-based health technology, with its flagship product MedTalk, an artificial intelligence clinical scribe tool that is used by doctors in clinics all over Australia to turn doctor–patient conversations into structured clinical notes. </w:t>
+      </w:r>
+      <w:proofErr w:type="gramStart"/>
+      <w:r>
+        <w:t>MedTalk  integrates</w:t>
+      </w:r>
+      <w:proofErr w:type="gramEnd"/>
+      <w:r>
+        <w:t xml:space="preserve"> with practice EMR systems via MedTalk Connect, a white label interoperability layer based on the HL7 FHIR standard, which currently supports Oracle Health Millennium and Best Practice/Halo Connect at production and supports Epic in sandbox.</w:t>
+      </w:r>
+    </w:p>
+    <w:p>
+      <w:pPr>
+        <w:pStyle w:val="ListParagraph"/>
+        <w:ind w:left="840"/>
+      </w:pPr>
+    </w:p>
+    <w:p>
+      <w:r>
+        <w:t xml:space="preserve">Currently MedTalk Connect does not provide for a secure and safe environment to validate data exchange with EMR systems, or validate clinical terminology mapping between SNOMED CT-AU, ICD-10-AM and Medicare Benefits Schedule (MBS) coding. Some new connectors and FHIR terminology mappings are subject to informal validation with ad hoc scripts and manual review of FHIR payloads in some environments sufficiently </w:t>
+      </w:r>
+      <w:proofErr w:type="gramStart"/>
+      <w:r>
+        <w:t>similar to</w:t>
+      </w:r>
+      <w:proofErr w:type="gramEnd"/>
+      <w:r>
+        <w:t xml:space="preserve"> production that they pose a real data risk. This puts the organisation at risk of clinical-safety, privacy and compliance issues with the Privacy Act 1988 (Cth) and the My Health Records Act 2012 (Cth</w:t>
+      </w:r>
+      <w:proofErr w:type="gramStart"/>
+      <w:r>
+        <w:t>), and</w:t>
+      </w:r>
+      <w:proofErr w:type="gramEnd"/>
+      <w:r>
+        <w:t xml:space="preserve"> delays the adoption of new connectors and practices.</w:t>
+      </w:r>
+    </w:p>
+    <w:p/>
+    <w:p>
+      <w:r>
+        <w:t>The size of this problem is illustrated by the quantified evidence from Stage 1 analysis: there is no repeatable process to validate terminology mapping, and the error-handling behaviour (slow responses, malformed data and dropped connections) is not systematically tested with a significant risk of undetected errors affecting real clinical scenarios, especially for Epic (sandbox-only); and test coverage varies widely by connector maturity, with Epic (sandbox-only) receiving significantly less validation than the two production-grade connectors.</w:t>
+      </w:r>
+    </w:p>
+    <w:p/>
+    <w:p>
+      <w:r>
+        <w:t xml:space="preserve">This project aims to solve the problem by creating the FHIR test harness, a fully synthetic standard based test harness that will allow FAZ Australia's engineers to test interoperability and terminology translations without the involvement of real patient data (Stage 1) and constructing the FHIR test harness (Stage 2). The project directly lowers cybersecurity and privacy risk, enhances the organisation's security around data exchange, boosts efficiency by eliminating reliance on production-adjacent testing, and helps ensure adherence to Australian privacy and health-data </w:t>
+      </w:r>
+      <w:proofErr w:type="gramStart"/>
+      <w:r>
+        <w:t>laws  and</w:t>
+      </w:r>
+      <w:proofErr w:type="gramEnd"/>
+      <w:r>
+        <w:t>, of course, speeds MedTalk Connect's development and onboarding process.</w:t>
+      </w:r>
+    </w:p>
+    <w:p/>
+    <w:p>
+      <w:pPr>
+        <w:pStyle w:val="Heading2"/>
+      </w:pPr>
+      <w:r>
+        <w:t xml:space="preserve">1.2 </w:t>
+      </w:r>
+      <w:r>
+        <w:t>Project Goals, Objectives, and Success Criteria</w:t>
+      </w:r>
+      <w:bookmarkEnd w:id="3"/>
+      <w:r>
+        <w:t> </w:t>
+      </w:r>
+    </w:p>
+    <w:p>
+      <w:r>
+        <w:t xml:space="preserve">Project </w:t>
+      </w:r>
+      <w:r>
+        <w:t>Goals</w:t>
+      </w:r>
+      <w:r>
+        <w:t>: Design and validate a synthetic, standards-based FHIR test harness to help FAZ Australia to safely test interoperability and clinical terminology mapping between MedTalk Connect and the FHIR standard before going to production to protect patient data.</w:t>
+      </w:r>
+    </w:p>
+    <w:p/>
+    <w:p/>
+    <w:p/>
+    <w:p>
+      <w:r>
+        <w:lastRenderedPageBreak/>
+        <w:t>SMART Objectives:</w:t>
+      </w:r>
+    </w:p>
+    <w:p>
+      <w:pPr>
+        <w:pStyle w:val="ListParagraph"/>
+        <w:numPr>
+          <w:ilvl w:val="0"/>
+          <w:numId w:val="19"/>
+        </w:numPr>
+      </w:pPr>
+      <w:r>
+        <w:t>By end of Stage 1, create a synthetic FHIR R4 test environment that supports MedTalk Connect's EMR connectors for production (Oracle Health Millennium and Best Practice/Halo Connect) and sandbox (Epic), and can be validated with peer review by mentors.</w:t>
+      </w:r>
+    </w:p>
+    <w:p>
+      <w:pPr>
+        <w:pStyle w:val="ListParagraph"/>
+        <w:numPr>
+          <w:ilvl w:val="0"/>
+          <w:numId w:val="19"/>
+        </w:numPr>
+      </w:pPr>
+      <w:r>
+        <w:t>Create and test a model for mapping a defined synthetic dataset of 50 patient records with 3 clinical conditions between the SNOMED CT-AU and ICD-10-AM coding systems, including against expected results, including edge cases.</w:t>
+      </w:r>
+    </w:p>
+    <w:p>
+      <w:pPr>
+        <w:pStyle w:val="ListParagraph"/>
+        <w:numPr>
+          <w:ilvl w:val="0"/>
+          <w:numId w:val="19"/>
+        </w:numPr>
+      </w:pPr>
+      <w:r>
+        <w:t>Draw up a written test plan for normal, error handling and degraded connection to implement and execute in Stage 2 (slow response, malformed data, drop connections).</w:t>
+      </w:r>
+    </w:p>
+    <w:p>
+      <w:pPr>
+        <w:pStyle w:val="ListParagraph"/>
+        <w:numPr>
+          <w:ilvl w:val="0"/>
+          <w:numId w:val="19"/>
+        </w:numPr>
+      </w:pPr>
+      <w:r>
+        <w:t>Fully avoid real patient data during the project, with all use of real patient data blocked by automatic validation rules for synthetic data (e.g., Luhn check) rejection of realistic identifiers.</w:t>
+      </w:r>
+    </w:p>
+    <w:p/>
+    <w:p>
+      <w:r>
+        <w:t>Measurable Success Criteria:</w:t>
+      </w:r>
+    </w:p>
+    <w:p>
+      <w:pPr>
+        <w:pStyle w:val="ListParagraph"/>
+        <w:numPr>
+          <w:ilvl w:val="0"/>
+          <w:numId w:val="20"/>
+        </w:numPr>
+      </w:pPr>
+      <w:r>
+        <w:t>Architecture diagram of the test harness reviewed and approved by the industry mentor.</w:t>
+      </w:r>
+    </w:p>
+    <w:p>
+      <w:pPr>
+        <w:pStyle w:val="ListParagraph"/>
+        <w:numPr>
+          <w:ilvl w:val="0"/>
+          <w:numId w:val="20"/>
+        </w:numPr>
+      </w:pPr>
+      <w:r>
+        <w:t>A synthetic test-data plan was developed and tested, representing a variety of patient scenarios coded in SNOMED CT-AU and with corresponding ICD-10-AM/MBS translations.</w:t>
+      </w:r>
+    </w:p>
+    <w:p>
+      <w:pPr>
+        <w:pStyle w:val="ListParagraph"/>
+        <w:numPr>
+          <w:ilvl w:val="0"/>
+          <w:numId w:val="20"/>
+        </w:numPr>
+      </w:pPr>
+      <w:r>
+        <w:t>A written, connector-weighted test plan covering happy-path, error-handling and degradation scenarios for all three connectors.</w:t>
+      </w:r>
+    </w:p>
+    <w:p>
+      <w:pPr>
+        <w:pStyle w:val="ListParagraph"/>
+        <w:numPr>
+          <w:ilvl w:val="0"/>
+          <w:numId w:val="20"/>
+        </w:numPr>
+      </w:pPr>
+      <w:r>
+        <w:t>All test data were synthetic, and there were no real patient identifiers at any point.</w:t>
+      </w:r>
+    </w:p>
+    <w:p>
+      <w:pPr>
+        <w:pStyle w:val="Heading2"/>
+      </w:pPr>
+      <w:bookmarkStart w:id="4" w:name="_Toc238803234"/>
+      <w:r>
+        <w:t>1.3 Project Scope, Assumptions, and Constraints</w:t>
+      </w:r>
+      <w:bookmarkEnd w:id="4"/>
+      <w:r>
+        <w:t> </w:t>
+      </w:r>
+    </w:p>
+    <w:p>
+      <w:r>
+        <w:t>In Scope:</w:t>
+      </w:r>
+    </w:p>
+    <w:p>
+      <w:pPr>
+        <w:pStyle w:val="ListParagraph"/>
+        <w:numPr>
+          <w:ilvl w:val="0"/>
+          <w:numId w:val="21"/>
+        </w:numPr>
+      </w:pPr>
+      <w:r>
+        <w:t>Design of a synthetic FHIR test harness for REST/JSON FHIR exchanges, where applicable, HL7v2 messaging and SMART on FHIR (OAuth 2.0) authentication, according to the AU Core FHIR Implementation Guide.</w:t>
+      </w:r>
+    </w:p>
+    <w:p>
+      <w:pPr>
+        <w:pStyle w:val="ListParagraph"/>
+        <w:numPr>
+          <w:ilvl w:val="0"/>
+          <w:numId w:val="21"/>
+        </w:numPr>
+      </w:pPr>
+      <w:r>
+        <w:t>Design level mapping logic for the translation of SNOMED CT-AU → ICD-10-AM for a representative set of synthetic clinical scenarios.</w:t>
+      </w:r>
+    </w:p>
+    <w:p>
+      <w:pPr>
+        <w:pStyle w:val="ListParagraph"/>
+        <w:numPr>
+          <w:ilvl w:val="0"/>
+          <w:numId w:val="21"/>
+        </w:numPr>
+      </w:pPr>
+      <w:r>
+        <w:t>Test-data plan and written test plan (functional, negative/error-handling and performance-style scenarios) of connectors defined in FAZ Australia's Connector Catalogue based on connector maturity.</w:t>
+      </w:r>
+    </w:p>
+    <w:p/>
+    <w:p>
+      <w:r>
+        <w:t>Out of Scope:</w:t>
+      </w:r>
+    </w:p>
+    <w:p>
+      <w:pPr>
+        <w:pStyle w:val="ListParagraph"/>
+        <w:numPr>
+          <w:ilvl w:val="0"/>
+          <w:numId w:val="22"/>
+        </w:numPr>
+      </w:pPr>
+      <w:r>
+        <w:t>Implementation or coding of the test harness (extended to Stage 2).</w:t>
+      </w:r>
+    </w:p>
+    <w:p>
+      <w:pPr>
+        <w:pStyle w:val="ListParagraph"/>
+        <w:numPr>
+          <w:ilvl w:val="0"/>
+          <w:numId w:val="22"/>
+        </w:numPr>
+      </w:pPr>
+      <w:r>
+        <w:t>Real patient data or access to real production EMR.</w:t>
+      </w:r>
+    </w:p>
+    <w:p>
+      <w:pPr>
+        <w:pStyle w:val="ListParagraph"/>
+        <w:numPr>
+          <w:ilvl w:val="0"/>
+          <w:numId w:val="22"/>
+        </w:numPr>
+      </w:pPr>
+      <w:r>
+        <w:t>This project is about interoperability and not about the functionality of the scribe, it's about changes to the core AI transcription/NLP engine of MedTalk.</w:t>
+      </w:r>
+    </w:p>
+    <w:p/>
+    <w:p/>
+    <w:p>
+      <w:r>
+        <w:lastRenderedPageBreak/>
+        <w:t>Assumptions:</w:t>
+      </w:r>
+    </w:p>
+    <w:p>
+      <w:pPr>
+        <w:pStyle w:val="ListParagraph"/>
+        <w:numPr>
+          <w:ilvl w:val="0"/>
+          <w:numId w:val="23"/>
+        </w:numPr>
+      </w:pPr>
+      <w:r>
+        <w:t>Halo Connect will publish a specific set of FHIR resources/endpoints that are enough for the test harness to exchange data.</w:t>
+      </w:r>
+    </w:p>
+    <w:p>
+      <w:pPr>
+        <w:pStyle w:val="ListParagraph"/>
+        <w:numPr>
+          <w:ilvl w:val="0"/>
+          <w:numId w:val="23"/>
+        </w:numPr>
+      </w:pPr>
+      <w:r>
+        <w:t>The mapping logic to map SNOMED CT-AU to ICD-10-AM/MBS agreed in Stage 1 is correct, because the wrong mapping would result in misleading outcomes of the test.</w:t>
+      </w:r>
+    </w:p>
+    <w:p>
+      <w:pPr>
+        <w:pStyle w:val="ListParagraph"/>
+        <w:numPr>
+          <w:ilvl w:val="0"/>
+          <w:numId w:val="23"/>
+        </w:numPr>
+      </w:pPr>
+      <w:r>
+        <w:t>The test harness will also be able to simulate and detect good, bad, and dropped/slow responses to ensure its robustness.</w:t>
+      </w:r>
+    </w:p>
+    <w:p/>
+    <w:p>
+      <w:r>
+        <w:t>Constraints:</w:t>
+      </w:r>
+    </w:p>
+    <w:p>
+      <w:pPr>
+        <w:pStyle w:val="ListParagraph"/>
+        <w:numPr>
+          <w:ilvl w:val="0"/>
+          <w:numId w:val="24"/>
+        </w:numPr>
+      </w:pPr>
+      <w:r>
+        <w:t>Requirements, analysis and design as per the waterfall model is only enough for Stage 1 and till Stage 2 proposed design is validated by implementing it.</w:t>
+      </w:r>
+    </w:p>
+    <w:p>
+      <w:pPr>
+        <w:pStyle w:val="ListParagraph"/>
+        <w:numPr>
+          <w:ilvl w:val="0"/>
+          <w:numId w:val="24"/>
+        </w:numPr>
+      </w:pPr>
+      <w:r>
+        <w:t xml:space="preserve">The client and the College have no budget or cloud services provided, and the team must use free tier and </w:t>
+      </w:r>
+      <w:proofErr w:type="gramStart"/>
+      <w:r>
+        <w:t>open source</w:t>
+      </w:r>
+      <w:proofErr w:type="gramEnd"/>
+      <w:r>
+        <w:t xml:space="preserve"> tools.</w:t>
+      </w:r>
+    </w:p>
+    <w:p>
+      <w:pPr>
+        <w:pStyle w:val="ListParagraph"/>
+        <w:numPr>
+          <w:ilvl w:val="0"/>
+          <w:numId w:val="24"/>
+        </w:numPr>
+      </w:pPr>
+      <w:r>
+        <w:t>The test harness is exclusively based on synthetic patient records, which if not well-designed, may not represent all the variety of typical clinical data.</w:t>
+      </w:r>
+    </w:p>
+    <w:p>
+      <w:pPr>
+        <w:pStyle w:val="ListParagraph"/>
+        <w:numPr>
+          <w:ilvl w:val="0"/>
+          <w:numId w:val="24"/>
+        </w:numPr>
+      </w:pPr>
+      <w:r>
+        <w:t>If there is any delay in FHIR, Halo Connect or connector documentation from FAZ Australia, project start may be delayed.</w:t>
+      </w:r>
+    </w:p>
+    <w:p>
+      <w:pPr>
+        <w:pStyle w:val="Heading2"/>
+      </w:pPr>
+      <w:bookmarkStart w:id="5" w:name="_Toc238803235"/>
+      <w:r>
+        <w:t>1.4 Stakeholders and User Requirements</w:t>
+      </w:r>
+      <w:bookmarkEnd w:id="5"/>
+      <w:r>
+        <w:t> </w:t>
+      </w:r>
+    </w:p>
+    <w:tbl>
+      <w:tblPr>
+        <w:tblStyle w:val="TableGrid"/>
+        <w:tblW w:w="0" w:type="auto"/>
+        <w:tblLook w:val="04A0" w:firstRow="1" w:lastRow="0" w:firstColumn="1" w:lastColumn="0" w:noHBand="0" w:noVBand="1"/>
+      </w:tblPr>
+      <w:tblGrid>
+        <w:gridCol w:w="2254"/>
+        <w:gridCol w:w="2254"/>
+        <w:gridCol w:w="2254"/>
+        <w:gridCol w:w="2254"/>
+      </w:tblGrid>
+      <w:tr>
+        <w:tc>
+          <w:tcPr>
+            <w:tcW w:w="2254" w:type="dxa"/>
+          </w:tcPr>
+          <w:p>
+            <w:bookmarkStart w:id="6" w:name="_Toc238803236"/>
+            <w:r>
+              <w:t>Stakeholder</w:t>
+            </w:r>
+          </w:p>
+        </w:tc>
+        <w:tc>
+          <w:tcPr>
+            <w:tcW w:w="2254" w:type="dxa"/>
+          </w:tcPr>
+          <w:p>
+            <w:r>
+              <w:t>Role</w:t>
+            </w:r>
+          </w:p>
+        </w:tc>
+        <w:tc>
+          <w:tcPr>
+            <w:tcW w:w="2254" w:type="dxa"/>
+          </w:tcPr>
+          <w:p>
+            <w:r>
+              <w:t>Interest</w:t>
+            </w:r>
+          </w:p>
+        </w:tc>
+        <w:tc>
+          <w:tcPr>
+            <w:tcW w:w="2254" w:type="dxa"/>
+          </w:tcPr>
+          <w:p>
+            <w:r>
+              <w:t>Influence</w:t>
+            </w:r>
+          </w:p>
+        </w:tc>
+      </w:tr>
+      <w:tr>
+        <w:tc>
+          <w:tcPr>
+            <w:tcW w:w="2254" w:type="dxa"/>
+          </w:tcPr>
+          <w:p>
+            <w:r>
+              <w:t>Atif Nisar (FAZ Australia)</w:t>
+            </w:r>
+          </w:p>
+        </w:tc>
+        <w:tc>
+          <w:tcPr>
+            <w:tcW w:w="2254" w:type="dxa"/>
+          </w:tcPr>
+          <w:p>
+            <w:r>
+              <w:t>Project Sponsor / Industry Mentor</w:t>
+            </w:r>
+          </w:p>
+        </w:tc>
+        <w:tc>
+          <w:tcPr>
+            <w:tcW w:w="2254" w:type="dxa"/>
+          </w:tcPr>
+          <w:p>
+            <w:r>
+              <w:t>High</w:t>
+            </w:r>
+          </w:p>
+        </w:tc>
+        <w:tc>
+          <w:tcPr>
+            <w:tcW w:w="2254" w:type="dxa"/>
+          </w:tcPr>
+          <w:p>
+            <w:r>
+              <w:t>High</w:t>
+            </w:r>
+          </w:p>
+        </w:tc>
+      </w:tr>
+      <w:tr>
+        <w:tc>
+          <w:tcPr>
+            <w:tcW w:w="2254" w:type="dxa"/>
+          </w:tcPr>
+          <w:p>
+            <w:r>
+              <w:t>Md Ashraf Uddin</w:t>
+            </w:r>
+          </w:p>
+        </w:tc>
+        <w:tc>
+          <w:tcPr>
+            <w:tcW w:w="2254" w:type="dxa"/>
+          </w:tcPr>
+          <w:p>
+            <w:r>
+              <w:t>Academic Supervisor</w:t>
+            </w:r>
+          </w:p>
+        </w:tc>
+        <w:tc>
+          <w:tcPr>
+            <w:tcW w:w="2254" w:type="dxa"/>
+          </w:tcPr>
+          <w:p>
+            <w:r>
+              <w:t>Medium</w:t>
+            </w:r>
+          </w:p>
+        </w:tc>
+        <w:tc>
+          <w:tcPr>
+            <w:tcW w:w="2254" w:type="dxa"/>
+          </w:tcPr>
+          <w:p>
+            <w:r>
+              <w:t>High</w:t>
+            </w:r>
+          </w:p>
+        </w:tc>
+      </w:tr>
+      <w:tr>
+        <w:tc>
+          <w:tcPr>
+            <w:tcW w:w="2254" w:type="dxa"/>
+          </w:tcPr>
+          <w:p>
+            <w:r>
+              <w:t>Project Team (Sonam, Charity, Rikesh, Zubair)</w:t>
+            </w:r>
+          </w:p>
+        </w:tc>
+        <w:tc>
+          <w:tcPr>
+            <w:tcW w:w="2254" w:type="dxa"/>
+          </w:tcPr>
+          <w:p>
+            <w:r>
+              <w:t>Delivery Team</w:t>
+            </w:r>
+          </w:p>
+        </w:tc>
+        <w:tc>
+          <w:tcPr>
+            <w:tcW w:w="2254" w:type="dxa"/>
+          </w:tcPr>
+          <w:p>
+            <w:r>
+              <w:t>High</w:t>
+            </w:r>
+          </w:p>
+        </w:tc>
+        <w:tc>
+          <w:tcPr>
+            <w:tcW w:w="2254" w:type="dxa"/>
+          </w:tcPr>
+          <w:p>
+            <w:r>
+              <w:t>High</w:t>
+            </w:r>
+          </w:p>
+        </w:tc>
+      </w:tr>
+      <w:tr>
+        <w:tc>
+          <w:tcPr>
+            <w:tcW w:w="2254" w:type="dxa"/>
+          </w:tcPr>
+          <w:p>
+            <w:r>
+              <w:t>MedTalk Connect Engineering Team</w:t>
+            </w:r>
+          </w:p>
+        </w:tc>
+        <w:tc>
+          <w:tcPr>
+            <w:tcW w:w="2254" w:type="dxa"/>
+          </w:tcPr>
+          <w:p>
+            <w:r>
+              <w:t>End users of the test harness</w:t>
+            </w:r>
+          </w:p>
+        </w:tc>
+        <w:tc>
+          <w:tcPr>
+            <w:tcW w:w="2254" w:type="dxa"/>
+          </w:tcPr>
+          <w:p>
+            <w:r>
+              <w:t>High</w:t>
+            </w:r>
+          </w:p>
+        </w:tc>
+        <w:tc>
+          <w:tcPr>
+            <w:tcW w:w="2254" w:type="dxa"/>
+          </w:tcPr>
+          <w:p>
+            <w:r>
+              <w:t>Medium</w:t>
+            </w:r>
+          </w:p>
+        </w:tc>
+      </w:tr>
+      <w:tr>
+        <w:tc>
+          <w:tcPr>
+            <w:tcW w:w="2254" w:type="dxa"/>
+          </w:tcPr>
+          <w:p>
+            <w:r>
+              <w:t>Medical Practices (Best Practice / Oracle Health users)</w:t>
+            </w:r>
+          </w:p>
+        </w:tc>
+        <w:tc>
+          <w:tcPr>
+            <w:tcW w:w="2254" w:type="dxa"/>
+          </w:tcPr>
+          <w:p>
+            <w:r>
+              <w:t>Indirect beneficiaries</w:t>
+            </w:r>
+          </w:p>
+        </w:tc>
+        <w:tc>
+          <w:tcPr>
+            <w:tcW w:w="2254" w:type="dxa"/>
+          </w:tcPr>
+          <w:p>
+            <w:r>
+              <w:t>Medium</w:t>
+            </w:r>
+          </w:p>
+        </w:tc>
+        <w:tc>
+          <w:tcPr>
+            <w:tcW w:w="2254" w:type="dxa"/>
+          </w:tcPr>
+          <w:p>
+            <w:r>
+              <w:t>Low</w:t>
+            </w:r>
+          </w:p>
+        </w:tc>
+      </w:tr>
+      <w:tr>
+        <w:tc>
+          <w:tcPr>
+            <w:tcW w:w="2254" w:type="dxa"/>
+          </w:tcPr>
+          <w:p>
+            <w:r>
+              <w:t>EMR Vendors (Oracle Health, Best Practice/Halo Connect, Epic)</w:t>
+            </w:r>
+          </w:p>
+        </w:tc>
+        <w:tc>
+          <w:tcPr>
+            <w:tcW w:w="2254" w:type="dxa"/>
+          </w:tcPr>
+          <w:p>
+            <w:r>
+              <w:t>Technical interface owners</w:t>
+            </w:r>
+          </w:p>
+        </w:tc>
+        <w:tc>
+          <w:tcPr>
+            <w:tcW w:w="2254" w:type="dxa"/>
+          </w:tcPr>
+          <w:p>
+            <w:r>
+              <w:t>Medium</w:t>
+            </w:r>
+          </w:p>
+        </w:tc>
+        <w:tc>
+          <w:tcPr>
+            <w:tcW w:w="2254" w:type="dxa"/>
+          </w:tcPr>
+          <w:p>
+            <w:r>
+              <w:t>Medium</w:t>
+            </w:r>
+          </w:p>
+        </w:tc>
+      </w:tr>
+    </w:tbl>
+    <w:p/>
+    <w:p>
+      <w:r>
+        <w:t>Functional and Non-Functional Requirements</w:t>
+      </w:r>
+      <w:r>
+        <w:t xml:space="preserve"> Summary:</w:t>
+      </w:r>
+    </w:p>
+    <w:p>
+      <w:pPr>
+        <w:pStyle w:val="ListParagraph"/>
+        <w:numPr>
+          <w:ilvl w:val="0"/>
+          <w:numId w:val="25"/>
+        </w:numPr>
+      </w:pPr>
+      <w:r>
+        <w:t>Security requirements: Control access of authorized test environment users; ensure tenant isolation to limit exposure of data from cross-connector or cross-tenant.</w:t>
+      </w:r>
+    </w:p>
+    <w:p>
+      <w:pPr>
+        <w:pStyle w:val="ListParagraph"/>
+        <w:numPr>
+          <w:ilvl w:val="0"/>
+          <w:numId w:val="25"/>
+        </w:numPr>
+      </w:pPr>
+      <w:r>
+        <w:t xml:space="preserve">Privacy needs: Only use synthetic patient info; get Luhn-check rejection when </w:t>
+      </w:r>
+      <w:proofErr w:type="gramStart"/>
+      <w:r>
+        <w:t>necessary</w:t>
+      </w:r>
+      <w:proofErr w:type="gramEnd"/>
+      <w:r>
+        <w:t xml:space="preserve"> automatically.</w:t>
+      </w:r>
+    </w:p>
+    <w:p>
+      <w:pPr>
+        <w:pStyle w:val="ListParagraph"/>
+        <w:numPr>
+          <w:ilvl w:val="0"/>
+          <w:numId w:val="25"/>
+        </w:numPr>
+      </w:pPr>
+      <w:r>
+        <w:t>Usability requirements: Users should be able to perform tests and understand the results without requiring extensive technical expertise, and in a few simple steps.</w:t>
+      </w:r>
+    </w:p>
+    <w:p>
+      <w:pPr>
+        <w:pStyle w:val="ListParagraph"/>
+        <w:numPr>
+          <w:ilvl w:val="0"/>
+          <w:numId w:val="25"/>
+        </w:numPr>
+      </w:pPr>
+      <w:r>
+        <w:lastRenderedPageBreak/>
+        <w:t>Scalability requirements: Have a specific, scalable synthetic data set (for the first few years – at least 50 records on 3 conditions without redesign).</w:t>
+      </w:r>
+    </w:p>
+    <w:p>
+      <w:pPr>
+        <w:pStyle w:val="ListParagraph"/>
+        <w:numPr>
+          <w:ilvl w:val="0"/>
+          <w:numId w:val="25"/>
+        </w:numPr>
+      </w:pPr>
+      <w:r>
+        <w:t>Performance criteria: Under normal test conditions, return standard test results in an acceptable response time.</w:t>
+      </w:r>
+    </w:p>
+    <w:p>
+      <w:pPr>
+        <w:pStyle w:val="ListParagraph"/>
+        <w:numPr>
+          <w:ilvl w:val="0"/>
+          <w:numId w:val="25"/>
+        </w:numPr>
+        <w:rPr>
+          <w:rFonts w:asciiTheme="majorHAnsi" w:eastAsiaTheme="majorEastAsia" w:hAnsiTheme="majorHAnsi" w:cstheme="majorBidi"/>
+          <w:b/>
+          <w:bCs/>
+          <w:color w:val="0F4761" w:themeColor="accent1" w:themeShade="BF"/>
+          <w:sz w:val="40"/>
+          <w:szCs w:val="40"/>
+        </w:rPr>
+      </w:pPr>
+      <w:r>
+        <w:t>Compliance requirements: Ensure the harness does not process real patient or health information and align with the Privacy Act 1988 (Cth), My Health Records Act 2012 (Cth) and the AU Core FHIR Implementation Guide.</w:t>
+      </w:r>
+      <w:r>
+        <w:br w:type="page"/>
+      </w:r>
+    </w:p>
+    <w:p>
+      <w:pPr>
+        <w:pStyle w:val="Heading1"/>
+        <w:rPr>
+          <w:rFonts w:ascii="Segoe UI" w:hAnsi="Segoe UI" w:cs="Segoe UI"/>
+          <w:sz w:val="18"/>
+          <w:szCs w:val="18"/>
+        </w:rPr>
+      </w:pPr>
+      <w:r>
+        <w:lastRenderedPageBreak/>
+        <w:t>2. Project Planning and Management</w:t>
+      </w:r>
+      <w:bookmarkEnd w:id="6"/>
+      <w:r>
+        <w:t> </w:t>
+      </w:r>
+    </w:p>
+    <w:p>
+      <w:pPr>
+        <w:pStyle w:val="Heading2"/>
+      </w:pPr>
+      <w:bookmarkStart w:id="7" w:name="_Toc238803237"/>
+      <w:r>
+        <w:t>2.1 Project Charter</w:t>
+      </w:r>
+      <w:bookmarkEnd w:id="7"/>
+      <w:r>
+        <w:t> </w:t>
+      </w:r>
+    </w:p>
+    <w:p>
+      <w:r>
+        <w:t xml:space="preserve">Project </w:t>
+      </w:r>
+      <w:r>
+        <w:t>Purpose</w:t>
+      </w:r>
+      <w:r>
+        <w:t>: Develop and provide a synthetic, standards-based FHIR test harness, to help FAZ Australia test MedTalk Connect's interoperability and clinical terminology mapping without real patient data.</w:t>
+      </w:r>
+    </w:p>
+    <w:p>
+      <w:r>
+        <w:t>Project Scope: Architecture design, terminology mapping logic (SNOMED CT-AU to ICD-10-AM to MBS); and a written test plan for the 3 EMR connectors (Stage 1); Build and demonstration of the harness (Stage 2).</w:t>
+      </w:r>
+    </w:p>
+    <w:p>
+      <w:r>
+        <w:t>Key Stakeholders: Atif Nisar (FAZ Australia, Project Sponsor/Industry Mentor), Md Ashraf Uddin (Academic Supervisor), Project Team, MedTalk Connect Engineering Team, Connected EMR Vendors.</w:t>
+      </w:r>
+    </w:p>
+    <w:p>
+      <w:r>
+        <w:t>Key Deliverables: Architecture diagram; synthetic test-data plan; written test plan for happy path, error handling and degradation scenarios; feasibility and risk analysis; working proof-of-concept test harness (Stage 2).</w:t>
+      </w:r>
+    </w:p>
+    <w:p>
+      <w:r>
+        <w:t>Architecture is reviewed and approved by the industry mentor, test-data plan is validated to provide representative SNOMED CT-AU scenarios, test plan includes all three connectors, weighted according to the maturity, with zero real patient data used at any stage.</w:t>
+      </w:r>
+    </w:p>
+    <w:p>
+      <w:r>
+        <w:t>The scope changes, stage-gate deliverables are approved by Project Authority comprising Md Ashraf Uddin (Academic Supervisor) and Atif Nisar (Industry Mentor).</w:t>
+      </w:r>
+    </w:p>
+    <w:p>
+      <w:r>
+        <w:t>Anticipated Business Value: Clinical-safety and compliance risk minimised, speeds up connector onboarding, and provides the business with a reusable CI/CD testing asset for FAZ Australia.</w:t>
+      </w:r>
+    </w:p>
+    <w:p>
+      <w:pPr>
+        <w:pStyle w:val="Heading2"/>
+      </w:pPr>
+      <w:bookmarkStart w:id="8" w:name="_Toc238803238"/>
+      <w:r>
+        <w:t>2.2 Project Roadmap / Gantt Chart</w:t>
+      </w:r>
+      <w:bookmarkEnd w:id="8"/>
+      <w:r>
+        <w:t> </w:t>
+      </w:r>
+    </w:p>
+    <w:tbl>
+      <w:tblPr>
+        <w:tblW w:w="8900" w:type="dxa"/>
+        <w:tblBorders>
+          <w:top w:val="single" w:sz="4" w:space="0" w:color="auto"/>
+          <w:left w:val="single" w:sz="4" w:space="0" w:color="auto"/>
+          <w:bottom w:val="single" w:sz="4" w:space="0" w:color="auto"/>
+          <w:right w:val="single" w:sz="4" w:space="0" w:color="auto"/>
+          <w:insideH w:val="single" w:sz="4" w:space="0" w:color="auto"/>
+          <w:insideV w:val="single" w:sz="4" w:space="0" w:color="auto"/>
+        </w:tblBorders>
+        <w:tblCellMar>
+          <w:left w:w="10" w:type="dxa"/>
+          <w:right w:w="10" w:type="dxa"/>
+        </w:tblCellMar>
+        <w:tblLook w:val="0000" w:firstRow="0" w:lastRow="0" w:firstColumn="0" w:lastColumn="0" w:noHBand="0" w:noVBand="0"/>
+      </w:tblPr>
+      <w:tblGrid>
+        <w:gridCol w:w="3200"/>
+        <w:gridCol w:w="1400"/>
+        <w:gridCol w:w="4300"/>
+      </w:tblGrid>
+      <w:tr>
+        <w:tblPrEx>
+          <w:tblCellMar>
+            <w:top w:w="0" w:type="dxa"/>
+            <w:bottom w:w="0" w:type="dxa"/>
+          </w:tblCellMar>
+        </w:tblPrEx>
+        <w:tc>
+          <w:tcPr>
+            <w:tcW w:w="3200" w:type="dxa"/>
+            <w:shd w:val="clear" w:color="auto" w:fill="1F4E79"/>
+            <w:tcMar>
+              <w:top w:w="80" w:type="dxa"/>
+              <w:left w:w="100" w:type="dxa"/>
+              <w:bottom w:w="80" w:type="dxa"/>
+              <w:right w:w="100" w:type="dxa"/>
+            </w:tcMar>
+          </w:tcPr>
+          <w:p>
+            <w:r>
+              <w:t>Phase</w:t>
+            </w:r>
+          </w:p>
+        </w:tc>
+        <w:tc>
+          <w:tcPr>
+            <w:tcW w:w="1400" w:type="dxa"/>
+            <w:shd w:val="clear" w:color="auto" w:fill="1F4E79"/>
+            <w:tcMar>
+              <w:top w:w="80" w:type="dxa"/>
+              <w:left w:w="100" w:type="dxa"/>
+              <w:bottom w:w="80" w:type="dxa"/>
+              <w:right w:w="100" w:type="dxa"/>
+            </w:tcMar>
+          </w:tcPr>
+          <w:p>
+            <w:r>
+              <w:t>Weeks</w:t>
+            </w:r>
+          </w:p>
+        </w:tc>
+        <w:tc>
+          <w:tcPr>
+            <w:tcW w:w="4300" w:type="dxa"/>
+            <w:shd w:val="clear" w:color="auto" w:fill="1F4E79"/>
+            <w:tcMar>
+              <w:top w:w="80" w:type="dxa"/>
+              <w:left w:w="100" w:type="dxa"/>
+              <w:bottom w:w="80" w:type="dxa"/>
+              <w:right w:w="100" w:type="dxa"/>
+            </w:tcMar>
+          </w:tcPr>
+          <w:p>
+            <w:r>
+              <w:t>Key Milestone</w:t>
+            </w:r>
+          </w:p>
+        </w:tc>
+      </w:tr>
+      <w:tr>
+        <w:tblPrEx>
+          <w:tblCellMar>
+            <w:top w:w="0" w:type="dxa"/>
+            <w:bottom w:w="0" w:type="dxa"/>
+          </w:tblCellMar>
+        </w:tblPrEx>
+        <w:tc>
+          <w:tcPr>
+            <w:tcW w:w="3200" w:type="dxa"/>
+            <w:tcMar>
+              <w:top w:w="80" w:type="dxa"/>
+              <w:left w:w="100" w:type="dxa"/>
+              <w:bottom w:w="80" w:type="dxa"/>
+              <w:right w:w="100" w:type="dxa"/>
+            </w:tcMar>
+          </w:tcPr>
+          <w:p>
+            <w:r>
+              <w:t>Requirements &amp; Charter</w:t>
+            </w:r>
+          </w:p>
+        </w:tc>
+        <w:tc>
+          <w:tcPr>
+            <w:tcW w:w="1400" w:type="dxa"/>
+            <w:tcMar>
+              <w:top w:w="80" w:type="dxa"/>
+              <w:left w:w="100" w:type="dxa"/>
+              <w:bottom w:w="80" w:type="dxa"/>
+              <w:right w:w="100" w:type="dxa"/>
+            </w:tcMar>
+          </w:tcPr>
+          <w:p>
+            <w:r>
+              <w:t>1–2</w:t>
+            </w:r>
+          </w:p>
+        </w:tc>
+        <w:tc>
+          <w:tcPr>
+            <w:tcW w:w="4300" w:type="dxa"/>
+            <w:tcMar>
+              <w:top w:w="80" w:type="dxa"/>
+              <w:left w:w="100" w:type="dxa"/>
+              <w:bottom w:w="80" w:type="dxa"/>
+              <w:right w:w="100" w:type="dxa"/>
+            </w:tcMar>
+          </w:tcPr>
+          <w:p>
+            <w:r>
+              <w:t>Charter, stakeholder analysis, business/problem analysis approved</w:t>
+            </w:r>
+          </w:p>
+        </w:tc>
+      </w:tr>
+      <w:tr>
+        <w:tblPrEx>
+          <w:tblCellMar>
+            <w:top w:w="0" w:type="dxa"/>
+            <w:bottom w:w="0" w:type="dxa"/>
+          </w:tblCellMar>
+        </w:tblPrEx>
+        <w:tc>
+          <w:tcPr>
+            <w:tcW w:w="3200" w:type="dxa"/>
+            <w:tcMar>
+              <w:top w:w="80" w:type="dxa"/>
+              <w:left w:w="100" w:type="dxa"/>
+              <w:bottom w:w="80" w:type="dxa"/>
+              <w:right w:w="100" w:type="dxa"/>
+            </w:tcMar>
+          </w:tcPr>
+          <w:p>
+            <w:r>
+              <w:t>Requirements Elicitation &amp; SRS</w:t>
+            </w:r>
+          </w:p>
+        </w:tc>
+        <w:tc>
+          <w:tcPr>
+            <w:tcW w:w="1400" w:type="dxa"/>
+            <w:tcMar>
+              <w:top w:w="80" w:type="dxa"/>
+              <w:left w:w="100" w:type="dxa"/>
+              <w:bottom w:w="80" w:type="dxa"/>
+              <w:right w:w="100" w:type="dxa"/>
+            </w:tcMar>
+          </w:tcPr>
+          <w:p>
+            <w:r>
+              <w:t>3–4</w:t>
+            </w:r>
+          </w:p>
+        </w:tc>
+        <w:tc>
+          <w:tcPr>
+            <w:tcW w:w="4300" w:type="dxa"/>
+            <w:tcMar>
+              <w:top w:w="80" w:type="dxa"/>
+              <w:left w:w="100" w:type="dxa"/>
+              <w:bottom w:w="80" w:type="dxa"/>
+              <w:right w:w="100" w:type="dxa"/>
+            </w:tcMar>
+          </w:tcPr>
+          <w:p>
+            <w:r>
+              <w:t>Functional/non-functional requirements and use cases signed off</w:t>
+            </w:r>
+          </w:p>
+        </w:tc>
+      </w:tr>
+      <w:tr>
+        <w:tblPrEx>
+          <w:tblCellMar>
+            <w:top w:w="0" w:type="dxa"/>
+            <w:bottom w:w="0" w:type="dxa"/>
+          </w:tblCellMar>
+        </w:tblPrEx>
+        <w:tc>
+          <w:tcPr>
+            <w:tcW w:w="3200" w:type="dxa"/>
+            <w:tcMar>
+              <w:top w:w="80" w:type="dxa"/>
+              <w:left w:w="100" w:type="dxa"/>
+              <w:bottom w:w="80" w:type="dxa"/>
+              <w:right w:w="100" w:type="dxa"/>
+            </w:tcMar>
+          </w:tcPr>
+          <w:p>
+            <w:r>
+              <w:t>Feasibility &amp; Risk Analysis</w:t>
+            </w:r>
+          </w:p>
+        </w:tc>
+        <w:tc>
+          <w:tcPr>
+            <w:tcW w:w="1400" w:type="dxa"/>
+            <w:tcMar>
+              <w:top w:w="80" w:type="dxa"/>
+              <w:left w:w="100" w:type="dxa"/>
+              <w:bottom w:w="80" w:type="dxa"/>
+              <w:right w:w="100" w:type="dxa"/>
+            </w:tcMar>
+          </w:tcPr>
+          <w:p>
+            <w:r>
+              <w:t>5</w:t>
+            </w:r>
+          </w:p>
+        </w:tc>
+        <w:tc>
+          <w:tcPr>
+            <w:tcW w:w="4300" w:type="dxa"/>
+            <w:tcMar>
+              <w:top w:w="80" w:type="dxa"/>
+              <w:left w:w="100" w:type="dxa"/>
+              <w:bottom w:w="80" w:type="dxa"/>
+              <w:right w:w="100" w:type="dxa"/>
+            </w:tcMar>
+          </w:tcPr>
+          <w:p>
+            <w:r>
+              <w:t>Risk register, feasibility study, mentor sign-off (Stage 1 complete)</w:t>
+            </w:r>
+          </w:p>
+        </w:tc>
+      </w:tr>
+      <w:tr>
+        <w:tblPrEx>
+          <w:tblCellMar>
+            <w:top w:w="0" w:type="dxa"/>
+            <w:bottom w:w="0" w:type="dxa"/>
+          </w:tblCellMar>
+        </w:tblPrEx>
+        <w:tc>
+          <w:tcPr>
+            <w:tcW w:w="3200" w:type="dxa"/>
+            <w:tcMar>
+              <w:top w:w="80" w:type="dxa"/>
+              <w:left w:w="100" w:type="dxa"/>
+              <w:bottom w:w="80" w:type="dxa"/>
+              <w:right w:w="100" w:type="dxa"/>
+            </w:tcMar>
+          </w:tcPr>
+          <w:p>
+            <w:r>
+              <w:t>Report Drafting (2A/2B)</w:t>
+            </w:r>
+          </w:p>
+        </w:tc>
+        <w:tc>
+          <w:tcPr>
+            <w:tcW w:w="1400" w:type="dxa"/>
+            <w:tcMar>
+              <w:top w:w="80" w:type="dxa"/>
+              <w:left w:w="100" w:type="dxa"/>
+              <w:bottom w:w="80" w:type="dxa"/>
+              <w:right w:w="100" w:type="dxa"/>
+            </w:tcMar>
+          </w:tcPr>
+          <w:p>
+            <w:r>
+              <w:t>6</w:t>
+            </w:r>
+          </w:p>
+        </w:tc>
+        <w:tc>
+          <w:tcPr>
+            <w:tcW w:w="4300" w:type="dxa"/>
+            <w:tcMar>
+              <w:top w:w="80" w:type="dxa"/>
+              <w:left w:w="100" w:type="dxa"/>
+              <w:bottom w:w="80" w:type="dxa"/>
+              <w:right w:w="100" w:type="dxa"/>
+            </w:tcMar>
+          </w:tcPr>
+          <w:p>
+            <w:r>
+              <w:t>Sections 1–3 drafted; architecture diagram started</w:t>
+            </w:r>
+          </w:p>
+        </w:tc>
+      </w:tr>
+      <w:tr>
+        <w:tblPrEx>
+          <w:tblCellMar>
+            <w:top w:w="0" w:type="dxa"/>
+            <w:bottom w:w="0" w:type="dxa"/>
+          </w:tblCellMar>
+        </w:tblPrEx>
+        <w:tc>
+          <w:tcPr>
+            <w:tcW w:w="3200" w:type="dxa"/>
+            <w:tcMar>
+              <w:top w:w="80" w:type="dxa"/>
+              <w:left w:w="100" w:type="dxa"/>
+              <w:bottom w:w="80" w:type="dxa"/>
+              <w:right w:w="100" w:type="dxa"/>
+            </w:tcMar>
+          </w:tcPr>
+          <w:p>
+            <w:r>
+              <w:t>Solution Design &amp; PoC Planning</w:t>
+            </w:r>
+          </w:p>
+        </w:tc>
+        <w:tc>
+          <w:tcPr>
+            <w:tcW w:w="1400" w:type="dxa"/>
+            <w:tcMar>
+              <w:top w:w="80" w:type="dxa"/>
+              <w:left w:w="100" w:type="dxa"/>
+              <w:bottom w:w="80" w:type="dxa"/>
+              <w:right w:w="100" w:type="dxa"/>
+            </w:tcMar>
+          </w:tcPr>
+          <w:p>
+            <w:r>
+              <w:t>7</w:t>
+            </w:r>
+          </w:p>
+        </w:tc>
+        <w:tc>
+          <w:tcPr>
+            <w:tcW w:w="4300" w:type="dxa"/>
+            <w:tcMar>
+              <w:top w:w="80" w:type="dxa"/>
+              <w:left w:w="100" w:type="dxa"/>
+              <w:bottom w:w="80" w:type="dxa"/>
+              <w:right w:w="100" w:type="dxa"/>
+            </w:tcMar>
+          </w:tcPr>
+          <w:p>
+            <w:r>
+              <w:t>Sections 4–6 drafted; sprint plan finalised; first full draft compiled</w:t>
+            </w:r>
+          </w:p>
+        </w:tc>
+      </w:tr>
+      <w:tr>
+        <w:tblPrEx>
+          <w:tblCellMar>
+            <w:top w:w="0" w:type="dxa"/>
+            <w:bottom w:w="0" w:type="dxa"/>
+          </w:tblCellMar>
+        </w:tblPrEx>
+        <w:tc>
+          <w:tcPr>
+            <w:tcW w:w="3200" w:type="dxa"/>
+            <w:tcMar>
+              <w:top w:w="80" w:type="dxa"/>
+              <w:left w:w="100" w:type="dxa"/>
+              <w:bottom w:w="80" w:type="dxa"/>
+              <w:right w:w="100" w:type="dxa"/>
+            </w:tcMar>
+          </w:tcPr>
+          <w:p>
+            <w:r>
+              <w:lastRenderedPageBreak/>
+              <w:t>Finalisation &amp; Submission</w:t>
+            </w:r>
+          </w:p>
+        </w:tc>
+        <w:tc>
+          <w:tcPr>
+            <w:tcW w:w="1400" w:type="dxa"/>
+            <w:tcMar>
+              <w:top w:w="80" w:type="dxa"/>
+              <w:left w:w="100" w:type="dxa"/>
+              <w:bottom w:w="80" w:type="dxa"/>
+              <w:right w:w="100" w:type="dxa"/>
+            </w:tcMar>
+          </w:tcPr>
+          <w:p>
+            <w:r>
+              <w:t>8</w:t>
+            </w:r>
+          </w:p>
+        </w:tc>
+        <w:tc>
+          <w:tcPr>
+            <w:tcW w:w="4300" w:type="dxa"/>
+            <w:tcMar>
+              <w:top w:w="80" w:type="dxa"/>
+              <w:left w:w="100" w:type="dxa"/>
+              <w:bottom w:w="80" w:type="dxa"/>
+              <w:right w:w="100" w:type="dxa"/>
+            </w:tcMar>
+          </w:tcPr>
+          <w:p>
+            <w:r>
+              <w:t>References, proofreading, slides, rehearsal; submission by 13 Sept</w:t>
+            </w:r>
+          </w:p>
+        </w:tc>
+      </w:tr>
+    </w:tbl>
+    <w:p/>
+    <w:p>
+      <w:pPr>
+        <w:pStyle w:val="Heading2"/>
+      </w:pPr>
+      <w:bookmarkStart w:id="9" w:name="_Toc238803239"/>
+      <w:r>
+        <w:t>2.3 Team Roles and RACI Matrix</w:t>
+      </w:r>
+      <w:bookmarkEnd w:id="9"/>
+    </w:p>
+    <w:tbl>
+      <w:tblPr>
+        <w:tblW w:w="9026" w:type="dxa"/>
+        <w:tblBorders>
+          <w:top w:val="single" w:sz="4" w:space="0" w:color="auto"/>
+          <w:left w:val="single" w:sz="4" w:space="0" w:color="auto"/>
+          <w:bottom w:val="single" w:sz="4" w:space="0" w:color="auto"/>
+          <w:right w:val="single" w:sz="4" w:space="0" w:color="auto"/>
+          <w:insideH w:val="single" w:sz="4" w:space="0" w:color="auto"/>
+          <w:insideV w:val="single" w:sz="4" w:space="0" w:color="auto"/>
+        </w:tblBorders>
+        <w:tblCellMar>
+          <w:left w:w="10" w:type="dxa"/>
+          <w:right w:w="10" w:type="dxa"/>
+        </w:tblCellMar>
+        <w:tblLook w:val="0000" w:firstRow="0" w:lastRow="0" w:firstColumn="0" w:lastColumn="0" w:noHBand="0" w:noVBand="0"/>
+      </w:tblPr>
+      <w:tblGrid>
+        <w:gridCol w:w="2856"/>
+        <w:gridCol w:w="1542"/>
+        <w:gridCol w:w="1529"/>
+        <w:gridCol w:w="1542"/>
+        <w:gridCol w:w="1557"/>
+      </w:tblGrid>
+      <w:tr>
+        <w:tblPrEx>
+          <w:tblCellMar>
+            <w:top w:w="0" w:type="dxa"/>
+            <w:bottom w:w="0" w:type="dxa"/>
+          </w:tblCellMar>
+        </w:tblPrEx>
+        <w:tc>
+          <w:tcPr>
+            <w:tcW w:w="2900" w:type="dxa"/>
+            <w:shd w:val="clear" w:color="auto" w:fill="1F4E79"/>
+            <w:tcMar>
+              <w:top w:w="80" w:type="dxa"/>
+              <w:left w:w="100" w:type="dxa"/>
+              <w:bottom w:w="80" w:type="dxa"/>
+              <w:right w:w="100" w:type="dxa"/>
+            </w:tcMar>
+          </w:tcPr>
+          <w:p>
+            <w:r>
+              <w:t>Deliverable</w:t>
+            </w:r>
+          </w:p>
+        </w:tc>
+        <w:tc>
+          <w:tcPr>
+            <w:tcW w:w="1550" w:type="dxa"/>
+            <w:shd w:val="clear" w:color="auto" w:fill="1F4E79"/>
+            <w:tcMar>
+              <w:top w:w="80" w:type="dxa"/>
+              <w:left w:w="100" w:type="dxa"/>
+              <w:bottom w:w="80" w:type="dxa"/>
+              <w:right w:w="100" w:type="dxa"/>
+            </w:tcMar>
+          </w:tcPr>
+          <w:p>
+            <w:r>
+              <w:t>Sonam (Lead/Arch.)</w:t>
+            </w:r>
+          </w:p>
+        </w:tc>
+        <w:tc>
+          <w:tcPr>
+            <w:tcW w:w="1550" w:type="dxa"/>
+            <w:shd w:val="clear" w:color="auto" w:fill="1F4E79"/>
+            <w:tcMar>
+              <w:top w:w="80" w:type="dxa"/>
+              <w:left w:w="100" w:type="dxa"/>
+              <w:bottom w:w="80" w:type="dxa"/>
+              <w:right w:w="100" w:type="dxa"/>
+            </w:tcMar>
+          </w:tcPr>
+          <w:p>
+            <w:r>
+              <w:t>Charity (Clinical)</w:t>
+            </w:r>
+          </w:p>
+        </w:tc>
+        <w:tc>
+          <w:tcPr>
+            <w:tcW w:w="1550" w:type="dxa"/>
+            <w:shd w:val="clear" w:color="auto" w:fill="1F4E79"/>
+            <w:tcMar>
+              <w:top w:w="80" w:type="dxa"/>
+              <w:left w:w="100" w:type="dxa"/>
+              <w:bottom w:w="80" w:type="dxa"/>
+              <w:right w:w="100" w:type="dxa"/>
+            </w:tcMar>
+          </w:tcPr>
+          <w:p>
+            <w:r>
+              <w:t>Rikesh (Integration)</w:t>
+            </w:r>
+          </w:p>
+        </w:tc>
+        <w:tc>
+          <w:tcPr>
+            <w:tcW w:w="1476" w:type="dxa"/>
+            <w:shd w:val="clear" w:color="auto" w:fill="1F4E79"/>
+            <w:tcMar>
+              <w:top w:w="80" w:type="dxa"/>
+              <w:left w:w="100" w:type="dxa"/>
+              <w:bottom w:w="80" w:type="dxa"/>
+              <w:right w:w="100" w:type="dxa"/>
+            </w:tcMar>
+          </w:tcPr>
+          <w:p>
+            <w:r>
+              <w:t>Zubair (Testing/Docs)</w:t>
+            </w:r>
+          </w:p>
+        </w:tc>
+      </w:tr>
+      <w:tr>
+        <w:tblPrEx>
+          <w:tblCellMar>
+            <w:top w:w="0" w:type="dxa"/>
+            <w:bottom w:w="0" w:type="dxa"/>
+          </w:tblCellMar>
+        </w:tblPrEx>
+        <w:tc>
+          <w:tcPr>
+            <w:tcW w:w="2900" w:type="dxa"/>
+            <w:tcMar>
+              <w:top w:w="80" w:type="dxa"/>
+              <w:left w:w="100" w:type="dxa"/>
+              <w:bottom w:w="80" w:type="dxa"/>
+              <w:right w:w="100" w:type="dxa"/>
+            </w:tcMar>
+          </w:tcPr>
+          <w:p>
+            <w:r>
+              <w:t>Project Charter &amp; Planning</w:t>
+            </w:r>
+          </w:p>
+        </w:tc>
+        <w:tc>
+          <w:tcPr>
+            <w:tcW w:w="1550" w:type="dxa"/>
+            <w:tcMar>
+              <w:top w:w="80" w:type="dxa"/>
+              <w:left w:w="100" w:type="dxa"/>
+              <w:bottom w:w="80" w:type="dxa"/>
+              <w:right w:w="100" w:type="dxa"/>
+            </w:tcMar>
+          </w:tcPr>
+          <w:p>
+            <w:r>
+              <w:t>R/A</w:t>
+            </w:r>
+          </w:p>
+        </w:tc>
+        <w:tc>
+          <w:tcPr>
+            <w:tcW w:w="1550" w:type="dxa"/>
+            <w:tcMar>
+              <w:top w:w="80" w:type="dxa"/>
+              <w:left w:w="100" w:type="dxa"/>
+              <w:bottom w:w="80" w:type="dxa"/>
+              <w:right w:w="100" w:type="dxa"/>
+            </w:tcMar>
+          </w:tcPr>
+          <w:p>
+            <w:r>
+              <w:t>C</w:t>
+            </w:r>
+          </w:p>
+        </w:tc>
+        <w:tc>
+          <w:tcPr>
+            <w:tcW w:w="1550" w:type="dxa"/>
+            <w:tcMar>
+              <w:top w:w="80" w:type="dxa"/>
+              <w:left w:w="100" w:type="dxa"/>
+              <w:bottom w:w="80" w:type="dxa"/>
+              <w:right w:w="100" w:type="dxa"/>
+            </w:tcMar>
+          </w:tcPr>
+          <w:p>
+            <w:r>
+              <w:t>C</w:t>
+            </w:r>
+          </w:p>
+        </w:tc>
+        <w:tc>
+          <w:tcPr>
+            <w:tcW w:w="1476" w:type="dxa"/>
+            <w:tcMar>
+              <w:top w:w="80" w:type="dxa"/>
+              <w:left w:w="100" w:type="dxa"/>
+              <w:bottom w:w="80" w:type="dxa"/>
+              <w:right w:w="100" w:type="dxa"/>
+            </w:tcMar>
+          </w:tcPr>
+          <w:p>
+            <w:r>
+              <w:t>I</w:t>
+            </w:r>
+          </w:p>
+        </w:tc>
+      </w:tr>
+      <w:tr>
+        <w:tblPrEx>
+          <w:tblCellMar>
+            <w:top w:w="0" w:type="dxa"/>
+            <w:bottom w:w="0" w:type="dxa"/>
+          </w:tblCellMar>
+        </w:tblPrEx>
+        <w:tc>
+          <w:tcPr>
+            <w:tcW w:w="2900" w:type="dxa"/>
+            <w:tcMar>
+              <w:top w:w="80" w:type="dxa"/>
+              <w:left w:w="100" w:type="dxa"/>
+              <w:bottom w:w="80" w:type="dxa"/>
+              <w:right w:w="100" w:type="dxa"/>
+            </w:tcMar>
+          </w:tcPr>
+          <w:p>
+            <w:r>
+              <w:t>Business/Clinical Context (1.1–1.4)</w:t>
+            </w:r>
+          </w:p>
+        </w:tc>
+        <w:tc>
+          <w:tcPr>
+            <w:tcW w:w="1550" w:type="dxa"/>
+            <w:tcMar>
+              <w:top w:w="80" w:type="dxa"/>
+              <w:left w:w="100" w:type="dxa"/>
+              <w:bottom w:w="80" w:type="dxa"/>
+              <w:right w:w="100" w:type="dxa"/>
+            </w:tcMar>
+          </w:tcPr>
+          <w:p>
+            <w:r>
+              <w:t>A</w:t>
+            </w:r>
+          </w:p>
+        </w:tc>
+        <w:tc>
+          <w:tcPr>
+            <w:tcW w:w="1550" w:type="dxa"/>
+            <w:tcMar>
+              <w:top w:w="80" w:type="dxa"/>
+              <w:left w:w="100" w:type="dxa"/>
+              <w:bottom w:w="80" w:type="dxa"/>
+              <w:right w:w="100" w:type="dxa"/>
+            </w:tcMar>
+          </w:tcPr>
+          <w:p>
+            <w:r>
+              <w:t>R</w:t>
+            </w:r>
+          </w:p>
+        </w:tc>
+        <w:tc>
+          <w:tcPr>
+            <w:tcW w:w="1550" w:type="dxa"/>
+            <w:tcMar>
+              <w:top w:w="80" w:type="dxa"/>
+              <w:left w:w="100" w:type="dxa"/>
+              <w:bottom w:w="80" w:type="dxa"/>
+              <w:right w:w="100" w:type="dxa"/>
+            </w:tcMar>
+          </w:tcPr>
+          <w:p>
+            <w:r>
+              <w:t>I</w:t>
+            </w:r>
+          </w:p>
+        </w:tc>
+        <w:tc>
+          <w:tcPr>
+            <w:tcW w:w="1476" w:type="dxa"/>
+            <w:tcMar>
+              <w:top w:w="80" w:type="dxa"/>
+              <w:left w:w="100" w:type="dxa"/>
+              <w:bottom w:w="80" w:type="dxa"/>
+              <w:right w:w="100" w:type="dxa"/>
+            </w:tcMar>
+          </w:tcPr>
+          <w:p>
+            <w:r>
+              <w:t>I</w:t>
+            </w:r>
+          </w:p>
+        </w:tc>
+      </w:tr>
+      <w:tr>
+        <w:tblPrEx>
+          <w:tblCellMar>
+            <w:top w:w="0" w:type="dxa"/>
+            <w:bottom w:w="0" w:type="dxa"/>
+          </w:tblCellMar>
+        </w:tblPrEx>
+        <w:tc>
+          <w:tcPr>
+            <w:tcW w:w="2900" w:type="dxa"/>
+            <w:tcMar>
+              <w:top w:w="80" w:type="dxa"/>
+              <w:left w:w="100" w:type="dxa"/>
+              <w:bottom w:w="80" w:type="dxa"/>
+              <w:right w:w="100" w:type="dxa"/>
+            </w:tcMar>
+          </w:tcPr>
+          <w:p>
+            <w:r>
+              <w:t>Industry &amp; Technology Analysis (Ch. 3)</w:t>
+            </w:r>
+          </w:p>
+        </w:tc>
+        <w:tc>
+          <w:tcPr>
+            <w:tcW w:w="1550" w:type="dxa"/>
+            <w:tcMar>
+              <w:top w:w="80" w:type="dxa"/>
+              <w:left w:w="100" w:type="dxa"/>
+              <w:bottom w:w="80" w:type="dxa"/>
+              <w:right w:w="100" w:type="dxa"/>
+            </w:tcMar>
+          </w:tcPr>
+          <w:p>
+            <w:r>
+              <w:t>C</w:t>
+            </w:r>
+          </w:p>
+        </w:tc>
+        <w:tc>
+          <w:tcPr>
+            <w:tcW w:w="1550" w:type="dxa"/>
+            <w:tcMar>
+              <w:top w:w="80" w:type="dxa"/>
+              <w:left w:w="100" w:type="dxa"/>
+              <w:bottom w:w="80" w:type="dxa"/>
+              <w:right w:w="100" w:type="dxa"/>
+            </w:tcMar>
+          </w:tcPr>
+          <w:p>
+            <w:r>
+              <w:t>R (3.1)</w:t>
+            </w:r>
+          </w:p>
+        </w:tc>
+        <w:tc>
+          <w:tcPr>
+            <w:tcW w:w="1550" w:type="dxa"/>
+            <w:tcMar>
+              <w:top w:w="80" w:type="dxa"/>
+              <w:left w:w="100" w:type="dxa"/>
+              <w:bottom w:w="80" w:type="dxa"/>
+              <w:right w:w="100" w:type="dxa"/>
+            </w:tcMar>
+          </w:tcPr>
+          <w:p>
+            <w:r>
+              <w:t>R/A (3.2–3.4)</w:t>
+            </w:r>
+          </w:p>
+        </w:tc>
+        <w:tc>
+          <w:tcPr>
+            <w:tcW w:w="1476" w:type="dxa"/>
+            <w:tcMar>
+              <w:top w:w="80" w:type="dxa"/>
+              <w:left w:w="100" w:type="dxa"/>
+              <w:bottom w:w="80" w:type="dxa"/>
+              <w:right w:w="100" w:type="dxa"/>
+            </w:tcMar>
+          </w:tcPr>
+          <w:p>
+            <w:r>
+              <w:t>I</w:t>
+            </w:r>
+          </w:p>
+        </w:tc>
+      </w:tr>
+      <w:tr>
+        <w:tblPrEx>
+          <w:tblCellMar>
+            <w:top w:w="0" w:type="dxa"/>
+            <w:bottom w:w="0" w:type="dxa"/>
+          </w:tblCellMar>
+        </w:tblPrEx>
+        <w:tc>
+          <w:tcPr>
+            <w:tcW w:w="2900" w:type="dxa"/>
+            <w:tcMar>
+              <w:top w:w="80" w:type="dxa"/>
+              <w:left w:w="100" w:type="dxa"/>
+              <w:bottom w:w="80" w:type="dxa"/>
+              <w:right w:w="100" w:type="dxa"/>
+            </w:tcMar>
+          </w:tcPr>
+          <w:p>
+            <w:r>
+              <w:t>Solution Architecture (4.1–4.2)</w:t>
+            </w:r>
+          </w:p>
+        </w:tc>
+        <w:tc>
+          <w:tcPr>
+            <w:tcW w:w="1550" w:type="dxa"/>
+            <w:tcMar>
+              <w:top w:w="80" w:type="dxa"/>
+              <w:left w:w="100" w:type="dxa"/>
+              <w:bottom w:w="80" w:type="dxa"/>
+              <w:right w:w="100" w:type="dxa"/>
+            </w:tcMar>
+          </w:tcPr>
+          <w:p>
+            <w:r>
+              <w:t>R/A</w:t>
+            </w:r>
+          </w:p>
+        </w:tc>
+        <w:tc>
+          <w:tcPr>
+            <w:tcW w:w="1550" w:type="dxa"/>
+            <w:tcMar>
+              <w:top w:w="80" w:type="dxa"/>
+              <w:left w:w="100" w:type="dxa"/>
+              <w:bottom w:w="80" w:type="dxa"/>
+              <w:right w:w="100" w:type="dxa"/>
+            </w:tcMar>
+          </w:tcPr>
+          <w:p>
+            <w:r>
+              <w:t>I</w:t>
+            </w:r>
+          </w:p>
+        </w:tc>
+        <w:tc>
+          <w:tcPr>
+            <w:tcW w:w="1550" w:type="dxa"/>
+            <w:tcMar>
+              <w:top w:w="80" w:type="dxa"/>
+              <w:left w:w="100" w:type="dxa"/>
+              <w:bottom w:w="80" w:type="dxa"/>
+              <w:right w:w="100" w:type="dxa"/>
+            </w:tcMar>
+          </w:tcPr>
+          <w:p>
+            <w:r>
+              <w:t>C</w:t>
+            </w:r>
+          </w:p>
+        </w:tc>
+        <w:tc>
+          <w:tcPr>
+            <w:tcW w:w="1476" w:type="dxa"/>
+            <w:tcMar>
+              <w:top w:w="80" w:type="dxa"/>
+              <w:left w:w="100" w:type="dxa"/>
+              <w:bottom w:w="80" w:type="dxa"/>
+              <w:right w:w="100" w:type="dxa"/>
+            </w:tcMar>
+          </w:tcPr>
+          <w:p>
+            <w:r>
+              <w:t>I</w:t>
+            </w:r>
+          </w:p>
+        </w:tc>
+      </w:tr>
+      <w:tr>
+        <w:tblPrEx>
+          <w:tblCellMar>
+            <w:top w:w="0" w:type="dxa"/>
+            <w:bottom w:w="0" w:type="dxa"/>
+          </w:tblCellMar>
+        </w:tblPrEx>
+        <w:tc>
+          <w:tcPr>
+            <w:tcW w:w="2900" w:type="dxa"/>
+            <w:tcMar>
+              <w:top w:w="80" w:type="dxa"/>
+              <w:left w:w="100" w:type="dxa"/>
+              <w:bottom w:w="80" w:type="dxa"/>
+              <w:right w:w="100" w:type="dxa"/>
+            </w:tcMar>
+          </w:tcPr>
+          <w:p>
+            <w:r>
+              <w:t>Security Design &amp; Cost (4.3–4.4)</w:t>
+            </w:r>
+          </w:p>
+        </w:tc>
+        <w:tc>
+          <w:tcPr>
+            <w:tcW w:w="1550" w:type="dxa"/>
+            <w:tcMar>
+              <w:top w:w="80" w:type="dxa"/>
+              <w:left w:w="100" w:type="dxa"/>
+              <w:bottom w:w="80" w:type="dxa"/>
+              <w:right w:w="100" w:type="dxa"/>
+            </w:tcMar>
+          </w:tcPr>
+          <w:p>
+            <w:r>
+              <w:t>C</w:t>
+            </w:r>
+          </w:p>
+        </w:tc>
+        <w:tc>
+          <w:tcPr>
+            <w:tcW w:w="1550" w:type="dxa"/>
+            <w:tcMar>
+              <w:top w:w="80" w:type="dxa"/>
+              <w:left w:w="100" w:type="dxa"/>
+              <w:bottom w:w="80" w:type="dxa"/>
+              <w:right w:w="100" w:type="dxa"/>
+            </w:tcMar>
+          </w:tcPr>
+          <w:p>
+            <w:r>
+              <w:t>I</w:t>
+            </w:r>
+          </w:p>
+        </w:tc>
+        <w:tc>
+          <w:tcPr>
+            <w:tcW w:w="1550" w:type="dxa"/>
+            <w:tcMar>
+              <w:top w:w="80" w:type="dxa"/>
+              <w:left w:w="100" w:type="dxa"/>
+              <w:bottom w:w="80" w:type="dxa"/>
+              <w:right w:w="100" w:type="dxa"/>
+            </w:tcMar>
+          </w:tcPr>
+          <w:p>
+            <w:r>
+              <w:t>R/A</w:t>
+            </w:r>
+          </w:p>
+        </w:tc>
+        <w:tc>
+          <w:tcPr>
+            <w:tcW w:w="1476" w:type="dxa"/>
+            <w:tcMar>
+              <w:top w:w="80" w:type="dxa"/>
+              <w:left w:w="100" w:type="dxa"/>
+              <w:bottom w:w="80" w:type="dxa"/>
+              <w:right w:w="100" w:type="dxa"/>
+            </w:tcMar>
+          </w:tcPr>
+          <w:p>
+            <w:r>
+              <w:t>C</w:t>
+            </w:r>
+          </w:p>
+        </w:tc>
+      </w:tr>
+      <w:tr>
+        <w:tblPrEx>
+          <w:tblCellMar>
+            <w:top w:w="0" w:type="dxa"/>
+            <w:bottom w:w="0" w:type="dxa"/>
+          </w:tblCellMar>
+        </w:tblPrEx>
+        <w:tc>
+          <w:tcPr>
+            <w:tcW w:w="2900" w:type="dxa"/>
+            <w:tcMar>
+              <w:top w:w="80" w:type="dxa"/>
+              <w:left w:w="100" w:type="dxa"/>
+              <w:bottom w:w="80" w:type="dxa"/>
+              <w:right w:w="100" w:type="dxa"/>
+            </w:tcMar>
+          </w:tcPr>
+          <w:p>
+            <w:r>
+              <w:t>PoC &amp; Testing Evaluation (5.1–5.3)</w:t>
+            </w:r>
+          </w:p>
+        </w:tc>
+        <w:tc>
+          <w:tcPr>
+            <w:tcW w:w="1550" w:type="dxa"/>
+            <w:tcMar>
+              <w:top w:w="80" w:type="dxa"/>
+              <w:left w:w="100" w:type="dxa"/>
+              <w:bottom w:w="80" w:type="dxa"/>
+              <w:right w:w="100" w:type="dxa"/>
+            </w:tcMar>
+          </w:tcPr>
+          <w:p>
+            <w:r>
+              <w:t>I</w:t>
+            </w:r>
+          </w:p>
+        </w:tc>
+        <w:tc>
+          <w:tcPr>
+            <w:tcW w:w="1550" w:type="dxa"/>
+            <w:tcMar>
+              <w:top w:w="80" w:type="dxa"/>
+              <w:left w:w="100" w:type="dxa"/>
+              <w:bottom w:w="80" w:type="dxa"/>
+              <w:right w:w="100" w:type="dxa"/>
+            </w:tcMar>
+          </w:tcPr>
+          <w:p>
+            <w:r>
+              <w:t>R (5.2)</w:t>
+            </w:r>
+          </w:p>
+        </w:tc>
+        <w:tc>
+          <w:tcPr>
+            <w:tcW w:w="1550" w:type="dxa"/>
+            <w:tcMar>
+              <w:top w:w="80" w:type="dxa"/>
+              <w:left w:w="100" w:type="dxa"/>
+              <w:bottom w:w="80" w:type="dxa"/>
+              <w:right w:w="100" w:type="dxa"/>
+            </w:tcMar>
+          </w:tcPr>
+          <w:p>
+            <w:r>
+              <w:t>C</w:t>
+            </w:r>
+          </w:p>
+        </w:tc>
+        <w:tc>
+          <w:tcPr>
+            <w:tcW w:w="1476" w:type="dxa"/>
+            <w:tcMar>
+              <w:top w:w="80" w:type="dxa"/>
+              <w:left w:w="100" w:type="dxa"/>
+              <w:bottom w:w="80" w:type="dxa"/>
+              <w:right w:w="100" w:type="dxa"/>
+            </w:tcMar>
+          </w:tcPr>
+          <w:p>
+            <w:r>
+              <w:t>R/A (5.1, 5.3)</w:t>
+            </w:r>
+          </w:p>
+        </w:tc>
+      </w:tr>
+      <w:tr>
+        <w:tblPrEx>
+          <w:tblCellMar>
+            <w:top w:w="0" w:type="dxa"/>
+            <w:bottom w:w="0" w:type="dxa"/>
+          </w:tblCellMar>
+        </w:tblPrEx>
+        <w:tc>
+          <w:tcPr>
+            <w:tcW w:w="2900" w:type="dxa"/>
+            <w:tcMar>
+              <w:top w:w="80" w:type="dxa"/>
+              <w:left w:w="100" w:type="dxa"/>
+              <w:bottom w:w="80" w:type="dxa"/>
+              <w:right w:w="100" w:type="dxa"/>
+            </w:tcMar>
+          </w:tcPr>
+          <w:p>
+            <w:r>
+              <w:t>Final Report Compilation</w:t>
+            </w:r>
+          </w:p>
+        </w:tc>
+        <w:tc>
+          <w:tcPr>
+            <w:tcW w:w="1550" w:type="dxa"/>
+            <w:tcMar>
+              <w:top w:w="80" w:type="dxa"/>
+              <w:left w:w="100" w:type="dxa"/>
+              <w:bottom w:w="80" w:type="dxa"/>
+              <w:right w:w="100" w:type="dxa"/>
+            </w:tcMar>
+          </w:tcPr>
+          <w:p>
+            <w:r>
+              <w:t>A</w:t>
+            </w:r>
+          </w:p>
+        </w:tc>
+        <w:tc>
+          <w:tcPr>
+            <w:tcW w:w="1550" w:type="dxa"/>
+            <w:tcMar>
+              <w:top w:w="80" w:type="dxa"/>
+              <w:left w:w="100" w:type="dxa"/>
+              <w:bottom w:w="80" w:type="dxa"/>
+              <w:right w:w="100" w:type="dxa"/>
+            </w:tcMar>
+          </w:tcPr>
+          <w:p>
+            <w:r>
+              <w:t>C</w:t>
+            </w:r>
+          </w:p>
+        </w:tc>
+        <w:tc>
+          <w:tcPr>
+            <w:tcW w:w="1550" w:type="dxa"/>
+            <w:tcMar>
+              <w:top w:w="80" w:type="dxa"/>
+              <w:left w:w="100" w:type="dxa"/>
+              <w:bottom w:w="80" w:type="dxa"/>
+              <w:right w:w="100" w:type="dxa"/>
+            </w:tcMar>
+          </w:tcPr>
+          <w:p>
+            <w:r>
+              <w:t>C</w:t>
+            </w:r>
+          </w:p>
+        </w:tc>
+        <w:tc>
+          <w:tcPr>
+            <w:tcW w:w="1476" w:type="dxa"/>
+            <w:tcMar>
+              <w:top w:w="80" w:type="dxa"/>
+              <w:left w:w="100" w:type="dxa"/>
+              <w:bottom w:w="80" w:type="dxa"/>
+              <w:right w:w="100" w:type="dxa"/>
+            </w:tcMar>
+          </w:tcPr>
+          <w:p>
+            <w:r>
+              <w:t>R</w:t>
+            </w:r>
+          </w:p>
+        </w:tc>
+      </w:tr>
+      <w:tr>
+        <w:tblPrEx>
+          <w:tblCellMar>
+            <w:top w:w="0" w:type="dxa"/>
+            <w:bottom w:w="0" w:type="dxa"/>
+          </w:tblCellMar>
+        </w:tblPrEx>
+        <w:tc>
+          <w:tcPr>
+            <w:tcW w:w="2900" w:type="dxa"/>
+            <w:tcMar>
+              <w:top w:w="80" w:type="dxa"/>
+              <w:left w:w="100" w:type="dxa"/>
+              <w:bottom w:w="80" w:type="dxa"/>
+              <w:right w:w="100" w:type="dxa"/>
+            </w:tcMar>
+          </w:tcPr>
+          <w:p>
+            <w:r>
+              <w:t>Presentation Delivery</w:t>
+            </w:r>
+          </w:p>
+        </w:tc>
+        <w:tc>
+          <w:tcPr>
+            <w:tcW w:w="1550" w:type="dxa"/>
+            <w:tcMar>
+              <w:top w:w="80" w:type="dxa"/>
+              <w:left w:w="100" w:type="dxa"/>
+              <w:bottom w:w="80" w:type="dxa"/>
+              <w:right w:w="100" w:type="dxa"/>
+            </w:tcMar>
+          </w:tcPr>
+          <w:p>
+            <w:r>
+              <w:t>A</w:t>
+            </w:r>
+          </w:p>
+        </w:tc>
+        <w:tc>
+          <w:tcPr>
+            <w:tcW w:w="1550" w:type="dxa"/>
+            <w:tcMar>
+              <w:top w:w="80" w:type="dxa"/>
+              <w:left w:w="100" w:type="dxa"/>
+              <w:bottom w:w="80" w:type="dxa"/>
+              <w:right w:w="100" w:type="dxa"/>
+            </w:tcMar>
+          </w:tcPr>
+          <w:p>
+            <w:r>
+              <w:t>R</w:t>
+            </w:r>
+          </w:p>
+        </w:tc>
+        <w:tc>
+          <w:tcPr>
+            <w:tcW w:w="1550" w:type="dxa"/>
+            <w:tcMar>
+              <w:top w:w="80" w:type="dxa"/>
+              <w:left w:w="100" w:type="dxa"/>
+              <w:bottom w:w="80" w:type="dxa"/>
+              <w:right w:w="100" w:type="dxa"/>
+            </w:tcMar>
+          </w:tcPr>
+          <w:p>
+            <w:r>
+              <w:t>R</w:t>
+            </w:r>
+          </w:p>
+        </w:tc>
+        <w:tc>
+          <w:tcPr>
+            <w:tcW w:w="1476" w:type="dxa"/>
+            <w:tcMar>
+              <w:top w:w="80" w:type="dxa"/>
+              <w:left w:w="100" w:type="dxa"/>
+              <w:bottom w:w="80" w:type="dxa"/>
+              <w:right w:w="100" w:type="dxa"/>
+            </w:tcMar>
+          </w:tcPr>
+          <w:p>
+            <w:r>
+              <w:t>R</w:t>
+            </w:r>
+          </w:p>
+        </w:tc>
+      </w:tr>
+    </w:tbl>
+    <w:p>
+      <w:r>
+        <w:t> </w:t>
+      </w:r>
+    </w:p>
+    <w:p>
+      <w:pPr>
+        <w:pStyle w:val="Heading2"/>
+      </w:pPr>
+      <w:bookmarkStart w:id="10" w:name="_Toc238803240"/>
+      <w:r>
+        <w:lastRenderedPageBreak/>
+        <w:t>2.4 Risk Register</w:t>
+      </w:r>
+      <w:bookmarkEnd w:id="10"/>
+      <w:r>
+        <w:t> </w:t>
+      </w:r>
+    </w:p>
+    <w:p>
+      <w:pPr>
+        <w:pStyle w:val="Heading2"/>
+      </w:pPr>
+      <w:bookmarkStart w:id="11" w:name="_Toc238803241"/>
+      <w:r>
+        <w:t>2.5 Feasibility Study</w:t>
+      </w:r>
+      <w:bookmarkEnd w:id="11"/>
+      <w:r>
+        <w:t> </w:t>
+      </w:r>
+    </w:p>
+    <w:p>
+      <w:pPr>
+        <w:pStyle w:val="Heading1"/>
+        <w:rPr>
+          <w:rFonts w:ascii="Segoe UI" w:hAnsi="Segoe UI" w:cs="Segoe UI"/>
+          <w:sz w:val="18"/>
+          <w:szCs w:val="18"/>
+        </w:rPr>
+      </w:pPr>
+      <w:bookmarkStart w:id="12" w:name="_Toc238803242"/>
+      <w:r>
+        <w:t>3. Industry and Technology Landscape Analysis</w:t>
+      </w:r>
+      <w:bookmarkEnd w:id="12"/>
       <w:r>
         <w:t> </w:t>
       </w:r>
@@ -3402,27 +5675,24 @@
           <w:szCs w:val="18"/>
         </w:rPr>
       </w:pPr>
-      <w:bookmarkStart w:id="2" w:name="_Toc238803232"/>
-      <w:r>
-        <w:t>1.1 Business Context and Problem Statement</w:t>
-      </w:r>
-      <w:bookmarkEnd w:id="2"/>
+      <w:bookmarkStart w:id="13" w:name="_Toc238803243"/>
+      <w:r>
+        <w:t>3.1 Current State Assessment: As-Is Analysis</w:t>
+      </w:r>
+      <w:bookmarkEnd w:id="13"/>
       <w:r>
         <w:t> </w:t>
-      </w:r>
-      <w:r>
-        <w:t xml:space="preserve"> </w:t>
       </w:r>
     </w:p>
     <w:p>
       <w:pPr>
         <w:pStyle w:val="Heading2"/>
       </w:pPr>
-      <w:bookmarkStart w:id="3" w:name="_Toc238803233"/>
-      <w:r>
-        <w:t>1.2 Project Goals, Objectives, and Success Criteria</w:t>
-      </w:r>
-      <w:bookmarkEnd w:id="3"/>
+      <w:bookmarkStart w:id="14" w:name="_Toc238803244"/>
+      <w:r>
+        <w:t>3.2 Technology and Market Survey</w:t>
+      </w:r>
+      <w:bookmarkEnd w:id="14"/>
       <w:r>
         <w:t> </w:t>
       </w:r>
@@ -3437,125 +5707,11 @@
           <w:szCs w:val="18"/>
         </w:rPr>
       </w:pPr>
-      <w:bookmarkStart w:id="4" w:name="_Toc238803234"/>
-      <w:r>
-        <w:t>1.3 Project Scope, Assumptions, and Constraints</w:t>
-      </w:r>
-      <w:bookmarkEnd w:id="4"/>
-      <w:r>
-        <w:t> </w:t>
-      </w:r>
-    </w:p>
-    <w:p>
-      <w:pPr>
-        <w:pStyle w:val="Heading2"/>
-      </w:pPr>
-      <w:bookmarkStart w:id="5" w:name="_Toc238803235"/>
-      <w:r>
-        <w:t>1.4 Stakeholders and User Requirements</w:t>
-      </w:r>
-      <w:bookmarkEnd w:id="5"/>
-      <w:r>
-        <w:t> </w:t>
-      </w:r>
-    </w:p>
-    <w:p>
-      <w:pPr>
-        <w:pStyle w:val="Heading1"/>
-        <w:rPr>
-          <w:rFonts w:ascii="Segoe UI" w:hAnsi="Segoe UI" w:cs="Segoe UI"/>
-          <w:sz w:val="18"/>
-          <w:szCs w:val="18"/>
-        </w:rPr>
-      </w:pPr>
-      <w:bookmarkStart w:id="6" w:name="_Toc238803236"/>
-      <w:r>
-        <w:t>2. Project Planning and Management</w:t>
-      </w:r>
-      <w:bookmarkEnd w:id="6"/>
-      <w:r>
-        <w:t> </w:t>
-      </w:r>
-    </w:p>
-    <w:p>
-      <w:pPr>
-        <w:pStyle w:val="Heading2"/>
-      </w:pPr>
-      <w:bookmarkStart w:id="7" w:name="_Toc238803237"/>
-      <w:r>
-        <w:t>2.1 Project Charter</w:t>
-      </w:r>
-      <w:bookmarkEnd w:id="7"/>
-      <w:r>
-        <w:t> </w:t>
-      </w:r>
-    </w:p>
-    <w:p>
-      <w:pPr>
-        <w:pStyle w:val="Heading2"/>
-      </w:pPr>
-      <w:bookmarkStart w:id="8" w:name="_Toc238803238"/>
-      <w:r>
-        <w:t>2.2 Project Roadmap / Gantt Chart</w:t>
-      </w:r>
-      <w:bookmarkEnd w:id="8"/>
-      <w:r>
-        <w:t> </w:t>
-      </w:r>
-    </w:p>
-    <w:p>
-      <w:pPr>
-        <w:pStyle w:val="Heading2"/>
-      </w:pPr>
-      <w:bookmarkStart w:id="9" w:name="_Toc238803239"/>
-      <w:r>
-        <w:t>2.3 Team Roles and RACI Matrix</w:t>
-      </w:r>
-      <w:bookmarkEnd w:id="9"/>
-      <w:r>
-        <w:t> </w:t>
-      </w:r>
-    </w:p>
-    <w:p>
-      <w:pPr>
-        <w:pStyle w:val="Heading2"/>
-      </w:pPr>
-      <w:bookmarkStart w:id="10" w:name="_Toc238803240"/>
-      <w:r>
-        <w:t>2.4 Risk Register</w:t>
-      </w:r>
-      <w:bookmarkEnd w:id="10"/>
-      <w:r>
-        <w:t> </w:t>
-      </w:r>
-    </w:p>
-    <w:p>
-      <w:pPr>
-        <w:pStyle w:val="Heading2"/>
-      </w:pPr>
-      <w:bookmarkStart w:id="11" w:name="_Toc238803241"/>
-      <w:r>
-        <w:t>2.5 Feasibility Study</w:t>
-      </w:r>
-      <w:bookmarkEnd w:id="11"/>
-      <w:r>
-        <w:t> </w:t>
-      </w:r>
-    </w:p>
-    <w:p>
-      <w:pPr>
-        <w:pStyle w:val="Heading1"/>
-        <w:rPr>
-          <w:rFonts w:ascii="Segoe UI" w:hAnsi="Segoe UI" w:cs="Segoe UI"/>
-          <w:sz w:val="18"/>
-          <w:szCs w:val="18"/>
-        </w:rPr>
-      </w:pPr>
-      <w:bookmarkStart w:id="12" w:name="_Toc238803242"/>
-      <w:r>
-        <w:t>3. Industry and Technology Landscape Analysis</w:t>
-      </w:r>
-      <w:bookmarkEnd w:id="12"/>
+      <w:bookmarkStart w:id="15" w:name="_Toc238803245"/>
+      <w:r>
+        <w:t>3.3 Comparative Analysis of Existing Solutions</w:t>
+      </w:r>
+      <w:bookmarkEnd w:id="15"/>
       <w:r>
         <w:t> </w:t>
       </w:r>
@@ -3570,57 +5726,6 @@
           <w:szCs w:val="18"/>
         </w:rPr>
       </w:pPr>
-      <w:bookmarkStart w:id="13" w:name="_Toc238803243"/>
-      <w:r>
-        <w:t>3.1 Current State Assessment: As-Is Analysis</w:t>
-      </w:r>
-      <w:bookmarkEnd w:id="13"/>
-      <w:r>
-        <w:t> </w:t>
-      </w:r>
-    </w:p>
-    <w:p>
-      <w:pPr>
-        <w:pStyle w:val="Heading2"/>
-      </w:pPr>
-      <w:bookmarkStart w:id="14" w:name="_Toc238803244"/>
-      <w:r>
-        <w:t>3.2 Technology and Market Survey</w:t>
-      </w:r>
-      <w:bookmarkEnd w:id="14"/>
-      <w:r>
-        <w:t> </w:t>
-      </w:r>
-    </w:p>
-    <w:p>
-      <w:pPr>
-        <w:pStyle w:val="Heading2"/>
-        <w:rPr>
-          <w:rFonts w:ascii="Segoe UI" w:hAnsi="Segoe UI" w:cs="Segoe UI"/>
-          <w:color w:val="EE0000"/>
-          <w:sz w:val="18"/>
-          <w:szCs w:val="18"/>
-        </w:rPr>
-      </w:pPr>
-      <w:bookmarkStart w:id="15" w:name="_Toc238803245"/>
-      <w:r>
-        <w:t>3.3 Comparative Analysis of Existing Solutions</w:t>
-      </w:r>
-      <w:bookmarkEnd w:id="15"/>
-      <w:r>
-        <w:t> </w:t>
-      </w:r>
-    </w:p>
-    <w:p>
-      <w:pPr>
-        <w:pStyle w:val="Heading2"/>
-        <w:rPr>
-          <w:rFonts w:ascii="Segoe UI" w:hAnsi="Segoe UI" w:cs="Segoe UI"/>
-          <w:color w:val="EE0000"/>
-          <w:sz w:val="18"/>
-          <w:szCs w:val="18"/>
-        </w:rPr>
-      </w:pPr>
       <w:bookmarkStart w:id="16" w:name="_Toc238803246"/>
       <w:r>
         <w:t>3.4 Gap Analysis: As-Is to To-Be</w:t>
@@ -3716,7 +5821,6 @@
       </w:pPr>
       <w:bookmarkStart w:id="22" w:name="_Toc238803252"/>
       <w:r>
-        <w:lastRenderedPageBreak/>
         <w:t>5. Proof of Concept, and Evaluation</w:t>
       </w:r>
       <w:bookmarkEnd w:id="22"/>
@@ -3856,6 +5960,692 @@
 <file path=word/numbering.xml><?xml version="1.0" encoding="utf-8"?>
 <w:numbering xmlns:wpc="http://schemas.microsoft.com/office/word/2010/wordprocessingCanvas" xmlns:cx="http://schemas.microsoft.com/office/drawing/2014/chartex" xmlns:cx1="http://schemas.microsoft.com/office/drawing/2015/9/8/chartex" xmlns:cx2="http://schemas.microsoft.com/office/drawing/2015/10/21/chartex" xmlns:cx3="http://schemas.microsoft.com/office/drawing/2016/5/9/chartex" xmlns:cx4="http://schemas.microsoft.com/office/drawing/2016/5/10/chartex" xmlns:cx5="http://schemas.microsoft.com/office/drawing/2016/5/11/chartex" xmlns:cx6="http://schemas.microsoft.com/office/drawing/2016/5/12/chartex" xmlns:cx7="http://schemas.microsoft.com/office/drawing/2016/5/13/chartex" xmlns:cx8="http://schemas.microsoft.com/office/drawing/2016/5/14/chartex" xmlns:mc="http://schemas.openxmlformats.org/markup-compatibility/2006" xmlns:aink="http://schemas.microsoft.com/office/drawing/2016/ink" xmlns:am3d="http://schemas.microsoft.com/office/drawing/2017/model3d" xmlns:o="urn:schemas-microsoft-com:office:office" xmlns:oel="http://schemas.microsoft.com/office/2019/extlst" xmlns:r="http://schemas.openxmlformats.org/officeDocument/2006/relationships" xmlns:m="http://schemas.openxmlformats.org/officeDocument/2006/math" xmlns:v="urn:schemas-microsoft-com:vml" xmlns:wp14="http://schemas.microsoft.com/office/word/2010/wordprocessingDrawing" xmlns:wp="http://schemas.openxmlformats.org/drawingml/2006/wordprocessingDrawing" xmlns:w10="urn:schemas-microsoft-com:office:word" xmlns:w="http://schemas.openxmlformats.org/wordprocessingml/2006/main" xmlns:w14="http://schemas.microsoft.com/office/word/2010/wordml" xmlns:w15="http://schemas.microsoft.com/office/word/2012/wordml" xmlns:w16cex="http://schemas.microsoft.com/office/word/2018/wordml/cex" xmlns:w16cid="http://schemas.microsoft.com/office/word/2016/wordml/cid" xmlns:w16="http://schemas.microsoft.com/office/word/2018/wordml" xmlns:w16du="http://schemas.microsoft.com/office/word/2023/wordml/word16du" xmlns:w16sdtdh="http://schemas.microsoft.com/office/word/2020/wordml/sdtdatahash" xmlns:w16sdtfl="http://schemas.microsoft.com/office/word/2024/wordml/sdtformatlock" xmlns:w16se="http://schemas.microsoft.com/office/word/2015/wordml/symex" xmlns:wpg="http://schemas.microsoft.com/office/word/2010/wordprocessingGroup" xmlns:wpi="http://schemas.microsoft.com/office/word/2010/wordprocessingInk" xmlns:wne="http://schemas.microsoft.com/office/word/2006/wordml" xmlns:wps="http://schemas.microsoft.com/office/word/2010/wordprocessingShape" mc:Ignorable="w14 w15 w16se w16cid w16 w16cex w16sdtdh w16sdtfl w16du wp14">
   <w:abstractNum w:abstractNumId="0" w15:restartNumberingAfterBreak="0">
+    <w:nsid w:val="01E30731"/>
+    <w:multiLevelType w:val="hybridMultilevel"/>
+    <w:tmpl w:val="1F1CE858"/>
+    <w:lvl w:ilvl="0" w:tplc="04090001">
+      <w:start w:val="1"/>
+      <w:numFmt w:val="bullet"/>
+      <w:lvlText w:val=""/>
+      <w:lvlJc w:val="left"/>
+      <w:pPr>
+        <w:ind w:left="720" w:hanging="360"/>
+      </w:pPr>
+      <w:rPr>
+        <w:rFonts w:ascii="Symbol" w:hAnsi="Symbol" w:hint="default"/>
+      </w:rPr>
+    </w:lvl>
+    <w:lvl w:ilvl="1" w:tplc="04090003" w:tentative="1">
+      <w:start w:val="1"/>
+      <w:numFmt w:val="bullet"/>
+      <w:lvlText w:val="o"/>
+      <w:lvlJc w:val="left"/>
+      <w:pPr>
+        <w:ind w:left="1440" w:hanging="360"/>
+      </w:pPr>
+      <w:rPr>
+        <w:rFonts w:ascii="Courier New" w:hAnsi="Courier New" w:cs="Courier New" w:hint="default"/>
+      </w:rPr>
+    </w:lvl>
+    <w:lvl w:ilvl="2" w:tplc="04090005" w:tentative="1">
+      <w:start w:val="1"/>
+      <w:numFmt w:val="bullet"/>
+      <w:lvlText w:val=""/>
+      <w:lvlJc w:val="left"/>
+      <w:pPr>
+        <w:ind w:left="2160" w:hanging="360"/>
+      </w:pPr>
+      <w:rPr>
+        <w:rFonts w:ascii="Wingdings" w:hAnsi="Wingdings" w:hint="default"/>
+      </w:rPr>
+    </w:lvl>
+    <w:lvl w:ilvl="3" w:tplc="04090001" w:tentative="1">
+      <w:start w:val="1"/>
+      <w:numFmt w:val="bullet"/>
+      <w:lvlText w:val=""/>
+      <w:lvlJc w:val="left"/>
+      <w:pPr>
+        <w:ind w:left="2880" w:hanging="360"/>
+      </w:pPr>
+      <w:rPr>
+        <w:rFonts w:ascii="Symbol" w:hAnsi="Symbol" w:hint="default"/>
+      </w:rPr>
+    </w:lvl>
+    <w:lvl w:ilvl="4" w:tplc="04090003" w:tentative="1">
+      <w:start w:val="1"/>
+      <w:numFmt w:val="bullet"/>
+      <w:lvlText w:val="o"/>
+      <w:lvlJc w:val="left"/>
+      <w:pPr>
+        <w:ind w:left="3600" w:hanging="360"/>
+      </w:pPr>
+      <w:rPr>
+        <w:rFonts w:ascii="Courier New" w:hAnsi="Courier New" w:cs="Courier New" w:hint="default"/>
+      </w:rPr>
+    </w:lvl>
+    <w:lvl w:ilvl="5" w:tplc="04090005" w:tentative="1">
+      <w:start w:val="1"/>
+      <w:numFmt w:val="bullet"/>
+      <w:lvlText w:val=""/>
+      <w:lvlJc w:val="left"/>
+      <w:pPr>
+        <w:ind w:left="4320" w:hanging="360"/>
+      </w:pPr>
+      <w:rPr>
+        <w:rFonts w:ascii="Wingdings" w:hAnsi="Wingdings" w:hint="default"/>
+      </w:rPr>
+    </w:lvl>
+    <w:lvl w:ilvl="6" w:tplc="04090001" w:tentative="1">
+      <w:start w:val="1"/>
+      <w:numFmt w:val="bullet"/>
+      <w:lvlText w:val=""/>
+      <w:lvlJc w:val="left"/>
+      <w:pPr>
+        <w:ind w:left="5040" w:hanging="360"/>
+      </w:pPr>
+      <w:rPr>
+        <w:rFonts w:ascii="Symbol" w:hAnsi="Symbol" w:hint="default"/>
+      </w:rPr>
+    </w:lvl>
+    <w:lvl w:ilvl="7" w:tplc="04090003" w:tentative="1">
+      <w:start w:val="1"/>
+      <w:numFmt w:val="bullet"/>
+      <w:lvlText w:val="o"/>
+      <w:lvlJc w:val="left"/>
+      <w:pPr>
+        <w:ind w:left="5760" w:hanging="360"/>
+      </w:pPr>
+      <w:rPr>
+        <w:rFonts w:ascii="Courier New" w:hAnsi="Courier New" w:cs="Courier New" w:hint="default"/>
+      </w:rPr>
+    </w:lvl>
+    <w:lvl w:ilvl="8" w:tplc="04090005" w:tentative="1">
+      <w:start w:val="1"/>
+      <w:numFmt w:val="bullet"/>
+      <w:lvlText w:val=""/>
+      <w:lvlJc w:val="left"/>
+      <w:pPr>
+        <w:ind w:left="6480" w:hanging="360"/>
+      </w:pPr>
+      <w:rPr>
+        <w:rFonts w:ascii="Wingdings" w:hAnsi="Wingdings" w:hint="default"/>
+      </w:rPr>
+    </w:lvl>
+  </w:abstractNum>
+  <w:abstractNum w:abstractNumId="1" w15:restartNumberingAfterBreak="0">
+    <w:nsid w:val="025D6A24"/>
+    <w:multiLevelType w:val="hybridMultilevel"/>
+    <w:tmpl w:val="8DB83CA8"/>
+    <w:lvl w:ilvl="0" w:tplc="04090001">
+      <w:start w:val="1"/>
+      <w:numFmt w:val="bullet"/>
+      <w:lvlText w:val=""/>
+      <w:lvlJc w:val="left"/>
+      <w:pPr>
+        <w:ind w:left="720" w:hanging="360"/>
+      </w:pPr>
+      <w:rPr>
+        <w:rFonts w:ascii="Symbol" w:hAnsi="Symbol" w:hint="default"/>
+      </w:rPr>
+    </w:lvl>
+    <w:lvl w:ilvl="1" w:tplc="04090003" w:tentative="1">
+      <w:start w:val="1"/>
+      <w:numFmt w:val="bullet"/>
+      <w:lvlText w:val="o"/>
+      <w:lvlJc w:val="left"/>
+      <w:pPr>
+        <w:ind w:left="1440" w:hanging="360"/>
+      </w:pPr>
+      <w:rPr>
+        <w:rFonts w:ascii="Courier New" w:hAnsi="Courier New" w:cs="Courier New" w:hint="default"/>
+      </w:rPr>
+    </w:lvl>
+    <w:lvl w:ilvl="2" w:tplc="04090005" w:tentative="1">
+      <w:start w:val="1"/>
+      <w:numFmt w:val="bullet"/>
+      <w:lvlText w:val=""/>
+      <w:lvlJc w:val="left"/>
+      <w:pPr>
+        <w:ind w:left="2160" w:hanging="360"/>
+      </w:pPr>
+      <w:rPr>
+        <w:rFonts w:ascii="Wingdings" w:hAnsi="Wingdings" w:hint="default"/>
+      </w:rPr>
+    </w:lvl>
+    <w:lvl w:ilvl="3" w:tplc="04090001" w:tentative="1">
+      <w:start w:val="1"/>
+      <w:numFmt w:val="bullet"/>
+      <w:lvlText w:val=""/>
+      <w:lvlJc w:val="left"/>
+      <w:pPr>
+        <w:ind w:left="2880" w:hanging="360"/>
+      </w:pPr>
+      <w:rPr>
+        <w:rFonts w:ascii="Symbol" w:hAnsi="Symbol" w:hint="default"/>
+      </w:rPr>
+    </w:lvl>
+    <w:lvl w:ilvl="4" w:tplc="04090003" w:tentative="1">
+      <w:start w:val="1"/>
+      <w:numFmt w:val="bullet"/>
+      <w:lvlText w:val="o"/>
+      <w:lvlJc w:val="left"/>
+      <w:pPr>
+        <w:ind w:left="3600" w:hanging="360"/>
+      </w:pPr>
+      <w:rPr>
+        <w:rFonts w:ascii="Courier New" w:hAnsi="Courier New" w:cs="Courier New" w:hint="default"/>
+      </w:rPr>
+    </w:lvl>
+    <w:lvl w:ilvl="5" w:tplc="04090005" w:tentative="1">
+      <w:start w:val="1"/>
+      <w:numFmt w:val="bullet"/>
+      <w:lvlText w:val=""/>
+      <w:lvlJc w:val="left"/>
+      <w:pPr>
+        <w:ind w:left="4320" w:hanging="360"/>
+      </w:pPr>
+      <w:rPr>
+        <w:rFonts w:ascii="Wingdings" w:hAnsi="Wingdings" w:hint="default"/>
+      </w:rPr>
+    </w:lvl>
+    <w:lvl w:ilvl="6" w:tplc="04090001" w:tentative="1">
+      <w:start w:val="1"/>
+      <w:numFmt w:val="bullet"/>
+      <w:lvlText w:val=""/>
+      <w:lvlJc w:val="left"/>
+      <w:pPr>
+        <w:ind w:left="5040" w:hanging="360"/>
+      </w:pPr>
+      <w:rPr>
+        <w:rFonts w:ascii="Symbol" w:hAnsi="Symbol" w:hint="default"/>
+      </w:rPr>
+    </w:lvl>
+    <w:lvl w:ilvl="7" w:tplc="04090003" w:tentative="1">
+      <w:start w:val="1"/>
+      <w:numFmt w:val="bullet"/>
+      <w:lvlText w:val="o"/>
+      <w:lvlJc w:val="left"/>
+      <w:pPr>
+        <w:ind w:left="5760" w:hanging="360"/>
+      </w:pPr>
+      <w:rPr>
+        <w:rFonts w:ascii="Courier New" w:hAnsi="Courier New" w:cs="Courier New" w:hint="default"/>
+      </w:rPr>
+    </w:lvl>
+    <w:lvl w:ilvl="8" w:tplc="04090005" w:tentative="1">
+      <w:start w:val="1"/>
+      <w:numFmt w:val="bullet"/>
+      <w:lvlText w:val=""/>
+      <w:lvlJc w:val="left"/>
+      <w:pPr>
+        <w:ind w:left="6480" w:hanging="360"/>
+      </w:pPr>
+      <w:rPr>
+        <w:rFonts w:ascii="Wingdings" w:hAnsi="Wingdings" w:hint="default"/>
+      </w:rPr>
+    </w:lvl>
+  </w:abstractNum>
+  <w:abstractNum w:abstractNumId="2" w15:restartNumberingAfterBreak="0">
+    <w:nsid w:val="06483997"/>
+    <w:multiLevelType w:val="hybridMultilevel"/>
+    <w:tmpl w:val="322C3578"/>
+    <w:lvl w:ilvl="0" w:tplc="04090001">
+      <w:start w:val="1"/>
+      <w:numFmt w:val="bullet"/>
+      <w:lvlText w:val=""/>
+      <w:lvlJc w:val="left"/>
+      <w:pPr>
+        <w:ind w:left="720" w:hanging="360"/>
+      </w:pPr>
+      <w:rPr>
+        <w:rFonts w:ascii="Symbol" w:hAnsi="Symbol" w:hint="default"/>
+      </w:rPr>
+    </w:lvl>
+    <w:lvl w:ilvl="1" w:tplc="04090003" w:tentative="1">
+      <w:start w:val="1"/>
+      <w:numFmt w:val="bullet"/>
+      <w:lvlText w:val="o"/>
+      <w:lvlJc w:val="left"/>
+      <w:pPr>
+        <w:ind w:left="1440" w:hanging="360"/>
+      </w:pPr>
+      <w:rPr>
+        <w:rFonts w:ascii="Courier New" w:hAnsi="Courier New" w:cs="Courier New" w:hint="default"/>
+      </w:rPr>
+    </w:lvl>
+    <w:lvl w:ilvl="2" w:tplc="04090005" w:tentative="1">
+      <w:start w:val="1"/>
+      <w:numFmt w:val="bullet"/>
+      <w:lvlText w:val=""/>
+      <w:lvlJc w:val="left"/>
+      <w:pPr>
+        <w:ind w:left="2160" w:hanging="360"/>
+      </w:pPr>
+      <w:rPr>
+        <w:rFonts w:ascii="Wingdings" w:hAnsi="Wingdings" w:hint="default"/>
+      </w:rPr>
+    </w:lvl>
+    <w:lvl w:ilvl="3" w:tplc="04090001" w:tentative="1">
+      <w:start w:val="1"/>
+      <w:numFmt w:val="bullet"/>
+      <w:lvlText w:val=""/>
+      <w:lvlJc w:val="left"/>
+      <w:pPr>
+        <w:ind w:left="2880" w:hanging="360"/>
+      </w:pPr>
+      <w:rPr>
+        <w:rFonts w:ascii="Symbol" w:hAnsi="Symbol" w:hint="default"/>
+      </w:rPr>
+    </w:lvl>
+    <w:lvl w:ilvl="4" w:tplc="04090003" w:tentative="1">
+      <w:start w:val="1"/>
+      <w:numFmt w:val="bullet"/>
+      <w:lvlText w:val="o"/>
+      <w:lvlJc w:val="left"/>
+      <w:pPr>
+        <w:ind w:left="3600" w:hanging="360"/>
+      </w:pPr>
+      <w:rPr>
+        <w:rFonts w:ascii="Courier New" w:hAnsi="Courier New" w:cs="Courier New" w:hint="default"/>
+      </w:rPr>
+    </w:lvl>
+    <w:lvl w:ilvl="5" w:tplc="04090005" w:tentative="1">
+      <w:start w:val="1"/>
+      <w:numFmt w:val="bullet"/>
+      <w:lvlText w:val=""/>
+      <w:lvlJc w:val="left"/>
+      <w:pPr>
+        <w:ind w:left="4320" w:hanging="360"/>
+      </w:pPr>
+      <w:rPr>
+        <w:rFonts w:ascii="Wingdings" w:hAnsi="Wingdings" w:hint="default"/>
+      </w:rPr>
+    </w:lvl>
+    <w:lvl w:ilvl="6" w:tplc="04090001" w:tentative="1">
+      <w:start w:val="1"/>
+      <w:numFmt w:val="bullet"/>
+      <w:lvlText w:val=""/>
+      <w:lvlJc w:val="left"/>
+      <w:pPr>
+        <w:ind w:left="5040" w:hanging="360"/>
+      </w:pPr>
+      <w:rPr>
+        <w:rFonts w:ascii="Symbol" w:hAnsi="Symbol" w:hint="default"/>
+      </w:rPr>
+    </w:lvl>
+    <w:lvl w:ilvl="7" w:tplc="04090003" w:tentative="1">
+      <w:start w:val="1"/>
+      <w:numFmt w:val="bullet"/>
+      <w:lvlText w:val="o"/>
+      <w:lvlJc w:val="left"/>
+      <w:pPr>
+        <w:ind w:left="5760" w:hanging="360"/>
+      </w:pPr>
+      <w:rPr>
+        <w:rFonts w:ascii="Courier New" w:hAnsi="Courier New" w:cs="Courier New" w:hint="default"/>
+      </w:rPr>
+    </w:lvl>
+    <w:lvl w:ilvl="8" w:tplc="04090005" w:tentative="1">
+      <w:start w:val="1"/>
+      <w:numFmt w:val="bullet"/>
+      <w:lvlText w:val=""/>
+      <w:lvlJc w:val="left"/>
+      <w:pPr>
+        <w:ind w:left="6480" w:hanging="360"/>
+      </w:pPr>
+      <w:rPr>
+        <w:rFonts w:ascii="Wingdings" w:hAnsi="Wingdings" w:hint="default"/>
+      </w:rPr>
+    </w:lvl>
+  </w:abstractNum>
+  <w:abstractNum w:abstractNumId="3" w15:restartNumberingAfterBreak="0">
+    <w:nsid w:val="0DFF1505"/>
+    <w:multiLevelType w:val="hybridMultilevel"/>
+    <w:tmpl w:val="4ABA138A"/>
+    <w:lvl w:ilvl="0" w:tplc="04090001">
+      <w:start w:val="1"/>
+      <w:numFmt w:val="bullet"/>
+      <w:lvlText w:val=""/>
+      <w:lvlJc w:val="left"/>
+      <w:pPr>
+        <w:ind w:left="720" w:hanging="360"/>
+      </w:pPr>
+      <w:rPr>
+        <w:rFonts w:ascii="Symbol" w:hAnsi="Symbol" w:hint="default"/>
+      </w:rPr>
+    </w:lvl>
+    <w:lvl w:ilvl="1" w:tplc="04090003" w:tentative="1">
+      <w:start w:val="1"/>
+      <w:numFmt w:val="bullet"/>
+      <w:lvlText w:val="o"/>
+      <w:lvlJc w:val="left"/>
+      <w:pPr>
+        <w:ind w:left="1440" w:hanging="360"/>
+      </w:pPr>
+      <w:rPr>
+        <w:rFonts w:ascii="Courier New" w:hAnsi="Courier New" w:cs="Courier New" w:hint="default"/>
+      </w:rPr>
+    </w:lvl>
+    <w:lvl w:ilvl="2" w:tplc="04090005" w:tentative="1">
+      <w:start w:val="1"/>
+      <w:numFmt w:val="bullet"/>
+      <w:lvlText w:val=""/>
+      <w:lvlJc w:val="left"/>
+      <w:pPr>
+        <w:ind w:left="2160" w:hanging="360"/>
+      </w:pPr>
+      <w:rPr>
+        <w:rFonts w:ascii="Wingdings" w:hAnsi="Wingdings" w:hint="default"/>
+      </w:rPr>
+    </w:lvl>
+    <w:lvl w:ilvl="3" w:tplc="04090001" w:tentative="1">
+      <w:start w:val="1"/>
+      <w:numFmt w:val="bullet"/>
+      <w:lvlText w:val=""/>
+      <w:lvlJc w:val="left"/>
+      <w:pPr>
+        <w:ind w:left="2880" w:hanging="360"/>
+      </w:pPr>
+      <w:rPr>
+        <w:rFonts w:ascii="Symbol" w:hAnsi="Symbol" w:hint="default"/>
+      </w:rPr>
+    </w:lvl>
+    <w:lvl w:ilvl="4" w:tplc="04090003" w:tentative="1">
+      <w:start w:val="1"/>
+      <w:numFmt w:val="bullet"/>
+      <w:lvlText w:val="o"/>
+      <w:lvlJc w:val="left"/>
+      <w:pPr>
+        <w:ind w:left="3600" w:hanging="360"/>
+      </w:pPr>
+      <w:rPr>
+        <w:rFonts w:ascii="Courier New" w:hAnsi="Courier New" w:cs="Courier New" w:hint="default"/>
+      </w:rPr>
+    </w:lvl>
+    <w:lvl w:ilvl="5" w:tplc="04090005" w:tentative="1">
+      <w:start w:val="1"/>
+      <w:numFmt w:val="bullet"/>
+      <w:lvlText w:val=""/>
+      <w:lvlJc w:val="left"/>
+      <w:pPr>
+        <w:ind w:left="4320" w:hanging="360"/>
+      </w:pPr>
+      <w:rPr>
+        <w:rFonts w:ascii="Wingdings" w:hAnsi="Wingdings" w:hint="default"/>
+      </w:rPr>
+    </w:lvl>
+    <w:lvl w:ilvl="6" w:tplc="04090001" w:tentative="1">
+      <w:start w:val="1"/>
+      <w:numFmt w:val="bullet"/>
+      <w:lvlText w:val=""/>
+      <w:lvlJc w:val="left"/>
+      <w:pPr>
+        <w:ind w:left="5040" w:hanging="360"/>
+      </w:pPr>
+      <w:rPr>
+        <w:rFonts w:ascii="Symbol" w:hAnsi="Symbol" w:hint="default"/>
+      </w:rPr>
+    </w:lvl>
+    <w:lvl w:ilvl="7" w:tplc="04090003" w:tentative="1">
+      <w:start w:val="1"/>
+      <w:numFmt w:val="bullet"/>
+      <w:lvlText w:val="o"/>
+      <w:lvlJc w:val="left"/>
+      <w:pPr>
+        <w:ind w:left="5760" w:hanging="360"/>
+      </w:pPr>
+      <w:rPr>
+        <w:rFonts w:ascii="Courier New" w:hAnsi="Courier New" w:cs="Courier New" w:hint="default"/>
+      </w:rPr>
+    </w:lvl>
+    <w:lvl w:ilvl="8" w:tplc="04090005" w:tentative="1">
+      <w:start w:val="1"/>
+      <w:numFmt w:val="bullet"/>
+      <w:lvlText w:val=""/>
+      <w:lvlJc w:val="left"/>
+      <w:pPr>
+        <w:ind w:left="6480" w:hanging="360"/>
+      </w:pPr>
+      <w:rPr>
+        <w:rFonts w:ascii="Wingdings" w:hAnsi="Wingdings" w:hint="default"/>
+      </w:rPr>
+    </w:lvl>
+  </w:abstractNum>
+  <w:abstractNum w:abstractNumId="4" w15:restartNumberingAfterBreak="0">
+    <w:nsid w:val="165D111E"/>
+    <w:multiLevelType w:val="hybridMultilevel"/>
+    <w:tmpl w:val="B0A67740"/>
+    <w:lvl w:ilvl="0" w:tplc="04090001">
+      <w:start w:val="1"/>
+      <w:numFmt w:val="bullet"/>
+      <w:lvlText w:val=""/>
+      <w:lvlJc w:val="left"/>
+      <w:pPr>
+        <w:ind w:left="720" w:hanging="360"/>
+      </w:pPr>
+      <w:rPr>
+        <w:rFonts w:ascii="Symbol" w:hAnsi="Symbol" w:hint="default"/>
+      </w:rPr>
+    </w:lvl>
+    <w:lvl w:ilvl="1" w:tplc="04090003" w:tentative="1">
+      <w:start w:val="1"/>
+      <w:numFmt w:val="bullet"/>
+      <w:lvlText w:val="o"/>
+      <w:lvlJc w:val="left"/>
+      <w:pPr>
+        <w:ind w:left="1440" w:hanging="360"/>
+      </w:pPr>
+      <w:rPr>
+        <w:rFonts w:ascii="Courier New" w:hAnsi="Courier New" w:cs="Courier New" w:hint="default"/>
+      </w:rPr>
+    </w:lvl>
+    <w:lvl w:ilvl="2" w:tplc="04090005" w:tentative="1">
+      <w:start w:val="1"/>
+      <w:numFmt w:val="bullet"/>
+      <w:lvlText w:val=""/>
+      <w:lvlJc w:val="left"/>
+      <w:pPr>
+        <w:ind w:left="2160" w:hanging="360"/>
+      </w:pPr>
+      <w:rPr>
+        <w:rFonts w:ascii="Wingdings" w:hAnsi="Wingdings" w:hint="default"/>
+      </w:rPr>
+    </w:lvl>
+    <w:lvl w:ilvl="3" w:tplc="04090001" w:tentative="1">
+      <w:start w:val="1"/>
+      <w:numFmt w:val="bullet"/>
+      <w:lvlText w:val=""/>
+      <w:lvlJc w:val="left"/>
+      <w:pPr>
+        <w:ind w:left="2880" w:hanging="360"/>
+      </w:pPr>
+      <w:rPr>
+        <w:rFonts w:ascii="Symbol" w:hAnsi="Symbol" w:hint="default"/>
+      </w:rPr>
+    </w:lvl>
+    <w:lvl w:ilvl="4" w:tplc="04090003" w:tentative="1">
+      <w:start w:val="1"/>
+      <w:numFmt w:val="bullet"/>
+      <w:lvlText w:val="o"/>
+      <w:lvlJc w:val="left"/>
+      <w:pPr>
+        <w:ind w:left="3600" w:hanging="360"/>
+      </w:pPr>
+      <w:rPr>
+        <w:rFonts w:ascii="Courier New" w:hAnsi="Courier New" w:cs="Courier New" w:hint="default"/>
+      </w:rPr>
+    </w:lvl>
+    <w:lvl w:ilvl="5" w:tplc="04090005" w:tentative="1">
+      <w:start w:val="1"/>
+      <w:numFmt w:val="bullet"/>
+      <w:lvlText w:val=""/>
+      <w:lvlJc w:val="left"/>
+      <w:pPr>
+        <w:ind w:left="4320" w:hanging="360"/>
+      </w:pPr>
+      <w:rPr>
+        <w:rFonts w:ascii="Wingdings" w:hAnsi="Wingdings" w:hint="default"/>
+      </w:rPr>
+    </w:lvl>
+    <w:lvl w:ilvl="6" w:tplc="04090001" w:tentative="1">
+      <w:start w:val="1"/>
+      <w:numFmt w:val="bullet"/>
+      <w:lvlText w:val=""/>
+      <w:lvlJc w:val="left"/>
+      <w:pPr>
+        <w:ind w:left="5040" w:hanging="360"/>
+      </w:pPr>
+      <w:rPr>
+        <w:rFonts w:ascii="Symbol" w:hAnsi="Symbol" w:hint="default"/>
+      </w:rPr>
+    </w:lvl>
+    <w:lvl w:ilvl="7" w:tplc="04090003" w:tentative="1">
+      <w:start w:val="1"/>
+      <w:numFmt w:val="bullet"/>
+      <w:lvlText w:val="o"/>
+      <w:lvlJc w:val="left"/>
+      <w:pPr>
+        <w:ind w:left="5760" w:hanging="360"/>
+      </w:pPr>
+      <w:rPr>
+        <w:rFonts w:ascii="Courier New" w:hAnsi="Courier New" w:cs="Courier New" w:hint="default"/>
+      </w:rPr>
+    </w:lvl>
+    <w:lvl w:ilvl="8" w:tplc="04090005" w:tentative="1">
+      <w:start w:val="1"/>
+      <w:numFmt w:val="bullet"/>
+      <w:lvlText w:val=""/>
+      <w:lvlJc w:val="left"/>
+      <w:pPr>
+        <w:ind w:left="6480" w:hanging="360"/>
+      </w:pPr>
+      <w:rPr>
+        <w:rFonts w:ascii="Wingdings" w:hAnsi="Wingdings" w:hint="default"/>
+      </w:rPr>
+    </w:lvl>
+  </w:abstractNum>
+  <w:abstractNum w:abstractNumId="5" w15:restartNumberingAfterBreak="0">
+    <w:nsid w:val="27C434D2"/>
+    <w:multiLevelType w:val="multilevel"/>
+    <w:tmpl w:val="B1C20534"/>
+    <w:lvl w:ilvl="0">
+      <w:start w:val="1"/>
+      <w:numFmt w:val="decimal"/>
+      <w:lvlText w:val="%1."/>
+      <w:lvlJc w:val="left"/>
+      <w:pPr>
+        <w:ind w:left="760" w:hanging="400"/>
+      </w:pPr>
+      <w:rPr>
+        <w:rFonts w:hint="default"/>
+      </w:rPr>
+    </w:lvl>
+    <w:lvl w:ilvl="1">
+      <w:start w:val="1"/>
+      <w:numFmt w:val="decimal"/>
+      <w:isLgl/>
+      <w:lvlText w:val="%1.%2"/>
+      <w:lvlJc w:val="left"/>
+      <w:pPr>
+        <w:ind w:left="840" w:hanging="480"/>
+      </w:pPr>
+      <w:rPr>
+        <w:rFonts w:hint="default"/>
+      </w:rPr>
+    </w:lvl>
+    <w:lvl w:ilvl="2">
+      <w:start w:val="1"/>
+      <w:numFmt w:val="decimal"/>
+      <w:isLgl/>
+      <w:lvlText w:val="%1.%2.%3"/>
+      <w:lvlJc w:val="left"/>
+      <w:pPr>
+        <w:ind w:left="1080" w:hanging="720"/>
+      </w:pPr>
+      <w:rPr>
+        <w:rFonts w:hint="default"/>
+      </w:rPr>
+    </w:lvl>
+    <w:lvl w:ilvl="3">
+      <w:start w:val="1"/>
+      <w:numFmt w:val="decimal"/>
+      <w:isLgl/>
+      <w:lvlText w:val="%1.%2.%3.%4"/>
+      <w:lvlJc w:val="left"/>
+      <w:pPr>
+        <w:ind w:left="1080" w:hanging="720"/>
+      </w:pPr>
+      <w:rPr>
+        <w:rFonts w:hint="default"/>
+      </w:rPr>
+    </w:lvl>
+    <w:lvl w:ilvl="4">
+      <w:start w:val="1"/>
+      <w:numFmt w:val="decimal"/>
+      <w:isLgl/>
+      <w:lvlText w:val="%1.%2.%3.%4.%5"/>
+      <w:lvlJc w:val="left"/>
+      <w:pPr>
+        <w:ind w:left="1440" w:hanging="1080"/>
+      </w:pPr>
+      <w:rPr>
+        <w:rFonts w:hint="default"/>
+      </w:rPr>
+    </w:lvl>
+    <w:lvl w:ilvl="5">
+      <w:start w:val="1"/>
+      <w:numFmt w:val="decimal"/>
+      <w:isLgl/>
+      <w:lvlText w:val="%1.%2.%3.%4.%5.%6"/>
+      <w:lvlJc w:val="left"/>
+      <w:pPr>
+        <w:ind w:left="1440" w:hanging="1080"/>
+      </w:pPr>
+      <w:rPr>
+        <w:rFonts w:hint="default"/>
+      </w:rPr>
+    </w:lvl>
+    <w:lvl w:ilvl="6">
+      <w:start w:val="1"/>
+      <w:numFmt w:val="decimal"/>
+      <w:isLgl/>
+      <w:lvlText w:val="%1.%2.%3.%4.%5.%6.%7"/>
+      <w:lvlJc w:val="left"/>
+      <w:pPr>
+        <w:ind w:left="1800" w:hanging="1440"/>
+      </w:pPr>
+      <w:rPr>
+        <w:rFonts w:hint="default"/>
+      </w:rPr>
+    </w:lvl>
+    <w:lvl w:ilvl="7">
+      <w:start w:val="1"/>
+      <w:numFmt w:val="decimal"/>
+      <w:isLgl/>
+      <w:lvlText w:val="%1.%2.%3.%4.%5.%6.%7.%8"/>
+      <w:lvlJc w:val="left"/>
+      <w:pPr>
+        <w:ind w:left="1800" w:hanging="1440"/>
+      </w:pPr>
+      <w:rPr>
+        <w:rFonts w:hint="default"/>
+      </w:rPr>
+    </w:lvl>
+    <w:lvl w:ilvl="8">
+      <w:start w:val="1"/>
+      <w:numFmt w:val="decimal"/>
+      <w:isLgl/>
+      <w:lvlText w:val="%1.%2.%3.%4.%5.%6.%7.%8.%9"/>
+      <w:lvlJc w:val="left"/>
+      <w:pPr>
+        <w:ind w:left="2160" w:hanging="1800"/>
+      </w:pPr>
+      <w:rPr>
+        <w:rFonts w:hint="default"/>
+      </w:rPr>
+    </w:lvl>
+  </w:abstractNum>
+  <w:abstractNum w:abstractNumId="6" w15:restartNumberingAfterBreak="0">
     <w:nsid w:val="28236F37"/>
     <w:multiLevelType w:val="hybridMultilevel"/>
     <w:tmpl w:val="ADF29C32"/>
@@ -3968,7 +6758,7 @@
       </w:rPr>
     </w:lvl>
   </w:abstractNum>
-  <w:abstractNum w:abstractNumId="1" w15:restartNumberingAfterBreak="0">
+  <w:abstractNum w:abstractNumId="7" w15:restartNumberingAfterBreak="0">
     <w:nsid w:val="29556D95"/>
     <w:multiLevelType w:val="hybridMultilevel"/>
     <w:tmpl w:val="6C80EEB8"/>
@@ -4081,7 +6871,7 @@
       </w:rPr>
     </w:lvl>
   </w:abstractNum>
-  <w:abstractNum w:abstractNumId="2" w15:restartNumberingAfterBreak="0">
+  <w:abstractNum w:abstractNumId="8" w15:restartNumberingAfterBreak="0">
     <w:nsid w:val="2A9142D6"/>
     <w:multiLevelType w:val="hybridMultilevel"/>
     <w:tmpl w:val="186060BE"/>
@@ -4193,7 +6983,7 @@
       </w:rPr>
     </w:lvl>
   </w:abstractNum>
-  <w:abstractNum w:abstractNumId="3" w15:restartNumberingAfterBreak="0">
+  <w:abstractNum w:abstractNumId="9" w15:restartNumberingAfterBreak="0">
     <w:nsid w:val="376A1AFA"/>
     <w:multiLevelType w:val="hybridMultilevel"/>
     <w:tmpl w:val="54DAB2A8"/>
@@ -4306,7 +7096,7 @@
       </w:rPr>
     </w:lvl>
   </w:abstractNum>
-  <w:abstractNum w:abstractNumId="4" w15:restartNumberingAfterBreak="0">
+  <w:abstractNum w:abstractNumId="10" w15:restartNumberingAfterBreak="0">
     <w:nsid w:val="380717AE"/>
     <w:multiLevelType w:val="hybridMultilevel"/>
     <w:tmpl w:val="3CC824F6"/>
@@ -4419,7 +7209,7 @@
       </w:rPr>
     </w:lvl>
   </w:abstractNum>
-  <w:abstractNum w:abstractNumId="5" w15:restartNumberingAfterBreak="0">
+  <w:abstractNum w:abstractNumId="11" w15:restartNumberingAfterBreak="0">
     <w:nsid w:val="3AB273C5"/>
     <w:multiLevelType w:val="hybridMultilevel"/>
     <w:tmpl w:val="36C46E6E"/>
@@ -4508,7 +7298,7 @@
       </w:pPr>
     </w:lvl>
   </w:abstractNum>
-  <w:abstractNum w:abstractNumId="6" w15:restartNumberingAfterBreak="0">
+  <w:abstractNum w:abstractNumId="12" w15:restartNumberingAfterBreak="0">
     <w:nsid w:val="3FF735BE"/>
     <w:multiLevelType w:val="hybridMultilevel"/>
     <w:tmpl w:val="F8824B4C"/>
@@ -4620,7 +7410,120 @@
       </w:rPr>
     </w:lvl>
   </w:abstractNum>
-  <w:abstractNum w:abstractNumId="7" w15:restartNumberingAfterBreak="0">
+  <w:abstractNum w:abstractNumId="13" w15:restartNumberingAfterBreak="0">
+    <w:nsid w:val="426A1C66"/>
+    <w:multiLevelType w:val="hybridMultilevel"/>
+    <w:tmpl w:val="4F40A252"/>
+    <w:lvl w:ilvl="0" w:tplc="04090001">
+      <w:start w:val="1"/>
+      <w:numFmt w:val="bullet"/>
+      <w:lvlText w:val=""/>
+      <w:lvlJc w:val="left"/>
+      <w:pPr>
+        <w:ind w:left="720" w:hanging="360"/>
+      </w:pPr>
+      <w:rPr>
+        <w:rFonts w:ascii="Symbol" w:hAnsi="Symbol" w:hint="default"/>
+      </w:rPr>
+    </w:lvl>
+    <w:lvl w:ilvl="1" w:tplc="04090003" w:tentative="1">
+      <w:start w:val="1"/>
+      <w:numFmt w:val="bullet"/>
+      <w:lvlText w:val="o"/>
+      <w:lvlJc w:val="left"/>
+      <w:pPr>
+        <w:ind w:left="1440" w:hanging="360"/>
+      </w:pPr>
+      <w:rPr>
+        <w:rFonts w:ascii="Courier New" w:hAnsi="Courier New" w:cs="Courier New" w:hint="default"/>
+      </w:rPr>
+    </w:lvl>
+    <w:lvl w:ilvl="2" w:tplc="04090005" w:tentative="1">
+      <w:start w:val="1"/>
+      <w:numFmt w:val="bullet"/>
+      <w:lvlText w:val=""/>
+      <w:lvlJc w:val="left"/>
+      <w:pPr>
+        <w:ind w:left="2160" w:hanging="360"/>
+      </w:pPr>
+      <w:rPr>
+        <w:rFonts w:ascii="Wingdings" w:hAnsi="Wingdings" w:hint="default"/>
+      </w:rPr>
+    </w:lvl>
+    <w:lvl w:ilvl="3" w:tplc="04090001" w:tentative="1">
+      <w:start w:val="1"/>
+      <w:numFmt w:val="bullet"/>
+      <w:lvlText w:val=""/>
+      <w:lvlJc w:val="left"/>
+      <w:pPr>
+        <w:ind w:left="2880" w:hanging="360"/>
+      </w:pPr>
+      <w:rPr>
+        <w:rFonts w:ascii="Symbol" w:hAnsi="Symbol" w:hint="default"/>
+      </w:rPr>
+    </w:lvl>
+    <w:lvl w:ilvl="4" w:tplc="04090003" w:tentative="1">
+      <w:start w:val="1"/>
+      <w:numFmt w:val="bullet"/>
+      <w:lvlText w:val="o"/>
+      <w:lvlJc w:val="left"/>
+      <w:pPr>
+        <w:ind w:left="3600" w:hanging="360"/>
+      </w:pPr>
+      <w:rPr>
+        <w:rFonts w:ascii="Courier New" w:hAnsi="Courier New" w:cs="Courier New" w:hint="default"/>
+      </w:rPr>
+    </w:lvl>
+    <w:lvl w:ilvl="5" w:tplc="04090005" w:tentative="1">
+      <w:start w:val="1"/>
+      <w:numFmt w:val="bullet"/>
+      <w:lvlText w:val=""/>
+      <w:lvlJc w:val="left"/>
+      <w:pPr>
+        <w:ind w:left="4320" w:hanging="360"/>
+      </w:pPr>
+      <w:rPr>
+        <w:rFonts w:ascii="Wingdings" w:hAnsi="Wingdings" w:hint="default"/>
+      </w:rPr>
+    </w:lvl>
+    <w:lvl w:ilvl="6" w:tplc="04090001" w:tentative="1">
+      <w:start w:val="1"/>
+      <w:numFmt w:val="bullet"/>
+      <w:lvlText w:val=""/>
+      <w:lvlJc w:val="left"/>
+      <w:pPr>
+        <w:ind w:left="5040" w:hanging="360"/>
+      </w:pPr>
+      <w:rPr>
+        <w:rFonts w:ascii="Symbol" w:hAnsi="Symbol" w:hint="default"/>
+      </w:rPr>
+    </w:lvl>
+    <w:lvl w:ilvl="7" w:tplc="04090003" w:tentative="1">
+      <w:start w:val="1"/>
+      <w:numFmt w:val="bullet"/>
+      <w:lvlText w:val="o"/>
+      <w:lvlJc w:val="left"/>
+      <w:pPr>
+        <w:ind w:left="5760" w:hanging="360"/>
+      </w:pPr>
+      <w:rPr>
+        <w:rFonts w:ascii="Courier New" w:hAnsi="Courier New" w:cs="Courier New" w:hint="default"/>
+      </w:rPr>
+    </w:lvl>
+    <w:lvl w:ilvl="8" w:tplc="04090005" w:tentative="1">
+      <w:start w:val="1"/>
+      <w:numFmt w:val="bullet"/>
+      <w:lvlText w:val=""/>
+      <w:lvlJc w:val="left"/>
+      <w:pPr>
+        <w:ind w:left="6480" w:hanging="360"/>
+      </w:pPr>
+      <w:rPr>
+        <w:rFonts w:ascii="Wingdings" w:hAnsi="Wingdings" w:hint="default"/>
+      </w:rPr>
+    </w:lvl>
+  </w:abstractNum>
+  <w:abstractNum w:abstractNumId="14" w15:restartNumberingAfterBreak="0">
     <w:nsid w:val="50F639F3"/>
     <w:multiLevelType w:val="hybridMultilevel"/>
     <w:tmpl w:val="DB20E234"/>
@@ -4733,7 +7636,7 @@
       </w:rPr>
     </w:lvl>
   </w:abstractNum>
-  <w:abstractNum w:abstractNumId="8" w15:restartNumberingAfterBreak="0">
+  <w:abstractNum w:abstractNumId="15" w15:restartNumberingAfterBreak="0">
     <w:nsid w:val="55543EB4"/>
     <w:multiLevelType w:val="hybridMultilevel"/>
     <w:tmpl w:val="880A7B68"/>
@@ -4846,7 +7749,120 @@
       </w:rPr>
     </w:lvl>
   </w:abstractNum>
-  <w:abstractNum w:abstractNumId="9" w15:restartNumberingAfterBreak="0">
+  <w:abstractNum w:abstractNumId="16" w15:restartNumberingAfterBreak="0">
+    <w:nsid w:val="58592266"/>
+    <w:multiLevelType w:val="hybridMultilevel"/>
+    <w:tmpl w:val="97C84C1C"/>
+    <w:lvl w:ilvl="0" w:tplc="04090001">
+      <w:start w:val="1"/>
+      <w:numFmt w:val="bullet"/>
+      <w:lvlText w:val=""/>
+      <w:lvlJc w:val="left"/>
+      <w:pPr>
+        <w:ind w:left="720" w:hanging="360"/>
+      </w:pPr>
+      <w:rPr>
+        <w:rFonts w:ascii="Symbol" w:hAnsi="Symbol" w:hint="default"/>
+      </w:rPr>
+    </w:lvl>
+    <w:lvl w:ilvl="1" w:tplc="04090003" w:tentative="1">
+      <w:start w:val="1"/>
+      <w:numFmt w:val="bullet"/>
+      <w:lvlText w:val="o"/>
+      <w:lvlJc w:val="left"/>
+      <w:pPr>
+        <w:ind w:left="1440" w:hanging="360"/>
+      </w:pPr>
+      <w:rPr>
+        <w:rFonts w:ascii="Courier New" w:hAnsi="Courier New" w:cs="Courier New" w:hint="default"/>
+      </w:rPr>
+    </w:lvl>
+    <w:lvl w:ilvl="2" w:tplc="04090005" w:tentative="1">
+      <w:start w:val="1"/>
+      <w:numFmt w:val="bullet"/>
+      <w:lvlText w:val=""/>
+      <w:lvlJc w:val="left"/>
+      <w:pPr>
+        <w:ind w:left="2160" w:hanging="360"/>
+      </w:pPr>
+      <w:rPr>
+        <w:rFonts w:ascii="Wingdings" w:hAnsi="Wingdings" w:hint="default"/>
+      </w:rPr>
+    </w:lvl>
+    <w:lvl w:ilvl="3" w:tplc="04090001" w:tentative="1">
+      <w:start w:val="1"/>
+      <w:numFmt w:val="bullet"/>
+      <w:lvlText w:val=""/>
+      <w:lvlJc w:val="left"/>
+      <w:pPr>
+        <w:ind w:left="2880" w:hanging="360"/>
+      </w:pPr>
+      <w:rPr>
+        <w:rFonts w:ascii="Symbol" w:hAnsi="Symbol" w:hint="default"/>
+      </w:rPr>
+    </w:lvl>
+    <w:lvl w:ilvl="4" w:tplc="04090003" w:tentative="1">
+      <w:start w:val="1"/>
+      <w:numFmt w:val="bullet"/>
+      <w:lvlText w:val="o"/>
+      <w:lvlJc w:val="left"/>
+      <w:pPr>
+        <w:ind w:left="3600" w:hanging="360"/>
+      </w:pPr>
+      <w:rPr>
+        <w:rFonts w:ascii="Courier New" w:hAnsi="Courier New" w:cs="Courier New" w:hint="default"/>
+      </w:rPr>
+    </w:lvl>
+    <w:lvl w:ilvl="5" w:tplc="04090005" w:tentative="1">
+      <w:start w:val="1"/>
+      <w:numFmt w:val="bullet"/>
+      <w:lvlText w:val=""/>
+      <w:lvlJc w:val="left"/>
+      <w:pPr>
+        <w:ind w:left="4320" w:hanging="360"/>
+      </w:pPr>
+      <w:rPr>
+        <w:rFonts w:ascii="Wingdings" w:hAnsi="Wingdings" w:hint="default"/>
+      </w:rPr>
+    </w:lvl>
+    <w:lvl w:ilvl="6" w:tplc="04090001" w:tentative="1">
+      <w:start w:val="1"/>
+      <w:numFmt w:val="bullet"/>
+      <w:lvlText w:val=""/>
+      <w:lvlJc w:val="left"/>
+      <w:pPr>
+        <w:ind w:left="5040" w:hanging="360"/>
+      </w:pPr>
+      <w:rPr>
+        <w:rFonts w:ascii="Symbol" w:hAnsi="Symbol" w:hint="default"/>
+      </w:rPr>
+    </w:lvl>
+    <w:lvl w:ilvl="7" w:tplc="04090003" w:tentative="1">
+      <w:start w:val="1"/>
+      <w:numFmt w:val="bullet"/>
+      <w:lvlText w:val="o"/>
+      <w:lvlJc w:val="left"/>
+      <w:pPr>
+        <w:ind w:left="5760" w:hanging="360"/>
+      </w:pPr>
+      <w:rPr>
+        <w:rFonts w:ascii="Courier New" w:hAnsi="Courier New" w:cs="Courier New" w:hint="default"/>
+      </w:rPr>
+    </w:lvl>
+    <w:lvl w:ilvl="8" w:tplc="04090005" w:tentative="1">
+      <w:start w:val="1"/>
+      <w:numFmt w:val="bullet"/>
+      <w:lvlText w:val=""/>
+      <w:lvlJc w:val="left"/>
+      <w:pPr>
+        <w:ind w:left="6480" w:hanging="360"/>
+      </w:pPr>
+      <w:rPr>
+        <w:rFonts w:ascii="Wingdings" w:hAnsi="Wingdings" w:hint="default"/>
+      </w:rPr>
+    </w:lvl>
+  </w:abstractNum>
+  <w:abstractNum w:abstractNumId="17" w15:restartNumberingAfterBreak="0">
     <w:nsid w:val="608112CE"/>
     <w:multiLevelType w:val="hybridMultilevel"/>
     <w:tmpl w:val="09EE3DBA"/>
@@ -4958,7 +7974,7 @@
       </w:rPr>
     </w:lvl>
   </w:abstractNum>
-  <w:abstractNum w:abstractNumId="10" w15:restartNumberingAfterBreak="0">
+  <w:abstractNum w:abstractNumId="18" w15:restartNumberingAfterBreak="0">
     <w:nsid w:val="6353268B"/>
     <w:multiLevelType w:val="hybridMultilevel"/>
     <w:tmpl w:val="DC4AB506"/>
@@ -5071,7 +8087,7 @@
       </w:rPr>
     </w:lvl>
   </w:abstractNum>
-  <w:abstractNum w:abstractNumId="11" w15:restartNumberingAfterBreak="0">
+  <w:abstractNum w:abstractNumId="19" w15:restartNumberingAfterBreak="0">
     <w:nsid w:val="6AAE6C20"/>
     <w:multiLevelType w:val="hybridMultilevel"/>
     <w:tmpl w:val="ECE84744"/>
@@ -5160,7 +8176,7 @@
       </w:pPr>
     </w:lvl>
   </w:abstractNum>
-  <w:abstractNum w:abstractNumId="12" w15:restartNumberingAfterBreak="0">
+  <w:abstractNum w:abstractNumId="20" w15:restartNumberingAfterBreak="0">
     <w:nsid w:val="6D367050"/>
     <w:multiLevelType w:val="hybridMultilevel"/>
     <w:tmpl w:val="05CEFB78"/>
@@ -5273,7 +8289,7 @@
       </w:rPr>
     </w:lvl>
   </w:abstractNum>
-  <w:abstractNum w:abstractNumId="13" w15:restartNumberingAfterBreak="0">
+  <w:abstractNum w:abstractNumId="21" w15:restartNumberingAfterBreak="0">
     <w:nsid w:val="6F450195"/>
     <w:multiLevelType w:val="hybridMultilevel"/>
     <w:tmpl w:val="C936CC20"/>
@@ -5386,7 +8402,7 @@
       </w:rPr>
     </w:lvl>
   </w:abstractNum>
-  <w:abstractNum w:abstractNumId="14" w15:restartNumberingAfterBreak="0">
+  <w:abstractNum w:abstractNumId="22" w15:restartNumberingAfterBreak="0">
     <w:nsid w:val="7852D037"/>
     <w:multiLevelType w:val="hybridMultilevel"/>
     <w:tmpl w:val="F43A1892"/>
@@ -5472,7 +8488,7 @@
       </w:pPr>
     </w:lvl>
   </w:abstractNum>
-  <w:abstractNum w:abstractNumId="15" w15:restartNumberingAfterBreak="0">
+  <w:abstractNum w:abstractNumId="23" w15:restartNumberingAfterBreak="0">
     <w:nsid w:val="78DF649D"/>
     <w:multiLevelType w:val="hybridMultilevel"/>
     <w:tmpl w:val="49443DB2"/>
@@ -5585,7 +8601,7 @@
       </w:rPr>
     </w:lvl>
   </w:abstractNum>
-  <w:abstractNum w:abstractNumId="16" w15:restartNumberingAfterBreak="0">
+  <w:abstractNum w:abstractNumId="24" w15:restartNumberingAfterBreak="0">
     <w:nsid w:val="7CF05B2C"/>
     <w:multiLevelType w:val="hybridMultilevel"/>
     <w:tmpl w:val="DD36FAF8"/>
@@ -5699,55 +8715,79 @@
     </w:lvl>
   </w:abstractNum>
   <w:num w:numId="1" w16cid:durableId="375550706">
+    <w:abstractNumId w:val="22"/>
+  </w:num>
+  <w:num w:numId="2" w16cid:durableId="412551155">
+    <w:abstractNumId w:val="9"/>
+  </w:num>
+  <w:num w:numId="3" w16cid:durableId="2069301550">
+    <w:abstractNumId w:val="20"/>
+  </w:num>
+  <w:num w:numId="4" w16cid:durableId="1492333399">
+    <w:abstractNumId w:val="15"/>
+  </w:num>
+  <w:num w:numId="5" w16cid:durableId="2122918184">
+    <w:abstractNumId w:val="6"/>
+  </w:num>
+  <w:num w:numId="6" w16cid:durableId="1188104306">
+    <w:abstractNumId w:val="7"/>
+  </w:num>
+  <w:num w:numId="7" w16cid:durableId="287276096">
+    <w:abstractNumId w:val="24"/>
+  </w:num>
+  <w:num w:numId="8" w16cid:durableId="836380917">
+    <w:abstractNumId w:val="21"/>
+  </w:num>
+  <w:num w:numId="9" w16cid:durableId="1751193279">
     <w:abstractNumId w:val="14"/>
   </w:num>
-  <w:num w:numId="2" w16cid:durableId="412551155">
+  <w:num w:numId="10" w16cid:durableId="1687247538">
+    <w:abstractNumId w:val="11"/>
+  </w:num>
+  <w:num w:numId="11" w16cid:durableId="42295535">
+    <w:abstractNumId w:val="19"/>
+  </w:num>
+  <w:num w:numId="12" w16cid:durableId="693270215">
+    <w:abstractNumId w:val="23"/>
+  </w:num>
+  <w:num w:numId="13" w16cid:durableId="1217937573">
+    <w:abstractNumId w:val="12"/>
+  </w:num>
+  <w:num w:numId="14" w16cid:durableId="195435717">
+    <w:abstractNumId w:val="18"/>
+  </w:num>
+  <w:num w:numId="15" w16cid:durableId="912396702">
+    <w:abstractNumId w:val="8"/>
+  </w:num>
+  <w:num w:numId="16" w16cid:durableId="452942021">
+    <w:abstractNumId w:val="10"/>
+  </w:num>
+  <w:num w:numId="17" w16cid:durableId="878929890">
+    <w:abstractNumId w:val="17"/>
+  </w:num>
+  <w:num w:numId="18" w16cid:durableId="778649773">
+    <w:abstractNumId w:val="5"/>
+  </w:num>
+  <w:num w:numId="19" w16cid:durableId="493255704">
+    <w:abstractNumId w:val="1"/>
+  </w:num>
+  <w:num w:numId="20" w16cid:durableId="961497269">
+    <w:abstractNumId w:val="4"/>
+  </w:num>
+  <w:num w:numId="21" w16cid:durableId="1795369159">
+    <w:abstractNumId w:val="0"/>
+  </w:num>
+  <w:num w:numId="22" w16cid:durableId="127820005">
+    <w:abstractNumId w:val="2"/>
+  </w:num>
+  <w:num w:numId="23" w16cid:durableId="1209533461">
+    <w:abstractNumId w:val="16"/>
+  </w:num>
+  <w:num w:numId="24" w16cid:durableId="1194660521">
     <w:abstractNumId w:val="3"/>
   </w:num>
-  <w:num w:numId="3" w16cid:durableId="2069301550">
-    <w:abstractNumId w:val="12"/>
-  </w:num>
-  <w:num w:numId="4" w16cid:durableId="1492333399">
-    <w:abstractNumId w:val="8"/>
-  </w:num>
-  <w:num w:numId="5" w16cid:durableId="2122918184">
-    <w:abstractNumId w:val="0"/>
-  </w:num>
-  <w:num w:numId="6" w16cid:durableId="1188104306">
-    <w:abstractNumId w:val="1"/>
-  </w:num>
-  <w:num w:numId="7" w16cid:durableId="287276096">
-    <w:abstractNumId w:val="16"/>
-  </w:num>
-  <w:num w:numId="8" w16cid:durableId="836380917">
+  <w:num w:numId="25" w16cid:durableId="1720124383">
     <w:abstractNumId w:val="13"/>
-  </w:num>
-  <w:num w:numId="9" w16cid:durableId="1751193279">
-    <w:abstractNumId w:val="7"/>
-  </w:num>
-  <w:num w:numId="10" w16cid:durableId="1687247538">
-    <w:abstractNumId w:val="5"/>
-  </w:num>
-  <w:num w:numId="11" w16cid:durableId="42295535">
-    <w:abstractNumId w:val="11"/>
-  </w:num>
-  <w:num w:numId="12" w16cid:durableId="693270215">
-    <w:abstractNumId w:val="15"/>
-  </w:num>
-  <w:num w:numId="13" w16cid:durableId="1217937573">
-    <w:abstractNumId w:val="6"/>
-  </w:num>
-  <w:num w:numId="14" w16cid:durableId="195435717">
-    <w:abstractNumId w:val="10"/>
-  </w:num>
-  <w:num w:numId="15" w16cid:durableId="912396702">
-    <w:abstractNumId w:val="2"/>
-  </w:num>
-  <w:num w:numId="16" w16cid:durableId="452942021">
-    <w:abstractNumId w:val="4"/>
-  </w:num>
-  <w:num w:numId="17" w16cid:durableId="878929890">
-    <w:abstractNumId w:val="9"/>
   </w:num>
 </w:numbering>
 </file>
@@ -6356,7 +9396,6 @@
   <w:style w:type="character" w:default="1" w:styleId="DefaultParagraphFont">
     <w:name w:val="Default Paragraph Font"/>
     <w:uiPriority w:val="1"/>
-    <w:semiHidden/>
     <w:unhideWhenUsed/>
   </w:style>
   <w:style w:type="table" w:default="1" w:styleId="TableNormal">

</xml_diff>

<commit_message>
Section 4 solution, security and cost mapping
</commit_message>
<xml_diff>
--- a/DOCUMENTS/Assessment_2_report.docx
+++ b/DOCUMENTS/Assessment_2_report.docx
@@ -1,6 +1,6 @@
 
 <file path=word/document.xml><?xml version="1.0" encoding="utf-8"?>
-<w:document xmlns:wpc="http://schemas.microsoft.com/office/word/2010/wordprocessingCanvas" xmlns:cx="http://schemas.microsoft.com/office/drawing/2014/chartex" xmlns:cx1="http://schemas.microsoft.com/office/drawing/2015/9/8/chartex" xmlns:cx2="http://schemas.microsoft.com/office/drawing/2015/10/21/chartex" xmlns:cx3="http://schemas.microsoft.com/office/drawing/2016/5/9/chartex" xmlns:cx4="http://schemas.microsoft.com/office/drawing/2016/5/10/chartex" xmlns:cx5="http://schemas.microsoft.com/office/drawing/2016/5/11/chartex" xmlns:cx6="http://schemas.microsoft.com/office/drawing/2016/5/12/chartex" xmlns:cx7="http://schemas.microsoft.com/office/drawing/2016/5/13/chartex" xmlns:cx8="http://schemas.microsoft.com/office/drawing/2016/5/14/chartex" xmlns:mc="http://schemas.openxmlformats.org/markup-compatibility/2006" xmlns:aink="http://schemas.microsoft.com/office/drawing/2016/ink" xmlns:am3d="http://schemas.microsoft.com/office/drawing/2017/model3d" xmlns:o="urn:schemas-microsoft-com:office:office" xmlns:oel="http://schemas.microsoft.com/office/2019/extlst" xmlns:r="http://schemas.openxmlformats.org/officeDocument/2006/relationships" xmlns:m="http://schemas.openxmlformats.org/officeDocument/2006/math" xmlns:v="urn:schemas-microsoft-com:vml" xmlns:wp14="http://schemas.microsoft.com/office/word/2010/wordprocessingDrawing" xmlns:wp="http://schemas.openxmlformats.org/drawingml/2006/wordprocessingDrawing" xmlns:w10="urn:schemas-microsoft-com:office:word" xmlns:w="http://schemas.openxmlformats.org/wordprocessingml/2006/main" xmlns:w14="http://schemas.microsoft.com/office/word/2010/wordml" xmlns:w15="http://schemas.microsoft.com/office/word/2012/wordml" xmlns:w16cex="http://schemas.microsoft.com/office/word/2018/wordml/cex" xmlns:w16cid="http://schemas.microsoft.com/office/word/2016/wordml/cid" xmlns:w16="http://schemas.microsoft.com/office/word/2018/wordml" xmlns:w16du="http://schemas.microsoft.com/office/word/2023/wordml/word16du" xmlns:w16sdtdh="http://schemas.microsoft.com/office/word/2020/wordml/sdtdatahash" xmlns:w16sdtfl="http://schemas.microsoft.com/office/word/2024/wordml/sdtformatlock" xmlns:w16se="http://schemas.microsoft.com/office/word/2015/wordml/symex" xmlns:wpg="http://schemas.microsoft.com/office/word/2010/wordprocessingGroup" xmlns:wpi="http://schemas.microsoft.com/office/word/2010/wordprocessingInk" xmlns:wne="http://schemas.microsoft.com/office/word/2006/wordml" xmlns:wps="http://schemas.microsoft.com/office/word/2010/wordprocessingShape" mc:Ignorable="w14 w15 w16se w16cid w16 w16cex w16sdtdh w16sdtfl w16du wp14">
+<w:document xmlns:wpc="http://schemas.microsoft.com/office/word/2010/wordprocessingCanvas" xmlns:cx="http://schemas.microsoft.com/office/drawing/2014/chartex" xmlns:cx1="http://schemas.microsoft.com/office/drawing/2015/9/8/chartex" xmlns:cx2="http://schemas.microsoft.com/office/drawing/2015/10/21/chartex" xmlns:cx3="http://schemas.microsoft.com/office/drawing/2016/5/9/chartex" xmlns:cx4="http://schemas.microsoft.com/office/drawing/2016/5/10/chartex" xmlns:cx5="http://schemas.microsoft.com/office/drawing/2016/5/11/chartex" xmlns:cx6="http://schemas.microsoft.com/office/drawing/2016/5/12/chartex" xmlns:cx7="http://schemas.microsoft.com/office/drawing/2016/5/13/chartex" xmlns:cx8="http://schemas.microsoft.com/office/drawing/2016/5/14/chartex" xmlns:mc="http://schemas.openxmlformats.org/markup-compatibility/2006" xmlns:m="http://schemas.openxmlformats.org/officeDocument/2006/math" xmlns:aink="http://schemas.microsoft.com/office/drawing/2016/ink" xmlns:am3d="http://schemas.microsoft.com/office/drawing/2017/model3d" xmlns:oel="http://schemas.microsoft.com/office/2019/extlst" xmlns:r="http://schemas.openxmlformats.org/officeDocument/2006/relationships" xmlns:wp14="http://schemas.microsoft.com/office/word/2010/wordprocessingDrawing" xmlns:wp="http://schemas.openxmlformats.org/drawingml/2006/wordprocessingDrawing" xmlns:wpg="http://schemas.microsoft.com/office/word/2010/wordprocessingGroup" xmlns:wpi="http://schemas.microsoft.com/office/word/2010/wordprocessingInk" xmlns:wps="http://schemas.microsoft.com/office/word/2010/wordprocessingShape" xmlns:o="urn:schemas-microsoft-com:office:office" xmlns:v="urn:schemas-microsoft-com:vml" xmlns:w10="urn:schemas-microsoft-com:office:word" xmlns:w="http://schemas.openxmlformats.org/wordprocessingml/2006/main" xmlns:w14="http://schemas.microsoft.com/office/word/2010/wordml" xmlns:w15="http://schemas.microsoft.com/office/word/2012/wordml" xmlns:w16cex="http://schemas.microsoft.com/office/word/2018/wordml/cex" xmlns:w16cid="http://schemas.microsoft.com/office/word/2016/wordml/cid" xmlns:w16="http://schemas.microsoft.com/office/word/2018/wordml" xmlns:w16sdtdh="http://schemas.microsoft.com/office/word/2020/wordml/sdtdatahash" xmlns:w16sdtfl="http://schemas.microsoft.com/office/word/2024/wordml/sdtformatlock" xmlns:w16se="http://schemas.microsoft.com/office/word/2015/wordml/symex" xmlns:w16du="http://schemas.microsoft.com/office/word/2023/wordml/word16du" xmlns:wne="http://schemas.microsoft.com/office/word/2006/wordml" mc:Ignorable="w14 w15 w16se w16cid w16 w16cex w16sdtdh w16sdtfl w16du wp14">
   <w:body>
     <w:p>
       <w:pPr>
@@ -278,7 +278,21 @@
               <w:rPr>
                 <w:lang w:val="en-US"/>
               </w:rPr>
-              <w:t xml:space="preserve"> Sonam Pelden, </w:t>
+              <w:t xml:space="preserve"> Sonam </w:t>
+            </w:r>
+            <w:proofErr w:type="spellStart"/>
+            <w:r>
+              <w:rPr>
+                <w:lang w:val="en-US"/>
+              </w:rPr>
+              <w:t>Pelden</w:t>
+            </w:r>
+            <w:proofErr w:type="spellEnd"/>
+            <w:r>
+              <w:rPr>
+                <w:lang w:val="en-US"/>
+              </w:rPr>
+              <w:t xml:space="preserve">, </w:t>
             </w:r>
             <w:r>
               <w:rPr>
@@ -3482,12 +3496,28 @@
     <w:p>
       <w:bookmarkStart w:id="3" w:name="_Toc238803233"/>
       <w:r>
-        <w:t>FAZ Australia is a Canberra-based health technology, with its flagship product MedTalk, an artificial intelligence clinical scribe tool that is used by doctors in clinics all over Australia to turn doctor–patient conversations into structured clinical notes. MedTalk  integrates with practice EMR systems via MedTalk Connect, a white label interoperability layer based on the HL7 FHIR standard, which currently supports Oracle Health Millennium and Best Practice/Halo Connect at production and supports Epic in sandbox.</w:t>
+        <w:t xml:space="preserve">FAZ Australia is a Canberra-based health technology, with its flagship product MedTalk, an artificial intelligence clinical scribe tool that is used by doctors in clinics all over Australia to turn doctor–patient conversations into structured clinical notes. </w:t>
+      </w:r>
+      <w:proofErr w:type="gramStart"/>
+      <w:r>
+        <w:t>MedTalk  integrates</w:t>
+      </w:r>
+      <w:proofErr w:type="gramEnd"/>
+      <w:r>
+        <w:t xml:space="preserve"> with practice EMR systems via MedTalk Connect, a white label interoperability layer based on the HL7 FHIR standard, which currently supports Oracle Health Millennium and Best Practice/Halo Connect at production and supports Epic in sandbox.</w:t>
       </w:r>
     </w:p>
     <w:p>
       <w:r>
-        <w:t>Currently MedTalk Connect does not provide for a secure and safe environment to validate data exchange with EMR systems, or validate clinical terminology mapping between SNOMED CT-AU, ICD-10-AM and Medicare Benefits Schedule (MBS) coding. Some new connectors and FHIR terminology mappings are subject to informal validation with ad hoc scripts and manual review of FHIR payloads in some environments sufficiently similar to production that they pose a real data risk. This puts the organisation at risk of clinical-safety, privacy and compliance issues with the Privacy Act 1988 (Cth) and the My Health Records Act 2012 (</w:t>
+        <w:t xml:space="preserve">Currently MedTalk Connect does not provide for a secure and safe environment to validate data exchange with EMR systems, or validate clinical terminology mapping between SNOMED CT-AU, ICD-10-AM and Medicare Benefits Schedule (MBS) coding. Some new connectors and FHIR terminology mappings are subject to informal validation with ad hoc scripts and manual review of FHIR payloads in some environments sufficiently </w:t>
+      </w:r>
+      <w:proofErr w:type="gramStart"/>
+      <w:r>
+        <w:t>similar to</w:t>
+      </w:r>
+      <w:proofErr w:type="gramEnd"/>
+      <w:r>
+        <w:t xml:space="preserve"> production that they pose a real data risk. This puts the organisation at risk of clinical-safety, privacy and compliance issues with the Privacy Act 1988 (Cth) and the My Health Records Act 2012 (</w:t>
       </w:r>
       <w:proofErr w:type="spellStart"/>
       <w:r>
@@ -3517,6 +3547,64 @@
         <w:t>, of course, speeds MedTalk Connect's development and onboarding process.</w:t>
       </w:r>
     </w:p>
+    <w:p>
+      <w:r>
+        <w:rPr>
+          <w:noProof/>
+        </w:rPr>
+        <w:lastRenderedPageBreak/>
+        <w:drawing>
+          <wp:inline distT="0" distB="0" distL="0" distR="0" wp14:anchorId="6DE916D0" wp14:editId="5BBC5DC6">
+            <wp:extent cx="5731510" cy="3201035"/>
+            <wp:effectExtent l="0" t="0" r="0" b="0"/>
+            <wp:docPr id="257003765" name="Picture 2"/>
+            <wp:cNvGraphicFramePr>
+              <a:graphicFrameLocks xmlns:a="http://schemas.openxmlformats.org/drawingml/2006/main" noChangeAspect="1"/>
+            </wp:cNvGraphicFramePr>
+            <a:graphic xmlns:a="http://schemas.openxmlformats.org/drawingml/2006/main">
+              <a:graphicData uri="http://schemas.openxmlformats.org/drawingml/2006/picture">
+                <pic:pic xmlns:pic="http://schemas.openxmlformats.org/drawingml/2006/picture">
+                  <pic:nvPicPr>
+                    <pic:cNvPr id="257003765" name="Picture 257003765"/>
+                    <pic:cNvPicPr/>
+                  </pic:nvPicPr>
+                  <pic:blipFill>
+                    <a:blip r:embed="rId8">
+                      <a:extLst>
+                        <a:ext uri="{28A0092B-C50C-407E-A947-70E740481C1C}">
+                          <a14:useLocalDpi xmlns:a14="http://schemas.microsoft.com/office/drawing/2010/main" val="0"/>
+                        </a:ext>
+                      </a:extLst>
+                    </a:blip>
+                    <a:stretch>
+                      <a:fillRect/>
+                    </a:stretch>
+                  </pic:blipFill>
+                  <pic:spPr>
+                    <a:xfrm>
+                      <a:off x="0" y="0"/>
+                      <a:ext cx="5731510" cy="3201035"/>
+                    </a:xfrm>
+                    <a:prstGeom prst="rect">
+                      <a:avLst/>
+                    </a:prstGeom>
+                  </pic:spPr>
+                </pic:pic>
+              </a:graphicData>
+            </a:graphic>
+          </wp:inline>
+        </w:drawing>
+      </w:r>
+    </w:p>
+    <w:p>
+      <w:pPr>
+        <w:jc w:val="center"/>
+      </w:pPr>
+      <w:r>
+        <w:t>Figure X: System context Diagram.</w:t>
+      </w:r>
+    </w:p>
+    <w:p/>
     <w:p/>
     <w:p>
       <w:pPr>
@@ -3586,7 +3674,6 @@
         </w:numPr>
       </w:pPr>
       <w:r>
-        <w:lastRenderedPageBreak/>
         <w:t>Produce</w:t>
       </w:r>
       <w:r>
@@ -3674,6 +3761,7 @@
         </w:numPr>
       </w:pPr>
       <w:r>
+        <w:lastRenderedPageBreak/>
         <w:t>A written, connector-weighted test plan covering happy-path, error-handling and degradation scenarios for all three connectors.</w:t>
       </w:r>
     </w:p>
@@ -3823,15 +3911,7 @@
         <w:t xml:space="preserve">not </w:t>
       </w:r>
       <w:r>
-        <w:t xml:space="preserve">about changes to the core AI transcription/NLP engine of </w:t>
-      </w:r>
-      <w:proofErr w:type="spellStart"/>
-      <w:r>
-        <w:t>MedTalk</w:t>
-      </w:r>
-      <w:proofErr w:type="spellEnd"/>
-      <w:r>
-        <w:t>.</w:t>
+        <w:t>about changes to the core AI transcription/NLP engine of MedTalk.</w:t>
       </w:r>
     </w:p>
     <w:p>
@@ -3921,8 +4001,15 @@
         </w:numPr>
       </w:pPr>
       <w:r>
-        <w:lastRenderedPageBreak/>
-        <w:t>The College have no budget or cloud services provided, and the team must use free tier and open source tools.</w:t>
+        <w:t xml:space="preserve">The College have no budget or cloud services provided, and the team must use free tier and </w:t>
+      </w:r>
+      <w:proofErr w:type="gramStart"/>
+      <w:r>
+        <w:t>open source</w:t>
+      </w:r>
+      <w:proofErr w:type="gramEnd"/>
+      <w:r>
+        <w:t xml:space="preserve"> tools.</w:t>
       </w:r>
     </w:p>
     <w:p>
@@ -4078,6 +4165,7 @@
           </w:tcPr>
           <w:p>
             <w:r>
+              <w:lastRenderedPageBreak/>
               <w:t>Md Ashraf Uddin</w:t>
             </w:r>
           </w:p>
@@ -5566,12 +5654,6 @@
         <w:gridCol w:w="712"/>
       </w:tblGrid>
       <w:tr>
-        <w:tblPrEx>
-          <w:tblCellMar>
-            <w:top w:w="0" w:type="dxa"/>
-            <w:bottom w:w="0" w:type="dxa"/>
-          </w:tblCellMar>
-        </w:tblPrEx>
         <w:tc>
           <w:tcPr>
             <w:tcW w:w="500" w:type="dxa"/>
@@ -5766,12 +5848,6 @@
         </w:tc>
       </w:tr>
       <w:tr>
-        <w:tblPrEx>
-          <w:tblCellMar>
-            <w:top w:w="0" w:type="dxa"/>
-            <w:bottom w:w="0" w:type="dxa"/>
-          </w:tblCellMar>
-        </w:tblPrEx>
         <w:tc>
           <w:tcPr>
             <w:tcW w:w="500" w:type="dxa"/>
@@ -5935,12 +6011,6 @@
         </w:tc>
       </w:tr>
       <w:tr>
-        <w:tblPrEx>
-          <w:tblCellMar>
-            <w:top w:w="0" w:type="dxa"/>
-            <w:bottom w:w="0" w:type="dxa"/>
-          </w:tblCellMar>
-        </w:tblPrEx>
         <w:tc>
           <w:tcPr>
             <w:tcW w:w="500" w:type="dxa"/>
@@ -6103,12 +6173,6 @@
         </w:tc>
       </w:tr>
       <w:tr>
-        <w:tblPrEx>
-          <w:tblCellMar>
-            <w:top w:w="0" w:type="dxa"/>
-            <w:bottom w:w="0" w:type="dxa"/>
-          </w:tblCellMar>
-        </w:tblPrEx>
         <w:tc>
           <w:tcPr>
             <w:tcW w:w="500" w:type="dxa"/>
@@ -6271,12 +6335,6 @@
         </w:tc>
       </w:tr>
       <w:tr>
-        <w:tblPrEx>
-          <w:tblCellMar>
-            <w:top w:w="0" w:type="dxa"/>
-            <w:bottom w:w="0" w:type="dxa"/>
-          </w:tblCellMar>
-        </w:tblPrEx>
         <w:tc>
           <w:tcPr>
             <w:tcW w:w="500" w:type="dxa"/>
@@ -6439,12 +6497,6 @@
         </w:tc>
       </w:tr>
       <w:tr>
-        <w:tblPrEx>
-          <w:tblCellMar>
-            <w:top w:w="0" w:type="dxa"/>
-            <w:bottom w:w="0" w:type="dxa"/>
-          </w:tblCellMar>
-        </w:tblPrEx>
         <w:tc>
           <w:tcPr>
             <w:tcW w:w="500" w:type="dxa"/>
@@ -6607,12 +6659,6 @@
         </w:tc>
       </w:tr>
       <w:tr>
-        <w:tblPrEx>
-          <w:tblCellMar>
-            <w:top w:w="0" w:type="dxa"/>
-            <w:bottom w:w="0" w:type="dxa"/>
-          </w:tblCellMar>
-        </w:tblPrEx>
         <w:tc>
           <w:tcPr>
             <w:tcW w:w="500" w:type="dxa"/>
@@ -6775,12 +6821,6 @@
         </w:tc>
       </w:tr>
       <w:tr>
-        <w:tblPrEx>
-          <w:tblCellMar>
-            <w:top w:w="0" w:type="dxa"/>
-            <w:bottom w:w="0" w:type="dxa"/>
-          </w:tblCellMar>
-        </w:tblPrEx>
         <w:tc>
           <w:tcPr>
             <w:tcW w:w="500" w:type="dxa"/>
@@ -7000,7 +7040,15 @@
         <w:t>feasibility is high</w:t>
       </w:r>
       <w:r>
-        <w:t>: estimated overall cost is around $150 AUD, both using open source tools and free tier hosting under the WIL arrangement, and the expected value for FAZ Australia is great, as defect escape rate will be reduced and onboarding of connectors will be accelerated.</w:t>
+        <w:t xml:space="preserve">: estimated overall cost is around $150 AUD, both using </w:t>
+      </w:r>
+      <w:proofErr w:type="gramStart"/>
+      <w:r>
+        <w:t>open source</w:t>
+      </w:r>
+      <w:proofErr w:type="gramEnd"/>
+      <w:r>
+        <w:t xml:space="preserve"> tools and free tier hosting under the WIL arrangement, and the expected value for FAZ Australia is great, as defect escape rate will be reduced and onboarding of connectors will be accelerated.</w:t>
       </w:r>
     </w:p>
     <w:p>
@@ -7033,7 +7081,15 @@
     </w:p>
     <w:p>
       <w:r>
-        <w:t>Ethical feasibility is high: the design poses no risk of actual harm to patients as a result of construction as no actual clinical data are ever processed. Other ethical issues include the ethical use of AI for creating and verifying synthetic clinical scenarios, and the appropriate mapping of the terminology without inadvertently introducing coding errors into the downstream billing or clinical use.</w:t>
+        <w:t xml:space="preserve">Ethical feasibility is high: the design poses no risk of actual harm to patients </w:t>
+      </w:r>
+      <w:proofErr w:type="gramStart"/>
+      <w:r>
+        <w:t>as a result of</w:t>
+      </w:r>
+      <w:proofErr w:type="gramEnd"/>
+      <w:r>
+        <w:t xml:space="preserve"> construction as no actual clinical data are ever processed. Other ethical issues include the ethical use of AI for creating and verifying synthetic clinical scenarios, and the appropriate mapping of the terminology without inadvertently introducing coding errors into the downstream billing or clinical use.</w:t>
       </w:r>
     </w:p>
     <w:p>
@@ -7066,7 +7122,6 @@
       </w:pPr>
       <w:bookmarkStart w:id="12" w:name="_Toc238803242"/>
       <w:r>
-        <w:lastRenderedPageBreak/>
         <w:t>3. Industry and Technology Landscape Analysis</w:t>
       </w:r>
       <w:bookmarkEnd w:id="12"/>
@@ -7146,77 +7201,2770 @@
     </w:p>
     <w:p>
       <w:pPr>
-        <w:pStyle w:val="Heading1"/>
-      </w:pPr>
-      <w:bookmarkStart w:id="17" w:name="_Toc238803247"/>
-      <w:r>
-        <w:t>4. Solution Design</w:t>
-      </w:r>
-      <w:bookmarkEnd w:id="17"/>
-      <w:r>
-        <w:t> </w:t>
+        <w:rPr>
+          <w:rFonts w:asciiTheme="majorHAnsi" w:eastAsiaTheme="majorEastAsia" w:hAnsiTheme="majorHAnsi" w:cstheme="majorBidi"/>
+          <w:b/>
+          <w:bCs/>
+          <w:color w:val="0F4761" w:themeColor="accent1" w:themeShade="BF"/>
+          <w:sz w:val="40"/>
+          <w:szCs w:val="40"/>
+        </w:rPr>
+      </w:pPr>
+      <w:bookmarkStart w:id="17" w:name="_Toc238803252"/>
+      <w:r>
+        <w:br w:type="page"/>
       </w:r>
     </w:p>
     <w:p>
       <w:pPr>
-        <w:pStyle w:val="Heading2"/>
-      </w:pPr>
-      <w:bookmarkStart w:id="18" w:name="_Toc238803248"/>
-      <w:r>
-        <w:t>4.1 Proposed Solution Architecture</w:t>
-      </w:r>
-      <w:bookmarkEnd w:id="18"/>
-      <w:r>
-        <w:t> </w:t>
+        <w:pStyle w:val="Heading1"/>
+      </w:pPr>
+      <w:r>
+        <w:lastRenderedPageBreak/>
+        <w:t>4. Solution Design</w:t>
       </w:r>
     </w:p>
     <w:p>
       <w:pPr>
-        <w:pStyle w:val="Heading2"/>
-      </w:pPr>
-      <w:bookmarkStart w:id="19" w:name="_Toc238803249"/>
-      <w:r>
-        <w:t>4.2 Technology Stack and Justification</w:t>
-      </w:r>
-      <w:bookmarkEnd w:id="19"/>
+        <w:pStyle w:val="NormalWeb"/>
+        <w:jc w:val="both"/>
+      </w:pPr>
+      <w:r>
+        <w:t xml:space="preserve">This chapter presents the proposed technical solution for the Healthcare Integration &amp; Clinical Terminology Test Harness. The design addresses the cybersecurity and clinical-safety risks identified in the current-state </w:t>
+      </w:r>
+      <w:r>
+        <w:t>analysis</w:t>
+      </w:r>
+      <w:r>
+        <w:rPr>
+          <w:lang w:val="en-US"/>
+        </w:rPr>
+        <w:t xml:space="preserve"> (</w:t>
+      </w:r>
+      <w:r>
+        <w:rPr>
+          <w:lang w:val="en-US"/>
+        </w:rPr>
+        <w:t>F</w:t>
+      </w:r>
+      <w:r>
+        <w:rPr>
+          <w:lang w:val="en-US"/>
+        </w:rPr>
+        <w:t xml:space="preserve">AZ Australia, n.d.) </w:t>
+      </w:r>
+      <w:r>
+        <w:t xml:space="preserve"> by providing a controlled environment for testing interoperability, terminology mapping and connector behaviour without using real patient information. The proposed solution is based on synthetic data, FHIR R4</w:t>
+      </w:r>
       <w:r>
         <w:t xml:space="preserve"> </w:t>
+      </w:r>
+      <w:r>
+        <w:t>(HL7 International, 2019),</w:t>
+      </w:r>
+      <w:r>
+        <w:t xml:space="preserve"> Australian healthcare interoperability requirements</w:t>
+      </w:r>
+      <w:r>
+        <w:t xml:space="preserve"> </w:t>
+      </w:r>
+      <w:r>
+        <w:t xml:space="preserve">(HL7 Australia, n.d.) </w:t>
+      </w:r>
+      <w:r>
+        <w:t xml:space="preserve"> and simulated EMR integrations. Stage 1 focuses on architecture and design, while implementation and deployment of the complete test harness are planned for Stage 2.</w:t>
       </w:r>
     </w:p>
     <w:p>
       <w:pPr>
         <w:pStyle w:val="Heading2"/>
-        <w:rPr>
-          <w:rFonts w:ascii="Segoe UI" w:hAnsi="Segoe UI" w:cs="Segoe UI"/>
-          <w:sz w:val="18"/>
-          <w:szCs w:val="18"/>
-        </w:rPr>
-      </w:pPr>
-      <w:bookmarkStart w:id="20" w:name="_Toc238803250"/>
-      <w:r>
-        <w:t>4.3 Security Design and Control Mapping</w:t>
-      </w:r>
-      <w:bookmarkEnd w:id="20"/>
-      <w:r>
-        <w:t xml:space="preserve"> </w:t>
+      </w:pPr>
+      <w:r>
+        <w:t>4.1 Proposed Solution Architecture</w:t>
       </w:r>
     </w:p>
     <w:p>
       <w:pPr>
+        <w:pStyle w:val="NormalWeb"/>
+        <w:jc w:val="both"/>
+      </w:pPr>
+      <w:r>
+        <w:t>The solution architecture will be a system architecture comprising the synthetic test data layer, validation and terminology mapping modules, the test execution layer, simulated EMR connectors, and a test reporting module. The architecture of the proposed solution is shown in Figure 4.1.1: Proposed Solution Architecture, while the system context is depicted separately in Figure X: System Context Diagram. Both figures can be found in the project repository.</w:t>
+      </w:r>
+    </w:p>
+    <w:p>
+      <w:pPr>
+        <w:pStyle w:val="NormalWeb"/>
+        <w:jc w:val="both"/>
+      </w:pPr>
+      <w:r>
+        <w:rPr>
+          <w:noProof/>
+        </w:rPr>
+        <w:drawing>
+          <wp:inline distT="0" distB="0" distL="0" distR="0" wp14:anchorId="21EEEA85" wp14:editId="65A7A30A">
+            <wp:extent cx="5943600" cy="1875155"/>
+            <wp:effectExtent l="0" t="0" r="0" b="0"/>
+            <wp:docPr id="946408949" name="Picture 1"/>
+            <wp:cNvGraphicFramePr>
+              <a:graphicFrameLocks xmlns:a="http://schemas.openxmlformats.org/drawingml/2006/main" noChangeAspect="1"/>
+            </wp:cNvGraphicFramePr>
+            <a:graphic xmlns:a="http://schemas.openxmlformats.org/drawingml/2006/main">
+              <a:graphicData uri="http://schemas.openxmlformats.org/drawingml/2006/picture">
+                <pic:pic xmlns:pic="http://schemas.openxmlformats.org/drawingml/2006/picture">
+                  <pic:nvPicPr>
+                    <pic:cNvPr id="946408949" name="Picture 946408949"/>
+                    <pic:cNvPicPr/>
+                  </pic:nvPicPr>
+                  <pic:blipFill>
+                    <a:blip r:embed="rId9" cstate="print">
+                      <a:extLst>
+                        <a:ext uri="{28A0092B-C50C-407E-A947-70E740481C1C}">
+                          <a14:useLocalDpi xmlns:a14="http://schemas.microsoft.com/office/drawing/2010/main" val="0"/>
+                        </a:ext>
+                      </a:extLst>
+                    </a:blip>
+                    <a:stretch>
+                      <a:fillRect/>
+                    </a:stretch>
+                  </pic:blipFill>
+                  <pic:spPr>
+                    <a:xfrm>
+                      <a:off x="0" y="0"/>
+                      <a:ext cx="5943600" cy="1875155"/>
+                    </a:xfrm>
+                    <a:prstGeom prst="rect">
+                      <a:avLst/>
+                    </a:prstGeom>
+                  </pic:spPr>
+                </pic:pic>
+              </a:graphicData>
+            </a:graphic>
+          </wp:inline>
+        </w:drawing>
+      </w:r>
+    </w:p>
+    <w:p>
+      <w:pPr>
+        <w:pStyle w:val="NormalWeb"/>
+        <w:jc w:val="both"/>
+      </w:pPr>
+      <w:r>
+        <w:t>Figure 4.1.1: Proposed Solution Architecture</w:t>
+      </w:r>
+    </w:p>
+    <w:p>
+      <w:pPr>
+        <w:pStyle w:val="NormalWeb"/>
+        <w:jc w:val="both"/>
+      </w:pPr>
+      <w:r>
+        <w:t>The primary end-user of the proposed test harness is the authorised MedTalk Connect engineering or testing end-user. The end-user creates a test scenario and selects the appropriate connector and test parameters. The system creates synthetic patients and clinical encounter records based on this information</w:t>
+      </w:r>
+      <w:r>
+        <w:t xml:space="preserve"> </w:t>
+      </w:r>
+      <w:r>
+        <w:t>(</w:t>
+      </w:r>
+      <w:proofErr w:type="spellStart"/>
+      <w:r>
+        <w:t>Walonoski</w:t>
+      </w:r>
+      <w:proofErr w:type="spellEnd"/>
+      <w:r>
+        <w:t xml:space="preserve"> et al., 2018)</w:t>
+      </w:r>
+      <w:r>
+        <w:t xml:space="preserve">. Before these records are used for testing purposes, they go through validation control checks to ensure that they satisfy the necessary synthetic data constraints and do not include any realistic patient identifiers. </w:t>
+      </w:r>
+    </w:p>
+    <w:p>
+      <w:pPr>
         <w:pStyle w:val="Heading2"/>
+        <w:jc w:val="both"/>
         <w:rPr>
-          <w:rFonts w:ascii="Segoe UI" w:hAnsi="Segoe UI" w:cs="Segoe UI"/>
-          <w:sz w:val="18"/>
-          <w:szCs w:val="18"/>
+          <w:rFonts w:ascii="Times New Roman" w:eastAsia="Times New Roman" w:hAnsi="Times New Roman" w:cs="Times New Roman"/>
+          <w:color w:val="auto"/>
+          <w:sz w:val="24"/>
+          <w:szCs w:val="24"/>
+          <w:lang w:val="en-GB" w:eastAsia="en-GB"/>
         </w:rPr>
       </w:pPr>
-      <w:bookmarkStart w:id="21" w:name="_Toc238803251"/>
-      <w:r>
+      <w:r>
+        <w:rPr>
+          <w:rFonts w:ascii="Times New Roman" w:eastAsia="Times New Roman" w:hAnsi="Times New Roman" w:cs="Times New Roman"/>
+          <w:color w:val="auto"/>
+          <w:sz w:val="24"/>
+          <w:szCs w:val="24"/>
+          <w:lang w:val="en-GB" w:eastAsia="en-GB"/>
+        </w:rPr>
+        <w:lastRenderedPageBreak/>
+        <w:t>Validated data is represented using FHIR R4 objects and passed to the interoperability testing layer</w:t>
+      </w:r>
+      <w:r>
+        <w:rPr>
+          <w:rFonts w:ascii="Times New Roman" w:eastAsia="Times New Roman" w:hAnsi="Times New Roman" w:cs="Times New Roman"/>
+          <w:color w:val="auto"/>
+          <w:sz w:val="24"/>
+          <w:szCs w:val="24"/>
+          <w:lang w:val="en-GB" w:eastAsia="en-GB"/>
+        </w:rPr>
+        <w:t xml:space="preserve"> </w:t>
+      </w:r>
+      <w:r>
+        <w:rPr>
+          <w:rFonts w:ascii="Times New Roman" w:eastAsia="Times New Roman" w:hAnsi="Times New Roman" w:cs="Times New Roman"/>
+          <w:color w:val="auto"/>
+          <w:sz w:val="24"/>
+          <w:szCs w:val="24"/>
+          <w:lang w:val="en-GB" w:eastAsia="en-GB"/>
+        </w:rPr>
+        <w:t>(</w:t>
+      </w:r>
+      <w:proofErr w:type="spellStart"/>
+      <w:r>
+        <w:rPr>
+          <w:rFonts w:ascii="Times New Roman" w:eastAsia="Times New Roman" w:hAnsi="Times New Roman" w:cs="Times New Roman"/>
+          <w:color w:val="auto"/>
+          <w:sz w:val="24"/>
+          <w:szCs w:val="24"/>
+          <w:lang w:val="en-GB" w:eastAsia="en-GB"/>
+        </w:rPr>
+        <w:t>Gruendner</w:t>
+      </w:r>
+      <w:proofErr w:type="spellEnd"/>
+      <w:r>
+        <w:rPr>
+          <w:rFonts w:ascii="Times New Roman" w:eastAsia="Times New Roman" w:hAnsi="Times New Roman" w:cs="Times New Roman"/>
+          <w:color w:val="auto"/>
+          <w:sz w:val="24"/>
+          <w:szCs w:val="24"/>
+          <w:lang w:val="en-GB" w:eastAsia="en-GB"/>
+        </w:rPr>
+        <w:t xml:space="preserve"> et al., 2021). </w:t>
+      </w:r>
+      <w:r>
+        <w:rPr>
+          <w:rFonts w:ascii="Times New Roman" w:eastAsia="Times New Roman" w:hAnsi="Times New Roman" w:cs="Times New Roman"/>
+          <w:color w:val="auto"/>
+          <w:sz w:val="24"/>
+          <w:szCs w:val="24"/>
+          <w:lang w:val="en-GB" w:eastAsia="en-GB"/>
+        </w:rPr>
+        <w:t xml:space="preserve"> In addition, HL7 v2 messages can be simulated in case it is required. Data will go through the terminology mapping stage, where representative clinical concepts will be mapped on SNOMED CT-AU, ICD-10-AM and MBS</w:t>
+      </w:r>
+      <w:r>
+        <w:rPr>
+          <w:rFonts w:ascii="Times New Roman" w:eastAsia="Times New Roman" w:hAnsi="Times New Roman" w:cs="Times New Roman"/>
+          <w:color w:val="auto"/>
+          <w:sz w:val="24"/>
+          <w:szCs w:val="24"/>
+          <w:lang w:val="en-GB" w:eastAsia="en-GB"/>
+        </w:rPr>
+        <w:t xml:space="preserve"> </w:t>
+      </w:r>
+      <w:r>
+        <w:rPr>
+          <w:rFonts w:ascii="Times New Roman" w:eastAsia="Times New Roman" w:hAnsi="Times New Roman" w:cs="Times New Roman"/>
+          <w:color w:val="auto"/>
+          <w:sz w:val="24"/>
+          <w:szCs w:val="24"/>
+          <w:lang w:val="en-GB" w:eastAsia="en-GB"/>
+        </w:rPr>
+        <w:t>(</w:t>
+      </w:r>
+      <w:proofErr w:type="spellStart"/>
+      <w:r>
+        <w:rPr>
+          <w:rFonts w:ascii="Times New Roman" w:eastAsia="Times New Roman" w:hAnsi="Times New Roman" w:cs="Times New Roman"/>
+          <w:color w:val="auto"/>
+          <w:sz w:val="24"/>
+          <w:szCs w:val="24"/>
+          <w:lang w:val="en-GB" w:eastAsia="en-GB"/>
+        </w:rPr>
+        <w:t>Giannangelo</w:t>
+      </w:r>
+      <w:proofErr w:type="spellEnd"/>
+      <w:r>
+        <w:rPr>
+          <w:rFonts w:ascii="Times New Roman" w:eastAsia="Times New Roman" w:hAnsi="Times New Roman" w:cs="Times New Roman"/>
+          <w:color w:val="auto"/>
+          <w:sz w:val="24"/>
+          <w:szCs w:val="24"/>
+          <w:lang w:val="en-GB" w:eastAsia="en-GB"/>
+        </w:rPr>
+        <w:t xml:space="preserve"> et al., 2012)</w:t>
+      </w:r>
+      <w:r>
+        <w:rPr>
+          <w:rFonts w:ascii="Times New Roman" w:eastAsia="Times New Roman" w:hAnsi="Times New Roman" w:cs="Times New Roman"/>
+          <w:color w:val="auto"/>
+          <w:sz w:val="24"/>
+          <w:szCs w:val="24"/>
+          <w:lang w:val="en-GB" w:eastAsia="en-GB"/>
+        </w:rPr>
+        <w:t>.</w:t>
+      </w:r>
+      <w:r>
+        <w:rPr>
+          <w:rFonts w:ascii="Times New Roman" w:eastAsia="Times New Roman" w:hAnsi="Times New Roman" w:cs="Times New Roman"/>
+          <w:color w:val="auto"/>
+          <w:sz w:val="24"/>
+          <w:szCs w:val="24"/>
+          <w:lang w:val="en-GB" w:eastAsia="en-GB"/>
+        </w:rPr>
+        <w:t xml:space="preserve"> Repository will provide a special terminology mapping chain that depicts this process.</w:t>
+      </w:r>
+    </w:p>
+    <w:p>
+      <w:pPr>
+        <w:pStyle w:val="Heading2"/>
+        <w:jc w:val="both"/>
+        <w:rPr>
+          <w:rFonts w:ascii="Times New Roman" w:eastAsia="Times New Roman" w:hAnsi="Times New Roman" w:cs="Times New Roman"/>
+          <w:color w:val="auto"/>
+          <w:sz w:val="24"/>
+          <w:szCs w:val="24"/>
+          <w:lang w:val="en-GB" w:eastAsia="en-GB"/>
+        </w:rPr>
+      </w:pPr>
+      <w:r>
+        <w:rPr>
+          <w:rFonts w:ascii="Times New Roman" w:eastAsia="Times New Roman" w:hAnsi="Times New Roman" w:cs="Times New Roman"/>
+          <w:noProof/>
+          <w:color w:val="auto"/>
+          <w:sz w:val="24"/>
+          <w:szCs w:val="24"/>
+          <w:lang w:val="en-GB" w:eastAsia="en-GB"/>
+        </w:rPr>
+        <w:drawing>
+          <wp:inline distT="0" distB="0" distL="0" distR="0" wp14:anchorId="6B26B5B5" wp14:editId="4715E35B">
+            <wp:extent cx="5943600" cy="586105"/>
+            <wp:effectExtent l="0" t="0" r="0" b="0"/>
+            <wp:docPr id="1119624554" name="Picture 2"/>
+            <wp:cNvGraphicFramePr>
+              <a:graphicFrameLocks xmlns:a="http://schemas.openxmlformats.org/drawingml/2006/main" noChangeAspect="1"/>
+            </wp:cNvGraphicFramePr>
+            <a:graphic xmlns:a="http://schemas.openxmlformats.org/drawingml/2006/main">
+              <a:graphicData uri="http://schemas.openxmlformats.org/drawingml/2006/picture">
+                <pic:pic xmlns:pic="http://schemas.openxmlformats.org/drawingml/2006/picture">
+                  <pic:nvPicPr>
+                    <pic:cNvPr id="1119624554" name="Picture 1119624554"/>
+                    <pic:cNvPicPr/>
+                  </pic:nvPicPr>
+                  <pic:blipFill>
+                    <a:blip r:embed="rId10" cstate="print">
+                      <a:extLst>
+                        <a:ext uri="{28A0092B-C50C-407E-A947-70E740481C1C}">
+                          <a14:useLocalDpi xmlns:a14="http://schemas.microsoft.com/office/drawing/2010/main" val="0"/>
+                        </a:ext>
+                      </a:extLst>
+                    </a:blip>
+                    <a:stretch>
+                      <a:fillRect/>
+                    </a:stretch>
+                  </pic:blipFill>
+                  <pic:spPr>
+                    <a:xfrm>
+                      <a:off x="0" y="0"/>
+                      <a:ext cx="5943600" cy="586105"/>
+                    </a:xfrm>
+                    <a:prstGeom prst="rect">
+                      <a:avLst/>
+                    </a:prstGeom>
+                  </pic:spPr>
+                </pic:pic>
+              </a:graphicData>
+            </a:graphic>
+          </wp:inline>
+        </w:drawing>
+      </w:r>
+    </w:p>
+    <w:p>
+      <w:pPr>
+        <w:pStyle w:val="Heading2"/>
+        <w:jc w:val="both"/>
+        <w:rPr>
+          <w:rFonts w:ascii="Times New Roman" w:eastAsia="Times New Roman" w:hAnsi="Times New Roman" w:cs="Times New Roman"/>
+          <w:color w:val="auto"/>
+          <w:sz w:val="24"/>
+          <w:szCs w:val="24"/>
+          <w:lang w:val="en-GB" w:eastAsia="en-GB"/>
+        </w:rPr>
+      </w:pPr>
+      <w:r>
+        <w:rPr>
+          <w:rFonts w:ascii="Times New Roman" w:eastAsia="Times New Roman" w:hAnsi="Times New Roman" w:cs="Times New Roman"/>
+          <w:color w:val="auto"/>
+          <w:sz w:val="24"/>
+          <w:szCs w:val="24"/>
+          <w:lang w:val="en-GB" w:eastAsia="en-GB"/>
+        </w:rPr>
+        <w:t>Figure 4.1.</w:t>
+      </w:r>
+      <w:r>
+        <w:rPr>
+          <w:rFonts w:ascii="Times New Roman" w:eastAsia="Times New Roman" w:hAnsi="Times New Roman" w:cs="Times New Roman"/>
+          <w:color w:val="auto"/>
+          <w:sz w:val="24"/>
+          <w:szCs w:val="24"/>
+          <w:lang w:val="en-GB" w:eastAsia="en-GB"/>
+        </w:rPr>
+        <w:t>2</w:t>
+      </w:r>
+      <w:r>
+        <w:rPr>
+          <w:rFonts w:ascii="Times New Roman" w:eastAsia="Times New Roman" w:hAnsi="Times New Roman" w:cs="Times New Roman"/>
+          <w:color w:val="auto"/>
+          <w:sz w:val="24"/>
+          <w:szCs w:val="24"/>
+          <w:lang w:val="en-GB" w:eastAsia="en-GB"/>
+        </w:rPr>
+        <w:t xml:space="preserve"> Terminology Mapping Chain</w:t>
+      </w:r>
+    </w:p>
+    <w:p>
+      <w:pPr>
+        <w:pStyle w:val="Heading2"/>
+        <w:jc w:val="both"/>
+        <w:rPr>
+          <w:rFonts w:ascii="Times New Roman" w:eastAsia="Times New Roman" w:hAnsi="Times New Roman" w:cs="Times New Roman"/>
+          <w:color w:val="auto"/>
+          <w:sz w:val="24"/>
+          <w:szCs w:val="24"/>
+          <w:lang w:val="en-GB" w:eastAsia="en-GB"/>
+        </w:rPr>
+      </w:pPr>
+      <w:r>
+        <w:rPr>
+          <w:rFonts w:ascii="Times New Roman" w:eastAsia="Times New Roman" w:hAnsi="Times New Roman" w:cs="Times New Roman"/>
+          <w:color w:val="auto"/>
+          <w:sz w:val="24"/>
+          <w:szCs w:val="24"/>
+          <w:lang w:val="en-GB" w:eastAsia="en-GB"/>
+        </w:rPr>
+        <w:t xml:space="preserve">Test execution layer performs normal, negative and degraded scenarios. These involve successful message exchange, malformed data, slow responses and dropped connections. The response from test execution layer is evaluated according to the expected outcome and stored for future analysis. Simulated connector layer provides simulated EMR integrations relevant to MedTalk Connect, which will allow testing connector </w:t>
+      </w:r>
+      <w:proofErr w:type="spellStart"/>
+      <w:r>
+        <w:rPr>
+          <w:rFonts w:ascii="Times New Roman" w:eastAsia="Times New Roman" w:hAnsi="Times New Roman" w:cs="Times New Roman"/>
+          <w:color w:val="auto"/>
+          <w:sz w:val="24"/>
+          <w:szCs w:val="24"/>
+          <w:lang w:val="en-GB" w:eastAsia="en-GB"/>
+        </w:rPr>
+        <w:t>behavior</w:t>
+      </w:r>
+      <w:proofErr w:type="spellEnd"/>
+      <w:r>
+        <w:rPr>
+          <w:rFonts w:ascii="Times New Roman" w:eastAsia="Times New Roman" w:hAnsi="Times New Roman" w:cs="Times New Roman"/>
+          <w:color w:val="auto"/>
+          <w:sz w:val="24"/>
+          <w:szCs w:val="24"/>
+          <w:lang w:val="en-GB" w:eastAsia="en-GB"/>
+        </w:rPr>
+        <w:t xml:space="preserve"> without having to connect the test harness to production clinical systems.</w:t>
+      </w:r>
+    </w:p>
+    <w:p>
+      <w:pPr>
+        <w:pStyle w:val="Heading2"/>
+        <w:jc w:val="both"/>
+        <w:rPr>
+          <w:rFonts w:ascii="Times New Roman" w:eastAsia="Times New Roman" w:hAnsi="Times New Roman" w:cs="Times New Roman"/>
+          <w:color w:val="auto"/>
+          <w:sz w:val="24"/>
+          <w:szCs w:val="24"/>
+          <w:lang w:val="en-GB" w:eastAsia="en-GB"/>
+        </w:rPr>
+      </w:pPr>
+      <w:r>
+        <w:rPr>
+          <w:rFonts w:ascii="Times New Roman" w:eastAsia="Times New Roman" w:hAnsi="Times New Roman" w:cs="Times New Roman"/>
+          <w:color w:val="auto"/>
+          <w:sz w:val="24"/>
+          <w:szCs w:val="24"/>
+          <w:lang w:val="en-GB" w:eastAsia="en-GB"/>
+        </w:rPr>
+        <w:t>The primary trust boundaries are thus established between the authorized user and the test harness, between unvalidated and validated synthetic data and between internal test environment and simulated connectors. The authentication, access control, data validation, connector isolation and secure communication are proposed as a protection measure at these trust boundaries. Such design allows implementing all the necessary requirements of the project directly.</w:t>
+      </w:r>
+    </w:p>
+    <w:p>
+      <w:pPr>
+        <w:pStyle w:val="Heading2"/>
+        <w:jc w:val="both"/>
+        <w:rPr>
+          <w:rFonts w:ascii="Times New Roman" w:eastAsia="Times New Roman" w:hAnsi="Times New Roman" w:cs="Times New Roman"/>
+          <w:color w:val="auto"/>
+          <w:sz w:val="24"/>
+          <w:szCs w:val="24"/>
+          <w:lang w:val="en-GB" w:eastAsia="en-GB"/>
+        </w:rPr>
+      </w:pPr>
+    </w:p>
+    <w:p>
+      <w:pPr>
+        <w:pStyle w:val="Heading2"/>
+      </w:pPr>
+      <w:r>
+        <w:t>4.2 Technology Stack and Justification</w:t>
+      </w:r>
+    </w:p>
+    <w:p>
+      <w:pPr>
+        <w:jc w:val="both"/>
+        <w:rPr>
+          <w:rFonts w:ascii="Times New Roman" w:eastAsia="Times New Roman" w:hAnsi="Times New Roman" w:cs="Times New Roman"/>
+          <w:lang w:val="en-GB" w:eastAsia="en-GB"/>
+        </w:rPr>
+      </w:pPr>
+      <w:r>
+        <w:rPr>
+          <w:rFonts w:ascii="Times New Roman" w:eastAsia="Times New Roman" w:hAnsi="Times New Roman" w:cs="Times New Roman"/>
+          <w:lang w:val="en-GB" w:eastAsia="en-GB"/>
+        </w:rPr>
+        <w:t>The technology stack is chosen taking into consideration interoperability standards, needs of Australian healthcare system, security and cheapness of implementation. The selected technologies will enable implementing the Stage 1 architecture, laying a foundation for the Stage 2.</w:t>
+      </w:r>
+    </w:p>
+    <w:p>
+      <w:pPr>
+        <w:jc w:val="both"/>
+        <w:rPr>
+          <w:rFonts w:ascii="Times New Roman" w:eastAsia="Times New Roman" w:hAnsi="Times New Roman" w:cs="Times New Roman"/>
+          <w:lang w:val="en-GB" w:eastAsia="en-GB"/>
+        </w:rPr>
+      </w:pPr>
+      <w:r>
+        <w:rPr>
+          <w:rFonts w:ascii="Times New Roman" w:eastAsia="Times New Roman" w:hAnsi="Times New Roman" w:cs="Times New Roman"/>
+          <w:lang w:val="en-GB" w:eastAsia="en-GB"/>
+        </w:rPr>
+        <w:t>React technology is used as the frontend framework because of the requirement to use the stateful and component-based interface (scenario builder, results of the live test, connector statuses) instead of several static pages; React technology, along with its ecosystem, will enable developing such an interface without paying license costs, which is possible due to the limitations of the project budget.  There are both Python (</w:t>
+      </w:r>
+      <w:proofErr w:type="spellStart"/>
+      <w:r>
+        <w:rPr>
+          <w:rFonts w:ascii="Times New Roman" w:eastAsia="Times New Roman" w:hAnsi="Times New Roman" w:cs="Times New Roman"/>
+          <w:lang w:val="en-GB" w:eastAsia="en-GB"/>
+        </w:rPr>
+        <w:t>FastAPI</w:t>
+      </w:r>
+      <w:proofErr w:type="spellEnd"/>
+      <w:r>
+        <w:rPr>
+          <w:rFonts w:ascii="Times New Roman" w:eastAsia="Times New Roman" w:hAnsi="Times New Roman" w:cs="Times New Roman"/>
+          <w:lang w:val="en-GB" w:eastAsia="en-GB"/>
+        </w:rPr>
+        <w:t>) and Node.js (Express) suggested as the backend languages, not as the single option, because any of these frameworks will be able to implement the sandbox FHIR API with equal level of efficiency and community; the actual choice will be decided by the knowledge of the team, not by any technological requirement.</w:t>
+      </w:r>
+      <w:r>
+        <w:br w:type="page"/>
+      </w:r>
+    </w:p>
+    <w:p>
+      <w:pPr>
+        <w:pStyle w:val="NormalWeb"/>
+        <w:jc w:val="both"/>
+        <w:rPr>
+          <w:b/>
+          <w:bCs/>
+        </w:rPr>
+      </w:pPr>
+      <w:r>
+        <w:rPr>
+          <w:b/>
+          <w:bCs/>
+        </w:rPr>
+        <w:lastRenderedPageBreak/>
+        <w:t>Table: 4.2.1: Technology Stack and Justification</w:t>
+      </w:r>
+    </w:p>
+    <w:tbl>
+      <w:tblPr>
+        <w:tblStyle w:val="TableGrid"/>
+        <w:tblW w:w="10173" w:type="dxa"/>
+        <w:tblLook w:val="04A0" w:firstRow="1" w:lastRow="0" w:firstColumn="1" w:lastColumn="0" w:noHBand="0" w:noVBand="1"/>
+      </w:tblPr>
+      <w:tblGrid>
+        <w:gridCol w:w="1865"/>
+        <w:gridCol w:w="1784"/>
+        <w:gridCol w:w="2889"/>
+        <w:gridCol w:w="3635"/>
+      </w:tblGrid>
+      <w:tr>
+        <w:tc>
+          <w:tcPr>
+            <w:tcW w:w="0" w:type="auto"/>
+            <w:hideMark/>
+          </w:tcPr>
+          <w:p>
+            <w:pPr>
+              <w:jc w:val="both"/>
+              <w:rPr>
+                <w:b/>
+                <w:bCs/>
+              </w:rPr>
+            </w:pPr>
+            <w:r>
+              <w:rPr>
+                <w:b/>
+                <w:bCs/>
+              </w:rPr>
+              <w:t>Layer / Standard</w:t>
+            </w:r>
+          </w:p>
+        </w:tc>
+        <w:tc>
+          <w:tcPr>
+            <w:tcW w:w="0" w:type="auto"/>
+            <w:hideMark/>
+          </w:tcPr>
+          <w:p>
+            <w:pPr>
+              <w:jc w:val="both"/>
+              <w:rPr>
+                <w:b/>
+                <w:bCs/>
+              </w:rPr>
+            </w:pPr>
+            <w:r>
+              <w:rPr>
+                <w:b/>
+                <w:bCs/>
+              </w:rPr>
+              <w:t>Technology / Tool</w:t>
+            </w:r>
+          </w:p>
+        </w:tc>
+        <w:tc>
+          <w:tcPr>
+            <w:tcW w:w="0" w:type="auto"/>
+            <w:hideMark/>
+          </w:tcPr>
+          <w:p>
+            <w:pPr>
+              <w:jc w:val="both"/>
+              <w:rPr>
+                <w:b/>
+                <w:bCs/>
+              </w:rPr>
+            </w:pPr>
+            <w:r>
+              <w:rPr>
+                <w:b/>
+                <w:bCs/>
+              </w:rPr>
+              <w:t>Purpose</w:t>
+            </w:r>
+          </w:p>
+        </w:tc>
+        <w:tc>
+          <w:tcPr>
+            <w:tcW w:w="3635" w:type="dxa"/>
+            <w:hideMark/>
+          </w:tcPr>
+          <w:p>
+            <w:pPr>
+              <w:jc w:val="both"/>
+              <w:rPr>
+                <w:b/>
+                <w:bCs/>
+              </w:rPr>
+            </w:pPr>
+            <w:r>
+              <w:rPr>
+                <w:b/>
+                <w:bCs/>
+              </w:rPr>
+              <w:t>Justification (vs. alternative)</w:t>
+            </w:r>
+          </w:p>
+        </w:tc>
+      </w:tr>
+      <w:tr>
+        <w:tc>
+          <w:tcPr>
+            <w:tcW w:w="0" w:type="auto"/>
+            <w:hideMark/>
+          </w:tcPr>
+          <w:p>
+            <w:pPr>
+              <w:jc w:val="both"/>
+            </w:pPr>
+            <w:r>
+              <w:t>Backend / API</w:t>
+            </w:r>
+          </w:p>
+        </w:tc>
+        <w:tc>
+          <w:tcPr>
+            <w:tcW w:w="0" w:type="auto"/>
+            <w:hideMark/>
+          </w:tcPr>
+          <w:p>
+            <w:pPr>
+              <w:jc w:val="both"/>
+            </w:pPr>
+            <w:proofErr w:type="spellStart"/>
+            <w:r>
+              <w:t>FastAPI</w:t>
+            </w:r>
+            <w:proofErr w:type="spellEnd"/>
+            <w:r>
+              <w:t xml:space="preserve"> (Python) or Express (Node.js)</w:t>
+            </w:r>
+          </w:p>
+        </w:tc>
+        <w:tc>
+          <w:tcPr>
+            <w:tcW w:w="0" w:type="auto"/>
+            <w:hideMark/>
+          </w:tcPr>
+          <w:p>
+            <w:pPr>
+              <w:jc w:val="both"/>
+            </w:pPr>
+            <w:r>
+              <w:t>Implements the sandbox FHIR API and test-harness logic</w:t>
+            </w:r>
+          </w:p>
+        </w:tc>
+        <w:tc>
+          <w:tcPr>
+            <w:tcW w:w="3635" w:type="dxa"/>
+            <w:hideMark/>
+          </w:tcPr>
+          <w:p>
+            <w:pPr>
+              <w:jc w:val="both"/>
+            </w:pPr>
+            <w:r>
+              <w:t>Mature, well-documented frameworks with strong REST support; either is fine as a starting point</w:t>
+            </w:r>
+          </w:p>
+        </w:tc>
+      </w:tr>
+      <w:tr>
+        <w:tc>
+          <w:tcPr>
+            <w:tcW w:w="0" w:type="auto"/>
+            <w:hideMark/>
+          </w:tcPr>
+          <w:p>
+            <w:pPr>
+              <w:jc w:val="both"/>
+            </w:pPr>
+            <w:r>
+              <w:t>FHIR test server</w:t>
+            </w:r>
+          </w:p>
+        </w:tc>
+        <w:tc>
+          <w:tcPr>
+            <w:tcW w:w="0" w:type="auto"/>
+            <w:hideMark/>
+          </w:tcPr>
+          <w:p>
+            <w:pPr>
+              <w:jc w:val="both"/>
+            </w:pPr>
+            <w:r>
+              <w:t>HAPI FHIR (open source)</w:t>
+            </w:r>
+          </w:p>
+        </w:tc>
+        <w:tc>
+          <w:tcPr>
+            <w:tcW w:w="0" w:type="auto"/>
+            <w:hideMark/>
+          </w:tcPr>
+          <w:p>
+            <w:pPr>
+              <w:jc w:val="both"/>
+            </w:pPr>
+            <w:r>
+              <w:t>Reference server to bootstrap the mock FHIR endpoints</w:t>
+            </w:r>
+          </w:p>
+        </w:tc>
+        <w:tc>
+          <w:tcPr>
+            <w:tcW w:w="3635" w:type="dxa"/>
+            <w:hideMark/>
+          </w:tcPr>
+          <w:p>
+            <w:pPr>
+              <w:jc w:val="both"/>
+            </w:pPr>
+            <w:r>
+              <w:t>Saves building a FHIR server from scratch; widely used, well-supported reference implementation</w:t>
+            </w:r>
+          </w:p>
+        </w:tc>
+      </w:tr>
+      <w:tr>
+        <w:tc>
+          <w:tcPr>
+            <w:tcW w:w="0" w:type="auto"/>
+            <w:hideMark/>
+          </w:tcPr>
+          <w:p>
+            <w:pPr>
+              <w:jc w:val="both"/>
+            </w:pPr>
+            <w:r>
+              <w:t>Data exchange standard</w:t>
+            </w:r>
+          </w:p>
+        </w:tc>
+        <w:tc>
+          <w:tcPr>
+            <w:tcW w:w="0" w:type="auto"/>
+            <w:hideMark/>
+          </w:tcPr>
+          <w:p>
+            <w:pPr>
+              <w:jc w:val="both"/>
+            </w:pPr>
+            <w:r>
+              <w:t>FHIR R4 (REST/JSON)</w:t>
+            </w:r>
+          </w:p>
+        </w:tc>
+        <w:tc>
+          <w:tcPr>
+            <w:tcW w:w="0" w:type="auto"/>
+            <w:hideMark/>
+          </w:tcPr>
+          <w:p>
+            <w:pPr>
+              <w:jc w:val="both"/>
+            </w:pPr>
+            <w:r>
+              <w:t>Primary standard for healthcare data exchange and interoperability testing</w:t>
+            </w:r>
+          </w:p>
+        </w:tc>
+        <w:tc>
+          <w:tcPr>
+            <w:tcW w:w="3635" w:type="dxa"/>
+            <w:hideMark/>
+          </w:tcPr>
+          <w:p>
+            <w:pPr>
+              <w:jc w:val="both"/>
+            </w:pPr>
+            <w:r>
+              <w:t>Required for REST/JSON-based interoperability testing; HL7 v2 alone doesn't support this</w:t>
+            </w:r>
+          </w:p>
+        </w:tc>
+      </w:tr>
+      <w:tr>
+        <w:tc>
+          <w:tcPr>
+            <w:tcW w:w="0" w:type="auto"/>
+            <w:hideMark/>
+          </w:tcPr>
+          <w:p>
+            <w:pPr>
+              <w:jc w:val="both"/>
+            </w:pPr>
+            <w:r>
+              <w:t>Implementation guide</w:t>
+            </w:r>
+          </w:p>
+        </w:tc>
+        <w:tc>
+          <w:tcPr>
+            <w:tcW w:w="0" w:type="auto"/>
+            <w:hideMark/>
+          </w:tcPr>
+          <w:p>
+            <w:pPr>
+              <w:jc w:val="both"/>
+            </w:pPr>
+            <w:r>
+              <w:t>AU Core</w:t>
+            </w:r>
+          </w:p>
+        </w:tc>
+        <w:tc>
+          <w:tcPr>
+            <w:tcW w:w="0" w:type="auto"/>
+            <w:hideMark/>
+          </w:tcPr>
+          <w:p>
+            <w:pPr>
+              <w:jc w:val="both"/>
+            </w:pPr>
+            <w:r>
+              <w:t>Shapes FHIR resources to the Australian context</w:t>
+            </w:r>
+          </w:p>
+        </w:tc>
+        <w:tc>
+          <w:tcPr>
+            <w:tcW w:w="3635" w:type="dxa"/>
+            <w:hideMark/>
+          </w:tcPr>
+          <w:p>
+            <w:pPr>
+              <w:jc w:val="both"/>
+            </w:pPr>
+            <w:r>
+              <w:t>Generic FHIR lacks Australian-specific alignment</w:t>
+            </w:r>
+          </w:p>
+        </w:tc>
+      </w:tr>
+      <w:tr>
+        <w:tc>
+          <w:tcPr>
+            <w:tcW w:w="0" w:type="auto"/>
+            <w:hideMark/>
+          </w:tcPr>
+          <w:p>
+            <w:pPr>
+              <w:jc w:val="both"/>
+            </w:pPr>
+            <w:r>
+              <w:t>Legacy messaging</w:t>
+            </w:r>
+          </w:p>
+        </w:tc>
+        <w:tc>
+          <w:tcPr>
+            <w:tcW w:w="0" w:type="auto"/>
+            <w:hideMark/>
+          </w:tcPr>
+          <w:p>
+            <w:pPr>
+              <w:jc w:val="both"/>
+            </w:pPr>
+            <w:r>
+              <w:t>HL7 v2</w:t>
+            </w:r>
+          </w:p>
+        </w:tc>
+        <w:tc>
+          <w:tcPr>
+            <w:tcW w:w="0" w:type="auto"/>
+            <w:hideMark/>
+          </w:tcPr>
+          <w:p>
+            <w:pPr>
+              <w:jc w:val="both"/>
+            </w:pPr>
+            <w:r>
+              <w:t>Simulates applicable legacy messaging scenarios</w:t>
+            </w:r>
+          </w:p>
+        </w:tc>
+        <w:tc>
+          <w:tcPr>
+            <w:tcW w:w="3635" w:type="dxa"/>
+            <w:hideMark/>
+          </w:tcPr>
+          <w:p>
+            <w:pPr>
+              <w:jc w:val="both"/>
+            </w:pPr>
+            <w:r>
+              <w:t>Retained only where relevant; FHIR R4 is preferred for the primary workflow</w:t>
+            </w:r>
+          </w:p>
+        </w:tc>
+      </w:tr>
+      <w:tr>
+        <w:tc>
+          <w:tcPr>
+            <w:tcW w:w="0" w:type="auto"/>
+          </w:tcPr>
+          <w:p>
+            <w:pPr>
+              <w:jc w:val="both"/>
+            </w:pPr>
+            <w:r>
+              <w:t xml:space="preserve">Frontend </w:t>
+            </w:r>
+          </w:p>
+        </w:tc>
+        <w:tc>
+          <w:tcPr>
+            <w:tcW w:w="0" w:type="auto"/>
+          </w:tcPr>
+          <w:p>
+            <w:pPr>
+              <w:jc w:val="both"/>
+            </w:pPr>
+            <w:r>
+              <w:t>React</w:t>
+            </w:r>
+          </w:p>
+        </w:tc>
+        <w:tc>
+          <w:tcPr>
+            <w:tcW w:w="0" w:type="auto"/>
+          </w:tcPr>
+          <w:p>
+            <w:pPr>
+              <w:jc w:val="both"/>
+            </w:pPr>
+            <w:r>
+              <w:t>Builds the test-harness UI (scenario builder, results dashboard, connector configuration)</w:t>
+            </w:r>
+          </w:p>
+        </w:tc>
+        <w:tc>
+          <w:tcPr>
+            <w:tcW w:w="3635" w:type="dxa"/>
+          </w:tcPr>
+          <w:p>
+            <w:pPr>
+              <w:jc w:val="both"/>
+            </w:pPr>
+            <w:r>
+              <w:t>Component-based structure suits a dashboard with repeating elements (test cards, result rows); large ecosystem and free tooling keep it within the no-budget constraint; plain HTML/JS would require more manual work for the same interactivity</w:t>
+            </w:r>
+          </w:p>
+        </w:tc>
+      </w:tr>
+      <w:tr>
+        <w:tc>
+          <w:tcPr>
+            <w:tcW w:w="0" w:type="auto"/>
+            <w:hideMark/>
+          </w:tcPr>
+          <w:p>
+            <w:pPr>
+              <w:jc w:val="both"/>
+            </w:pPr>
+            <w:r>
+              <w:t>Terminology</w:t>
+            </w:r>
+          </w:p>
+        </w:tc>
+        <w:tc>
+          <w:tcPr>
+            <w:tcW w:w="0" w:type="auto"/>
+            <w:hideMark/>
+          </w:tcPr>
+          <w:p>
+            <w:pPr>
+              <w:jc w:val="both"/>
+            </w:pPr>
+            <w:r>
+              <w:t>SNOMED CT-AU, ICD-10-AM / MBS</w:t>
+            </w:r>
+          </w:p>
+        </w:tc>
+        <w:tc>
+          <w:tcPr>
+            <w:tcW w:w="0" w:type="auto"/>
+            <w:hideMark/>
+          </w:tcPr>
+          <w:p>
+            <w:pPr>
+              <w:jc w:val="both"/>
+            </w:pPr>
+            <w:r>
+              <w:t>Clinical terminology and Medicare/billing mapping scenarios</w:t>
+            </w:r>
+          </w:p>
+        </w:tc>
+        <w:tc>
+          <w:tcPr>
+            <w:tcW w:w="3635" w:type="dxa"/>
+            <w:hideMark/>
+          </w:tcPr>
+          <w:p>
+            <w:pPr>
+              <w:jc w:val="both"/>
+            </w:pPr>
+            <w:r>
+              <w:t>Required for Australian clinical/billing context; non-AU code sets wouldn't meet project requirements</w:t>
+            </w:r>
+          </w:p>
+        </w:tc>
+      </w:tr>
+      <w:tr>
+        <w:tc>
+          <w:tcPr>
+            <w:tcW w:w="0" w:type="auto"/>
+            <w:hideMark/>
+          </w:tcPr>
+          <w:p>
+            <w:pPr>
+              <w:jc w:val="both"/>
+            </w:pPr>
+            <w:r>
+              <w:t>Auth</w:t>
+            </w:r>
+          </w:p>
+        </w:tc>
+        <w:tc>
+          <w:tcPr>
+            <w:tcW w:w="0" w:type="auto"/>
+            <w:hideMark/>
+          </w:tcPr>
+          <w:p>
+            <w:pPr>
+              <w:jc w:val="both"/>
+            </w:pPr>
+            <w:r>
+              <w:t>SMART on FHIR / OAuth 2.0</w:t>
+            </w:r>
+          </w:p>
+        </w:tc>
+        <w:tc>
+          <w:tcPr>
+            <w:tcW w:w="0" w:type="auto"/>
+            <w:hideMark/>
+          </w:tcPr>
+          <w:p>
+            <w:pPr>
+              <w:jc w:val="both"/>
+            </w:pPr>
+            <w:r>
+              <w:t>Authentication and authorisation for FHIR interfaces</w:t>
+            </w:r>
+          </w:p>
+        </w:tc>
+        <w:tc>
+          <w:tcPr>
+            <w:tcW w:w="3635" w:type="dxa"/>
+            <w:hideMark/>
+          </w:tcPr>
+          <w:p>
+            <w:pPr>
+              <w:jc w:val="both"/>
+            </w:pPr>
+            <w:r>
+              <w:t>More granular access control than static API keys</w:t>
+            </w:r>
+          </w:p>
+        </w:tc>
+      </w:tr>
+      <w:tr>
+        <w:tc>
+          <w:tcPr>
+            <w:tcW w:w="0" w:type="auto"/>
+            <w:hideMark/>
+          </w:tcPr>
+          <w:p>
+            <w:pPr>
+              <w:jc w:val="both"/>
+            </w:pPr>
+            <w:r>
+              <w:t>Database</w:t>
+            </w:r>
+          </w:p>
+        </w:tc>
+        <w:tc>
+          <w:tcPr>
+            <w:tcW w:w="0" w:type="auto"/>
+            <w:hideMark/>
+          </w:tcPr>
+          <w:p>
+            <w:pPr>
+              <w:jc w:val="both"/>
+            </w:pPr>
+            <w:r>
+              <w:t>PostgreSQL</w:t>
+            </w:r>
+          </w:p>
+        </w:tc>
+        <w:tc>
+          <w:tcPr>
+            <w:tcW w:w="0" w:type="auto"/>
+            <w:hideMark/>
+          </w:tcPr>
+          <w:p>
+            <w:pPr>
+              <w:jc w:val="both"/>
+            </w:pPr>
+            <w:r>
+              <w:t>Stores synthetic patients, conditions, and mappings</w:t>
+            </w:r>
+          </w:p>
+        </w:tc>
+        <w:tc>
+          <w:tcPr>
+            <w:tcW w:w="3635" w:type="dxa"/>
+            <w:hideMark/>
+          </w:tcPr>
+          <w:p>
+            <w:pPr>
+              <w:jc w:val="both"/>
+            </w:pPr>
+            <w:r>
+              <w:t>Relational integrity suits structured, linked clinical data</w:t>
+            </w:r>
+          </w:p>
+        </w:tc>
+      </w:tr>
+      <w:tr>
+        <w:tc>
+          <w:tcPr>
+            <w:tcW w:w="0" w:type="auto"/>
+            <w:hideMark/>
+          </w:tcPr>
+          <w:p>
+            <w:pPr>
+              <w:jc w:val="both"/>
+            </w:pPr>
+            <w:r>
+              <w:t>Test data</w:t>
+            </w:r>
+          </w:p>
+        </w:tc>
+        <w:tc>
+          <w:tcPr>
+            <w:tcW w:w="0" w:type="auto"/>
+            <w:hideMark/>
+          </w:tcPr>
+          <w:p>
+            <w:pPr>
+              <w:jc w:val="both"/>
+            </w:pPr>
+            <w:r>
+              <w:t>Synthetic data only</w:t>
+            </w:r>
+          </w:p>
+        </w:tc>
+        <w:tc>
+          <w:tcPr>
+            <w:tcW w:w="0" w:type="auto"/>
+            <w:hideMark/>
+          </w:tcPr>
+          <w:p>
+            <w:pPr>
+              <w:jc w:val="both"/>
+            </w:pPr>
+            <w:r>
+              <w:t>All test records</w:t>
+            </w:r>
+          </w:p>
+        </w:tc>
+        <w:tc>
+          <w:tcPr>
+            <w:tcW w:w="3635" w:type="dxa"/>
+            <w:hideMark/>
+          </w:tcPr>
+          <w:p>
+            <w:pPr>
+              <w:jc w:val="both"/>
+            </w:pPr>
+            <w:r>
+              <w:t>Prevents exposure of real patient data; enables safe, repeatable testing</w:t>
+            </w:r>
+          </w:p>
+        </w:tc>
+      </w:tr>
+    </w:tbl>
+    <w:p>
+      <w:pPr>
+        <w:pStyle w:val="Heading2"/>
+        <w:jc w:val="both"/>
+        <w:rPr>
+          <w:rFonts w:ascii="Times New Roman" w:eastAsia="Times New Roman" w:hAnsi="Times New Roman" w:cs="Times New Roman"/>
+          <w:color w:val="auto"/>
+          <w:sz w:val="24"/>
+          <w:szCs w:val="24"/>
+          <w:lang w:val="en-GB" w:eastAsia="en-GB"/>
+        </w:rPr>
+      </w:pPr>
+      <w:r>
+        <w:rPr>
+          <w:rFonts w:ascii="Times New Roman" w:eastAsia="Times New Roman" w:hAnsi="Times New Roman" w:cs="Times New Roman"/>
+          <w:color w:val="auto"/>
+          <w:sz w:val="24"/>
+          <w:szCs w:val="24"/>
+          <w:lang w:val="en-GB" w:eastAsia="en-GB"/>
+        </w:rPr>
+        <w:lastRenderedPageBreak/>
+        <w:t>The combination of FHIR R4 and AU Core is right since the solution needs to check the interoperability in an Australian healthcare environment</w:t>
+      </w:r>
+      <w:r>
+        <w:rPr>
+          <w:rFonts w:ascii="Times New Roman" w:eastAsia="Times New Roman" w:hAnsi="Times New Roman" w:cs="Times New Roman"/>
+          <w:color w:val="auto"/>
+          <w:sz w:val="24"/>
+          <w:szCs w:val="24"/>
+          <w:lang w:val="en-GB" w:eastAsia="en-GB"/>
+        </w:rPr>
+        <w:t xml:space="preserve"> </w:t>
+      </w:r>
+      <w:r>
+        <w:rPr>
+          <w:rFonts w:ascii="Times New Roman" w:eastAsia="Times New Roman" w:hAnsi="Times New Roman" w:cs="Times New Roman"/>
+          <w:color w:val="auto"/>
+          <w:sz w:val="24"/>
+          <w:szCs w:val="24"/>
+          <w:lang w:val="en-GB" w:eastAsia="en-GB"/>
+        </w:rPr>
+        <w:t xml:space="preserve">(HL7 Australia, n.d.). </w:t>
+      </w:r>
+      <w:r>
+        <w:rPr>
+          <w:rFonts w:ascii="Times New Roman" w:eastAsia="Times New Roman" w:hAnsi="Times New Roman" w:cs="Times New Roman"/>
+          <w:color w:val="auto"/>
+          <w:sz w:val="24"/>
+          <w:szCs w:val="24"/>
+          <w:lang w:val="en-GB" w:eastAsia="en-GB"/>
+        </w:rPr>
+        <w:t xml:space="preserve"> HL7 v2 remains part of the complementary simulation capabilities but not a substitute for FHIR. The terminology standards (SNOMED CT-AU, ICD-10-AM, MBS) serve as the foundation for clinical and billing mapping testing, whereas SMART on FHIR and OAuth 2.0 become the proposed authentication </w:t>
+      </w:r>
+      <w:r>
+        <w:rPr>
+          <w:rFonts w:ascii="Times New Roman" w:eastAsia="Times New Roman" w:hAnsi="Times New Roman" w:cs="Times New Roman"/>
+          <w:color w:val="auto"/>
+          <w:sz w:val="24"/>
+          <w:szCs w:val="24"/>
+          <w:lang w:val="en-GB" w:eastAsia="en-GB"/>
+        </w:rPr>
+        <w:t xml:space="preserve">approach </w:t>
+      </w:r>
+      <w:r>
+        <w:rPr>
+          <w:rFonts w:ascii="Times New Roman" w:eastAsia="Times New Roman" w:hAnsi="Times New Roman" w:cs="Times New Roman"/>
+          <w:color w:val="auto"/>
+          <w:sz w:val="24"/>
+          <w:szCs w:val="24"/>
+          <w:lang w:val="en-GB" w:eastAsia="en-GB"/>
+        </w:rPr>
+        <w:t xml:space="preserve">(SMART Health IT, n.d.). </w:t>
+      </w:r>
+      <w:r>
+        <w:rPr>
+          <w:rFonts w:ascii="Times New Roman" w:eastAsia="Times New Roman" w:hAnsi="Times New Roman" w:cs="Times New Roman"/>
+          <w:color w:val="auto"/>
+          <w:sz w:val="24"/>
+          <w:szCs w:val="24"/>
+          <w:lang w:val="en-GB" w:eastAsia="en-GB"/>
+        </w:rPr>
+        <w:t>Docker becomes a Stage 2 implementation technology and not the pre-existing solution due to the scope of work, where no test harness implementation takes place in Stage 1. Postman/Newman becomes part of the solution besides the unit-testing platform since the API validation comes from an external protocol level that the unit testing cannot handle</w:t>
+      </w:r>
+      <w:r>
+        <w:rPr>
+          <w:rFonts w:ascii="Times New Roman" w:eastAsia="Times New Roman" w:hAnsi="Times New Roman" w:cs="Times New Roman"/>
+          <w:color w:val="auto"/>
+          <w:sz w:val="24"/>
+          <w:szCs w:val="24"/>
+          <w:lang w:val="en-GB" w:eastAsia="en-GB"/>
+        </w:rPr>
+        <w:t xml:space="preserve"> </w:t>
+      </w:r>
+      <w:r>
+        <w:rPr>
+          <w:rFonts w:ascii="Times New Roman" w:eastAsia="Times New Roman" w:hAnsi="Times New Roman" w:cs="Times New Roman"/>
+          <w:color w:val="auto"/>
+          <w:sz w:val="24"/>
+          <w:szCs w:val="24"/>
+          <w:lang w:val="en-GB" w:eastAsia="en-GB"/>
+        </w:rPr>
+        <w:t>(</w:t>
+      </w:r>
+      <w:proofErr w:type="spellStart"/>
+      <w:r>
+        <w:rPr>
+          <w:rFonts w:ascii="Times New Roman" w:eastAsia="Times New Roman" w:hAnsi="Times New Roman" w:cs="Times New Roman"/>
+          <w:color w:val="auto"/>
+          <w:sz w:val="24"/>
+          <w:szCs w:val="24"/>
+          <w:lang w:val="en-GB" w:eastAsia="en-GB"/>
+        </w:rPr>
+        <w:t>Gruendner</w:t>
+      </w:r>
+      <w:proofErr w:type="spellEnd"/>
+      <w:r>
+        <w:rPr>
+          <w:rFonts w:ascii="Times New Roman" w:eastAsia="Times New Roman" w:hAnsi="Times New Roman" w:cs="Times New Roman"/>
+          <w:color w:val="auto"/>
+          <w:sz w:val="24"/>
+          <w:szCs w:val="24"/>
+          <w:lang w:val="en-GB" w:eastAsia="en-GB"/>
+        </w:rPr>
+        <w:t xml:space="preserve"> et al., 2021).</w:t>
+      </w:r>
+    </w:p>
+    <w:p>
+      <w:pPr>
+        <w:pStyle w:val="Heading2"/>
+        <w:jc w:val="both"/>
+        <w:rPr>
+          <w:rFonts w:ascii="Times New Roman" w:eastAsia="Times New Roman" w:hAnsi="Times New Roman" w:cs="Times New Roman"/>
+          <w:color w:val="auto"/>
+          <w:sz w:val="24"/>
+          <w:szCs w:val="24"/>
+          <w:lang w:val="en-GB" w:eastAsia="en-GB"/>
+        </w:rPr>
+      </w:pPr>
+    </w:p>
+    <w:p>
+      <w:pPr>
+        <w:pStyle w:val="Heading2"/>
+      </w:pPr>
+      <w:r>
+        <w:t>4.3 Security Design and Control Mapping</w:t>
+      </w:r>
+    </w:p>
+    <w:p>
+      <w:pPr>
+        <w:pStyle w:val="NormalWeb"/>
+        <w:jc w:val="both"/>
+      </w:pPr>
+      <w:r>
+        <w:t xml:space="preserve">Security will be integrated in the recommended solution using preventive, protective and monitoring controls. </w:t>
+      </w:r>
+      <w:r>
+        <w:t>The most important prevention control is the utilization of only synthetic patients, which must be created separately from any patient record data. As a long-term prevention mechanism fit for production with actual patient data, the system should integrate with the Document Verification Service (DVS) – the federal government system that verifies the information in the identity documents, such as the Medicare card, on real-time basis from the records of the issuing authority. It is an authentic verification mechanism instead of structural one, since a real identifier can be verified for its actual issuance instead of good formatting. However, in the sandbox of stage 1 where there is no access to DVS, the equivalent testing-time prevention control would be to reject any identifier that matches any real-world identifier prefix/ranges (such as the IHI prefix ‘800360’) and generate identifiers from the synthetic data generator only.</w:t>
+      </w:r>
+    </w:p>
+    <w:p>
+      <w:pPr>
+        <w:pStyle w:val="NormalWeb"/>
+        <w:jc w:val="both"/>
+      </w:pPr>
+      <w:r>
+        <w:t xml:space="preserve">Authentication will be employed for authorised users of the test harness. This would restrict who could define test scenarios, run tests and access their results. Authentication and delegation for FHIR interfaces would be achieved using SMART on FHIR and OAuth 2.0. Secure transfer should be implemented for implemented interfaces to ensure the security of data in transit.  Moreover, logical separation is also needed for connectors and test environments. This helps to minimize chances that the test data or results corresponding to one connector is accessed by another connector. Input validation needs to be performed for the FHIR resources and other message formats to identify any mal-formed input data. Test log will help in providing traceability. </w:t>
+      </w:r>
+    </w:p>
+    <w:p>
+      <w:pPr>
+        <w:pStyle w:val="NormalWeb"/>
+        <w:jc w:val="both"/>
+      </w:pPr>
+      <w:r>
+        <w:t>For Stage 2, the vulnerability management process should cover the dependency and container checking, secure configuration and updating of the deployed components. The incident response plan will be necessary to specify the containment, investigation and documentation process of any suspicious security events. Backup and recovery controls will be needed for important configuration and test result data.</w:t>
+      </w:r>
+    </w:p>
+    <w:p>
+      <w:pPr>
+        <w:pStyle w:val="NormalWeb"/>
+        <w:jc w:val="both"/>
+      </w:pPr>
+      <w:r>
+        <w:t xml:space="preserve">These controls have been mainly mapped to NIST Cybersecurity Framework (CSF) since its functions of Identify, Protect, Detect, Respond and Recover help establish a definite framework for the suggested cybersecurity </w:t>
+      </w:r>
+      <w:r>
+        <w:t>controls</w:t>
+      </w:r>
+      <w:r>
+        <w:t xml:space="preserve"> (</w:t>
+      </w:r>
+      <w:r>
+        <w:t>National Institute of Standards and Technology, 2024).</w:t>
+      </w:r>
+      <w:r>
+        <w:br w:type="page"/>
+      </w:r>
+    </w:p>
+    <w:p>
+      <w:pPr>
+        <w:pStyle w:val="NormalWeb"/>
+        <w:jc w:val="both"/>
+      </w:pPr>
+      <w:r>
+        <w:lastRenderedPageBreak/>
+        <w:t xml:space="preserve">Table 4.3.1: Security Design and Control Mapping (section 10 – </w:t>
+      </w:r>
+      <w:r>
+        <w:t>planning)</w:t>
+      </w:r>
+    </w:p>
+    <w:tbl>
+      <w:tblPr>
+        <w:tblStyle w:val="PlainTable1"/>
+        <w:tblW w:w="0" w:type="auto"/>
+        <w:tblLook w:val="04A0" w:firstRow="1" w:lastRow="0" w:firstColumn="1" w:lastColumn="0" w:noHBand="0" w:noVBand="1"/>
+      </w:tblPr>
+      <w:tblGrid>
+        <w:gridCol w:w="2374"/>
+        <w:gridCol w:w="3268"/>
+        <w:gridCol w:w="1186"/>
+        <w:gridCol w:w="2188"/>
+      </w:tblGrid>
+      <w:tr>
+        <w:trPr>
+          <w:cnfStyle w:val="100000000000" w:firstRow="1" w:lastRow="0" w:firstColumn="0" w:lastColumn="0" w:oddVBand="0" w:evenVBand="0" w:oddHBand="0" w:evenHBand="0" w:firstRowFirstColumn="0" w:firstRowLastColumn="0" w:lastRowFirstColumn="0" w:lastRowLastColumn="0"/>
+        </w:trPr>
+        <w:tc>
+          <w:tcPr>
+            <w:cnfStyle w:val="001000000000" w:firstRow="0" w:lastRow="0" w:firstColumn="1" w:lastColumn="0" w:oddVBand="0" w:evenVBand="0" w:oddHBand="0" w:evenHBand="0" w:firstRowFirstColumn="0" w:firstRowLastColumn="0" w:lastRowFirstColumn="0" w:lastRowLastColumn="0"/>
+            <w:tcW w:w="0" w:type="auto"/>
+            <w:hideMark/>
+          </w:tcPr>
+          <w:p>
+            <w:pPr>
+              <w:jc w:val="center"/>
+            </w:pPr>
+            <w:r>
+              <w:rPr>
+                <w:b w:val="0"/>
+                <w:bCs w:val="0"/>
+              </w:rPr>
+              <w:t>Security Control</w:t>
+            </w:r>
+          </w:p>
+        </w:tc>
+        <w:tc>
+          <w:tcPr>
+            <w:tcW w:w="0" w:type="auto"/>
+            <w:hideMark/>
+          </w:tcPr>
+          <w:p>
+            <w:pPr>
+              <w:jc w:val="center"/>
+              <w:cnfStyle w:val="100000000000" w:firstRow="1" w:lastRow="0" w:firstColumn="0" w:lastColumn="0" w:oddVBand="0" w:evenVBand="0" w:oddHBand="0" w:evenHBand="0" w:firstRowFirstColumn="0" w:firstRowLastColumn="0" w:lastRowFirstColumn="0" w:lastRowLastColumn="0"/>
+              <w:rPr>
+                <w:b w:val="0"/>
+                <w:bCs w:val="0"/>
+              </w:rPr>
+            </w:pPr>
+            <w:r>
+              <w:rPr>
+                <w:b w:val="0"/>
+                <w:bCs w:val="0"/>
+              </w:rPr>
+              <w:t>Proposed Design</w:t>
+            </w:r>
+          </w:p>
+        </w:tc>
+        <w:tc>
+          <w:tcPr>
+            <w:tcW w:w="0" w:type="auto"/>
+            <w:hideMark/>
+          </w:tcPr>
+          <w:p>
+            <w:pPr>
+              <w:jc w:val="center"/>
+              <w:cnfStyle w:val="100000000000" w:firstRow="1" w:lastRow="0" w:firstColumn="0" w:lastColumn="0" w:oddVBand="0" w:evenVBand="0" w:oddHBand="0" w:evenHBand="0" w:firstRowFirstColumn="0" w:firstRowLastColumn="0" w:lastRowFirstColumn="0" w:lastRowLastColumn="0"/>
+              <w:rPr>
+                <w:b w:val="0"/>
+                <w:bCs w:val="0"/>
+              </w:rPr>
+            </w:pPr>
+            <w:r>
+              <w:rPr>
+                <w:b w:val="0"/>
+                <w:bCs w:val="0"/>
+              </w:rPr>
+              <w:t>NIST CSF Mapping</w:t>
+            </w:r>
+          </w:p>
+        </w:tc>
+        <w:tc>
+          <w:tcPr>
+            <w:tcW w:w="0" w:type="auto"/>
+            <w:hideMark/>
+          </w:tcPr>
+          <w:p>
+            <w:pPr>
+              <w:jc w:val="center"/>
+              <w:cnfStyle w:val="100000000000" w:firstRow="1" w:lastRow="0" w:firstColumn="0" w:lastColumn="0" w:oddVBand="0" w:evenVBand="0" w:oddHBand="0" w:evenHBand="0" w:firstRowFirstColumn="0" w:firstRowLastColumn="0" w:lastRowFirstColumn="0" w:lastRowLastColumn="0"/>
+              <w:rPr>
+                <w:b w:val="0"/>
+                <w:bCs w:val="0"/>
+              </w:rPr>
+            </w:pPr>
+            <w:r>
+              <w:rPr>
+                <w:b w:val="0"/>
+                <w:bCs w:val="0"/>
+              </w:rPr>
+              <w:t>Status</w:t>
+            </w:r>
+          </w:p>
+        </w:tc>
+      </w:tr>
+      <w:tr>
+        <w:trPr>
+          <w:cnfStyle w:val="000000100000" w:firstRow="0" w:lastRow="0" w:firstColumn="0" w:lastColumn="0" w:oddVBand="0" w:evenVBand="0" w:oddHBand="1" w:evenHBand="0" w:firstRowFirstColumn="0" w:firstRowLastColumn="0" w:lastRowFirstColumn="0" w:lastRowLastColumn="0"/>
+        </w:trPr>
+        <w:tc>
+          <w:tcPr>
+            <w:cnfStyle w:val="001000000000" w:firstRow="0" w:lastRow="0" w:firstColumn="1" w:lastColumn="0" w:oddVBand="0" w:evenVBand="0" w:oddHBand="0" w:evenHBand="0" w:firstRowFirstColumn="0" w:firstRowLastColumn="0" w:lastRowFirstColumn="0" w:lastRowLastColumn="0"/>
+            <w:tcW w:w="0" w:type="auto"/>
+            <w:hideMark/>
+          </w:tcPr>
+          <w:p>
+            <w:pPr>
+              <w:rPr>
+                <w:b w:val="0"/>
+                <w:bCs w:val="0"/>
+              </w:rPr>
+            </w:pPr>
+            <w:r>
+              <w:t>Authentication</w:t>
+            </w:r>
+          </w:p>
+        </w:tc>
+        <w:tc>
+          <w:tcPr>
+            <w:tcW w:w="0" w:type="auto"/>
+            <w:hideMark/>
+          </w:tcPr>
+          <w:p>
+            <w:pPr>
+              <w:cnfStyle w:val="000000100000" w:firstRow="0" w:lastRow="0" w:firstColumn="0" w:lastColumn="0" w:oddVBand="0" w:evenVBand="0" w:oddHBand="1" w:evenHBand="0" w:firstRowFirstColumn="0" w:firstRowLastColumn="0" w:lastRowFirstColumn="0" w:lastRowLastColumn="0"/>
+            </w:pPr>
+            <w:r>
+              <w:t>Basic OAuth 2.0 / SMART on FHIR token-based access for FHIR interfaces</w:t>
+            </w:r>
+          </w:p>
+        </w:tc>
+        <w:tc>
+          <w:tcPr>
+            <w:tcW w:w="0" w:type="auto"/>
+            <w:hideMark/>
+          </w:tcPr>
+          <w:p>
+            <w:pPr>
+              <w:cnfStyle w:val="000000100000" w:firstRow="0" w:lastRow="0" w:firstColumn="0" w:lastColumn="0" w:oddVBand="0" w:evenVBand="0" w:oddHBand="1" w:evenHBand="0" w:firstRowFirstColumn="0" w:firstRowLastColumn="0" w:lastRowFirstColumn="0" w:lastRowLastColumn="0"/>
+            </w:pPr>
+            <w:r>
+              <w:t>Protect</w:t>
+            </w:r>
+          </w:p>
+        </w:tc>
+        <w:tc>
+          <w:tcPr>
+            <w:tcW w:w="0" w:type="auto"/>
+            <w:hideMark/>
+          </w:tcPr>
+          <w:p>
+            <w:pPr>
+              <w:cnfStyle w:val="000000100000" w:firstRow="0" w:lastRow="0" w:firstColumn="0" w:lastColumn="0" w:oddVBand="0" w:evenVBand="0" w:oddHBand="1" w:evenHBand="0" w:firstRowFirstColumn="0" w:firstRowLastColumn="0" w:lastRowFirstColumn="0" w:lastRowLastColumn="0"/>
+            </w:pPr>
+            <w:r>
+              <w:t>Implemented (basic)</w:t>
+            </w:r>
+          </w:p>
+        </w:tc>
+      </w:tr>
+      <w:tr>
+        <w:tc>
+          <w:tcPr>
+            <w:cnfStyle w:val="001000000000" w:firstRow="0" w:lastRow="0" w:firstColumn="1" w:lastColumn="0" w:oddVBand="0" w:evenVBand="0" w:oddHBand="0" w:evenHBand="0" w:firstRowFirstColumn="0" w:firstRowLastColumn="0" w:lastRowFirstColumn="0" w:lastRowLastColumn="0"/>
+            <w:tcW w:w="0" w:type="auto"/>
+            <w:hideMark/>
+          </w:tcPr>
+          <w:p>
+            <w:r>
+              <w:t>Data protection</w:t>
+            </w:r>
+          </w:p>
+        </w:tc>
+        <w:tc>
+          <w:tcPr>
+            <w:tcW w:w="0" w:type="auto"/>
+            <w:hideMark/>
+          </w:tcPr>
+          <w:p>
+            <w:pPr>
+              <w:cnfStyle w:val="000000000000" w:firstRow="0" w:lastRow="0" w:firstColumn="0" w:lastColumn="0" w:oddVBand="0" w:evenVBand="0" w:oddHBand="0" w:evenHBand="0" w:firstRowFirstColumn="0" w:firstRowLastColumn="0" w:lastRowFirstColumn="0" w:lastRowLastColumn="0"/>
+            </w:pPr>
+            <w:r>
+              <w:t>Synthetic data only; real-identifier prefix rejection (e.g. IHI '800360') at input</w:t>
+            </w:r>
+          </w:p>
+        </w:tc>
+        <w:tc>
+          <w:tcPr>
+            <w:tcW w:w="0" w:type="auto"/>
+            <w:hideMark/>
+          </w:tcPr>
+          <w:p>
+            <w:pPr>
+              <w:cnfStyle w:val="000000000000" w:firstRow="0" w:lastRow="0" w:firstColumn="0" w:lastColumn="0" w:oddVBand="0" w:evenVBand="0" w:oddHBand="0" w:evenHBand="0" w:firstRowFirstColumn="0" w:firstRowLastColumn="0" w:lastRowFirstColumn="0" w:lastRowLastColumn="0"/>
+            </w:pPr>
+            <w:r>
+              <w:t>Protect</w:t>
+            </w:r>
+          </w:p>
+        </w:tc>
+        <w:tc>
+          <w:tcPr>
+            <w:tcW w:w="0" w:type="auto"/>
+            <w:hideMark/>
+          </w:tcPr>
+          <w:p>
+            <w:pPr>
+              <w:cnfStyle w:val="000000000000" w:firstRow="0" w:lastRow="0" w:firstColumn="0" w:lastColumn="0" w:oddVBand="0" w:evenVBand="0" w:oddHBand="0" w:evenHBand="0" w:firstRowFirstColumn="0" w:firstRowLastColumn="0" w:lastRowFirstColumn="0" w:lastRowLastColumn="0"/>
+            </w:pPr>
+            <w:r>
+              <w:t>Implemented (basic)</w:t>
+            </w:r>
+          </w:p>
+        </w:tc>
+      </w:tr>
+      <w:tr>
+        <w:trPr>
+          <w:cnfStyle w:val="000000100000" w:firstRow="0" w:lastRow="0" w:firstColumn="0" w:lastColumn="0" w:oddVBand="0" w:evenVBand="0" w:oddHBand="1" w:evenHBand="0" w:firstRowFirstColumn="0" w:firstRowLastColumn="0" w:lastRowFirstColumn="0" w:lastRowLastColumn="0"/>
+        </w:trPr>
+        <w:tc>
+          <w:tcPr>
+            <w:cnfStyle w:val="001000000000" w:firstRow="0" w:lastRow="0" w:firstColumn="1" w:lastColumn="0" w:oddVBand="0" w:evenVBand="0" w:oddHBand="0" w:evenHBand="0" w:firstRowFirstColumn="0" w:firstRowLastColumn="0" w:lastRowFirstColumn="0" w:lastRowLastColumn="0"/>
+            <w:tcW w:w="0" w:type="auto"/>
+            <w:hideMark/>
+          </w:tcPr>
+          <w:p>
+            <w:r>
+              <w:t>Encryption</w:t>
+            </w:r>
+          </w:p>
+        </w:tc>
+        <w:tc>
+          <w:tcPr>
+            <w:tcW w:w="0" w:type="auto"/>
+            <w:hideMark/>
+          </w:tcPr>
+          <w:p>
+            <w:pPr>
+              <w:cnfStyle w:val="000000100000" w:firstRow="0" w:lastRow="0" w:firstColumn="0" w:lastColumn="0" w:oddVBand="0" w:evenVBand="0" w:oddHBand="1" w:evenHBand="0" w:firstRowFirstColumn="0" w:firstRowLastColumn="0" w:lastRowFirstColumn="0" w:lastRowLastColumn="0"/>
+            </w:pPr>
+            <w:r>
+              <w:t>Encrypted transport (HTTPS/TLS) for implemented interfaces</w:t>
+            </w:r>
+          </w:p>
+        </w:tc>
+        <w:tc>
+          <w:tcPr>
+            <w:tcW w:w="0" w:type="auto"/>
+            <w:hideMark/>
+          </w:tcPr>
+          <w:p>
+            <w:pPr>
+              <w:cnfStyle w:val="000000100000" w:firstRow="0" w:lastRow="0" w:firstColumn="0" w:lastColumn="0" w:oddVBand="0" w:evenVBand="0" w:oddHBand="1" w:evenHBand="0" w:firstRowFirstColumn="0" w:firstRowLastColumn="0" w:lastRowFirstColumn="0" w:lastRowLastColumn="0"/>
+            </w:pPr>
+            <w:r>
+              <w:t>Protect</w:t>
+            </w:r>
+          </w:p>
+        </w:tc>
+        <w:tc>
+          <w:tcPr>
+            <w:tcW w:w="0" w:type="auto"/>
+            <w:hideMark/>
+          </w:tcPr>
+          <w:p>
+            <w:pPr>
+              <w:cnfStyle w:val="000000100000" w:firstRow="0" w:lastRow="0" w:firstColumn="0" w:lastColumn="0" w:oddVBand="0" w:evenVBand="0" w:oddHBand="1" w:evenHBand="0" w:firstRowFirstColumn="0" w:firstRowLastColumn="0" w:lastRowFirstColumn="0" w:lastRowLastColumn="0"/>
+            </w:pPr>
+            <w:r>
+              <w:t>Implemented (basic)</w:t>
+            </w:r>
+          </w:p>
+        </w:tc>
+      </w:tr>
+      <w:tr>
+        <w:tc>
+          <w:tcPr>
+            <w:cnfStyle w:val="001000000000" w:firstRow="0" w:lastRow="0" w:firstColumn="1" w:lastColumn="0" w:oddVBand="0" w:evenVBand="0" w:oddHBand="0" w:evenHBand="0" w:firstRowFirstColumn="0" w:firstRowLastColumn="0" w:lastRowFirstColumn="0" w:lastRowLastColumn="0"/>
+            <w:tcW w:w="0" w:type="auto"/>
+            <w:hideMark/>
+          </w:tcPr>
+          <w:p>
+            <w:r>
+              <w:t>Input validation</w:t>
+            </w:r>
+          </w:p>
+        </w:tc>
+        <w:tc>
+          <w:tcPr>
+            <w:tcW w:w="0" w:type="auto"/>
+            <w:hideMark/>
+          </w:tcPr>
+          <w:p>
+            <w:pPr>
+              <w:cnfStyle w:val="000000000000" w:firstRow="0" w:lastRow="0" w:firstColumn="0" w:lastColumn="0" w:oddVBand="0" w:evenVBand="0" w:oddHBand="0" w:evenHBand="0" w:firstRowFirstColumn="0" w:firstRowLastColumn="0" w:lastRowFirstColumn="0" w:lastRowLastColumn="0"/>
+            </w:pPr>
+            <w:r>
+              <w:t>FHIR resource/message format validation before processing</w:t>
+            </w:r>
+          </w:p>
+        </w:tc>
+        <w:tc>
+          <w:tcPr>
+            <w:tcW w:w="0" w:type="auto"/>
+            <w:hideMark/>
+          </w:tcPr>
+          <w:p>
+            <w:pPr>
+              <w:cnfStyle w:val="000000000000" w:firstRow="0" w:lastRow="0" w:firstColumn="0" w:lastColumn="0" w:oddVBand="0" w:evenVBand="0" w:oddHBand="0" w:evenHBand="0" w:firstRowFirstColumn="0" w:firstRowLastColumn="0" w:lastRowFirstColumn="0" w:lastRowLastColumn="0"/>
+            </w:pPr>
+            <w:r>
+              <w:t>Protect</w:t>
+            </w:r>
+          </w:p>
+        </w:tc>
+        <w:tc>
+          <w:tcPr>
+            <w:tcW w:w="0" w:type="auto"/>
+            <w:hideMark/>
+          </w:tcPr>
+          <w:p>
+            <w:pPr>
+              <w:cnfStyle w:val="000000000000" w:firstRow="0" w:lastRow="0" w:firstColumn="0" w:lastColumn="0" w:oddVBand="0" w:evenVBand="0" w:oddHBand="0" w:evenHBand="0" w:firstRowFirstColumn="0" w:firstRowLastColumn="0" w:lastRowFirstColumn="0" w:lastRowLastColumn="0"/>
+            </w:pPr>
+            <w:r>
+              <w:t>Implemented (basic)</w:t>
+            </w:r>
+          </w:p>
+        </w:tc>
+      </w:tr>
+      <w:tr>
+        <w:trPr>
+          <w:cnfStyle w:val="000000100000" w:firstRow="0" w:lastRow="0" w:firstColumn="0" w:lastColumn="0" w:oddVBand="0" w:evenVBand="0" w:oddHBand="1" w:evenHBand="0" w:firstRowFirstColumn="0" w:firstRowLastColumn="0" w:lastRowFirstColumn="0" w:lastRowLastColumn="0"/>
+        </w:trPr>
+        <w:tc>
+          <w:tcPr>
+            <w:cnfStyle w:val="001000000000" w:firstRow="0" w:lastRow="0" w:firstColumn="1" w:lastColumn="0" w:oddVBand="0" w:evenVBand="0" w:oddHBand="0" w:evenHBand="0" w:firstRowFirstColumn="0" w:firstRowLastColumn="0" w:lastRowFirstColumn="0" w:lastRowLastColumn="0"/>
+            <w:tcW w:w="0" w:type="auto"/>
+            <w:hideMark/>
+          </w:tcPr>
+          <w:p>
+            <w:r>
+              <w:t>Logging and monitoring</w:t>
+            </w:r>
+          </w:p>
+        </w:tc>
+        <w:tc>
+          <w:tcPr>
+            <w:tcW w:w="0" w:type="auto"/>
+            <w:hideMark/>
+          </w:tcPr>
+          <w:p>
+            <w:pPr>
+              <w:cnfStyle w:val="000000100000" w:firstRow="0" w:lastRow="0" w:firstColumn="0" w:lastColumn="0" w:oddVBand="0" w:evenVBand="0" w:oddHBand="1" w:evenHBand="0" w:firstRowFirstColumn="0" w:firstRowLastColumn="0" w:lastRowFirstColumn="0" w:lastRowLastColumn="0"/>
+            </w:pPr>
+            <w:r>
+              <w:t>Test execution and security-event logging for traceability</w:t>
+            </w:r>
+          </w:p>
+        </w:tc>
+        <w:tc>
+          <w:tcPr>
+            <w:tcW w:w="0" w:type="auto"/>
+            <w:hideMark/>
+          </w:tcPr>
+          <w:p>
+            <w:pPr>
+              <w:cnfStyle w:val="000000100000" w:firstRow="0" w:lastRow="0" w:firstColumn="0" w:lastColumn="0" w:oddVBand="0" w:evenVBand="0" w:oddHBand="1" w:evenHBand="0" w:firstRowFirstColumn="0" w:firstRowLastColumn="0" w:lastRowFirstColumn="0" w:lastRowLastColumn="0"/>
+            </w:pPr>
+            <w:r>
+              <w:t>Detect</w:t>
+            </w:r>
+          </w:p>
+        </w:tc>
+        <w:tc>
+          <w:tcPr>
+            <w:tcW w:w="0" w:type="auto"/>
+            <w:hideMark/>
+          </w:tcPr>
+          <w:p>
+            <w:pPr>
+              <w:cnfStyle w:val="000000100000" w:firstRow="0" w:lastRow="0" w:firstColumn="0" w:lastColumn="0" w:oddVBand="0" w:evenVBand="0" w:oddHBand="1" w:evenHBand="0" w:firstRowFirstColumn="0" w:firstRowLastColumn="0" w:lastRowFirstColumn="0" w:lastRowLastColumn="0"/>
+            </w:pPr>
+            <w:r>
+              <w:t>Implemented (basic)</w:t>
+            </w:r>
+          </w:p>
+        </w:tc>
+      </w:tr>
+      <w:tr>
+        <w:tc>
+          <w:tcPr>
+            <w:cnfStyle w:val="001000000000" w:firstRow="0" w:lastRow="0" w:firstColumn="1" w:lastColumn="0" w:oddVBand="0" w:evenVBand="0" w:oddHBand="0" w:evenHBand="0" w:firstRowFirstColumn="0" w:firstRowLastColumn="0" w:lastRowFirstColumn="0" w:lastRowLastColumn="0"/>
+            <w:tcW w:w="0" w:type="auto"/>
+            <w:hideMark/>
+          </w:tcPr>
+          <w:p>
+            <w:r>
+              <w:t>Secure configuration</w:t>
+            </w:r>
+          </w:p>
+        </w:tc>
+        <w:tc>
+          <w:tcPr>
+            <w:tcW w:w="0" w:type="auto"/>
+            <w:hideMark/>
+          </w:tcPr>
+          <w:p>
+            <w:pPr>
+              <w:cnfStyle w:val="000000000000" w:firstRow="0" w:lastRow="0" w:firstColumn="0" w:lastColumn="0" w:oddVBand="0" w:evenVBand="0" w:oddHBand="0" w:evenHBand="0" w:firstRowFirstColumn="0" w:firstRowLastColumn="0" w:lastRowFirstColumn="0" w:lastRowLastColumn="0"/>
+            </w:pPr>
+            <w:r>
+              <w:t>Baseline hardened configuration for application/containers</w:t>
+            </w:r>
+          </w:p>
+        </w:tc>
+        <w:tc>
+          <w:tcPr>
+            <w:tcW w:w="0" w:type="auto"/>
+            <w:hideMark/>
+          </w:tcPr>
+          <w:p>
+            <w:pPr>
+              <w:cnfStyle w:val="000000000000" w:firstRow="0" w:lastRow="0" w:firstColumn="0" w:lastColumn="0" w:oddVBand="0" w:evenVBand="0" w:oddHBand="0" w:evenHBand="0" w:firstRowFirstColumn="0" w:firstRowLastColumn="0" w:lastRowFirstColumn="0" w:lastRowLastColumn="0"/>
+            </w:pPr>
+            <w:r>
+              <w:t>Protect</w:t>
+            </w:r>
+          </w:p>
+        </w:tc>
+        <w:tc>
+          <w:tcPr>
+            <w:tcW w:w="0" w:type="auto"/>
+            <w:hideMark/>
+          </w:tcPr>
+          <w:p>
+            <w:pPr>
+              <w:cnfStyle w:val="000000000000" w:firstRow="0" w:lastRow="0" w:firstColumn="0" w:lastColumn="0" w:oddVBand="0" w:evenVBand="0" w:oddHBand="0" w:evenHBand="0" w:firstRowFirstColumn="0" w:firstRowLastColumn="0" w:lastRowFirstColumn="0" w:lastRowLastColumn="0"/>
+            </w:pPr>
+            <w:r>
+              <w:t>Implemented (basic)</w:t>
+            </w:r>
+          </w:p>
+        </w:tc>
+      </w:tr>
+      <w:tr>
+        <w:trPr>
+          <w:cnfStyle w:val="000000100000" w:firstRow="0" w:lastRow="0" w:firstColumn="0" w:lastColumn="0" w:oddVBand="0" w:evenVBand="0" w:oddHBand="1" w:evenHBand="0" w:firstRowFirstColumn="0" w:firstRowLastColumn="0" w:lastRowFirstColumn="0" w:lastRowLastColumn="0"/>
+        </w:trPr>
+        <w:tc>
+          <w:tcPr>
+            <w:cnfStyle w:val="001000000000" w:firstRow="0" w:lastRow="0" w:firstColumn="1" w:lastColumn="0" w:oddVBand="0" w:evenVBand="0" w:oddHBand="0" w:evenHBand="0" w:firstRowFirstColumn="0" w:firstRowLastColumn="0" w:lastRowFirstColumn="0" w:lastRowLastColumn="0"/>
+            <w:tcW w:w="0" w:type="auto"/>
+            <w:hideMark/>
+          </w:tcPr>
+          <w:p>
+            <w:r>
+              <w:t>Vulnerability management</w:t>
+            </w:r>
+          </w:p>
+        </w:tc>
+        <w:tc>
+          <w:tcPr>
+            <w:tcW w:w="0" w:type="auto"/>
+            <w:hideMark/>
+          </w:tcPr>
+          <w:p>
+            <w:pPr>
+              <w:cnfStyle w:val="000000100000" w:firstRow="0" w:lastRow="0" w:firstColumn="0" w:lastColumn="0" w:oddVBand="0" w:evenVBand="0" w:oddHBand="1" w:evenHBand="0" w:firstRowFirstColumn="0" w:firstRowLastColumn="0" w:lastRowFirstColumn="0" w:lastRowLastColumn="0"/>
+            </w:pPr>
+            <w:r>
+              <w:t>Dependency and container security checks</w:t>
+            </w:r>
+          </w:p>
+        </w:tc>
+        <w:tc>
+          <w:tcPr>
+            <w:tcW w:w="0" w:type="auto"/>
+            <w:hideMark/>
+          </w:tcPr>
+          <w:p>
+            <w:pPr>
+              <w:cnfStyle w:val="000000100000" w:firstRow="0" w:lastRow="0" w:firstColumn="0" w:lastColumn="0" w:oddVBand="0" w:evenVBand="0" w:oddHBand="1" w:evenHBand="0" w:firstRowFirstColumn="0" w:firstRowLastColumn="0" w:lastRowFirstColumn="0" w:lastRowLastColumn="0"/>
+            </w:pPr>
+            <w:r>
+              <w:t>Identify / Protect</w:t>
+            </w:r>
+          </w:p>
+        </w:tc>
+        <w:tc>
+          <w:tcPr>
+            <w:tcW w:w="0" w:type="auto"/>
+            <w:hideMark/>
+          </w:tcPr>
+          <w:p>
+            <w:pPr>
+              <w:cnfStyle w:val="000000100000" w:firstRow="0" w:lastRow="0" w:firstColumn="0" w:lastColumn="0" w:oddVBand="0" w:evenVBand="0" w:oddHBand="1" w:evenHBand="0" w:firstRowFirstColumn="0" w:firstRowLastColumn="0" w:lastRowFirstColumn="0" w:lastRowLastColumn="0"/>
+            </w:pPr>
+            <w:r>
+              <w:t>Planned — Stage 2</w:t>
+            </w:r>
+          </w:p>
+        </w:tc>
+      </w:tr>
+      <w:tr>
+        <w:tc>
+          <w:tcPr>
+            <w:cnfStyle w:val="001000000000" w:firstRow="0" w:lastRow="0" w:firstColumn="1" w:lastColumn="0" w:oddVBand="0" w:evenVBand="0" w:oddHBand="0" w:evenHBand="0" w:firstRowFirstColumn="0" w:firstRowLastColumn="0" w:lastRowFirstColumn="0" w:lastRowLastColumn="0"/>
+            <w:tcW w:w="0" w:type="auto"/>
+            <w:hideMark/>
+          </w:tcPr>
+          <w:p>
+            <w:r>
+              <w:t>Backup and recovery</w:t>
+            </w:r>
+          </w:p>
+        </w:tc>
+        <w:tc>
+          <w:tcPr>
+            <w:tcW w:w="0" w:type="auto"/>
+            <w:hideMark/>
+          </w:tcPr>
+          <w:p>
+            <w:pPr>
+              <w:cnfStyle w:val="000000000000" w:firstRow="0" w:lastRow="0" w:firstColumn="0" w:lastColumn="0" w:oddVBand="0" w:evenVBand="0" w:oddHBand="0" w:evenHBand="0" w:firstRowFirstColumn="0" w:firstRowLastColumn="0" w:lastRowFirstColumn="0" w:lastRowLastColumn="0"/>
+            </w:pPr>
+            <w:r>
+              <w:t>Backup of configuration and test-result data</w:t>
+            </w:r>
+          </w:p>
+        </w:tc>
+        <w:tc>
+          <w:tcPr>
+            <w:tcW w:w="0" w:type="auto"/>
+            <w:hideMark/>
+          </w:tcPr>
+          <w:p>
+            <w:pPr>
+              <w:cnfStyle w:val="000000000000" w:firstRow="0" w:lastRow="0" w:firstColumn="0" w:lastColumn="0" w:oddVBand="0" w:evenVBand="0" w:oddHBand="0" w:evenHBand="0" w:firstRowFirstColumn="0" w:firstRowLastColumn="0" w:lastRowFirstColumn="0" w:lastRowLastColumn="0"/>
+            </w:pPr>
+            <w:r>
+              <w:t>Recover</w:t>
+            </w:r>
+          </w:p>
+        </w:tc>
+        <w:tc>
+          <w:tcPr>
+            <w:tcW w:w="0" w:type="auto"/>
+            <w:hideMark/>
+          </w:tcPr>
+          <w:p>
+            <w:pPr>
+              <w:cnfStyle w:val="000000000000" w:firstRow="0" w:lastRow="0" w:firstColumn="0" w:lastColumn="0" w:oddVBand="0" w:evenVBand="0" w:oddHBand="0" w:evenHBand="0" w:firstRowFirstColumn="0" w:firstRowLastColumn="0" w:lastRowFirstColumn="0" w:lastRowLastColumn="0"/>
+            </w:pPr>
+            <w:r>
+              <w:t>Planned — Stage 2</w:t>
+            </w:r>
+          </w:p>
+        </w:tc>
+      </w:tr>
+      <w:tr>
+        <w:trPr>
+          <w:cnfStyle w:val="000000100000" w:firstRow="0" w:lastRow="0" w:firstColumn="0" w:lastColumn="0" w:oddVBand="0" w:evenVBand="0" w:oddHBand="1" w:evenHBand="0" w:firstRowFirstColumn="0" w:firstRowLastColumn="0" w:lastRowFirstColumn="0" w:lastRowLastColumn="0"/>
+        </w:trPr>
+        <w:tc>
+          <w:tcPr>
+            <w:cnfStyle w:val="001000000000" w:firstRow="0" w:lastRow="0" w:firstColumn="1" w:lastColumn="0" w:oddVBand="0" w:evenVBand="0" w:oddHBand="0" w:evenHBand="0" w:firstRowFirstColumn="0" w:firstRowLastColumn="0" w:lastRowFirstColumn="0" w:lastRowLastColumn="0"/>
+            <w:tcW w:w="0" w:type="auto"/>
+            <w:hideMark/>
+          </w:tcPr>
+          <w:p>
+            <w:r>
+              <w:t>Incident response</w:t>
+            </w:r>
+          </w:p>
+        </w:tc>
+        <w:tc>
+          <w:tcPr>
+            <w:tcW w:w="0" w:type="auto"/>
+            <w:hideMark/>
+          </w:tcPr>
+          <w:p>
+            <w:pPr>
+              <w:cnfStyle w:val="000000100000" w:firstRow="0" w:lastRow="0" w:firstColumn="0" w:lastColumn="0" w:oddVBand="0" w:evenVBand="0" w:oddHBand="1" w:evenHBand="0" w:firstRowFirstColumn="0" w:firstRowLastColumn="0" w:lastRowFirstColumn="0" w:lastRowLastColumn="0"/>
+            </w:pPr>
+            <w:r>
+              <w:t>Defined containment, investigation and reporting process</w:t>
+            </w:r>
+          </w:p>
+        </w:tc>
+        <w:tc>
+          <w:tcPr>
+            <w:tcW w:w="0" w:type="auto"/>
+            <w:hideMark/>
+          </w:tcPr>
+          <w:p>
+            <w:pPr>
+              <w:cnfStyle w:val="000000100000" w:firstRow="0" w:lastRow="0" w:firstColumn="0" w:lastColumn="0" w:oddVBand="0" w:evenVBand="0" w:oddHBand="1" w:evenHBand="0" w:firstRowFirstColumn="0" w:firstRowLastColumn="0" w:lastRowFirstColumn="0" w:lastRowLastColumn="0"/>
+            </w:pPr>
+            <w:r>
+              <w:t>Respond</w:t>
+            </w:r>
+          </w:p>
+        </w:tc>
+        <w:tc>
+          <w:tcPr>
+            <w:tcW w:w="0" w:type="auto"/>
+            <w:hideMark/>
+          </w:tcPr>
+          <w:p>
+            <w:pPr>
+              <w:cnfStyle w:val="000000100000" w:firstRow="0" w:lastRow="0" w:firstColumn="0" w:lastColumn="0" w:oddVBand="0" w:evenVBand="0" w:oddHBand="1" w:evenHBand="0" w:firstRowFirstColumn="0" w:firstRowLastColumn="0" w:lastRowFirstColumn="0" w:lastRowLastColumn="0"/>
+            </w:pPr>
+            <w:r>
+              <w:t>Documented only (process, not tooling)</w:t>
+            </w:r>
+          </w:p>
+        </w:tc>
+      </w:tr>
+      <w:tr>
+        <w:tc>
+          <w:tcPr>
+            <w:cnfStyle w:val="001000000000" w:firstRow="0" w:lastRow="0" w:firstColumn="1" w:lastColumn="0" w:oddVBand="0" w:evenVBand="0" w:oddHBand="0" w:evenHBand="0" w:firstRowFirstColumn="0" w:firstRowLastColumn="0" w:lastRowFirstColumn="0" w:lastRowLastColumn="0"/>
+            <w:tcW w:w="0" w:type="auto"/>
+            <w:hideMark/>
+          </w:tcPr>
+          <w:p>
+            <w:r>
+              <w:t>Identity verification (production)</w:t>
+            </w:r>
+          </w:p>
+        </w:tc>
+        <w:tc>
+          <w:tcPr>
+            <w:tcW w:w="0" w:type="auto"/>
+            <w:hideMark/>
+          </w:tcPr>
+          <w:p>
+            <w:pPr>
+              <w:cnfStyle w:val="000000000000" w:firstRow="0" w:lastRow="0" w:firstColumn="0" w:lastColumn="0" w:oddVBand="0" w:evenVBand="0" w:oddHBand="0" w:evenHBand="0" w:firstRowFirstColumn="0" w:firstRowLastColumn="0" w:lastRowFirstColumn="0" w:lastRowLastColumn="0"/>
+            </w:pPr>
+            <w:r>
+              <w:t>DVS-style real-time verification against issuing records (e.g. Medicare/Services Australia)</w:t>
+            </w:r>
+          </w:p>
+        </w:tc>
+        <w:tc>
+          <w:tcPr>
+            <w:tcW w:w="0" w:type="auto"/>
+            <w:hideMark/>
+          </w:tcPr>
+          <w:p>
+            <w:pPr>
+              <w:cnfStyle w:val="000000000000" w:firstRow="0" w:lastRow="0" w:firstColumn="0" w:lastColumn="0" w:oddVBand="0" w:evenVBand="0" w:oddHBand="0" w:evenHBand="0" w:firstRowFirstColumn="0" w:firstRowLastColumn="0" w:lastRowFirstColumn="0" w:lastRowLastColumn="0"/>
+            </w:pPr>
+            <w:r>
+              <w:t>Protect</w:t>
+            </w:r>
+          </w:p>
+        </w:tc>
+        <w:tc>
+          <w:tcPr>
+            <w:tcW w:w="0" w:type="auto"/>
+            <w:hideMark/>
+          </w:tcPr>
+          <w:p>
+            <w:pPr>
+              <w:cnfStyle w:val="000000000000" w:firstRow="0" w:lastRow="0" w:firstColumn="0" w:lastColumn="0" w:oddVBand="0" w:evenVBand="0" w:oddHBand="0" w:evenHBand="0" w:firstRowFirstColumn="0" w:firstRowLastColumn="0" w:lastRowFirstColumn="0" w:lastRowLastColumn="0"/>
+            </w:pPr>
+            <w:r>
+              <w:t>Out of scope — future/production only</w:t>
+            </w:r>
+          </w:p>
+        </w:tc>
+      </w:tr>
+      <w:tr>
+        <w:trPr>
+          <w:cnfStyle w:val="000000100000" w:firstRow="0" w:lastRow="0" w:firstColumn="0" w:lastColumn="0" w:oddVBand="0" w:evenVBand="0" w:oddHBand="1" w:evenHBand="0" w:firstRowFirstColumn="0" w:firstRowLastColumn="0" w:lastRowFirstColumn="0" w:lastRowLastColumn="0"/>
+        </w:trPr>
+        <w:tc>
+          <w:tcPr>
+            <w:cnfStyle w:val="001000000000" w:firstRow="0" w:lastRow="0" w:firstColumn="1" w:lastColumn="0" w:oddVBand="0" w:evenVBand="0" w:oddHBand="0" w:evenHBand="0" w:firstRowFirstColumn="0" w:firstRowLastColumn="0" w:lastRowFirstColumn="0" w:lastRowLastColumn="0"/>
+            <w:tcW w:w="0" w:type="auto"/>
+            <w:hideMark/>
+          </w:tcPr>
+          <w:p>
+            <w:r>
+              <w:t>Privacy/compliance</w:t>
+            </w:r>
+          </w:p>
+        </w:tc>
+        <w:tc>
+          <w:tcPr>
+            <w:tcW w:w="0" w:type="auto"/>
+            <w:hideMark/>
+          </w:tcPr>
+          <w:p>
+            <w:pPr>
+              <w:cnfStyle w:val="000000100000" w:firstRow="0" w:lastRow="0" w:firstColumn="0" w:lastColumn="0" w:oddVBand="0" w:evenVBand="0" w:oddHBand="1" w:evenHBand="0" w:firstRowFirstColumn="0" w:firstRowLastColumn="0" w:lastRowFirstColumn="0" w:lastRowLastColumn="0"/>
+            </w:pPr>
+            <w:r>
+              <w:t>No real patient data; alignment with Privacy Act 1988, My Health Records Act 2012, AU Core</w:t>
+            </w:r>
+          </w:p>
+        </w:tc>
+        <w:tc>
+          <w:tcPr>
+            <w:tcW w:w="0" w:type="auto"/>
+            <w:hideMark/>
+          </w:tcPr>
+          <w:p>
+            <w:pPr>
+              <w:cnfStyle w:val="000000100000" w:firstRow="0" w:lastRow="0" w:firstColumn="0" w:lastColumn="0" w:oddVBand="0" w:evenVBand="0" w:oddHBand="1" w:evenHBand="0" w:firstRowFirstColumn="0" w:firstRowLastColumn="0" w:lastRowFirstColumn="0" w:lastRowLastColumn="0"/>
+            </w:pPr>
+            <w:r>
+              <w:t>Identify / Protect</w:t>
+            </w:r>
+          </w:p>
+        </w:tc>
+        <w:tc>
+          <w:tcPr>
+            <w:tcW w:w="0" w:type="auto"/>
+            <w:hideMark/>
+          </w:tcPr>
+          <w:p>
+            <w:pPr>
+              <w:cnfStyle w:val="000000100000" w:firstRow="0" w:lastRow="0" w:firstColumn="0" w:lastColumn="0" w:oddVBand="0" w:evenVBand="0" w:oddHBand="1" w:evenHBand="0" w:firstRowFirstColumn="0" w:firstRowLastColumn="0" w:lastRowFirstColumn="0" w:lastRowLastColumn="0"/>
+            </w:pPr>
+            <w:r>
+              <w:t>Implemented (basic)</w:t>
+            </w:r>
+          </w:p>
+        </w:tc>
+      </w:tr>
+    </w:tbl>
+    <w:p>
+      <w:pPr>
+        <w:pStyle w:val="NormalWeb"/>
+        <w:jc w:val="both"/>
+      </w:pPr>
+      <w:r>
+        <w:t>These controls support the project's stated privacy and compliance objectives, including alignment with the Privacy Act 1988 (</w:t>
+      </w:r>
+      <w:proofErr w:type="spellStart"/>
+      <w:r>
+        <w:t>Cth</w:t>
+      </w:r>
+      <w:proofErr w:type="spellEnd"/>
+      <w:r>
+        <w:t>)</w:t>
+      </w:r>
+      <w:r>
+        <w:t xml:space="preserve"> </w:t>
+      </w:r>
+      <w:r>
+        <w:t>(Australian Government, 1988)</w:t>
+      </w:r>
+      <w:r>
+        <w:t>, My Health Records Act 2012 (</w:t>
+      </w:r>
+      <w:proofErr w:type="spellStart"/>
+      <w:r>
+        <w:t>Cth</w:t>
+      </w:r>
+      <w:proofErr w:type="spellEnd"/>
+      <w:r>
+        <w:t>) and AU Core requirements</w:t>
+      </w:r>
+      <w:r>
+        <w:t xml:space="preserve"> </w:t>
+      </w:r>
+      <w:r>
+        <w:t>(HL7 Australia, n.d.).</w:t>
+      </w:r>
+    </w:p>
+    <w:p>
+      <w:pPr>
+        <w:pStyle w:val="NormalWeb"/>
+        <w:jc w:val="both"/>
+      </w:pPr>
+    </w:p>
+    <w:p>
+      <w:pPr>
+        <w:rPr>
+          <w:rFonts w:ascii="Times New Roman" w:eastAsia="Times New Roman" w:hAnsi="Times New Roman" w:cs="Times New Roman"/>
+          <w:kern w:val="0"/>
+          <w:sz w:val="24"/>
+          <w:szCs w:val="24"/>
+          <w:lang w:val="en-GB" w:eastAsia="en-GB"/>
+          <w14:ligatures w14:val="none"/>
+        </w:rPr>
+      </w:pPr>
+      <w:r>
+        <w:br w:type="page"/>
+      </w:r>
+    </w:p>
+    <w:p>
+      <w:pPr>
+        <w:pStyle w:val="Heading2"/>
+      </w:pPr>
+      <w:r>
+        <w:lastRenderedPageBreak/>
         <w:t>4.4 Capital and Non-Capital Cost Estimation</w:t>
       </w:r>
-      <w:bookmarkEnd w:id="21"/>
-      <w:r>
-        <w:t xml:space="preserve"> </w:t>
+    </w:p>
+    <w:p>
+      <w:pPr>
+        <w:jc w:val="both"/>
+        <w:rPr>
+          <w:rFonts w:ascii="Times New Roman" w:eastAsia="Times New Roman" w:hAnsi="Times New Roman" w:cs="Times New Roman"/>
+          <w:lang w:val="en-GB" w:eastAsia="en-GB"/>
+        </w:rPr>
+      </w:pPr>
+      <w:r>
+        <w:rPr>
+          <w:rFonts w:ascii="Times New Roman" w:eastAsia="Times New Roman" w:hAnsi="Times New Roman" w:cs="Times New Roman"/>
+          <w:lang w:val="en-GB" w:eastAsia="en-GB"/>
+        </w:rPr>
+        <w:t>The solution suggested has an indirect financial impact as stage 1 is related to design, and it can be implemented using only free-tier and open-source tools, according to the report. As stated in the report, there is no budget allocated for any client or College, and there is also no allocation of cloud services, so students must use free-tier and open-source software.</w:t>
+      </w:r>
+    </w:p>
+    <w:p>
+      <w:pPr>
+        <w:jc w:val="both"/>
+        <w:rPr>
+          <w:rFonts w:ascii="Times New Roman" w:eastAsia="Times New Roman" w:hAnsi="Times New Roman" w:cs="Times New Roman"/>
+          <w:b/>
+          <w:bCs/>
+          <w:lang w:val="en-GB" w:eastAsia="en-GB"/>
+        </w:rPr>
+      </w:pPr>
+      <w:r>
+        <w:rPr>
+          <w:rFonts w:ascii="Times New Roman" w:eastAsia="Times New Roman" w:hAnsi="Times New Roman" w:cs="Times New Roman"/>
+          <w:b/>
+          <w:bCs/>
+          <w:lang w:val="en-GB" w:eastAsia="en-GB"/>
+        </w:rPr>
+        <w:t>Table 4.4.1: Cost category and estimation</w:t>
+      </w:r>
+    </w:p>
+    <w:tbl>
+      <w:tblPr>
+        <w:tblStyle w:val="PlainTable1"/>
+        <w:tblW w:w="0" w:type="auto"/>
+        <w:tblLook w:val="04A0" w:firstRow="1" w:lastRow="0" w:firstColumn="1" w:lastColumn="0" w:noHBand="0" w:noVBand="1"/>
+      </w:tblPr>
+      <w:tblGrid>
+        <w:gridCol w:w="2890"/>
+        <w:gridCol w:w="1348"/>
+        <w:gridCol w:w="2251"/>
+        <w:gridCol w:w="2527"/>
+      </w:tblGrid>
+      <w:tr>
+        <w:trPr>
+          <w:cnfStyle w:val="100000000000" w:firstRow="1" w:lastRow="0" w:firstColumn="0" w:lastColumn="0" w:oddVBand="0" w:evenVBand="0" w:oddHBand="0" w:evenHBand="0" w:firstRowFirstColumn="0" w:firstRowLastColumn="0" w:lastRowFirstColumn="0" w:lastRowLastColumn="0"/>
+        </w:trPr>
+        <w:tc>
+          <w:tcPr>
+            <w:cnfStyle w:val="001000000000" w:firstRow="0" w:lastRow="0" w:firstColumn="1" w:lastColumn="0" w:oddVBand="0" w:evenVBand="0" w:oddHBand="0" w:evenHBand="0" w:firstRowFirstColumn="0" w:firstRowLastColumn="0" w:lastRowFirstColumn="0" w:lastRowLastColumn="0"/>
+            <w:tcW w:w="0" w:type="auto"/>
+            <w:hideMark/>
+          </w:tcPr>
+          <w:p>
+            <w:pPr>
+              <w:jc w:val="center"/>
+            </w:pPr>
+            <w:r>
+              <w:rPr>
+                <w:b w:val="0"/>
+                <w:bCs w:val="0"/>
+              </w:rPr>
+              <w:t>Cost Category</w:t>
+            </w:r>
+          </w:p>
+        </w:tc>
+        <w:tc>
+          <w:tcPr>
+            <w:tcW w:w="0" w:type="auto"/>
+            <w:hideMark/>
+          </w:tcPr>
+          <w:p>
+            <w:pPr>
+              <w:jc w:val="center"/>
+              <w:cnfStyle w:val="100000000000" w:firstRow="1" w:lastRow="0" w:firstColumn="0" w:lastColumn="0" w:oddVBand="0" w:evenVBand="0" w:oddHBand="0" w:evenHBand="0" w:firstRowFirstColumn="0" w:firstRowLastColumn="0" w:lastRowFirstColumn="0" w:lastRowLastColumn="0"/>
+              <w:rPr>
+                <w:b w:val="0"/>
+                <w:bCs w:val="0"/>
+              </w:rPr>
+            </w:pPr>
+            <w:r>
+              <w:rPr>
+                <w:b w:val="0"/>
+                <w:bCs w:val="0"/>
+              </w:rPr>
+              <w:t>Stage 1 Estimate (AUD)</w:t>
+            </w:r>
+          </w:p>
+        </w:tc>
+        <w:tc>
+          <w:tcPr>
+            <w:tcW w:w="0" w:type="auto"/>
+            <w:hideMark/>
+          </w:tcPr>
+          <w:p>
+            <w:pPr>
+              <w:jc w:val="center"/>
+              <w:cnfStyle w:val="100000000000" w:firstRow="1" w:lastRow="0" w:firstColumn="0" w:lastColumn="0" w:oddVBand="0" w:evenVBand="0" w:oddHBand="0" w:evenHBand="0" w:firstRowFirstColumn="0" w:firstRowLastColumn="0" w:lastRowFirstColumn="0" w:lastRowLastColumn="0"/>
+              <w:rPr>
+                <w:b w:val="0"/>
+                <w:bCs w:val="0"/>
+              </w:rPr>
+            </w:pPr>
+            <w:r>
+              <w:rPr>
+                <w:b w:val="0"/>
+                <w:bCs w:val="0"/>
+              </w:rPr>
+              <w:t>Future / Stage 2 Consideration</w:t>
+            </w:r>
+          </w:p>
+        </w:tc>
+        <w:tc>
+          <w:tcPr>
+            <w:tcW w:w="0" w:type="auto"/>
+            <w:hideMark/>
+          </w:tcPr>
+          <w:p>
+            <w:pPr>
+              <w:jc w:val="center"/>
+              <w:cnfStyle w:val="100000000000" w:firstRow="1" w:lastRow="0" w:firstColumn="0" w:lastColumn="0" w:oddVBand="0" w:evenVBand="0" w:oddHBand="0" w:evenHBand="0" w:firstRowFirstColumn="0" w:firstRowLastColumn="0" w:lastRowFirstColumn="0" w:lastRowLastColumn="0"/>
+              <w:rPr>
+                <w:b w:val="0"/>
+                <w:bCs w:val="0"/>
+              </w:rPr>
+            </w:pPr>
+            <w:r>
+              <w:rPr>
+                <w:b w:val="0"/>
+                <w:bCs w:val="0"/>
+              </w:rPr>
+              <w:t>Basis</w:t>
+            </w:r>
+          </w:p>
+        </w:tc>
+      </w:tr>
+      <w:tr>
+        <w:trPr>
+          <w:cnfStyle w:val="000000100000" w:firstRow="0" w:lastRow="0" w:firstColumn="0" w:lastColumn="0" w:oddVBand="0" w:evenVBand="0" w:oddHBand="1" w:evenHBand="0" w:firstRowFirstColumn="0" w:firstRowLastColumn="0" w:lastRowFirstColumn="0" w:lastRowLastColumn="0"/>
+        </w:trPr>
+        <w:tc>
+          <w:tcPr>
+            <w:cnfStyle w:val="001000000000" w:firstRow="0" w:lastRow="0" w:firstColumn="1" w:lastColumn="0" w:oddVBand="0" w:evenVBand="0" w:oddHBand="0" w:evenHBand="0" w:firstRowFirstColumn="0" w:firstRowLastColumn="0" w:lastRowFirstColumn="0" w:lastRowLastColumn="0"/>
+            <w:tcW w:w="0" w:type="auto"/>
+            <w:hideMark/>
+          </w:tcPr>
+          <w:p>
+            <w:pPr>
+              <w:rPr>
+                <w:b w:val="0"/>
+                <w:bCs w:val="0"/>
+              </w:rPr>
+            </w:pPr>
+            <w:r>
+              <w:t>Development hardware</w:t>
+            </w:r>
+          </w:p>
+        </w:tc>
+        <w:tc>
+          <w:tcPr>
+            <w:tcW w:w="0" w:type="auto"/>
+            <w:hideMark/>
+          </w:tcPr>
+          <w:p>
+            <w:pPr>
+              <w:cnfStyle w:val="000000100000" w:firstRow="0" w:lastRow="0" w:firstColumn="0" w:lastColumn="0" w:oddVBand="0" w:evenVBand="0" w:oddHBand="1" w:evenHBand="0" w:firstRowFirstColumn="0" w:firstRowLastColumn="0" w:lastRowFirstColumn="0" w:lastRowLastColumn="0"/>
+            </w:pPr>
+            <w:r>
+              <w:t>$0</w:t>
+            </w:r>
+          </w:p>
+        </w:tc>
+        <w:tc>
+          <w:tcPr>
+            <w:tcW w:w="0" w:type="auto"/>
+            <w:hideMark/>
+          </w:tcPr>
+          <w:p>
+            <w:pPr>
+              <w:cnfStyle w:val="000000100000" w:firstRow="0" w:lastRow="0" w:firstColumn="0" w:lastColumn="0" w:oddVBand="0" w:evenVBand="0" w:oddHBand="1" w:evenHBand="0" w:firstRowFirstColumn="0" w:firstRowLastColumn="0" w:lastRowFirstColumn="0" w:lastRowLastColumn="0"/>
+            </w:pPr>
+            <w:r>
+              <w:t>$0–$2,000 if dedicated hardware is required</w:t>
+            </w:r>
+          </w:p>
+        </w:tc>
+        <w:tc>
+          <w:tcPr>
+            <w:tcW w:w="0" w:type="auto"/>
+            <w:hideMark/>
+          </w:tcPr>
+          <w:p>
+            <w:pPr>
+              <w:cnfStyle w:val="000000100000" w:firstRow="0" w:lastRow="0" w:firstColumn="0" w:lastColumn="0" w:oddVBand="0" w:evenVBand="0" w:oddHBand="1" w:evenHBand="0" w:firstRowFirstColumn="0" w:firstRowLastColumn="0" w:lastRowFirstColumn="0" w:lastRowLastColumn="0"/>
+            </w:pPr>
+            <w:r>
+              <w:t>Existing team equipment</w:t>
+            </w:r>
+          </w:p>
+        </w:tc>
+      </w:tr>
+      <w:tr>
+        <w:tc>
+          <w:tcPr>
+            <w:cnfStyle w:val="001000000000" w:firstRow="0" w:lastRow="0" w:firstColumn="1" w:lastColumn="0" w:oddVBand="0" w:evenVBand="0" w:oddHBand="0" w:evenHBand="0" w:firstRowFirstColumn="0" w:firstRowLastColumn="0" w:lastRowFirstColumn="0" w:lastRowLastColumn="0"/>
+            <w:tcW w:w="0" w:type="auto"/>
+            <w:hideMark/>
+          </w:tcPr>
+          <w:p>
+            <w:r>
+              <w:t>Software &amp; platform tools (stack, GitHub, Docker)</w:t>
+            </w:r>
+          </w:p>
+        </w:tc>
+        <w:tc>
+          <w:tcPr>
+            <w:tcW w:w="0" w:type="auto"/>
+            <w:hideMark/>
+          </w:tcPr>
+          <w:p>
+            <w:pPr>
+              <w:cnfStyle w:val="000000000000" w:firstRow="0" w:lastRow="0" w:firstColumn="0" w:lastColumn="0" w:oddVBand="0" w:evenVBand="0" w:oddHBand="0" w:evenHBand="0" w:firstRowFirstColumn="0" w:firstRowLastColumn="0" w:lastRowFirstColumn="0" w:lastRowLastColumn="0"/>
+            </w:pPr>
+            <w:r>
+              <w:t>$0</w:t>
+            </w:r>
+          </w:p>
+        </w:tc>
+        <w:tc>
+          <w:tcPr>
+            <w:tcW w:w="0" w:type="auto"/>
+            <w:hideMark/>
+          </w:tcPr>
+          <w:p>
+            <w:pPr>
+              <w:cnfStyle w:val="000000000000" w:firstRow="0" w:lastRow="0" w:firstColumn="0" w:lastColumn="0" w:oddVBand="0" w:evenVBand="0" w:oddHBand="0" w:evenHBand="0" w:firstRowFirstColumn="0" w:firstRowLastColumn="0" w:lastRowFirstColumn="0" w:lastRowLastColumn="0"/>
+            </w:pPr>
+            <w:r>
+              <w:t>$0, or vendor-dependent if paid tiers are needed</w:t>
+            </w:r>
+          </w:p>
+        </w:tc>
+        <w:tc>
+          <w:tcPr>
+            <w:tcW w:w="0" w:type="auto"/>
+            <w:hideMark/>
+          </w:tcPr>
+          <w:p>
+            <w:pPr>
+              <w:cnfStyle w:val="000000000000" w:firstRow="0" w:lastRow="0" w:firstColumn="0" w:lastColumn="0" w:oddVBand="0" w:evenVBand="0" w:oddHBand="0" w:evenHBand="0" w:firstRowFirstColumn="0" w:firstRowLastColumn="0" w:lastRowFirstColumn="0" w:lastRowLastColumn="0"/>
+            </w:pPr>
+            <w:r>
+              <w:t>Open-source technologies preferred throughout</w:t>
+            </w:r>
+          </w:p>
+        </w:tc>
+      </w:tr>
+      <w:tr>
+        <w:trPr>
+          <w:cnfStyle w:val="000000100000" w:firstRow="0" w:lastRow="0" w:firstColumn="0" w:lastColumn="0" w:oddVBand="0" w:evenVBand="0" w:oddHBand="1" w:evenHBand="0" w:firstRowFirstColumn="0" w:firstRowLastColumn="0" w:lastRowFirstColumn="0" w:lastRowLastColumn="0"/>
+        </w:trPr>
+        <w:tc>
+          <w:tcPr>
+            <w:cnfStyle w:val="001000000000" w:firstRow="0" w:lastRow="0" w:firstColumn="1" w:lastColumn="0" w:oddVBand="0" w:evenVBand="0" w:oddHBand="0" w:evenHBand="0" w:firstRowFirstColumn="0" w:firstRowLastColumn="0" w:lastRowFirstColumn="0" w:lastRowLastColumn="0"/>
+            <w:tcW w:w="0" w:type="auto"/>
+            <w:hideMark/>
+          </w:tcPr>
+          <w:p>
+            <w:r>
+              <w:t>Cloud / hosting services</w:t>
+            </w:r>
+          </w:p>
+        </w:tc>
+        <w:tc>
+          <w:tcPr>
+            <w:tcW w:w="0" w:type="auto"/>
+            <w:hideMark/>
+          </w:tcPr>
+          <w:p>
+            <w:pPr>
+              <w:cnfStyle w:val="000000100000" w:firstRow="0" w:lastRow="0" w:firstColumn="0" w:lastColumn="0" w:oddVBand="0" w:evenVBand="0" w:oddHBand="1" w:evenHBand="0" w:firstRowFirstColumn="0" w:firstRowLastColumn="0" w:lastRowFirstColumn="0" w:lastRowLastColumn="0"/>
+            </w:pPr>
+            <w:r>
+              <w:t>$0</w:t>
+            </w:r>
+          </w:p>
+        </w:tc>
+        <w:tc>
+          <w:tcPr>
+            <w:tcW w:w="0" w:type="auto"/>
+            <w:hideMark/>
+          </w:tcPr>
+          <w:p>
+            <w:pPr>
+              <w:cnfStyle w:val="000000100000" w:firstRow="0" w:lastRow="0" w:firstColumn="0" w:lastColumn="0" w:oddVBand="0" w:evenVBand="0" w:oddHBand="1" w:evenHBand="0" w:firstRowFirstColumn="0" w:firstRowLastColumn="0" w:lastRowFirstColumn="0" w:lastRowLastColumn="0"/>
+            </w:pPr>
+            <w:r>
+              <w:t>TBD</w:t>
+            </w:r>
+          </w:p>
+        </w:tc>
+        <w:tc>
+          <w:tcPr>
+            <w:tcW w:w="0" w:type="auto"/>
+            <w:hideMark/>
+          </w:tcPr>
+          <w:p>
+            <w:pPr>
+              <w:cnfStyle w:val="000000100000" w:firstRow="0" w:lastRow="0" w:firstColumn="0" w:lastColumn="0" w:oddVBand="0" w:evenVBand="0" w:oddHBand="1" w:evenHBand="0" w:firstRowFirstColumn="0" w:firstRowLastColumn="0" w:lastRowFirstColumn="0" w:lastRowLastColumn="0"/>
+            </w:pPr>
+            <w:r>
+              <w:t>Not required for Stage 1; dependent on Stage 2 deployment model</w:t>
+            </w:r>
+          </w:p>
+        </w:tc>
+      </w:tr>
+      <w:tr>
+        <w:tc>
+          <w:tcPr>
+            <w:cnfStyle w:val="001000000000" w:firstRow="0" w:lastRow="0" w:firstColumn="1" w:lastColumn="0" w:oddVBand="0" w:evenVBand="0" w:oddHBand="0" w:evenHBand="0" w:firstRowFirstColumn="0" w:firstRowLastColumn="0" w:lastRowFirstColumn="0" w:lastRowLastColumn="0"/>
+            <w:tcW w:w="0" w:type="auto"/>
+            <w:hideMark/>
+          </w:tcPr>
+          <w:p>
+            <w:r>
+              <w:t>Labor</w:t>
+            </w:r>
+          </w:p>
+        </w:tc>
+        <w:tc>
+          <w:tcPr>
+            <w:tcW w:w="0" w:type="auto"/>
+            <w:hideMark/>
+          </w:tcPr>
+          <w:p>
+            <w:pPr>
+              <w:cnfStyle w:val="000000000000" w:firstRow="0" w:lastRow="0" w:firstColumn="0" w:lastColumn="0" w:oddVBand="0" w:evenVBand="0" w:oddHBand="0" w:evenHBand="0" w:firstRowFirstColumn="0" w:firstRowLastColumn="0" w:lastRowFirstColumn="0" w:lastRowLastColumn="0"/>
+            </w:pPr>
+            <w:r>
+              <w:t>$0*</w:t>
+            </w:r>
+          </w:p>
+        </w:tc>
+        <w:tc>
+          <w:tcPr>
+            <w:tcW w:w="0" w:type="auto"/>
+            <w:hideMark/>
+          </w:tcPr>
+          <w:p>
+            <w:pPr>
+              <w:cnfStyle w:val="000000000000" w:firstRow="0" w:lastRow="0" w:firstColumn="0" w:lastColumn="0" w:oddVBand="0" w:evenVBand="0" w:oddHBand="0" w:evenHBand="0" w:firstRowFirstColumn="0" w:firstRowLastColumn="0" w:lastRowFirstColumn="0" w:lastRowLastColumn="0"/>
+            </w:pPr>
+            <w:r>
+              <w:t>TBD</w:t>
+            </w:r>
+          </w:p>
+        </w:tc>
+        <w:tc>
+          <w:tcPr>
+            <w:tcW w:w="0" w:type="auto"/>
+            <w:hideMark/>
+          </w:tcPr>
+          <w:p>
+            <w:pPr>
+              <w:cnfStyle w:val="000000000000" w:firstRow="0" w:lastRow="0" w:firstColumn="0" w:lastColumn="0" w:oddVBand="0" w:evenVBand="0" w:oddHBand="0" w:evenHBand="0" w:firstRowFirstColumn="0" w:firstRowLastColumn="0" w:lastRowFirstColumn="0" w:lastRowLastColumn="0"/>
+            </w:pPr>
+            <w:r>
+              <w:t>Student project labour excluded from direct expenditure</w:t>
+            </w:r>
+          </w:p>
+        </w:tc>
+      </w:tr>
+      <w:tr>
+        <w:trPr>
+          <w:cnfStyle w:val="000000100000" w:firstRow="0" w:lastRow="0" w:firstColumn="0" w:lastColumn="0" w:oddVBand="0" w:evenVBand="0" w:oddHBand="1" w:evenHBand="0" w:firstRowFirstColumn="0" w:firstRowLastColumn="0" w:lastRowFirstColumn="0" w:lastRowLastColumn="0"/>
+        </w:trPr>
+        <w:tc>
+          <w:tcPr>
+            <w:cnfStyle w:val="001000000000" w:firstRow="0" w:lastRow="0" w:firstColumn="1" w:lastColumn="0" w:oddVBand="0" w:evenVBand="0" w:oddHBand="0" w:evenHBand="0" w:firstRowFirstColumn="0" w:firstRowLastColumn="0" w:lastRowFirstColumn="0" w:lastRowLastColumn="0"/>
+            <w:tcW w:w="0" w:type="auto"/>
+            <w:hideMark/>
+          </w:tcPr>
+          <w:p>
+            <w:r>
+              <w:t>Post-deployment (training, maintenance, operational support, scalability)</w:t>
+            </w:r>
+          </w:p>
+        </w:tc>
+        <w:tc>
+          <w:tcPr>
+            <w:tcW w:w="0" w:type="auto"/>
+            <w:hideMark/>
+          </w:tcPr>
+          <w:p>
+            <w:pPr>
+              <w:cnfStyle w:val="000000100000" w:firstRow="0" w:lastRow="0" w:firstColumn="0" w:lastColumn="0" w:oddVBand="0" w:evenVBand="0" w:oddHBand="1" w:evenHBand="0" w:firstRowFirstColumn="0" w:firstRowLastColumn="0" w:lastRowFirstColumn="0" w:lastRowLastColumn="0"/>
+            </w:pPr>
+            <w:r>
+              <w:t>$0</w:t>
+            </w:r>
+          </w:p>
+        </w:tc>
+        <w:tc>
+          <w:tcPr>
+            <w:tcW w:w="0" w:type="auto"/>
+            <w:hideMark/>
+          </w:tcPr>
+          <w:p>
+            <w:pPr>
+              <w:cnfStyle w:val="000000100000" w:firstRow="0" w:lastRow="0" w:firstColumn="0" w:lastColumn="0" w:oddVBand="0" w:evenVBand="0" w:oddHBand="1" w:evenHBand="0" w:firstRowFirstColumn="0" w:firstRowLastColumn="0" w:lastRowFirstColumn="0" w:lastRowLastColumn="0"/>
+            </w:pPr>
+            <w:r>
+              <w:t>TBD</w:t>
+            </w:r>
+          </w:p>
+        </w:tc>
+        <w:tc>
+          <w:tcPr>
+            <w:tcW w:w="0" w:type="auto"/>
+            <w:hideMark/>
+          </w:tcPr>
+          <w:p>
+            <w:pPr>
+              <w:cnfStyle w:val="000000100000" w:firstRow="0" w:lastRow="0" w:firstColumn="0" w:lastColumn="0" w:oddVBand="0" w:evenVBand="0" w:oddHBand="1" w:evenHBand="0" w:firstRowFirstColumn="0" w:firstRowLastColumn="0" w:lastRowFirstColumn="0" w:lastRowLastColumn="0"/>
+            </w:pPr>
+            <w:r>
+              <w:t>Only relevant after production adoption; not applicable at Stage 1</w:t>
+            </w:r>
+          </w:p>
+        </w:tc>
+      </w:tr>
+    </w:tbl>
+    <w:p>
+      <w:pPr>
+        <w:jc w:val="both"/>
+        <w:rPr>
+          <w:rFonts w:ascii="Times New Roman" w:eastAsia="Times New Roman" w:hAnsi="Times New Roman" w:cs="Times New Roman"/>
+          <w:lang w:val="en-GB" w:eastAsia="en-GB"/>
+        </w:rPr>
+      </w:pPr>
+    </w:p>
+    <w:p>
+      <w:pPr>
+        <w:jc w:val="both"/>
+        <w:rPr>
+          <w:rFonts w:ascii="Times New Roman" w:eastAsia="Times New Roman" w:hAnsi="Times New Roman" w:cs="Times New Roman"/>
+          <w:lang w:val="en-GB" w:eastAsia="en-GB"/>
+        </w:rPr>
+      </w:pPr>
+      <w:r>
+        <w:rPr>
+          <w:rFonts w:ascii="Times New Roman" w:eastAsia="Times New Roman" w:hAnsi="Times New Roman" w:cs="Times New Roman"/>
+          <w:lang w:val="en-GB" w:eastAsia="en-GB"/>
+        </w:rPr>
+        <w:t>Labour is not considered as part of the expense for the student project; an organisational implementation will require accounting for labour associated with engineering and support.</w:t>
+      </w:r>
+    </w:p>
+    <w:p>
+      <w:pPr>
+        <w:jc w:val="both"/>
+      </w:pPr>
+      <w:r>
+        <w:rPr>
+          <w:rFonts w:ascii="Times New Roman" w:eastAsia="Times New Roman" w:hAnsi="Times New Roman" w:cs="Times New Roman"/>
+          <w:lang w:val="en-GB" w:eastAsia="en-GB"/>
+        </w:rPr>
+        <w:t>The solution will have a number of cost advantages beyond its low cost to implement. For instance, the creation of a synthetic reusable testing environment can limit testing near production and make repeat testing of the connectors possible, while reducing risks of privacy incidents or unknown issues of interoperability. It might also help to decrease testing efforts with the addition of new connectors. But it is not possible to determine a reliable financial return on investment or break-even point, as there is no information about the costs related to testing or incidents in the available project data, labour rates or expected savings of the implementation – the invention of such a number would be inappropriate.</w:t>
       </w:r>
     </w:p>
     <w:p>
@@ -7228,11 +9976,11 @@
           <w:szCs w:val="18"/>
         </w:rPr>
       </w:pPr>
-      <w:bookmarkStart w:id="22" w:name="_Toc238803252"/>
-      <w:r>
+      <w:r>
+        <w:lastRenderedPageBreak/>
         <w:t>5. Proof of Concept, and Evaluation</w:t>
       </w:r>
-      <w:bookmarkEnd w:id="22"/>
+      <w:bookmarkEnd w:id="17"/>
       <w:r>
         <w:t> </w:t>
       </w:r>
@@ -7241,11 +9989,11 @@
       <w:pPr>
         <w:pStyle w:val="Heading2"/>
       </w:pPr>
-      <w:bookmarkStart w:id="23" w:name="_Toc238803253"/>
+      <w:bookmarkStart w:id="18" w:name="_Toc238803253"/>
       <w:r>
         <w:t>5.1 Sprint Plan</w:t>
       </w:r>
-      <w:bookmarkEnd w:id="23"/>
+      <w:bookmarkEnd w:id="18"/>
       <w:r>
         <w:t> </w:t>
       </w:r>
@@ -7254,11 +10002,11 @@
       <w:pPr>
         <w:pStyle w:val="Heading2"/>
       </w:pPr>
-      <w:bookmarkStart w:id="24" w:name="_Toc238803254"/>
+      <w:bookmarkStart w:id="19" w:name="_Toc238803254"/>
       <w:r>
         <w:t>5.2 Proof of Concept Description</w:t>
       </w:r>
-      <w:bookmarkEnd w:id="24"/>
+      <w:bookmarkEnd w:id="19"/>
       <w:r>
         <w:t> </w:t>
       </w:r>
@@ -7267,14 +10015,14 @@
       <w:pPr>
         <w:pStyle w:val="Heading2"/>
       </w:pPr>
-      <w:bookmarkStart w:id="25" w:name="_Toc238803255"/>
+      <w:bookmarkStart w:id="20" w:name="_Toc238803255"/>
       <w:r>
         <w:t>5.3 Testing, Validation, and Cybersecurity Evaluation</w:t>
       </w:r>
       <w:r>
         <w:t>/evaluate ethical and privacy issues</w:t>
       </w:r>
-      <w:bookmarkEnd w:id="25"/>
+      <w:bookmarkEnd w:id="20"/>
       <w:r>
         <w:t> </w:t>
       </w:r>
@@ -7283,11 +10031,11 @@
       <w:pPr>
         <w:pStyle w:val="Heading1"/>
       </w:pPr>
-      <w:bookmarkStart w:id="26" w:name="_Toc238803256"/>
+      <w:bookmarkStart w:id="21" w:name="_Toc238803256"/>
       <w:r>
         <w:t>6. Conclusion and Recommendations</w:t>
       </w:r>
-      <w:bookmarkEnd w:id="26"/>
+      <w:bookmarkEnd w:id="21"/>
       <w:r>
         <w:t> </w:t>
       </w:r>
@@ -7296,24 +10044,343 @@
       <w:pPr>
         <w:pStyle w:val="Heading1"/>
       </w:pPr>
-      <w:bookmarkStart w:id="27" w:name="_Toc238803257"/>
+      <w:bookmarkStart w:id="22" w:name="_Toc238803257"/>
       <w:r>
         <w:t>References</w:t>
       </w:r>
-      <w:bookmarkEnd w:id="27"/>
+      <w:bookmarkEnd w:id="22"/>
       <w:r>
         <w:t> </w:t>
       </w:r>
     </w:p>
     <w:p>
       <w:pPr>
+        <w:ind w:left="720" w:hanging="720"/>
+      </w:pPr>
+      <w:r>
+        <w:t xml:space="preserve">Attorney-General's Department. (n.d.). Document Verification Service (DVS). Australian Government. </w:t>
+      </w:r>
+      <w:hyperlink r:id="rId11" w:history="1">
+        <w:r>
+          <w:rPr>
+            <w:rStyle w:val="Hyperlink"/>
+          </w:rPr>
+          <w:t>https://www.idmatch.gov.au/resources/identity-verification-services-privacy-statement</w:t>
+        </w:r>
+      </w:hyperlink>
+    </w:p>
+    <w:p>
+      <w:pPr>
+        <w:ind w:left="720" w:hanging="720"/>
+      </w:pPr>
+      <w:r>
+        <w:t>Australian Government. (1988). Privacy Act 1988 (</w:t>
+      </w:r>
+      <w:proofErr w:type="spellStart"/>
+      <w:r>
+        <w:t>Cth</w:t>
+      </w:r>
+      <w:proofErr w:type="spellEnd"/>
+      <w:r>
+        <w:t xml:space="preserve">). </w:t>
+      </w:r>
+      <w:hyperlink r:id="rId12" w:history="1">
+        <w:r>
+          <w:rPr>
+            <w:rStyle w:val="Hyperlink"/>
+          </w:rPr>
+          <w:t>https://www.legislation.gov.au/Detail</w:t>
+        </w:r>
+        <w:r>
+          <w:rPr>
+            <w:rStyle w:val="Hyperlink"/>
+          </w:rPr>
+          <w:t>s</w:t>
+        </w:r>
+        <w:r>
+          <w:rPr>
+            <w:rStyle w:val="Hyperlink"/>
+          </w:rPr>
+          <w:t>/C2022C00361</w:t>
+        </w:r>
+      </w:hyperlink>
+    </w:p>
+    <w:p>
+      <w:pPr>
+        <w:ind w:left="720" w:hanging="720"/>
+      </w:pPr>
+      <w:r>
+        <w:t>Australian Government. (2012). My Health Records Act 2012 (</w:t>
+      </w:r>
+      <w:proofErr w:type="spellStart"/>
+      <w:r>
+        <w:t>Cth</w:t>
+      </w:r>
+      <w:proofErr w:type="spellEnd"/>
+      <w:r>
+        <w:t xml:space="preserve">). </w:t>
+      </w:r>
+      <w:hyperlink r:id="rId13" w:history="1">
+        <w:r>
+          <w:rPr>
+            <w:rStyle w:val="Hyperlink"/>
+          </w:rPr>
+          <w:t>https://www.legislation.gov.au/Details/C2017C</w:t>
+        </w:r>
+        <w:r>
+          <w:rPr>
+            <w:rStyle w:val="Hyperlink"/>
+          </w:rPr>
+          <w:t>0</w:t>
+        </w:r>
+        <w:r>
+          <w:rPr>
+            <w:rStyle w:val="Hyperlink"/>
+          </w:rPr>
+          <w:t>0313</w:t>
+        </w:r>
+      </w:hyperlink>
+    </w:p>
+    <w:p>
+      <w:pPr>
+        <w:ind w:left="720" w:hanging="720"/>
+      </w:pPr>
+      <w:r>
+        <w:t>FAZ Australia. (n.d.). Project brief and requirements specification [Unpublished internal document].</w:t>
+      </w:r>
+    </w:p>
+    <w:p>
+      <w:pPr>
+        <w:ind w:left="720" w:hanging="720"/>
+      </w:pPr>
+      <w:proofErr w:type="spellStart"/>
+      <w:r>
+        <w:t>Giannangelo</w:t>
+      </w:r>
+      <w:proofErr w:type="spellEnd"/>
+      <w:r>
+        <w:t>, K., et al. (2012). Mapping SNOMED CT to ICD-10. Studies in Health Technology and Informatics, 180, 83–87.</w:t>
+      </w:r>
+      <w:r>
+        <w:t xml:space="preserve"> </w:t>
+      </w:r>
+      <w:hyperlink r:id="rId14" w:history="1">
+        <w:r>
+          <w:rPr>
+            <w:rStyle w:val="Hyperlink"/>
+          </w:rPr>
+          <w:t>https://pubmed.ncbi.nlm.nih.gov/22874157/</w:t>
+        </w:r>
+      </w:hyperlink>
+    </w:p>
+    <w:p>
+      <w:pPr>
+        <w:ind w:left="720" w:hanging="720"/>
+      </w:pPr>
+      <w:proofErr w:type="spellStart"/>
+      <w:r>
+        <w:t>Gruendner</w:t>
+      </w:r>
+      <w:proofErr w:type="spellEnd"/>
+      <w:r>
+        <w:t xml:space="preserve">, J., Gulden, C., Kampf, M., Mate, S., Prokosch, H.-U., &amp; Zierk, J. (2021). A framework for criteria-based selection and processing of Fast Healthcare Interoperability Resources (FHIR) data for statistical analysis: Design and implementation study. JMIR Medical Informatics, 9(4), e25645. </w:t>
+      </w:r>
+      <w:hyperlink r:id="rId15" w:history="1">
+        <w:r>
+          <w:rPr>
+            <w:rStyle w:val="Hyperlink"/>
+          </w:rPr>
+          <w:t>https://doi.org</w:t>
+        </w:r>
+        <w:r>
+          <w:rPr>
+            <w:rStyle w:val="Hyperlink"/>
+          </w:rPr>
+          <w:t>/</w:t>
+        </w:r>
+        <w:r>
+          <w:rPr>
+            <w:rStyle w:val="Hyperlink"/>
+          </w:rPr>
+          <w:t>10.2</w:t>
+        </w:r>
+        <w:r>
+          <w:rPr>
+            <w:rStyle w:val="Hyperlink"/>
+          </w:rPr>
+          <w:t>1</w:t>
+        </w:r>
+        <w:r>
+          <w:rPr>
+            <w:rStyle w:val="Hyperlink"/>
+          </w:rPr>
+          <w:t>96/25645</w:t>
+        </w:r>
+      </w:hyperlink>
+    </w:p>
+    <w:p>
+      <w:pPr>
+        <w:ind w:left="720" w:hanging="720"/>
+      </w:pPr>
+      <w:r>
+        <w:t xml:space="preserve">HL7 Australia. (n.d.). AU Core Implementation Guide (v1.0.0). HL7 International. </w:t>
+      </w:r>
+      <w:hyperlink r:id="rId16" w:history="1">
+        <w:r>
+          <w:rPr>
+            <w:rStyle w:val="Hyperlink"/>
+          </w:rPr>
+          <w:t>http://hl7.org.a</w:t>
+        </w:r>
+        <w:r>
+          <w:rPr>
+            <w:rStyle w:val="Hyperlink"/>
+          </w:rPr>
+          <w:t>u</w:t>
+        </w:r>
+        <w:r>
+          <w:rPr>
+            <w:rStyle w:val="Hyperlink"/>
+          </w:rPr>
+          <w:t>/fhir/core/</w:t>
+        </w:r>
+      </w:hyperlink>
+    </w:p>
+    <w:p>
+      <w:pPr>
+        <w:ind w:left="720" w:hanging="720"/>
+      </w:pPr>
+      <w:r>
+        <w:t xml:space="preserve">HL7 International. (2019). HL7 FHIR Release 4 (R4). </w:t>
+      </w:r>
+      <w:hyperlink r:id="rId17" w:history="1">
+        <w:r>
+          <w:rPr>
+            <w:rStyle w:val="Hyperlink"/>
+          </w:rPr>
+          <w:t>https://hl</w:t>
+        </w:r>
+        <w:r>
+          <w:rPr>
+            <w:rStyle w:val="Hyperlink"/>
+          </w:rPr>
+          <w:t>7</w:t>
+        </w:r>
+        <w:r>
+          <w:rPr>
+            <w:rStyle w:val="Hyperlink"/>
+          </w:rPr>
+          <w:t>.org/fhir/R4/</w:t>
+        </w:r>
+      </w:hyperlink>
+    </w:p>
+    <w:p>
+      <w:pPr>
+        <w:ind w:left="720" w:hanging="720"/>
+      </w:pPr>
+      <w:r>
+        <w:t xml:space="preserve">National Institute of Standards and Technology. (2024). The NIST Cybersecurity Framework (CSF) 2.0 (NIST CSWP 29). U.S. Department of Commerce. </w:t>
+      </w:r>
+      <w:hyperlink r:id="rId18" w:history="1">
+        <w:r>
+          <w:rPr>
+            <w:rStyle w:val="Hyperlink"/>
+          </w:rPr>
+          <w:t>https://doi.org/10.60</w:t>
+        </w:r>
+        <w:r>
+          <w:rPr>
+            <w:rStyle w:val="Hyperlink"/>
+          </w:rPr>
+          <w:t>2</w:t>
+        </w:r>
+        <w:r>
+          <w:rPr>
+            <w:rStyle w:val="Hyperlink"/>
+          </w:rPr>
+          <w:t>8/NIST.CSWP.29</w:t>
+        </w:r>
+      </w:hyperlink>
+    </w:p>
+    <w:p>
+      <w:pPr>
+        <w:ind w:left="720" w:hanging="720"/>
+      </w:pPr>
+      <w:r>
+        <w:t xml:space="preserve">SMART Health IT. (n.d.). SMART App Launch Framework. HL7 International. </w:t>
+      </w:r>
+      <w:hyperlink r:id="rId19" w:history="1">
+        <w:r>
+          <w:rPr>
+            <w:rStyle w:val="Hyperlink"/>
+          </w:rPr>
+          <w:t>https://hl7.org/fhir/</w:t>
+        </w:r>
+        <w:r>
+          <w:rPr>
+            <w:rStyle w:val="Hyperlink"/>
+          </w:rPr>
+          <w:t>s</w:t>
+        </w:r>
+        <w:r>
+          <w:rPr>
+            <w:rStyle w:val="Hyperlink"/>
+          </w:rPr>
+          <w:t>mart-app-launch/</w:t>
+        </w:r>
+      </w:hyperlink>
+    </w:p>
+    <w:p>
+      <w:pPr>
+        <w:ind w:left="720" w:hanging="720"/>
+      </w:pPr>
+      <w:r>
+        <w:t xml:space="preserve">Walonoski, J., Kramer, M., Nichols, J., Quina, A., </w:t>
+      </w:r>
+      <w:proofErr w:type="spellStart"/>
+      <w:r>
+        <w:t>Moesel</w:t>
+      </w:r>
+      <w:proofErr w:type="spellEnd"/>
+      <w:r>
+        <w:t xml:space="preserve">, C., Hall, D., Duffett, C., Dube, K., Gallagher, T., &amp; McLachlan, S. (2018). Synthea: An approach, method, and software mechanism for generating synthetic patients and the synthetic electronic health care </w:t>
+      </w:r>
+      <w:r>
+        <w:lastRenderedPageBreak/>
+        <w:t xml:space="preserve">record. Journal of the American Medical Informatics Association, 25(3), 230–238. </w:t>
+      </w:r>
+      <w:hyperlink r:id="rId20" w:history="1">
+        <w:r>
+          <w:rPr>
+            <w:rStyle w:val="Hyperlink"/>
+          </w:rPr>
+          <w:t>https://doi.org/10.10</w:t>
+        </w:r>
+        <w:r>
+          <w:rPr>
+            <w:rStyle w:val="Hyperlink"/>
+          </w:rPr>
+          <w:t>9</w:t>
+        </w:r>
+        <w:r>
+          <w:rPr>
+            <w:rStyle w:val="Hyperlink"/>
+          </w:rPr>
+          <w:t>3/jamia/ocx079</w:t>
+        </w:r>
+      </w:hyperlink>
+    </w:p>
+    <w:p/>
+    <w:p/>
+    <w:p>
+      <w:pPr>
         <w:pStyle w:val="Heading1"/>
       </w:pPr>
-      <w:bookmarkStart w:id="28" w:name="_Toc238803258"/>
+      <w:bookmarkStart w:id="23" w:name="_Toc238803258"/>
       <w:r>
         <w:t>Appendices</w:t>
       </w:r>
-      <w:bookmarkEnd w:id="28"/>
+      <w:bookmarkEnd w:id="23"/>
       <w:r>
         <w:t> </w:t>
       </w:r>
@@ -7329,7 +10396,7 @@
 </file>
 
 <file path=word/endnotes.xml><?xml version="1.0" encoding="utf-8"?>
-<w:endnotes xmlns:wpc="http://schemas.microsoft.com/office/word/2010/wordprocessingCanvas" xmlns:cx="http://schemas.microsoft.com/office/drawing/2014/chartex" xmlns:cx1="http://schemas.microsoft.com/office/drawing/2015/9/8/chartex" xmlns:cx2="http://schemas.microsoft.com/office/drawing/2015/10/21/chartex" xmlns:cx3="http://schemas.microsoft.com/office/drawing/2016/5/9/chartex" xmlns:cx4="http://schemas.microsoft.com/office/drawing/2016/5/10/chartex" xmlns:cx5="http://schemas.microsoft.com/office/drawing/2016/5/11/chartex" xmlns:cx6="http://schemas.microsoft.com/office/drawing/2016/5/12/chartex" xmlns:cx7="http://schemas.microsoft.com/office/drawing/2016/5/13/chartex" xmlns:cx8="http://schemas.microsoft.com/office/drawing/2016/5/14/chartex" xmlns:mc="http://schemas.openxmlformats.org/markup-compatibility/2006" xmlns:aink="http://schemas.microsoft.com/office/drawing/2016/ink" xmlns:am3d="http://schemas.microsoft.com/office/drawing/2017/model3d" xmlns:o="urn:schemas-microsoft-com:office:office" xmlns:oel="http://schemas.microsoft.com/office/2019/extlst" xmlns:r="http://schemas.openxmlformats.org/officeDocument/2006/relationships" xmlns:m="http://schemas.openxmlformats.org/officeDocument/2006/math" xmlns:v="urn:schemas-microsoft-com:vml" xmlns:wp14="http://schemas.microsoft.com/office/word/2010/wordprocessingDrawing" xmlns:wp="http://schemas.openxmlformats.org/drawingml/2006/wordprocessingDrawing" xmlns:w10="urn:schemas-microsoft-com:office:word" xmlns:w="http://schemas.openxmlformats.org/wordprocessingml/2006/main" xmlns:w14="http://schemas.microsoft.com/office/word/2010/wordml" xmlns:w15="http://schemas.microsoft.com/office/word/2012/wordml" xmlns:w16cex="http://schemas.microsoft.com/office/word/2018/wordml/cex" xmlns:w16cid="http://schemas.microsoft.com/office/word/2016/wordml/cid" xmlns:w16="http://schemas.microsoft.com/office/word/2018/wordml" xmlns:w16du="http://schemas.microsoft.com/office/word/2023/wordml/word16du" xmlns:w16sdtdh="http://schemas.microsoft.com/office/word/2020/wordml/sdtdatahash" xmlns:w16sdtfl="http://schemas.microsoft.com/office/word/2024/wordml/sdtformatlock" xmlns:w16se="http://schemas.microsoft.com/office/word/2015/wordml/symex" xmlns:wpg="http://schemas.microsoft.com/office/word/2010/wordprocessingGroup" xmlns:wpi="http://schemas.microsoft.com/office/word/2010/wordprocessingInk" xmlns:wne="http://schemas.microsoft.com/office/word/2006/wordml" xmlns:wps="http://schemas.microsoft.com/office/word/2010/wordprocessingShape" mc:Ignorable="w14 w15 w16se w16cid w16 w16cex w16sdtdh w16sdtfl w16du wp14">
+<w:endnotes xmlns:wpc="http://schemas.microsoft.com/office/word/2010/wordprocessingCanvas" xmlns:cx="http://schemas.microsoft.com/office/drawing/2014/chartex" xmlns:cx1="http://schemas.microsoft.com/office/drawing/2015/9/8/chartex" xmlns:cx2="http://schemas.microsoft.com/office/drawing/2015/10/21/chartex" xmlns:cx3="http://schemas.microsoft.com/office/drawing/2016/5/9/chartex" xmlns:cx4="http://schemas.microsoft.com/office/drawing/2016/5/10/chartex" xmlns:cx5="http://schemas.microsoft.com/office/drawing/2016/5/11/chartex" xmlns:cx6="http://schemas.microsoft.com/office/drawing/2016/5/12/chartex" xmlns:cx7="http://schemas.microsoft.com/office/drawing/2016/5/13/chartex" xmlns:cx8="http://schemas.microsoft.com/office/drawing/2016/5/14/chartex" xmlns:mc="http://schemas.openxmlformats.org/markup-compatibility/2006" xmlns:m="http://schemas.openxmlformats.org/officeDocument/2006/math" xmlns:aink="http://schemas.microsoft.com/office/drawing/2016/ink" xmlns:am3d="http://schemas.microsoft.com/office/drawing/2017/model3d" xmlns:oel="http://schemas.microsoft.com/office/2019/extlst" xmlns:r="http://schemas.openxmlformats.org/officeDocument/2006/relationships" xmlns:wp14="http://schemas.microsoft.com/office/word/2010/wordprocessingDrawing" xmlns:wp="http://schemas.openxmlformats.org/drawingml/2006/wordprocessingDrawing" xmlns:wpg="http://schemas.microsoft.com/office/word/2010/wordprocessingGroup" xmlns:wpi="http://schemas.microsoft.com/office/word/2010/wordprocessingInk" xmlns:wps="http://schemas.microsoft.com/office/word/2010/wordprocessingShape" xmlns:o="urn:schemas-microsoft-com:office:office" xmlns:v="urn:schemas-microsoft-com:vml" xmlns:w10="urn:schemas-microsoft-com:office:word" xmlns:w="http://schemas.openxmlformats.org/wordprocessingml/2006/main" xmlns:w14="http://schemas.microsoft.com/office/word/2010/wordml" xmlns:w15="http://schemas.microsoft.com/office/word/2012/wordml" xmlns:w16cex="http://schemas.microsoft.com/office/word/2018/wordml/cex" xmlns:w16cid="http://schemas.microsoft.com/office/word/2016/wordml/cid" xmlns:w16="http://schemas.microsoft.com/office/word/2018/wordml" xmlns:w16sdtdh="http://schemas.microsoft.com/office/word/2020/wordml/sdtdatahash" xmlns:w16sdtfl="http://schemas.microsoft.com/office/word/2024/wordml/sdtformatlock" xmlns:w16se="http://schemas.microsoft.com/office/word/2015/wordml/symex" xmlns:w16du="http://schemas.microsoft.com/office/word/2023/wordml/word16du" xmlns:wne="http://schemas.microsoft.com/office/word/2006/wordml" mc:Ignorable="w14 w15 w16se w16cid w16 w16cex w16sdtdh w16sdtfl w16du wp14">
   <w:endnote w:type="separator" w:id="-1">
     <w:p>
       <w:r>
@@ -7348,7 +10415,7 @@
 </file>
 
 <file path=word/footnotes.xml><?xml version="1.0" encoding="utf-8"?>
-<w:footnotes xmlns:wpc="http://schemas.microsoft.com/office/word/2010/wordprocessingCanvas" xmlns:cx="http://schemas.microsoft.com/office/drawing/2014/chartex" xmlns:cx1="http://schemas.microsoft.com/office/drawing/2015/9/8/chartex" xmlns:cx2="http://schemas.microsoft.com/office/drawing/2015/10/21/chartex" xmlns:cx3="http://schemas.microsoft.com/office/drawing/2016/5/9/chartex" xmlns:cx4="http://schemas.microsoft.com/office/drawing/2016/5/10/chartex" xmlns:cx5="http://schemas.microsoft.com/office/drawing/2016/5/11/chartex" xmlns:cx6="http://schemas.microsoft.com/office/drawing/2016/5/12/chartex" xmlns:cx7="http://schemas.microsoft.com/office/drawing/2016/5/13/chartex" xmlns:cx8="http://schemas.microsoft.com/office/drawing/2016/5/14/chartex" xmlns:mc="http://schemas.openxmlformats.org/markup-compatibility/2006" xmlns:aink="http://schemas.microsoft.com/office/drawing/2016/ink" xmlns:am3d="http://schemas.microsoft.com/office/drawing/2017/model3d" xmlns:o="urn:schemas-microsoft-com:office:office" xmlns:oel="http://schemas.microsoft.com/office/2019/extlst" xmlns:r="http://schemas.openxmlformats.org/officeDocument/2006/relationships" xmlns:m="http://schemas.openxmlformats.org/officeDocument/2006/math" xmlns:v="urn:schemas-microsoft-com:vml" xmlns:wp14="http://schemas.microsoft.com/office/word/2010/wordprocessingDrawing" xmlns:wp="http://schemas.openxmlformats.org/drawingml/2006/wordprocessingDrawing" xmlns:w10="urn:schemas-microsoft-com:office:word" xmlns:w="http://schemas.openxmlformats.org/wordprocessingml/2006/main" xmlns:w14="http://schemas.microsoft.com/office/word/2010/wordml" xmlns:w15="http://schemas.microsoft.com/office/word/2012/wordml" xmlns:w16cex="http://schemas.microsoft.com/office/word/2018/wordml/cex" xmlns:w16cid="http://schemas.microsoft.com/office/word/2016/wordml/cid" xmlns:w16="http://schemas.microsoft.com/office/word/2018/wordml" xmlns:w16du="http://schemas.microsoft.com/office/word/2023/wordml/word16du" xmlns:w16sdtdh="http://schemas.microsoft.com/office/word/2020/wordml/sdtdatahash" xmlns:w16sdtfl="http://schemas.microsoft.com/office/word/2024/wordml/sdtformatlock" xmlns:w16se="http://schemas.microsoft.com/office/word/2015/wordml/symex" xmlns:wpg="http://schemas.microsoft.com/office/word/2010/wordprocessingGroup" xmlns:wpi="http://schemas.microsoft.com/office/word/2010/wordprocessingInk" xmlns:wne="http://schemas.microsoft.com/office/word/2006/wordml" xmlns:wps="http://schemas.microsoft.com/office/word/2010/wordprocessingShape" mc:Ignorable="w14 w15 w16se w16cid w16 w16cex w16sdtdh w16sdtfl w16du wp14">
+<w:footnotes xmlns:wpc="http://schemas.microsoft.com/office/word/2010/wordprocessingCanvas" xmlns:cx="http://schemas.microsoft.com/office/drawing/2014/chartex" xmlns:cx1="http://schemas.microsoft.com/office/drawing/2015/9/8/chartex" xmlns:cx2="http://schemas.microsoft.com/office/drawing/2015/10/21/chartex" xmlns:cx3="http://schemas.microsoft.com/office/drawing/2016/5/9/chartex" xmlns:cx4="http://schemas.microsoft.com/office/drawing/2016/5/10/chartex" xmlns:cx5="http://schemas.microsoft.com/office/drawing/2016/5/11/chartex" xmlns:cx6="http://schemas.microsoft.com/office/drawing/2016/5/12/chartex" xmlns:cx7="http://schemas.microsoft.com/office/drawing/2016/5/13/chartex" xmlns:cx8="http://schemas.microsoft.com/office/drawing/2016/5/14/chartex" xmlns:mc="http://schemas.openxmlformats.org/markup-compatibility/2006" xmlns:m="http://schemas.openxmlformats.org/officeDocument/2006/math" xmlns:aink="http://schemas.microsoft.com/office/drawing/2016/ink" xmlns:am3d="http://schemas.microsoft.com/office/drawing/2017/model3d" xmlns:oel="http://schemas.microsoft.com/office/2019/extlst" xmlns:r="http://schemas.openxmlformats.org/officeDocument/2006/relationships" xmlns:wp14="http://schemas.microsoft.com/office/word/2010/wordprocessingDrawing" xmlns:wp="http://schemas.openxmlformats.org/drawingml/2006/wordprocessingDrawing" xmlns:wpg="http://schemas.microsoft.com/office/word/2010/wordprocessingGroup" xmlns:wpi="http://schemas.microsoft.com/office/word/2010/wordprocessingInk" xmlns:wps="http://schemas.microsoft.com/office/word/2010/wordprocessingShape" xmlns:o="urn:schemas-microsoft-com:office:office" xmlns:v="urn:schemas-microsoft-com:vml" xmlns:w10="urn:schemas-microsoft-com:office:word" xmlns:w="http://schemas.openxmlformats.org/wordprocessingml/2006/main" xmlns:w14="http://schemas.microsoft.com/office/word/2010/wordml" xmlns:w15="http://schemas.microsoft.com/office/word/2012/wordml" xmlns:w16cex="http://schemas.microsoft.com/office/word/2018/wordml/cex" xmlns:w16cid="http://schemas.microsoft.com/office/word/2016/wordml/cid" xmlns:w16="http://schemas.microsoft.com/office/word/2018/wordml" xmlns:w16sdtdh="http://schemas.microsoft.com/office/word/2020/wordml/sdtdatahash" xmlns:w16sdtfl="http://schemas.microsoft.com/office/word/2024/wordml/sdtformatlock" xmlns:w16se="http://schemas.microsoft.com/office/word/2015/wordml/symex" xmlns:w16du="http://schemas.microsoft.com/office/word/2023/wordml/word16du" xmlns:wne="http://schemas.microsoft.com/office/word/2006/wordml" mc:Ignorable="w14 w15 w16se w16cid w16 w16cex w16sdtdh w16sdtfl w16du wp14">
   <w:footnote w:type="separator" w:id="-1">
     <w:p>
       <w:r>
@@ -7367,7 +10434,7 @@
 </file>
 
 <file path=word/numbering.xml><?xml version="1.0" encoding="utf-8"?>
-<w:numbering xmlns:wpc="http://schemas.microsoft.com/office/word/2010/wordprocessingCanvas" xmlns:cx="http://schemas.microsoft.com/office/drawing/2014/chartex" xmlns:cx1="http://schemas.microsoft.com/office/drawing/2015/9/8/chartex" xmlns:cx2="http://schemas.microsoft.com/office/drawing/2015/10/21/chartex" xmlns:cx3="http://schemas.microsoft.com/office/drawing/2016/5/9/chartex" xmlns:cx4="http://schemas.microsoft.com/office/drawing/2016/5/10/chartex" xmlns:cx5="http://schemas.microsoft.com/office/drawing/2016/5/11/chartex" xmlns:cx6="http://schemas.microsoft.com/office/drawing/2016/5/12/chartex" xmlns:cx7="http://schemas.microsoft.com/office/drawing/2016/5/13/chartex" xmlns:cx8="http://schemas.microsoft.com/office/drawing/2016/5/14/chartex" xmlns:mc="http://schemas.openxmlformats.org/markup-compatibility/2006" xmlns:aink="http://schemas.microsoft.com/office/drawing/2016/ink" xmlns:am3d="http://schemas.microsoft.com/office/drawing/2017/model3d" xmlns:o="urn:schemas-microsoft-com:office:office" xmlns:oel="http://schemas.microsoft.com/office/2019/extlst" xmlns:r="http://schemas.openxmlformats.org/officeDocument/2006/relationships" xmlns:m="http://schemas.openxmlformats.org/officeDocument/2006/math" xmlns:v="urn:schemas-microsoft-com:vml" xmlns:wp14="http://schemas.microsoft.com/office/word/2010/wordprocessingDrawing" xmlns:wp="http://schemas.openxmlformats.org/drawingml/2006/wordprocessingDrawing" xmlns:w10="urn:schemas-microsoft-com:office:word" xmlns:w="http://schemas.openxmlformats.org/wordprocessingml/2006/main" xmlns:w14="http://schemas.microsoft.com/office/word/2010/wordml" xmlns:w15="http://schemas.microsoft.com/office/word/2012/wordml" xmlns:w16cex="http://schemas.microsoft.com/office/word/2018/wordml/cex" xmlns:w16cid="http://schemas.microsoft.com/office/word/2016/wordml/cid" xmlns:w16="http://schemas.microsoft.com/office/word/2018/wordml" xmlns:w16du="http://schemas.microsoft.com/office/word/2023/wordml/word16du" xmlns:w16sdtdh="http://schemas.microsoft.com/office/word/2020/wordml/sdtdatahash" xmlns:w16sdtfl="http://schemas.microsoft.com/office/word/2024/wordml/sdtformatlock" xmlns:w16se="http://schemas.microsoft.com/office/word/2015/wordml/symex" xmlns:wpg="http://schemas.microsoft.com/office/word/2010/wordprocessingGroup" xmlns:wpi="http://schemas.microsoft.com/office/word/2010/wordprocessingInk" xmlns:wne="http://schemas.microsoft.com/office/word/2006/wordml" xmlns:wps="http://schemas.microsoft.com/office/word/2010/wordprocessingShape" mc:Ignorable="w14 w15 w16se w16cid w16 w16cex w16sdtdh w16sdtfl w16du wp14">
+<w:numbering xmlns:wpc="http://schemas.microsoft.com/office/word/2010/wordprocessingCanvas" xmlns:cx="http://schemas.microsoft.com/office/drawing/2014/chartex" xmlns:cx1="http://schemas.microsoft.com/office/drawing/2015/9/8/chartex" xmlns:cx2="http://schemas.microsoft.com/office/drawing/2015/10/21/chartex" xmlns:cx3="http://schemas.microsoft.com/office/drawing/2016/5/9/chartex" xmlns:cx4="http://schemas.microsoft.com/office/drawing/2016/5/10/chartex" xmlns:cx5="http://schemas.microsoft.com/office/drawing/2016/5/11/chartex" xmlns:cx6="http://schemas.microsoft.com/office/drawing/2016/5/12/chartex" xmlns:cx7="http://schemas.microsoft.com/office/drawing/2016/5/13/chartex" xmlns:cx8="http://schemas.microsoft.com/office/drawing/2016/5/14/chartex" xmlns:mc="http://schemas.openxmlformats.org/markup-compatibility/2006" xmlns:m="http://schemas.openxmlformats.org/officeDocument/2006/math" xmlns:aink="http://schemas.microsoft.com/office/drawing/2016/ink" xmlns:am3d="http://schemas.microsoft.com/office/drawing/2017/model3d" xmlns:oel="http://schemas.microsoft.com/office/2019/extlst" xmlns:r="http://schemas.openxmlformats.org/officeDocument/2006/relationships" xmlns:wp14="http://schemas.microsoft.com/office/word/2010/wordprocessingDrawing" xmlns:wp="http://schemas.openxmlformats.org/drawingml/2006/wordprocessingDrawing" xmlns:wpg="http://schemas.microsoft.com/office/word/2010/wordprocessingGroup" xmlns:wpi="http://schemas.microsoft.com/office/word/2010/wordprocessingInk" xmlns:wps="http://schemas.microsoft.com/office/word/2010/wordprocessingShape" xmlns:o="urn:schemas-microsoft-com:office:office" xmlns:v="urn:schemas-microsoft-com:vml" xmlns:w10="urn:schemas-microsoft-com:office:word" xmlns:w="http://schemas.openxmlformats.org/wordprocessingml/2006/main" xmlns:w14="http://schemas.microsoft.com/office/word/2010/wordml" xmlns:w15="http://schemas.microsoft.com/office/word/2012/wordml" xmlns:w16cex="http://schemas.microsoft.com/office/word/2018/wordml/cex" xmlns:w16cid="http://schemas.microsoft.com/office/word/2016/wordml/cid" xmlns:w16="http://schemas.microsoft.com/office/word/2018/wordml" xmlns:w16sdtdh="http://schemas.microsoft.com/office/word/2020/wordml/sdtdatahash" xmlns:w16sdtfl="http://schemas.microsoft.com/office/word/2024/wordml/sdtformatlock" xmlns:w16se="http://schemas.microsoft.com/office/word/2015/wordml/symex" xmlns:w16du="http://schemas.microsoft.com/office/word/2023/wordml/word16du" xmlns:wne="http://schemas.microsoft.com/office/word/2006/wordml" mc:Ignorable="w14 w15 w16se w16cid w16 w16cex w16sdtdh w16sdtfl w16du wp14">
   <w:abstractNum w:abstractNumId="0" w15:restartNumberingAfterBreak="0">
     <w:nsid w:val="01E30731"/>
     <w:multiLevelType w:val="hybridMultilevel"/>
@@ -10202,7 +13269,7 @@
 </file>
 
 <file path=word/styles.xml><?xml version="1.0" encoding="utf-8"?>
-<w:styles xmlns:mc="http://schemas.openxmlformats.org/markup-compatibility/2006" xmlns:r="http://schemas.openxmlformats.org/officeDocument/2006/relationships" xmlns:w="http://schemas.openxmlformats.org/wordprocessingml/2006/main" xmlns:w14="http://schemas.microsoft.com/office/word/2010/wordml" xmlns:w15="http://schemas.microsoft.com/office/word/2012/wordml" xmlns:w16cex="http://schemas.microsoft.com/office/word/2018/wordml/cex" xmlns:w16cid="http://schemas.microsoft.com/office/word/2016/wordml/cid" xmlns:w16="http://schemas.microsoft.com/office/word/2018/wordml" xmlns:w16du="http://schemas.microsoft.com/office/word/2023/wordml/word16du" xmlns:w16sdtdh="http://schemas.microsoft.com/office/word/2020/wordml/sdtdatahash" xmlns:w16sdtfl="http://schemas.microsoft.com/office/word/2024/wordml/sdtformatlock" xmlns:w16se="http://schemas.microsoft.com/office/word/2015/wordml/symex" mc:Ignorable="w14 w15 w16se w16cid w16 w16cex w16sdtdh w16sdtfl w16du">
+<w:styles xmlns:mc="http://schemas.openxmlformats.org/markup-compatibility/2006" xmlns:r="http://schemas.openxmlformats.org/officeDocument/2006/relationships" xmlns:w="http://schemas.openxmlformats.org/wordprocessingml/2006/main" xmlns:w14="http://schemas.microsoft.com/office/word/2010/wordml" xmlns:w15="http://schemas.microsoft.com/office/word/2012/wordml" xmlns:w16cex="http://schemas.microsoft.com/office/word/2018/wordml/cex" xmlns:w16cid="http://schemas.microsoft.com/office/word/2016/wordml/cid" xmlns:w16="http://schemas.microsoft.com/office/word/2018/wordml" xmlns:w16sdtdh="http://schemas.microsoft.com/office/word/2020/wordml/sdtdatahash" xmlns:w16sdtfl="http://schemas.microsoft.com/office/word/2024/wordml/sdtformatlock" xmlns:w16se="http://schemas.microsoft.com/office/word/2015/wordml/symex" xmlns:w16du="http://schemas.microsoft.com/office/word/2023/wordml/word16du" mc:Ignorable="w14 w15 w16se w16cid w16 w16cex w16sdtdh w16sdtfl w16du">
   <w:docDefaults>
     <w:rPrDefault>
       <w:rPr>
@@ -10488,7 +13555,7 @@
     <w:lsdException w:name="Book Title" w:uiPriority="33" w:qFormat="1"/>
     <w:lsdException w:name="Bibliography" w:semiHidden="1" w:uiPriority="37" w:unhideWhenUsed="1"/>
     <w:lsdException w:name="TOC Heading" w:semiHidden="1" w:uiPriority="39" w:unhideWhenUsed="1" w:qFormat="1"/>
-    <w:lsdException w:name="Plain Table 1" w:uiPriority="41"/>
+    <w:lsdException w:name="Plain Table 1" w:uiPriority="0"/>
     <w:lsdException w:name="Plain Table 2" w:uiPriority="42"/>
     <w:lsdException w:name="Plain Table 3" w:uiPriority="43"/>
     <w:lsdException w:name="Plain Table 4" w:uiPriority="44"/>
@@ -10805,7 +13872,6 @@
   <w:style w:type="character" w:default="1" w:styleId="DefaultParagraphFont">
     <w:name w:val="Default Paragraph Font"/>
     <w:uiPriority w:val="1"/>
-    <w:semiHidden/>
     <w:unhideWhenUsed/>
   </w:style>
   <w:style w:type="table" w:default="1" w:styleId="TableNormal">
@@ -11271,7 +14337,6 @@
   <w:style w:type="table" w:styleId="PlainTable1">
     <w:name w:val="Plain Table 1"/>
     <w:basedOn w:val="TableNormal"/>
-    <w:uiPriority w:val="41"/>
     <w:rsid w:val="00B07ECD"/>
     <w:pPr>
       <w:spacing w:after="0" w:line="240" w:lineRule="auto"/>
@@ -11924,6 +14989,36 @@
         <w:insideV w:val="single" w:sz="4" w:space="0" w:color="BFBFBF" w:themeColor="background1" w:themeShade="BF"/>
       </w:tblBorders>
     </w:tblPr>
+  </w:style>
+  <w:style w:type="paragraph" w:styleId="NormalWeb">
+    <w:name w:val="Normal (Web)"/>
+    <w:basedOn w:val="Normal"/>
+    <w:uiPriority w:val="99"/>
+    <w:unhideWhenUsed/>
+    <w:rsid w:val="00EC040C"/>
+    <w:pPr>
+      <w:spacing w:before="100" w:beforeAutospacing="1" w:after="100" w:afterAutospacing="1" w:line="240" w:lineRule="auto"/>
+    </w:pPr>
+    <w:rPr>
+      <w:rFonts w:ascii="Times New Roman" w:eastAsia="Times New Roman" w:hAnsi="Times New Roman" w:cs="Times New Roman"/>
+      <w:kern w:val="0"/>
+      <w:sz w:val="24"/>
+      <w:szCs w:val="24"/>
+      <w:lang w:val="en-GB" w:eastAsia="en-GB"/>
+      <w14:ligatures w14:val="none"/>
+    </w:rPr>
+  </w:style>
+  <w:style w:type="character" w:styleId="FollowedHyperlink">
+    <w:name w:val="FollowedHyperlink"/>
+    <w:basedOn w:val="DefaultParagraphFont"/>
+    <w:uiPriority w:val="99"/>
+    <w:semiHidden/>
+    <w:unhideWhenUsed/>
+    <w:rsid w:val="003923C2"/>
+    <w:rPr>
+      <w:color w:val="96607D" w:themeColor="followedHyperlink"/>
+      <w:u w:val="single"/>
+    </w:rPr>
   </w:style>
 </w:styles>
 </file>

</xml_diff>

<commit_message>
finalized section 1 and 2
</commit_message>
<xml_diff>
--- a/DOCUMENTS/Assessment_2_report.docx
+++ b/DOCUMENTS/Assessment_2_report.docx
@@ -1,6 +1,6 @@
 
 <file path=word/document.xml><?xml version="1.0" encoding="utf-8"?>
-<w:document xmlns:wpc="http://schemas.microsoft.com/office/word/2010/wordprocessingCanvas" xmlns:cx="http://schemas.microsoft.com/office/drawing/2014/chartex" xmlns:cx1="http://schemas.microsoft.com/office/drawing/2015/9/8/chartex" xmlns:cx2="http://schemas.microsoft.com/office/drawing/2015/10/21/chartex" xmlns:cx3="http://schemas.microsoft.com/office/drawing/2016/5/9/chartex" xmlns:cx4="http://schemas.microsoft.com/office/drawing/2016/5/10/chartex" xmlns:cx5="http://schemas.microsoft.com/office/drawing/2016/5/11/chartex" xmlns:cx6="http://schemas.microsoft.com/office/drawing/2016/5/12/chartex" xmlns:cx7="http://schemas.microsoft.com/office/drawing/2016/5/13/chartex" xmlns:cx8="http://schemas.microsoft.com/office/drawing/2016/5/14/chartex" xmlns:mc="http://schemas.openxmlformats.org/markup-compatibility/2006" xmlns:m="http://schemas.openxmlformats.org/officeDocument/2006/math" xmlns:aink="http://schemas.microsoft.com/office/drawing/2016/ink" xmlns:am3d="http://schemas.microsoft.com/office/drawing/2017/model3d" xmlns:oel="http://schemas.microsoft.com/office/2019/extlst" xmlns:r="http://schemas.openxmlformats.org/officeDocument/2006/relationships" xmlns:wp14="http://schemas.microsoft.com/office/word/2010/wordprocessingDrawing" xmlns:wp="http://schemas.openxmlformats.org/drawingml/2006/wordprocessingDrawing" xmlns:wpg="http://schemas.microsoft.com/office/word/2010/wordprocessingGroup" xmlns:wpi="http://schemas.microsoft.com/office/word/2010/wordprocessingInk" xmlns:wps="http://schemas.microsoft.com/office/word/2010/wordprocessingShape" xmlns:o="urn:schemas-microsoft-com:office:office" xmlns:v="urn:schemas-microsoft-com:vml" xmlns:w10="urn:schemas-microsoft-com:office:word" xmlns:w="http://schemas.openxmlformats.org/wordprocessingml/2006/main" xmlns:w14="http://schemas.microsoft.com/office/word/2010/wordml" xmlns:w15="http://schemas.microsoft.com/office/word/2012/wordml" xmlns:w16cex="http://schemas.microsoft.com/office/word/2018/wordml/cex" xmlns:w16cid="http://schemas.microsoft.com/office/word/2016/wordml/cid" xmlns:w16="http://schemas.microsoft.com/office/word/2018/wordml" xmlns:w16sdtdh="http://schemas.microsoft.com/office/word/2020/wordml/sdtdatahash" xmlns:w16sdtfl="http://schemas.microsoft.com/office/word/2024/wordml/sdtformatlock" xmlns:w16se="http://schemas.microsoft.com/office/word/2015/wordml/symex" xmlns:w16du="http://schemas.microsoft.com/office/word/2023/wordml/word16du" xmlns:wne="http://schemas.microsoft.com/office/word/2006/wordml" mc:Ignorable="w14 w15 w16se w16cid w16 w16cex w16sdtdh w16sdtfl w16du wp14">
+<w:document xmlns:wpc="http://schemas.microsoft.com/office/word/2010/wordprocessingCanvas" xmlns:cx="http://schemas.microsoft.com/office/drawing/2014/chartex" xmlns:cx1="http://schemas.microsoft.com/office/drawing/2015/9/8/chartex" xmlns:cx2="http://schemas.microsoft.com/office/drawing/2015/10/21/chartex" xmlns:cx3="http://schemas.microsoft.com/office/drawing/2016/5/9/chartex" xmlns:cx4="http://schemas.microsoft.com/office/drawing/2016/5/10/chartex" xmlns:cx5="http://schemas.microsoft.com/office/drawing/2016/5/11/chartex" xmlns:cx6="http://schemas.microsoft.com/office/drawing/2016/5/12/chartex" xmlns:cx7="http://schemas.microsoft.com/office/drawing/2016/5/13/chartex" xmlns:cx8="http://schemas.microsoft.com/office/drawing/2016/5/14/chartex" xmlns:mc="http://schemas.openxmlformats.org/markup-compatibility/2006" xmlns:aink="http://schemas.microsoft.com/office/drawing/2016/ink" xmlns:am3d="http://schemas.microsoft.com/office/drawing/2017/model3d" xmlns:o="urn:schemas-microsoft-com:office:office" xmlns:oel="http://schemas.microsoft.com/office/2019/extlst" xmlns:r="http://schemas.openxmlformats.org/officeDocument/2006/relationships" xmlns:m="http://schemas.openxmlformats.org/officeDocument/2006/math" xmlns:v="urn:schemas-microsoft-com:vml" xmlns:wp14="http://schemas.microsoft.com/office/word/2010/wordprocessingDrawing" xmlns:wp="http://schemas.openxmlformats.org/drawingml/2006/wordprocessingDrawing" xmlns:w10="urn:schemas-microsoft-com:office:word" xmlns:w="http://schemas.openxmlformats.org/wordprocessingml/2006/main" xmlns:w14="http://schemas.microsoft.com/office/word/2010/wordml" xmlns:w15="http://schemas.microsoft.com/office/word/2012/wordml" xmlns:w16cex="http://schemas.microsoft.com/office/word/2018/wordml/cex" xmlns:w16cid="http://schemas.microsoft.com/office/word/2016/wordml/cid" xmlns:w16="http://schemas.microsoft.com/office/word/2018/wordml" xmlns:w16du="http://schemas.microsoft.com/office/word/2023/wordml/word16du" xmlns:w16sdtdh="http://schemas.microsoft.com/office/word/2020/wordml/sdtdatahash" xmlns:w16sdtfl="http://schemas.microsoft.com/office/word/2024/wordml/sdtformatlock" xmlns:w16se="http://schemas.microsoft.com/office/word/2015/wordml/symex" xmlns:wpg="http://schemas.microsoft.com/office/word/2010/wordprocessingGroup" xmlns:wpi="http://schemas.microsoft.com/office/word/2010/wordprocessingInk" xmlns:wne="http://schemas.microsoft.com/office/word/2006/wordml" xmlns:wps="http://schemas.microsoft.com/office/word/2010/wordprocessingShape" mc:Ignorable="w14 w15 w16se w16cid w16 w16cex w16sdtdh w16sdtfl w16du wp14">
   <w:body>
     <w:p>
       <w:pPr>
@@ -278,21 +278,7 @@
               <w:rPr>
                 <w:lang w:val="en-US"/>
               </w:rPr>
-              <w:t xml:space="preserve"> Sonam </w:t>
-            </w:r>
-            <w:proofErr w:type="spellStart"/>
-            <w:r>
-              <w:rPr>
-                <w:lang w:val="en-US"/>
-              </w:rPr>
-              <w:t>Pelden</w:t>
-            </w:r>
-            <w:proofErr w:type="spellEnd"/>
-            <w:r>
-              <w:rPr>
-                <w:lang w:val="en-US"/>
-              </w:rPr>
-              <w:t xml:space="preserve">, </w:t>
+              <w:t xml:space="preserve"> Sonam Pelden, </w:t>
             </w:r>
             <w:r>
               <w:rPr>
@@ -733,8 +719,6 @@
             </w:pPr>
             <w:r>
               <w:rPr>
-                <w:sz w:val="20"/>
-                <w:szCs w:val="20"/>
                 <w:lang w:val="en-NZ" w:eastAsia="en-NZ"/>
               </w:rPr>
               <w:t xml:space="preserve">Charity </w:t>
@@ -742,8 +726,6 @@
             <w:proofErr w:type="spellStart"/>
             <w:r>
               <w:rPr>
-                <w:sz w:val="20"/>
-                <w:szCs w:val="20"/>
                 <w:lang w:val="en-NZ" w:eastAsia="en-NZ"/>
               </w:rPr>
               <w:t>Gwese</w:t>
@@ -977,10 +959,7 @@
             </w:pPr>
             <w:r>
               <w:rPr>
-                <w:rFonts w:ascii="Calibri" w:eastAsia="Times New Roman" w:hAnsi="Calibri" w:cs="Calibri"/>
-                <w:kern w:val="0"/>
                 <w:lang w:val="en-NZ" w:eastAsia="en-NZ"/>
-                <w14:ligatures w14:val="none"/>
               </w:rPr>
               <w:t>Zair Adil Soomro</w:t>
             </w:r>
@@ -1004,10 +983,7 @@
             </w:pPr>
             <w:r>
               <w:rPr>
-                <w:rFonts w:ascii="Calibri" w:eastAsia="Times New Roman" w:hAnsi="Calibri" w:cs="Calibri"/>
-                <w:kern w:val="0"/>
                 <w:lang w:eastAsia="en-NZ"/>
-                <w14:ligatures w14:val="none"/>
               </w:rPr>
               <w:t>CIHE250922</w:t>
             </w:r>
@@ -1236,8 +1212,6 @@
       <w:sdtPr>
         <w:rPr>
           <w:rFonts w:asciiTheme="minorHAnsi" w:eastAsiaTheme="minorHAnsi" w:hAnsiTheme="minorHAnsi" w:cstheme="minorBidi"/>
-          <w:b w:val="0"/>
-          <w:bCs w:val="0"/>
           <w:color w:val="auto"/>
           <w:kern w:val="2"/>
           <w:sz w:val="22"/>
@@ -1253,6 +1227,8 @@
       </w:sdtPr>
       <w:sdtEndPr>
         <w:rPr>
+          <w:b w:val="0"/>
+          <w:bCs w:val="0"/>
           <w:noProof/>
         </w:rPr>
       </w:sdtEndPr>
@@ -1268,9 +1244,6 @@
         <w:p>
           <w:pPr>
             <w:pStyle w:val="TOC1"/>
-            <w:tabs>
-              <w:tab w:val="right" w:leader="dot" w:pos="9016"/>
-            </w:tabs>
             <w:rPr>
               <w:rFonts w:eastAsiaTheme="minorEastAsia"/>
               <w:noProof/>
@@ -1349,9 +1322,6 @@
         <w:p>
           <w:pPr>
             <w:pStyle w:val="TOC1"/>
-            <w:tabs>
-              <w:tab w:val="right" w:leader="dot" w:pos="9016"/>
-            </w:tabs>
             <w:rPr>
               <w:rFonts w:eastAsiaTheme="minorEastAsia"/>
               <w:noProof/>
@@ -1421,9 +1391,6 @@
         <w:p>
           <w:pPr>
             <w:pStyle w:val="TOC2"/>
-            <w:tabs>
-              <w:tab w:val="right" w:leader="dot" w:pos="9016"/>
-            </w:tabs>
             <w:rPr>
               <w:rFonts w:eastAsiaTheme="minorEastAsia"/>
               <w:noProof/>
@@ -1493,9 +1460,6 @@
         <w:p>
           <w:pPr>
             <w:pStyle w:val="TOC2"/>
-            <w:tabs>
-              <w:tab w:val="right" w:leader="dot" w:pos="9016"/>
-            </w:tabs>
             <w:rPr>
               <w:rFonts w:eastAsiaTheme="minorEastAsia"/>
               <w:noProof/>
@@ -1565,9 +1529,6 @@
         <w:p>
           <w:pPr>
             <w:pStyle w:val="TOC2"/>
-            <w:tabs>
-              <w:tab w:val="right" w:leader="dot" w:pos="9016"/>
-            </w:tabs>
             <w:rPr>
               <w:rFonts w:eastAsiaTheme="minorEastAsia"/>
               <w:noProof/>
@@ -1637,9 +1598,6 @@
         <w:p>
           <w:pPr>
             <w:pStyle w:val="TOC2"/>
-            <w:tabs>
-              <w:tab w:val="right" w:leader="dot" w:pos="9016"/>
-            </w:tabs>
             <w:rPr>
               <w:rFonts w:eastAsiaTheme="minorEastAsia"/>
               <w:noProof/>
@@ -1709,9 +1667,6 @@
         <w:p>
           <w:pPr>
             <w:pStyle w:val="TOC1"/>
-            <w:tabs>
-              <w:tab w:val="right" w:leader="dot" w:pos="9016"/>
-            </w:tabs>
             <w:rPr>
               <w:rFonts w:eastAsiaTheme="minorEastAsia"/>
               <w:noProof/>
@@ -1781,9 +1736,6 @@
         <w:p>
           <w:pPr>
             <w:pStyle w:val="TOC2"/>
-            <w:tabs>
-              <w:tab w:val="right" w:leader="dot" w:pos="9016"/>
-            </w:tabs>
             <w:rPr>
               <w:rFonts w:eastAsiaTheme="minorEastAsia"/>
               <w:noProof/>
@@ -1853,9 +1805,6 @@
         <w:p>
           <w:pPr>
             <w:pStyle w:val="TOC2"/>
-            <w:tabs>
-              <w:tab w:val="right" w:leader="dot" w:pos="9016"/>
-            </w:tabs>
             <w:rPr>
               <w:rFonts w:eastAsiaTheme="minorEastAsia"/>
               <w:noProof/>
@@ -1925,9 +1874,6 @@
         <w:p>
           <w:pPr>
             <w:pStyle w:val="TOC2"/>
-            <w:tabs>
-              <w:tab w:val="right" w:leader="dot" w:pos="9016"/>
-            </w:tabs>
             <w:rPr>
               <w:rFonts w:eastAsiaTheme="minorEastAsia"/>
               <w:noProof/>
@@ -1997,9 +1943,6 @@
         <w:p>
           <w:pPr>
             <w:pStyle w:val="TOC2"/>
-            <w:tabs>
-              <w:tab w:val="right" w:leader="dot" w:pos="9016"/>
-            </w:tabs>
             <w:rPr>
               <w:rFonts w:eastAsiaTheme="minorEastAsia"/>
               <w:noProof/>
@@ -2069,9 +2012,6 @@
         <w:p>
           <w:pPr>
             <w:pStyle w:val="TOC2"/>
-            <w:tabs>
-              <w:tab w:val="right" w:leader="dot" w:pos="9016"/>
-            </w:tabs>
             <w:rPr>
               <w:rFonts w:eastAsiaTheme="minorEastAsia"/>
               <w:noProof/>
@@ -2141,9 +2081,6 @@
         <w:p>
           <w:pPr>
             <w:pStyle w:val="TOC1"/>
-            <w:tabs>
-              <w:tab w:val="right" w:leader="dot" w:pos="9016"/>
-            </w:tabs>
             <w:rPr>
               <w:rFonts w:eastAsiaTheme="minorEastAsia"/>
               <w:noProof/>
@@ -2213,9 +2150,6 @@
         <w:p>
           <w:pPr>
             <w:pStyle w:val="TOC2"/>
-            <w:tabs>
-              <w:tab w:val="right" w:leader="dot" w:pos="9016"/>
-            </w:tabs>
             <w:rPr>
               <w:rFonts w:eastAsiaTheme="minorEastAsia"/>
               <w:noProof/>
@@ -2285,9 +2219,6 @@
         <w:p>
           <w:pPr>
             <w:pStyle w:val="TOC2"/>
-            <w:tabs>
-              <w:tab w:val="right" w:leader="dot" w:pos="9016"/>
-            </w:tabs>
             <w:rPr>
               <w:rFonts w:eastAsiaTheme="minorEastAsia"/>
               <w:noProof/>
@@ -2357,9 +2288,6 @@
         <w:p>
           <w:pPr>
             <w:pStyle w:val="TOC2"/>
-            <w:tabs>
-              <w:tab w:val="right" w:leader="dot" w:pos="9016"/>
-            </w:tabs>
             <w:rPr>
               <w:rFonts w:eastAsiaTheme="minorEastAsia"/>
               <w:noProof/>
@@ -2429,9 +2357,6 @@
         <w:p>
           <w:pPr>
             <w:pStyle w:val="TOC2"/>
-            <w:tabs>
-              <w:tab w:val="right" w:leader="dot" w:pos="9016"/>
-            </w:tabs>
             <w:rPr>
               <w:rFonts w:eastAsiaTheme="minorEastAsia"/>
               <w:noProof/>
@@ -2501,9 +2426,6 @@
         <w:p>
           <w:pPr>
             <w:pStyle w:val="TOC1"/>
-            <w:tabs>
-              <w:tab w:val="right" w:leader="dot" w:pos="9016"/>
-            </w:tabs>
             <w:rPr>
               <w:rFonts w:eastAsiaTheme="minorEastAsia"/>
               <w:noProof/>
@@ -2573,9 +2495,6 @@
         <w:p>
           <w:pPr>
             <w:pStyle w:val="TOC2"/>
-            <w:tabs>
-              <w:tab w:val="right" w:leader="dot" w:pos="9016"/>
-            </w:tabs>
             <w:rPr>
               <w:rFonts w:eastAsiaTheme="minorEastAsia"/>
               <w:noProof/>
@@ -2645,9 +2564,6 @@
         <w:p>
           <w:pPr>
             <w:pStyle w:val="TOC2"/>
-            <w:tabs>
-              <w:tab w:val="right" w:leader="dot" w:pos="9016"/>
-            </w:tabs>
             <w:rPr>
               <w:rFonts w:eastAsiaTheme="minorEastAsia"/>
               <w:noProof/>
@@ -2717,9 +2633,6 @@
         <w:p>
           <w:pPr>
             <w:pStyle w:val="TOC2"/>
-            <w:tabs>
-              <w:tab w:val="right" w:leader="dot" w:pos="9016"/>
-            </w:tabs>
             <w:rPr>
               <w:rFonts w:eastAsiaTheme="minorEastAsia"/>
               <w:noProof/>
@@ -2789,9 +2702,6 @@
         <w:p>
           <w:pPr>
             <w:pStyle w:val="TOC2"/>
-            <w:tabs>
-              <w:tab w:val="right" w:leader="dot" w:pos="9016"/>
-            </w:tabs>
             <w:rPr>
               <w:rFonts w:eastAsiaTheme="minorEastAsia"/>
               <w:noProof/>
@@ -2861,9 +2771,6 @@
         <w:p>
           <w:pPr>
             <w:pStyle w:val="TOC1"/>
-            <w:tabs>
-              <w:tab w:val="right" w:leader="dot" w:pos="9016"/>
-            </w:tabs>
             <w:rPr>
               <w:rFonts w:eastAsiaTheme="minorEastAsia"/>
               <w:noProof/>
@@ -2933,9 +2840,6 @@
         <w:p>
           <w:pPr>
             <w:pStyle w:val="TOC2"/>
-            <w:tabs>
-              <w:tab w:val="right" w:leader="dot" w:pos="9016"/>
-            </w:tabs>
             <w:rPr>
               <w:rFonts w:eastAsiaTheme="minorEastAsia"/>
               <w:noProof/>
@@ -3005,9 +2909,6 @@
         <w:p>
           <w:pPr>
             <w:pStyle w:val="TOC2"/>
-            <w:tabs>
-              <w:tab w:val="right" w:leader="dot" w:pos="9016"/>
-            </w:tabs>
             <w:rPr>
               <w:rFonts w:eastAsiaTheme="minorEastAsia"/>
               <w:noProof/>
@@ -3077,9 +2978,6 @@
         <w:p>
           <w:pPr>
             <w:pStyle w:val="TOC2"/>
-            <w:tabs>
-              <w:tab w:val="right" w:leader="dot" w:pos="9016"/>
-            </w:tabs>
             <w:rPr>
               <w:rFonts w:eastAsiaTheme="minorEastAsia"/>
               <w:noProof/>
@@ -3149,9 +3047,6 @@
         <w:p>
           <w:pPr>
             <w:pStyle w:val="TOC1"/>
-            <w:tabs>
-              <w:tab w:val="right" w:leader="dot" w:pos="9016"/>
-            </w:tabs>
             <w:rPr>
               <w:rFonts w:eastAsiaTheme="minorEastAsia"/>
               <w:noProof/>
@@ -3221,9 +3116,6 @@
         <w:p>
           <w:pPr>
             <w:pStyle w:val="TOC1"/>
-            <w:tabs>
-              <w:tab w:val="right" w:leader="dot" w:pos="9016"/>
-            </w:tabs>
             <w:rPr>
               <w:rFonts w:eastAsiaTheme="minorEastAsia"/>
               <w:noProof/>
@@ -3293,9 +3185,6 @@
         <w:p>
           <w:pPr>
             <w:pStyle w:val="TOC1"/>
-            <w:tabs>
-              <w:tab w:val="right" w:leader="dot" w:pos="9016"/>
-            </w:tabs>
             <w:rPr>
               <w:rFonts w:eastAsiaTheme="minorEastAsia"/>
               <w:noProof/>
@@ -3438,15 +3327,7 @@
         <w:t xml:space="preserve">or </w:t>
       </w:r>
       <w:r>
-        <w:t>validate FHIR-enabled data exchange and clinical terminology mapping with the EMRs that MedTalk Connect interfaces with, prior to implementation into production (FAZ Australia, 2026b). This gap presents a direct cybersecurity, privacy and clinical-safety issue because as systems change, connector and terminology-mapping changes are informally tested with systems near to or overlapping with real clinical data; this is not in line with obligations under the Privacy Act 1988 (Cth) and the My Health Records Act 2012 (</w:t>
-      </w:r>
-      <w:proofErr w:type="spellStart"/>
-      <w:r>
-        <w:t>Cth</w:t>
-      </w:r>
-      <w:proofErr w:type="spellEnd"/>
-      <w:r>
-        <w:t>).</w:t>
+        <w:t>validate FHIR-enabled data exchange and clinical terminology mapping with the EMRs that MedTalk Connect interfaces with, prior to implementation into production (FAZ Australia, 2026b). This gap presents a direct cybersecurity, privacy and clinical-safety issue because as systems change, connector and terminology-mapping changes are informally tested with systems near to or overlapping with real clinical data; this is not in line with obligations under the Privacy Act 1988 (Cth) and the My Health Records Act 2012 (Cth).</w:t>
       </w:r>
     </w:p>
     <w:p>
@@ -3517,13 +3398,8 @@
       </w:r>
       <w:proofErr w:type="gramEnd"/>
       <w:r>
-        <w:t xml:space="preserve"> production that they pose a real data risk. This puts the organisation at risk of clinical-safety, privacy and compliance issues with the Privacy Act 1988 (Cth) and the My Health Records Act 2012 (</w:t>
-      </w:r>
-      <w:proofErr w:type="spellStart"/>
-      <w:r>
-        <w:t>Cth</w:t>
-      </w:r>
-      <w:proofErr w:type="spellEnd"/>
+        <w:t xml:space="preserve"> production that they pose a real data risk. This puts the organisation at risk of clinical-safety, privacy and compliance issues with the Privacy Act 1988 (Cth) and the My Health Records Act 2012 (Cth</w:t>
+      </w:r>
       <w:r>
         <w:t>) and</w:t>
       </w:r>
@@ -3597,9 +3473,6 @@
       </w:r>
     </w:p>
     <w:p>
-      <w:pPr>
-        <w:jc w:val="center"/>
-      </w:pPr>
       <w:r>
         <w:t>Figure X: System context Diagram.</w:t>
       </w:r>
@@ -3627,17 +3500,7 @@
       </w:r>
     </w:p>
     <w:p>
-      <w:pPr>
-        <w:rPr>
-          <w:b/>
-          <w:bCs/>
-        </w:rPr>
-      </w:pPr>
-      <w:r>
-        <w:rPr>
-          <w:b/>
-          <w:bCs/>
-        </w:rPr>
+      <w:r>
         <w:t>SMART Objectives:</w:t>
       </w:r>
     </w:p>
@@ -3702,17 +3565,7 @@
       </w:r>
     </w:p>
     <w:p>
-      <w:pPr>
-        <w:rPr>
-          <w:b/>
-          <w:bCs/>
-        </w:rPr>
-      </w:pPr>
-      <w:r>
-        <w:rPr>
-          <w:b/>
-          <w:bCs/>
-        </w:rPr>
+      <w:r>
         <w:t>Measurable Success Criteria:</w:t>
       </w:r>
     </w:p>
@@ -3792,17 +3645,7 @@
       </w:r>
     </w:p>
     <w:p>
-      <w:pPr>
-        <w:rPr>
-          <w:b/>
-          <w:bCs/>
-        </w:rPr>
-      </w:pPr>
-      <w:r>
-        <w:rPr>
-          <w:b/>
-          <w:bCs/>
-        </w:rPr>
+      <w:r>
         <w:t>In Scope:</w:t>
       </w:r>
     </w:p>
@@ -3843,17 +3686,7 @@
       </w:r>
     </w:p>
     <w:p>
-      <w:pPr>
-        <w:rPr>
-          <w:b/>
-          <w:bCs/>
-        </w:rPr>
-      </w:pPr>
-      <w:r>
-        <w:rPr>
-          <w:b/>
-          <w:bCs/>
-        </w:rPr>
+      <w:r>
         <w:t>Out of Scope:</w:t>
       </w:r>
     </w:p>
@@ -3915,17 +3748,7 @@
       </w:r>
     </w:p>
     <w:p>
-      <w:pPr>
-        <w:rPr>
-          <w:b/>
-          <w:bCs/>
-        </w:rPr>
-      </w:pPr>
-      <w:r>
-        <w:rPr>
-          <w:b/>
-          <w:bCs/>
-        </w:rPr>
+      <w:r>
         <w:t>Assumptions:</w:t>
       </w:r>
     </w:p>
@@ -3966,17 +3789,7 @@
       </w:r>
     </w:p>
     <w:p>
-      <w:pPr>
-        <w:rPr>
-          <w:b/>
-          <w:bCs/>
-        </w:rPr>
-      </w:pPr>
-      <w:r>
-        <w:rPr>
-          <w:b/>
-          <w:bCs/>
-        </w:rPr>
+      <w:r>
         <w:t>Constraints:</w:t>
       </w:r>
     </w:p>
@@ -4073,7 +3886,7 @@
         <w:tc>
           <w:tcPr>
             <w:tcW w:w="2254" w:type="dxa"/>
-            <w:shd w:val="clear" w:color="auto" w:fill="8DD873" w:themeFill="accent6" w:themeFillTint="99"/>
+            <w:shd w:val="clear" w:color="auto" w:fill="92D050"/>
           </w:tcPr>
           <w:p>
             <w:bookmarkStart w:id="6" w:name="_Toc238803236"/>
@@ -4085,7 +3898,7 @@
         <w:tc>
           <w:tcPr>
             <w:tcW w:w="2254" w:type="dxa"/>
-            <w:shd w:val="clear" w:color="auto" w:fill="8DD873" w:themeFill="accent6" w:themeFillTint="99"/>
+            <w:shd w:val="clear" w:color="auto" w:fill="92D050"/>
           </w:tcPr>
           <w:p>
             <w:r>
@@ -4096,7 +3909,7 @@
         <w:tc>
           <w:tcPr>
             <w:tcW w:w="2254" w:type="dxa"/>
-            <w:shd w:val="clear" w:color="auto" w:fill="8DD873" w:themeFill="accent6" w:themeFillTint="99"/>
+            <w:shd w:val="clear" w:color="auto" w:fill="92D050"/>
           </w:tcPr>
           <w:p>
             <w:r>
@@ -4107,7 +3920,7 @@
         <w:tc>
           <w:tcPr>
             <w:tcW w:w="2254" w:type="dxa"/>
-            <w:shd w:val="clear" w:color="auto" w:fill="8DD873" w:themeFill="accent6" w:themeFillTint="99"/>
+            <w:shd w:val="clear" w:color="auto" w:fill="92D050"/>
           </w:tcPr>
           <w:p>
             <w:r>
@@ -4372,17 +4185,7 @@
     </w:tbl>
     <w:p/>
     <w:p>
-      <w:pPr>
-        <w:rPr>
-          <w:b/>
-          <w:bCs/>
-        </w:rPr>
-      </w:pPr>
-      <w:r>
-        <w:rPr>
-          <w:b/>
-          <w:bCs/>
-        </w:rPr>
+      <w:r>
         <w:t>Functional and Non-Functional Requirements Summary:</w:t>
       </w:r>
     </w:p>
@@ -4506,12 +4309,26 @@
     </w:p>
     <w:p>
       <w:r>
-        <w:t>Project Purpose: Develop and provide a synthetic, standards-based FHIR test harness, to help FAZ Australia test MedTalk Connect's interoperability and clinical terminology mapping without real patient data.</w:t>
-      </w:r>
-    </w:p>
-    <w:p>
-      <w:r>
-        <w:t xml:space="preserve">Project Scope: Architecture design, terminology mapping logic (SNOMED CT-AU to ICD-10-AM to MBS); and a written test plan for the 3 EMR connectors (Stage 1); </w:t>
+        <w:rPr>
+          <w:b/>
+          <w:bCs/>
+        </w:rPr>
+        <w:t>Project Purpose</w:t>
+      </w:r>
+      <w:r>
+        <w:t>: Develop and provide a synthetic, standards-based FHIR test harness, to help FAZ Australia test MedTalk Connect's interoperability and clinical terminology mapping without real patient data.</w:t>
+      </w:r>
+    </w:p>
+    <w:p>
+      <w:r>
+        <w:rPr>
+          <w:b/>
+          <w:bCs/>
+        </w:rPr>
+        <w:t>Project Scope</w:t>
+      </w:r>
+      <w:r>
+        <w:t xml:space="preserve">: Architecture design, terminology mapping logic (SNOMED CT-AU to ICD-10-AM to MBS); and a written test plan for the 3 EMR connectors (Stage 1); </w:t>
       </w:r>
       <w:r>
         <w:t>b</w:t>
@@ -4522,17 +4339,38 @@
     </w:p>
     <w:p>
       <w:r>
-        <w:t>Key Stakeholders: Atif Nisar (FAZ Australia, Project Sponsor/Industry Mentor), Md Ashraf Uddin (Academic Supervisor), Project Team, MedTalk Connect Engineering Team, Connected EMR Vendors.</w:t>
-      </w:r>
-    </w:p>
-    <w:p>
-      <w:r>
-        <w:t>Key Deliverables: Architecture diagram; synthetic test-data plan; written test plan for happy path, error handling and degradation scenarios; feasibility and risk analysis; working proof-of-concept test harness (Stage 2).</w:t>
-      </w:r>
-    </w:p>
-    <w:p>
-      <w:r>
-        <w:t xml:space="preserve">Acceptance Criteria: </w:t>
+        <w:rPr>
+          <w:b/>
+          <w:bCs/>
+        </w:rPr>
+        <w:t>Key Stakeholders</w:t>
+      </w:r>
+      <w:r>
+        <w:t>: Atif Nisar (FAZ Australia, Project Sponsor/Industry Mentor), Md Ashraf Uddin (Academic Supervisor), Project Team, MedTalk Connect Engineering Team, Connected EMR Vendors.</w:t>
+      </w:r>
+    </w:p>
+    <w:p>
+      <w:r>
+        <w:rPr>
+          <w:b/>
+          <w:bCs/>
+        </w:rPr>
+        <w:t>Key Deliverables</w:t>
+      </w:r>
+      <w:r>
+        <w:t>: Architecture diagram; synthetic test-data plan; written test plan for happy path, error handling and degradation scenarios; feasibility and risk analysis; working proof-of-concept test harness (Stage 2).</w:t>
+      </w:r>
+    </w:p>
+    <w:p>
+      <w:r>
+        <w:rPr>
+          <w:b/>
+          <w:bCs/>
+        </w:rPr>
+        <w:t>Acceptance Criteria</w:t>
+      </w:r>
+      <w:r>
+        <w:t xml:space="preserve">: </w:t>
       </w:r>
       <w:r>
         <w:t>Architecture is reviewed and approved by the industry mentor, test-data plan is validated to provide representative SNOMED CT-AU scenarios, test plan includes all three connectors, weighted according to the maturity, with zero real patient data used at any stage.</w:t>
@@ -4540,7 +4378,14 @@
     </w:p>
     <w:p>
       <w:r>
-        <w:t xml:space="preserve">Project Authority: </w:t>
+        <w:rPr>
+          <w:b/>
+          <w:bCs/>
+        </w:rPr>
+        <w:t>Project Authority</w:t>
+      </w:r>
+      <w:r>
+        <w:t xml:space="preserve">: </w:t>
       </w:r>
       <w:r>
         <w:t>The scope changes, stage-gate deliverables are approved by Project Authority comprising Md Ashraf Uddin (Academic Supervisor) and Atif Nisar (Industry Mentor).</w:t>
@@ -4548,10 +4393,21 @@
     </w:p>
     <w:p>
       <w:r>
+        <w:rPr>
+          <w:b/>
+          <w:bCs/>
+        </w:rPr>
         <w:t>Expected</w:t>
       </w:r>
       <w:r>
-        <w:t xml:space="preserve"> Business Value: Clinical-safety and compliance risk minimised, speeds up connector onboarding, and provides the business with a reusable CI/CD testing asset for FAZ Australia.</w:t>
+        <w:rPr>
+          <w:b/>
+          <w:bCs/>
+        </w:rPr>
+        <w:t xml:space="preserve"> Business Value</w:t>
+      </w:r>
+      <w:r>
+        <w:t>: Clinical-safety and compliance risk minimised, speeds up connector onboarding, and provides the business with a reusable CI/CD testing asset for FAZ Australia.</w:t>
       </w:r>
     </w:p>
     <w:p/>
@@ -4586,7 +4442,7 @@
         <w:tc>
           <w:tcPr>
             <w:tcW w:w="3005" w:type="dxa"/>
-            <w:shd w:val="clear" w:color="auto" w:fill="8DD873" w:themeFill="accent6" w:themeFillTint="99"/>
+            <w:shd w:val="clear" w:color="auto" w:fill="92D050"/>
           </w:tcPr>
           <w:p>
             <w:r>
@@ -4597,7 +4453,7 @@
         <w:tc>
           <w:tcPr>
             <w:tcW w:w="3005" w:type="dxa"/>
-            <w:shd w:val="clear" w:color="auto" w:fill="8DD873" w:themeFill="accent6" w:themeFillTint="99"/>
+            <w:shd w:val="clear" w:color="auto" w:fill="92D050"/>
           </w:tcPr>
           <w:p>
             <w:r>
@@ -4608,7 +4464,7 @@
         <w:tc>
           <w:tcPr>
             <w:tcW w:w="3006" w:type="dxa"/>
-            <w:shd w:val="clear" w:color="auto" w:fill="8DD873" w:themeFill="accent6" w:themeFillTint="99"/>
+            <w:shd w:val="clear" w:color="auto" w:fill="92D050"/>
           </w:tcPr>
           <w:p>
             <w:r>
@@ -4851,7 +4707,7 @@
         <w:tc>
           <w:tcPr>
             <w:tcW w:w="2900" w:type="dxa"/>
-            <w:shd w:val="clear" w:color="auto" w:fill="1F4E79"/>
+            <w:shd w:val="clear" w:color="auto" w:fill="92D050"/>
             <w:tcMar>
               <w:top w:w="80" w:type="dxa"/>
               <w:left w:w="100" w:type="dxa"/>
@@ -4868,7 +4724,7 @@
         <w:tc>
           <w:tcPr>
             <w:tcW w:w="1550" w:type="dxa"/>
-            <w:shd w:val="clear" w:color="auto" w:fill="1F4E79"/>
+            <w:shd w:val="clear" w:color="auto" w:fill="92D050"/>
             <w:tcMar>
               <w:top w:w="80" w:type="dxa"/>
               <w:left w:w="100" w:type="dxa"/>
@@ -4885,7 +4741,7 @@
         <w:tc>
           <w:tcPr>
             <w:tcW w:w="1550" w:type="dxa"/>
-            <w:shd w:val="clear" w:color="auto" w:fill="1F4E79"/>
+            <w:shd w:val="clear" w:color="auto" w:fill="92D050"/>
             <w:tcMar>
               <w:top w:w="80" w:type="dxa"/>
               <w:left w:w="100" w:type="dxa"/>
@@ -4902,7 +4758,7 @@
         <w:tc>
           <w:tcPr>
             <w:tcW w:w="1550" w:type="dxa"/>
-            <w:shd w:val="clear" w:color="auto" w:fill="1F4E79"/>
+            <w:shd w:val="clear" w:color="auto" w:fill="92D050"/>
             <w:tcMar>
               <w:top w:w="80" w:type="dxa"/>
               <w:left w:w="100" w:type="dxa"/>
@@ -4919,7 +4775,7 @@
         <w:tc>
           <w:tcPr>
             <w:tcW w:w="1476" w:type="dxa"/>
-            <w:shd w:val="clear" w:color="auto" w:fill="1F4E79"/>
+            <w:shd w:val="clear" w:color="auto" w:fill="92D050"/>
             <w:tcMar>
               <w:top w:w="80" w:type="dxa"/>
               <w:left w:w="100" w:type="dxa"/>
@@ -5597,17 +5453,11 @@
       </w:r>
     </w:p>
     <w:p>
-      <w:pPr>
-        <w:jc w:val="both"/>
-      </w:pPr>
       <w:r>
         <w:t>R = Responsible, A = Accountable, C = Consulted, I = Informed.</w:t>
       </w:r>
     </w:p>
     <w:p>
-      <w:pPr>
-        <w:jc w:val="both"/>
-      </w:pPr>
       <w:r>
         <w:t>Sonam holds overall accountability as Project Lead, chairing check-ins and resolving scope conflicts; Charity leads clinical-data accuracy decisions; Rikesh leads technical/integration trade-offs; Zubair leads quality assurance and documentation standards. Leadership was distributed by domain rather than centralised, which kept decisions close to the person with the relevant expertise and reduced review bottlenecks going into Stage 2.</w:t>
       </w:r>
@@ -5644,20 +5494,20 @@
         <w:tblLook w:val="0000" w:firstRow="0" w:lastRow="0" w:firstColumn="0" w:lastColumn="0" w:noHBand="0" w:noVBand="0"/>
       </w:tblPr>
       <w:tblGrid>
-        <w:gridCol w:w="499"/>
-        <w:gridCol w:w="2196"/>
-        <w:gridCol w:w="1004"/>
-        <w:gridCol w:w="846"/>
-        <w:gridCol w:w="650"/>
-        <w:gridCol w:w="800"/>
-        <w:gridCol w:w="2293"/>
-        <w:gridCol w:w="712"/>
+        <w:gridCol w:w="569"/>
+        <w:gridCol w:w="1812"/>
+        <w:gridCol w:w="1178"/>
+        <w:gridCol w:w="977"/>
+        <w:gridCol w:w="751"/>
+        <w:gridCol w:w="977"/>
+        <w:gridCol w:w="1905"/>
+        <w:gridCol w:w="831"/>
       </w:tblGrid>
       <w:tr>
         <w:tc>
           <w:tcPr>
             <w:tcW w:w="500" w:type="dxa"/>
-            <w:shd w:val="clear" w:color="auto" w:fill="1F4E79"/>
+            <w:shd w:val="clear" w:color="auto" w:fill="92D050"/>
             <w:tcMar>
               <w:top w:w="80" w:type="dxa"/>
               <w:left w:w="100" w:type="dxa"/>
@@ -5667,13 +5517,6 @@
           </w:tcPr>
           <w:p>
             <w:r>
-              <w:rPr>
-                <w:b/>
-                <w:bCs/>
-                <w:color w:val="FFFFFF"/>
-                <w:sz w:val="17"/>
-                <w:szCs w:val="17"/>
-              </w:rPr>
               <w:t>ID</w:t>
             </w:r>
           </w:p>
@@ -5681,7 +5524,7 @@
         <w:tc>
           <w:tcPr>
             <w:tcW w:w="2300" w:type="dxa"/>
-            <w:shd w:val="clear" w:color="auto" w:fill="1F4E79"/>
+            <w:shd w:val="clear" w:color="auto" w:fill="92D050"/>
             <w:tcMar>
               <w:top w:w="80" w:type="dxa"/>
               <w:left w:w="100" w:type="dxa"/>
@@ -5691,13 +5534,6 @@
           </w:tcPr>
           <w:p>
             <w:r>
-              <w:rPr>
-                <w:b/>
-                <w:bCs/>
-                <w:color w:val="FFFFFF"/>
-                <w:sz w:val="17"/>
-                <w:szCs w:val="17"/>
-              </w:rPr>
               <w:t>Risk</w:t>
             </w:r>
           </w:p>
@@ -5705,7 +5541,7 @@
         <w:tc>
           <w:tcPr>
             <w:tcW w:w="850" w:type="dxa"/>
-            <w:shd w:val="clear" w:color="auto" w:fill="1F4E79"/>
+            <w:shd w:val="clear" w:color="auto" w:fill="92D050"/>
             <w:tcMar>
               <w:top w:w="80" w:type="dxa"/>
               <w:left w:w="100" w:type="dxa"/>
@@ -5715,13 +5551,6 @@
           </w:tcPr>
           <w:p>
             <w:r>
-              <w:rPr>
-                <w:b/>
-                <w:bCs/>
-                <w:color w:val="FFFFFF"/>
-                <w:sz w:val="17"/>
-                <w:szCs w:val="17"/>
-              </w:rPr>
               <w:t>Likelihood</w:t>
             </w:r>
           </w:p>
@@ -5729,7 +5558,7 @@
         <w:tc>
           <w:tcPr>
             <w:tcW w:w="850" w:type="dxa"/>
-            <w:shd w:val="clear" w:color="auto" w:fill="1F4E79"/>
+            <w:shd w:val="clear" w:color="auto" w:fill="92D050"/>
             <w:tcMar>
               <w:top w:w="80" w:type="dxa"/>
               <w:left w:w="100" w:type="dxa"/>
@@ -5739,13 +5568,6 @@
           </w:tcPr>
           <w:p>
             <w:r>
-              <w:rPr>
-                <w:b/>
-                <w:bCs/>
-                <w:color w:val="FFFFFF"/>
-                <w:sz w:val="17"/>
-                <w:szCs w:val="17"/>
-              </w:rPr>
               <w:t>Impact</w:t>
             </w:r>
           </w:p>
@@ -5753,7 +5575,7 @@
         <w:tc>
           <w:tcPr>
             <w:tcW w:w="600" w:type="dxa"/>
-            <w:shd w:val="clear" w:color="auto" w:fill="1F4E79"/>
+            <w:shd w:val="clear" w:color="auto" w:fill="92D050"/>
             <w:tcMar>
               <w:top w:w="80" w:type="dxa"/>
               <w:left w:w="100" w:type="dxa"/>
@@ -5763,13 +5585,6 @@
           </w:tcPr>
           <w:p>
             <w:r>
-              <w:rPr>
-                <w:b/>
-                <w:bCs/>
-                <w:color w:val="FFFFFF"/>
-                <w:sz w:val="17"/>
-                <w:szCs w:val="17"/>
-              </w:rPr>
               <w:t>Score</w:t>
             </w:r>
           </w:p>
@@ -5777,7 +5592,7 @@
         <w:tc>
           <w:tcPr>
             <w:tcW w:w="800" w:type="dxa"/>
-            <w:shd w:val="clear" w:color="auto" w:fill="1F4E79"/>
+            <w:shd w:val="clear" w:color="auto" w:fill="92D050"/>
             <w:tcMar>
               <w:top w:w="80" w:type="dxa"/>
               <w:left w:w="100" w:type="dxa"/>
@@ -5787,13 +5602,6 @@
           </w:tcPr>
           <w:p>
             <w:r>
-              <w:rPr>
-                <w:b/>
-                <w:bCs/>
-                <w:color w:val="FFFFFF"/>
-                <w:sz w:val="17"/>
-                <w:szCs w:val="17"/>
-              </w:rPr>
               <w:t>Rating</w:t>
             </w:r>
           </w:p>
@@ -5801,7 +5609,7 @@
         <w:tc>
           <w:tcPr>
             <w:tcW w:w="2400" w:type="dxa"/>
-            <w:shd w:val="clear" w:color="auto" w:fill="1F4E79"/>
+            <w:shd w:val="clear" w:color="auto" w:fill="92D050"/>
             <w:tcMar>
               <w:top w:w="80" w:type="dxa"/>
               <w:left w:w="100" w:type="dxa"/>
@@ -5811,13 +5619,6 @@
           </w:tcPr>
           <w:p>
             <w:r>
-              <w:rPr>
-                <w:b/>
-                <w:bCs/>
-                <w:color w:val="FFFFFF"/>
-                <w:sz w:val="17"/>
-                <w:szCs w:val="17"/>
-              </w:rPr>
               <w:t>Response</w:t>
             </w:r>
           </w:p>
@@ -5825,7 +5626,7 @@
         <w:tc>
           <w:tcPr>
             <w:tcW w:w="700" w:type="dxa"/>
-            <w:shd w:val="clear" w:color="auto" w:fill="1F4E79"/>
+            <w:shd w:val="clear" w:color="auto" w:fill="92D050"/>
             <w:tcMar>
               <w:top w:w="80" w:type="dxa"/>
               <w:left w:w="100" w:type="dxa"/>
@@ -5835,13 +5636,6 @@
           </w:tcPr>
           <w:p>
             <w:r>
-              <w:rPr>
-                <w:b/>
-                <w:bCs/>
-                <w:color w:val="FFFFFF"/>
-                <w:sz w:val="17"/>
-                <w:szCs w:val="17"/>
-              </w:rPr>
               <w:t>Owner</w:t>
             </w:r>
           </w:p>
@@ -5860,10 +5654,6 @@
           </w:tcPr>
           <w:p>
             <w:r>
-              <w:rPr>
-                <w:sz w:val="17"/>
-                <w:szCs w:val="17"/>
-              </w:rPr>
               <w:lastRenderedPageBreak/>
               <w:t>R1</w:t>
             </w:r>
@@ -5881,10 +5671,6 @@
           </w:tcPr>
           <w:p>
             <w:r>
-              <w:rPr>
-                <w:sz w:val="17"/>
-                <w:szCs w:val="17"/>
-              </w:rPr>
               <w:t>Undetected connector crash/hang on slow FHIR response (&gt;5s)</w:t>
             </w:r>
           </w:p>
@@ -5901,10 +5687,6 @@
           </w:tcPr>
           <w:p>
             <w:r>
-              <w:rPr>
-                <w:sz w:val="17"/>
-                <w:szCs w:val="17"/>
-              </w:rPr>
               <w:t>Medium</w:t>
             </w:r>
           </w:p>
@@ -5921,10 +5703,6 @@
           </w:tcPr>
           <w:p>
             <w:r>
-              <w:rPr>
-                <w:sz w:val="17"/>
-                <w:szCs w:val="17"/>
-              </w:rPr>
               <w:t>High</w:t>
             </w:r>
           </w:p>
@@ -5941,10 +5719,6 @@
           </w:tcPr>
           <w:p>
             <w:r>
-              <w:rPr>
-                <w:sz w:val="17"/>
-                <w:szCs w:val="17"/>
-              </w:rPr>
               <w:t>6</w:t>
             </w:r>
           </w:p>
@@ -5961,10 +5735,6 @@
           </w:tcPr>
           <w:p>
             <w:r>
-              <w:rPr>
-                <w:sz w:val="17"/>
-                <w:szCs w:val="17"/>
-              </w:rPr>
               <w:t>High</w:t>
             </w:r>
           </w:p>
@@ -5981,10 +5751,6 @@
           </w:tcPr>
           <w:p>
             <w:r>
-              <w:rPr>
-                <w:sz w:val="17"/>
-                <w:szCs w:val="17"/>
-              </w:rPr>
               <w:t>Automated slow-response test with timeout/retry validation</w:t>
             </w:r>
           </w:p>
@@ -6001,10 +5767,6 @@
           </w:tcPr>
           <w:p>
             <w:r>
-              <w:rPr>
-                <w:sz w:val="17"/>
-                <w:szCs w:val="17"/>
-              </w:rPr>
               <w:t>Zubair</w:t>
             </w:r>
           </w:p>
@@ -6023,10 +5785,6 @@
           </w:tcPr>
           <w:p>
             <w:r>
-              <w:rPr>
-                <w:sz w:val="17"/>
-                <w:szCs w:val="17"/>
-              </w:rPr>
               <w:t>R2</w:t>
             </w:r>
           </w:p>
@@ -6043,10 +5801,6 @@
           </w:tcPr>
           <w:p>
             <w:r>
-              <w:rPr>
-                <w:sz w:val="17"/>
-                <w:szCs w:val="17"/>
-              </w:rPr>
               <w:t>Unhandled parser exception from invalid HL7 segment</w:t>
             </w:r>
           </w:p>
@@ -6063,10 +5817,6 @@
           </w:tcPr>
           <w:p>
             <w:r>
-              <w:rPr>
-                <w:sz w:val="17"/>
-                <w:szCs w:val="17"/>
-              </w:rPr>
               <w:t>Medium</w:t>
             </w:r>
           </w:p>
@@ -6083,10 +5833,6 @@
           </w:tcPr>
           <w:p>
             <w:r>
-              <w:rPr>
-                <w:sz w:val="17"/>
-                <w:szCs w:val="17"/>
-              </w:rPr>
               <w:t>High</w:t>
             </w:r>
           </w:p>
@@ -6103,10 +5849,6 @@
           </w:tcPr>
           <w:p>
             <w:r>
-              <w:rPr>
-                <w:sz w:val="17"/>
-                <w:szCs w:val="17"/>
-              </w:rPr>
               <w:t>6</w:t>
             </w:r>
           </w:p>
@@ -6123,10 +5865,6 @@
           </w:tcPr>
           <w:p>
             <w:r>
-              <w:rPr>
-                <w:sz w:val="17"/>
-                <w:szCs w:val="17"/>
-              </w:rPr>
               <w:t>High</w:t>
             </w:r>
           </w:p>
@@ -6143,10 +5881,6 @@
           </w:tcPr>
           <w:p>
             <w:r>
-              <w:rPr>
-                <w:sz w:val="17"/>
-                <w:szCs w:val="17"/>
-              </w:rPr>
               <w:t>Automated malformed-HL7 rejection test</w:t>
             </w:r>
           </w:p>
@@ -6163,10 +5897,6 @@
           </w:tcPr>
           <w:p>
             <w:r>
-              <w:rPr>
-                <w:sz w:val="17"/>
-                <w:szCs w:val="17"/>
-              </w:rPr>
               <w:t>Zubair</w:t>
             </w:r>
           </w:p>
@@ -6185,10 +5915,6 @@
           </w:tcPr>
           <w:p>
             <w:r>
-              <w:rPr>
-                <w:sz w:val="17"/>
-                <w:szCs w:val="17"/>
-              </w:rPr>
               <w:t>R3</w:t>
             </w:r>
           </w:p>
@@ -6205,10 +5931,6 @@
           </w:tcPr>
           <w:p>
             <w:r>
-              <w:rPr>
-                <w:sz w:val="17"/>
-                <w:szCs w:val="17"/>
-              </w:rPr>
               <w:t>Malformed FHIR data accepted and written to clinic system</w:t>
             </w:r>
           </w:p>
@@ -6225,10 +5947,6 @@
           </w:tcPr>
           <w:p>
             <w:r>
-              <w:rPr>
-                <w:sz w:val="17"/>
-                <w:szCs w:val="17"/>
-              </w:rPr>
               <w:t>Medium</w:t>
             </w:r>
           </w:p>
@@ -6245,10 +5963,6 @@
           </w:tcPr>
           <w:p>
             <w:r>
-              <w:rPr>
-                <w:sz w:val="17"/>
-                <w:szCs w:val="17"/>
-              </w:rPr>
               <w:t>High</w:t>
             </w:r>
           </w:p>
@@ -6265,10 +5979,6 @@
           </w:tcPr>
           <w:p>
             <w:r>
-              <w:rPr>
-                <w:sz w:val="17"/>
-                <w:szCs w:val="17"/>
-              </w:rPr>
               <w:t>6</w:t>
             </w:r>
           </w:p>
@@ -6285,10 +5995,6 @@
           </w:tcPr>
           <w:p>
             <w:r>
-              <w:rPr>
-                <w:sz w:val="17"/>
-                <w:szCs w:val="17"/>
-              </w:rPr>
               <w:t>High</w:t>
             </w:r>
           </w:p>
@@ -6305,10 +6011,6 @@
           </w:tcPr>
           <w:p>
             <w:r>
-              <w:rPr>
-                <w:sz w:val="17"/>
-                <w:szCs w:val="17"/>
-              </w:rPr>
               <w:t>Automated malformed-FHIR validation test</w:t>
             </w:r>
           </w:p>
@@ -6325,10 +6027,6 @@
           </w:tcPr>
           <w:p>
             <w:r>
-              <w:rPr>
-                <w:sz w:val="17"/>
-                <w:szCs w:val="17"/>
-              </w:rPr>
               <w:t>Zubair</w:t>
             </w:r>
           </w:p>
@@ -6347,10 +6045,6 @@
           </w:tcPr>
           <w:p>
             <w:r>
-              <w:rPr>
-                <w:sz w:val="17"/>
-                <w:szCs w:val="17"/>
-              </w:rPr>
               <w:t>R4</w:t>
             </w:r>
           </w:p>
@@ -6367,10 +6061,6 @@
           </w:tcPr>
           <w:p>
             <w:r>
-              <w:rPr>
-                <w:sz w:val="17"/>
-                <w:szCs w:val="17"/>
-              </w:rPr>
               <w:t>Cross-tenant data leakage via missing tenant scoping</w:t>
             </w:r>
           </w:p>
@@ -6387,10 +6077,6 @@
           </w:tcPr>
           <w:p>
             <w:r>
-              <w:rPr>
-                <w:sz w:val="17"/>
-                <w:szCs w:val="17"/>
-              </w:rPr>
               <w:t>Low</w:t>
             </w:r>
           </w:p>
@@ -6407,10 +6093,6 @@
           </w:tcPr>
           <w:p>
             <w:r>
-              <w:rPr>
-                <w:sz w:val="17"/>
-                <w:szCs w:val="17"/>
-              </w:rPr>
               <w:t>Critical</w:t>
             </w:r>
           </w:p>
@@ -6427,10 +6109,6 @@
           </w:tcPr>
           <w:p>
             <w:r>
-              <w:rPr>
-                <w:sz w:val="17"/>
-                <w:szCs w:val="17"/>
-              </w:rPr>
               <w:t>4</w:t>
             </w:r>
           </w:p>
@@ -6447,10 +6125,6 @@
           </w:tcPr>
           <w:p>
             <w:r>
-              <w:rPr>
-                <w:sz w:val="17"/>
-                <w:szCs w:val="17"/>
-              </w:rPr>
               <w:t>High</w:t>
             </w:r>
           </w:p>
@@ -6467,10 +6141,6 @@
           </w:tcPr>
           <w:p>
             <w:r>
-              <w:rPr>
-                <w:sz w:val="17"/>
-                <w:szCs w:val="17"/>
-              </w:rPr>
               <w:t>Row-level tenant isolation, gateway validation, dedicated test layer</w:t>
             </w:r>
           </w:p>
@@ -6487,10 +6157,6 @@
           </w:tcPr>
           <w:p>
             <w:r>
-              <w:rPr>
-                <w:sz w:val="17"/>
-                <w:szCs w:val="17"/>
-              </w:rPr>
               <w:t>Zubair</w:t>
             </w:r>
           </w:p>
@@ -6509,10 +6175,6 @@
           </w:tcPr>
           <w:p>
             <w:r>
-              <w:rPr>
-                <w:sz w:val="17"/>
-                <w:szCs w:val="17"/>
-              </w:rPr>
               <w:t>R5</w:t>
             </w:r>
           </w:p>
@@ -6529,10 +6191,6 @@
           </w:tcPr>
           <w:p>
             <w:r>
-              <w:rPr>
-                <w:sz w:val="17"/>
-                <w:szCs w:val="17"/>
-              </w:rPr>
               <w:t>Real patient identifier accidentally used in synthetic dataset</w:t>
             </w:r>
           </w:p>
@@ -6549,10 +6207,6 @@
           </w:tcPr>
           <w:p>
             <w:r>
-              <w:rPr>
-                <w:sz w:val="17"/>
-                <w:szCs w:val="17"/>
-              </w:rPr>
               <w:t>Low</w:t>
             </w:r>
           </w:p>
@@ -6569,10 +6223,6 @@
           </w:tcPr>
           <w:p>
             <w:r>
-              <w:rPr>
-                <w:sz w:val="17"/>
-                <w:szCs w:val="17"/>
-              </w:rPr>
               <w:t>Critical</w:t>
             </w:r>
           </w:p>
@@ -6589,10 +6239,6 @@
           </w:tcPr>
           <w:p>
             <w:r>
-              <w:rPr>
-                <w:sz w:val="17"/>
-                <w:szCs w:val="17"/>
-              </w:rPr>
               <w:t>4</w:t>
             </w:r>
           </w:p>
@@ -6609,10 +6255,6 @@
           </w:tcPr>
           <w:p>
             <w:r>
-              <w:rPr>
-                <w:sz w:val="17"/>
-                <w:szCs w:val="17"/>
-              </w:rPr>
               <w:t>High</w:t>
             </w:r>
           </w:p>
@@ -6629,10 +6271,6 @@
           </w:tcPr>
           <w:p>
             <w:r>
-              <w:rPr>
-                <w:sz w:val="17"/>
-                <w:szCs w:val="17"/>
-              </w:rPr>
               <w:t>Luhn-check rejection rule + automated negative test</w:t>
             </w:r>
           </w:p>
@@ -6649,10 +6287,6 @@
           </w:tcPr>
           <w:p>
             <w:r>
-              <w:rPr>
-                <w:sz w:val="17"/>
-                <w:szCs w:val="17"/>
-              </w:rPr>
               <w:t>Zubair</w:t>
             </w:r>
           </w:p>
@@ -6671,10 +6305,6 @@
           </w:tcPr>
           <w:p>
             <w:r>
-              <w:rPr>
-                <w:sz w:val="17"/>
-                <w:szCs w:val="17"/>
-              </w:rPr>
               <w:t>R9</w:t>
             </w:r>
           </w:p>
@@ -6691,10 +6321,6 @@
           </w:tcPr>
           <w:p>
             <w:r>
-              <w:rPr>
-                <w:sz w:val="17"/>
-                <w:szCs w:val="17"/>
-              </w:rPr>
               <w:t>Team's limited healthcare-semantics experience delays build</w:t>
             </w:r>
           </w:p>
@@ -6711,10 +6337,6 @@
           </w:tcPr>
           <w:p>
             <w:r>
-              <w:rPr>
-                <w:sz w:val="17"/>
-                <w:szCs w:val="17"/>
-              </w:rPr>
               <w:t>Medium</w:t>
             </w:r>
           </w:p>
@@ -6731,10 +6353,6 @@
           </w:tcPr>
           <w:p>
             <w:r>
-              <w:rPr>
-                <w:sz w:val="17"/>
-                <w:szCs w:val="17"/>
-              </w:rPr>
               <w:t>Medium</w:t>
             </w:r>
           </w:p>
@@ -6751,10 +6369,6 @@
           </w:tcPr>
           <w:p>
             <w:r>
-              <w:rPr>
-                <w:sz w:val="17"/>
-                <w:szCs w:val="17"/>
-              </w:rPr>
               <w:t>4</w:t>
             </w:r>
           </w:p>
@@ -6771,10 +6385,6 @@
           </w:tcPr>
           <w:p>
             <w:r>
-              <w:rPr>
-                <w:sz w:val="17"/>
-                <w:szCs w:val="17"/>
-              </w:rPr>
               <w:t>Medium</w:t>
             </w:r>
           </w:p>
@@ -6791,10 +6401,6 @@
           </w:tcPr>
           <w:p>
             <w:r>
-              <w:rPr>
-                <w:sz w:val="17"/>
-                <w:szCs w:val="17"/>
-              </w:rPr>
               <w:t>Curated SNOMED subset, weekly mentor guidance</w:t>
             </w:r>
           </w:p>
@@ -6811,10 +6417,6 @@
           </w:tcPr>
           <w:p>
             <w:r>
-              <w:rPr>
-                <w:sz w:val="17"/>
-                <w:szCs w:val="17"/>
-              </w:rPr>
               <w:t>Team</w:t>
             </w:r>
           </w:p>
@@ -6833,10 +6435,6 @@
           </w:tcPr>
           <w:p>
             <w:r>
-              <w:rPr>
-                <w:sz w:val="17"/>
-                <w:szCs w:val="17"/>
-              </w:rPr>
               <w:t>R10</w:t>
             </w:r>
           </w:p>
@@ -6853,10 +6451,6 @@
           </w:tcPr>
           <w:p>
             <w:r>
-              <w:rPr>
-                <w:sz w:val="17"/>
-                <w:szCs w:val="17"/>
-              </w:rPr>
               <w:t>Scope creep from broad project brief</w:t>
             </w:r>
           </w:p>
@@ -6873,10 +6467,6 @@
           </w:tcPr>
           <w:p>
             <w:r>
-              <w:rPr>
-                <w:sz w:val="17"/>
-                <w:szCs w:val="17"/>
-              </w:rPr>
               <w:t>Medium</w:t>
             </w:r>
           </w:p>
@@ -6893,10 +6483,6 @@
           </w:tcPr>
           <w:p>
             <w:r>
-              <w:rPr>
-                <w:sz w:val="17"/>
-                <w:szCs w:val="17"/>
-              </w:rPr>
               <w:t>Medium</w:t>
             </w:r>
           </w:p>
@@ -6913,10 +6499,6 @@
           </w:tcPr>
           <w:p>
             <w:r>
-              <w:rPr>
-                <w:sz w:val="17"/>
-                <w:szCs w:val="17"/>
-              </w:rPr>
               <w:t>4</w:t>
             </w:r>
           </w:p>
@@ -6933,10 +6515,6 @@
           </w:tcPr>
           <w:p>
             <w:r>
-              <w:rPr>
-                <w:sz w:val="17"/>
-                <w:szCs w:val="17"/>
-              </w:rPr>
               <w:t>Medium</w:t>
             </w:r>
           </w:p>
@@ -6953,10 +6531,6 @@
           </w:tcPr>
           <w:p>
             <w:r>
-              <w:rPr>
-                <w:sz w:val="17"/>
-                <w:szCs w:val="17"/>
-              </w:rPr>
               <w:t>Fixed endpoint list, agreed exclusions</w:t>
             </w:r>
           </w:p>
@@ -6973,25 +6547,14 @@
           </w:tcPr>
           <w:p>
             <w:r>
-              <w:rPr>
-                <w:sz w:val="17"/>
-                <w:szCs w:val="17"/>
-              </w:rPr>
               <w:t>Team Lead</w:t>
             </w:r>
           </w:p>
         </w:tc>
       </w:tr>
     </w:tbl>
-    <w:p>
-      <w:pPr>
-        <w:spacing w:after="200"/>
-      </w:pPr>
-    </w:p>
-    <w:p>
-      <w:pPr>
-        <w:jc w:val="both"/>
-      </w:pPr>
+    <w:p/>
+    <w:p>
       <w:r>
         <w:t>Score = Likelihood × Impact (Low=1, Medium=2, High=3, Critical=4). The register carries forward all ten risks identified in Stage 1, condensed here to the highest-scoring items. High/Critical risks (R1–R5) directly threaten clinical safety, data integrity or privacy and are mitigated through automated test cases tied to specific failure modes; Medium risks (R9–R10) are operational and are managed through scope discipline and mentor engagement rather than technical controls.</w:t>
       </w:r>
@@ -7003,6 +6566,7 @@
       </w:pPr>
       <w:bookmarkStart w:id="11" w:name="_Toc238803241"/>
       <w:r>
+        <w:lastRenderedPageBreak/>
         <w:t>2.5 Feasibility Study</w:t>
       </w:r>
       <w:bookmarkEnd w:id="11"/>
@@ -7012,13 +6576,27 @@
     </w:p>
     <w:p>
       <w:r>
+        <w:rPr>
+          <w:b/>
+          <w:bCs/>
+        </w:rPr>
         <w:t>Technical feas</w:t>
       </w:r>
       <w:r>
-        <w:t xml:space="preserve">ibility is high: </w:t>
-      </w:r>
-      <w:r>
-        <w:t xml:space="preserve">The proposed stack (FHIR R4 (Health Level Seven International, 2019), AU Core (HL7 Australia, 2025), HL7 v2.4 (Standards Australia, 2007), SNOMED CT-AU, HAPI FHIR, FastAPI/Node.js, PostgreSQL, Docker) is mature, open-source, and familiar to the team. The key difficulty is </w:t>
+        <w:rPr>
+          <w:b/>
+          <w:bCs/>
+        </w:rPr>
+        <w:t>ibility</w:t>
+      </w:r>
+      <w:r>
+        <w:t xml:space="preserve"> is high: </w:t>
+      </w:r>
+      <w:r>
+        <w:t>th</w:t>
+      </w:r>
+      <w:r>
+        <w:t xml:space="preserve">e proposed stack (FHIR R4 (Health Level Seven International, 2019), AU Core (HL7 Australia, 2025), HL7 v2.4 (Standards Australia, 2007), SNOMED CT-AU, HAPI FHIR, FastAPI/Node.js, PostgreSQL, Docker) is mature, open-source, and familiar to the team. The key difficulty is </w:t>
       </w:r>
       <w:r>
         <w:t>correctly implementing healthcare-</w:t>
@@ -7029,15 +6607,33 @@
     </w:p>
     <w:p>
       <w:r>
-        <w:t>Operational feasibility is medium-high: Mentor commitment is confirmed; Reference architecture documents; Team tooling (GitHub, Jira &amp; Teams) is established for delivery. Primary operational risk is from competing demands other University Units, addressed in a Team Working Agreement.</w:t>
-      </w:r>
-    </w:p>
-    <w:p>
-      <w:r>
+        <w:rPr>
+          <w:b/>
+          <w:bCs/>
+        </w:rPr>
+        <w:t>Operational feasibility</w:t>
+      </w:r>
+      <w:r>
+        <w:t xml:space="preserve"> is medium-high: Mentor commitment is confirmed; Reference architecture documents; Team tooling (GitHub, Jira &amp; Teams) is established for delivery. Primary operational risk is from competing demands other University Units, addressed in a Team Working Agreement.</w:t>
+      </w:r>
+    </w:p>
+    <w:p>
+      <w:r>
+        <w:rPr>
+          <w:b/>
+          <w:bCs/>
+        </w:rPr>
         <w:t xml:space="preserve">Economic </w:t>
       </w:r>
       <w:r>
-        <w:t>feasibility is high</w:t>
+        <w:rPr>
+          <w:b/>
+          <w:bCs/>
+        </w:rPr>
+        <w:t>feasibility</w:t>
+      </w:r>
+      <w:r>
+        <w:t xml:space="preserve"> is high</w:t>
       </w:r>
       <w:r>
         <w:t xml:space="preserve">: estimated overall cost is around $150 AUD, both using </w:t>
@@ -7053,35 +6649,32 @@
     </w:p>
     <w:p>
       <w:r>
-        <w:lastRenderedPageBreak/>
-        <w:t xml:space="preserve">Legal feasibility is </w:t>
+        <w:rPr>
+          <w:b/>
+          <w:bCs/>
+        </w:rPr>
+        <w:t>Legal feasibility</w:t>
+      </w:r>
+      <w:r>
+        <w:t xml:space="preserve"> is </w:t>
       </w:r>
       <w:r>
         <w:t>high</w:t>
       </w:r>
       <w:r>
-        <w:t>: the project also doesn't include real patient data, which is the primary exposure under the Privacy Act 1988 (</w:t>
-      </w:r>
-      <w:proofErr w:type="spellStart"/>
-      <w:r>
-        <w:t>Cth</w:t>
-      </w:r>
-      <w:proofErr w:type="spellEnd"/>
-      <w:r>
-        <w:t>) and My Health Records Act 2012 (</w:t>
-      </w:r>
-      <w:proofErr w:type="spellStart"/>
-      <w:r>
-        <w:t>Cth</w:t>
-      </w:r>
-      <w:proofErr w:type="spellEnd"/>
-      <w:r>
-        <w:t>). Automated synthetic-data validation rules (such as Luhn-check rejection) offer technical protection, but do not require manual compliance.</w:t>
-      </w:r>
-    </w:p>
-    <w:p>
-      <w:r>
-        <w:t xml:space="preserve">Ethical feasibility is high: the design poses no risk of actual harm to patients </w:t>
+        <w:t>: the project also doesn't include real patient data, which is the primary exposure under the Privacy Act 1988 (Cth) and My Health Records Act 2012 (Cth). Automated synthetic-data validation rules (such as Luhn-check rejection) offer technical protection, but do not require manual compliance.</w:t>
+      </w:r>
+    </w:p>
+    <w:p>
+      <w:r>
+        <w:rPr>
+          <w:b/>
+          <w:bCs/>
+        </w:rPr>
+        <w:t>Ethical feasibility</w:t>
+      </w:r>
+      <w:r>
+        <w:t xml:space="preserve"> is high: the design poses no risk of actual harm to patients </w:t>
       </w:r>
       <w:proofErr w:type="gramStart"/>
       <w:r>
@@ -7094,10 +6687,21 @@
     </w:p>
     <w:p>
       <w:r>
+        <w:rPr>
+          <w:b/>
+          <w:bCs/>
+        </w:rPr>
         <w:t>C</w:t>
       </w:r>
       <w:r>
-        <w:t>ybersecurity feasibility is hig</w:t>
+        <w:rPr>
+          <w:b/>
+          <w:bCs/>
+        </w:rPr>
+        <w:t>ybersecurity feasibility</w:t>
+      </w:r>
+      <w:r>
+        <w:t xml:space="preserve"> is hig</w:t>
       </w:r>
       <w:r>
         <w:t>h:</w:t>
@@ -7111,6 +6715,15 @@
         <w:t>The project is feasible across all six dimensions, the biggest risk is the team's learning curve with FHIR/SNOMED, this is addressed by limiting the scope of the data set at the start of the project and reviewing data with the mentor weekly.</w:t>
       </w:r>
     </w:p>
+    <w:p>
+      <w:pPr>
+        <w:jc w:val="left"/>
+      </w:pPr>
+      <w:r>
+        <w:br w:type="page"/>
+      </w:r>
+    </w:p>
+    <w:p/>
     <w:p>
       <w:pPr>
         <w:pStyle w:val="Heading1"/>
@@ -7203,8 +6816,6 @@
       <w:pPr>
         <w:rPr>
           <w:rFonts w:asciiTheme="majorHAnsi" w:eastAsiaTheme="majorEastAsia" w:hAnsiTheme="majorHAnsi" w:cstheme="majorBidi"/>
-          <w:b/>
-          <w:bCs/>
           <w:color w:val="0F4761" w:themeColor="accent1" w:themeShade="BF"/>
           <w:sz w:val="40"/>
           <w:szCs w:val="40"/>
@@ -7227,7 +6838,6 @@
     <w:p>
       <w:pPr>
         <w:pStyle w:val="NormalWeb"/>
-        <w:jc w:val="both"/>
       </w:pPr>
       <w:r>
         <w:t xml:space="preserve">This chapter presents the proposed technical solution for the Healthcare Integration &amp; Clinical Terminology Test Harness. The design addresses the cybersecurity and clinical-safety risks identified in the current-state </w:t>
@@ -7257,19 +6867,13 @@
         <w:t xml:space="preserve"> by providing a controlled environment for testing interoperability, terminology mapping and connector behaviour without using real patient information. The proposed solution is based on synthetic data, FHIR R4</w:t>
       </w:r>
       <w:r>
-        <w:t xml:space="preserve"> </w:t>
-      </w:r>
-      <w:r>
-        <w:t>(HL7 International, 2019),</w:t>
+        <w:t xml:space="preserve"> (HL7 International, 2019),</w:t>
       </w:r>
       <w:r>
         <w:t xml:space="preserve"> Australian healthcare interoperability requirements</w:t>
       </w:r>
       <w:r>
-        <w:t xml:space="preserve"> </w:t>
-      </w:r>
-      <w:r>
-        <w:t xml:space="preserve">(HL7 Australia, n.d.) </w:t>
+        <w:t xml:space="preserve"> (HL7 Australia, n.d.) </w:t>
       </w:r>
       <w:r>
         <w:t xml:space="preserve"> and simulated EMR integrations. Stage 1 focuses on architecture and design, while implementation and deployment of the complete test harness are planned for Stage 2.</w:t>
@@ -7286,7 +6890,6 @@
     <w:p>
       <w:pPr>
         <w:pStyle w:val="NormalWeb"/>
-        <w:jc w:val="both"/>
       </w:pPr>
       <w:r>
         <w:t>The solution architecture will be a system architecture comprising the synthetic test data layer, validation and terminology mapping modules, the test execution layer, simulated EMR connectors, and a test reporting module. The architecture of the proposed solution is shown in Figure 4.1.1: Proposed Solution Architecture, while the system context is depicted separately in Figure X: System Context Diagram. Both figures can be found in the project repository.</w:t>
@@ -7295,7 +6898,6 @@
     <w:p>
       <w:pPr>
         <w:pStyle w:val="NormalWeb"/>
-        <w:jc w:val="both"/>
       </w:pPr>
       <w:r>
         <w:rPr>
@@ -7347,7 +6949,6 @@
     <w:p>
       <w:pPr>
         <w:pStyle w:val="NormalWeb"/>
-        <w:jc w:val="both"/>
       </w:pPr>
       <w:r>
         <w:t>Figure 4.1.1: Proposed Solution Architecture</w:t>
@@ -7356,16 +6957,12 @@
     <w:p>
       <w:pPr>
         <w:pStyle w:val="NormalWeb"/>
-        <w:jc w:val="both"/>
       </w:pPr>
       <w:r>
         <w:t>The primary end-user of the proposed test harness is the authorised MedTalk Connect engineering or testing end-user. The end-user creates a test scenario and selects the appropriate connector and test parameters. The system creates synthetic patients and clinical encounter records based on this information</w:t>
       </w:r>
       <w:r>
-        <w:t xml:space="preserve"> </w:t>
-      </w:r>
-      <w:r>
-        <w:t>(</w:t>
+        <w:t xml:space="preserve"> (</w:t>
       </w:r>
       <w:proofErr w:type="spellStart"/>
       <w:r>
@@ -7381,54 +6978,25 @@
     </w:p>
     <w:p>
       <w:pPr>
-        <w:pStyle w:val="Heading2"/>
-        <w:jc w:val="both"/>
         <w:rPr>
-          <w:rFonts w:ascii="Times New Roman" w:eastAsia="Times New Roman" w:hAnsi="Times New Roman" w:cs="Times New Roman"/>
-          <w:color w:val="auto"/>
-          <w:sz w:val="24"/>
-          <w:szCs w:val="24"/>
           <w:lang w:val="en-GB" w:eastAsia="en-GB"/>
         </w:rPr>
       </w:pPr>
       <w:r>
         <w:rPr>
-          <w:rFonts w:ascii="Times New Roman" w:eastAsia="Times New Roman" w:hAnsi="Times New Roman" w:cs="Times New Roman"/>
-          <w:color w:val="auto"/>
-          <w:sz w:val="24"/>
-          <w:szCs w:val="24"/>
           <w:lang w:val="en-GB" w:eastAsia="en-GB"/>
         </w:rPr>
-        <w:lastRenderedPageBreak/>
         <w:t>Validated data is represented using FHIR R4 objects and passed to the interoperability testing layer</w:t>
       </w:r>
       <w:r>
         <w:rPr>
-          <w:rFonts w:ascii="Times New Roman" w:eastAsia="Times New Roman" w:hAnsi="Times New Roman" w:cs="Times New Roman"/>
-          <w:color w:val="auto"/>
-          <w:sz w:val="24"/>
-          <w:szCs w:val="24"/>
           <w:lang w:val="en-GB" w:eastAsia="en-GB"/>
         </w:rPr>
-        <w:t xml:space="preserve"> </w:t>
-      </w:r>
+        <w:t xml:space="preserve"> (</w:t>
+      </w:r>
+      <w:proofErr w:type="spellStart"/>
       <w:r>
         <w:rPr>
-          <w:rFonts w:ascii="Times New Roman" w:eastAsia="Times New Roman" w:hAnsi="Times New Roman" w:cs="Times New Roman"/>
-          <w:color w:val="auto"/>
-          <w:sz w:val="24"/>
-          <w:szCs w:val="24"/>
-          <w:lang w:val="en-GB" w:eastAsia="en-GB"/>
-        </w:rPr>
-        <w:t>(</w:t>
-      </w:r>
-      <w:proofErr w:type="spellStart"/>
-      <w:r>
-        <w:rPr>
-          <w:rFonts w:ascii="Times New Roman" w:eastAsia="Times New Roman" w:hAnsi="Times New Roman" w:cs="Times New Roman"/>
-          <w:color w:val="auto"/>
-          <w:sz w:val="24"/>
-          <w:szCs w:val="24"/>
           <w:lang w:val="en-GB" w:eastAsia="en-GB"/>
         </w:rPr>
         <w:t>Gruendner</w:t>
@@ -7436,51 +7004,25 @@
       <w:proofErr w:type="spellEnd"/>
       <w:r>
         <w:rPr>
-          <w:rFonts w:ascii="Times New Roman" w:eastAsia="Times New Roman" w:hAnsi="Times New Roman" w:cs="Times New Roman"/>
-          <w:color w:val="auto"/>
-          <w:sz w:val="24"/>
-          <w:szCs w:val="24"/>
           <w:lang w:val="en-GB" w:eastAsia="en-GB"/>
         </w:rPr>
         <w:t xml:space="preserve"> et al., 2021). </w:t>
       </w:r>
       <w:r>
         <w:rPr>
-          <w:rFonts w:ascii="Times New Roman" w:eastAsia="Times New Roman" w:hAnsi="Times New Roman" w:cs="Times New Roman"/>
-          <w:color w:val="auto"/>
-          <w:sz w:val="24"/>
-          <w:szCs w:val="24"/>
           <w:lang w:val="en-GB" w:eastAsia="en-GB"/>
         </w:rPr>
         <w:t xml:space="preserve"> In addition, HL7 v2 messages can be simulated in case it is required. Data will go through the terminology mapping stage, where representative clinical concepts will be mapped on SNOMED CT-AU, ICD-10-AM and MBS</w:t>
       </w:r>
       <w:r>
         <w:rPr>
-          <w:rFonts w:ascii="Times New Roman" w:eastAsia="Times New Roman" w:hAnsi="Times New Roman" w:cs="Times New Roman"/>
-          <w:color w:val="auto"/>
-          <w:sz w:val="24"/>
-          <w:szCs w:val="24"/>
           <w:lang w:val="en-GB" w:eastAsia="en-GB"/>
         </w:rPr>
-        <w:t xml:space="preserve"> </w:t>
-      </w:r>
+        <w:t xml:space="preserve"> (</w:t>
+      </w:r>
+      <w:proofErr w:type="spellStart"/>
       <w:r>
         <w:rPr>
-          <w:rFonts w:ascii="Times New Roman" w:eastAsia="Times New Roman" w:hAnsi="Times New Roman" w:cs="Times New Roman"/>
-          <w:color w:val="auto"/>
-          <w:sz w:val="24"/>
-          <w:szCs w:val="24"/>
-          <w:lang w:val="en-GB" w:eastAsia="en-GB"/>
-        </w:rPr>
-        <w:t>(</w:t>
-      </w:r>
-      <w:proofErr w:type="spellStart"/>
-      <w:r>
-        <w:rPr>
-          <w:rFonts w:ascii="Times New Roman" w:eastAsia="Times New Roman" w:hAnsi="Times New Roman" w:cs="Times New Roman"/>
-          <w:color w:val="auto"/>
-          <w:sz w:val="24"/>
-          <w:szCs w:val="24"/>
           <w:lang w:val="en-GB" w:eastAsia="en-GB"/>
         </w:rPr>
         <w:t>Giannangelo</w:t>
@@ -7488,30 +7030,12 @@
       <w:proofErr w:type="spellEnd"/>
       <w:r>
         <w:rPr>
-          <w:rFonts w:ascii="Times New Roman" w:eastAsia="Times New Roman" w:hAnsi="Times New Roman" w:cs="Times New Roman"/>
-          <w:color w:val="auto"/>
-          <w:sz w:val="24"/>
-          <w:szCs w:val="24"/>
           <w:lang w:val="en-GB" w:eastAsia="en-GB"/>
         </w:rPr>
-        <w:t xml:space="preserve"> et al., 2012)</w:t>
+        <w:t xml:space="preserve"> et al., 2012).</w:t>
       </w:r>
       <w:r>
         <w:rPr>
-          <w:rFonts w:ascii="Times New Roman" w:eastAsia="Times New Roman" w:hAnsi="Times New Roman" w:cs="Times New Roman"/>
-          <w:color w:val="auto"/>
-          <w:sz w:val="24"/>
-          <w:szCs w:val="24"/>
-          <w:lang w:val="en-GB" w:eastAsia="en-GB"/>
-        </w:rPr>
-        <w:t>.</w:t>
-      </w:r>
-      <w:r>
-        <w:rPr>
-          <w:rFonts w:ascii="Times New Roman" w:eastAsia="Times New Roman" w:hAnsi="Times New Roman" w:cs="Times New Roman"/>
-          <w:color w:val="auto"/>
-          <w:sz w:val="24"/>
-          <w:szCs w:val="24"/>
           <w:lang w:val="en-GB" w:eastAsia="en-GB"/>
         </w:rPr>
         <w:t xml:space="preserve"> Repository will provide a special terminology mapping chain that depicts this process.</w:t>
@@ -7519,23 +7043,13 @@
     </w:p>
     <w:p>
       <w:pPr>
-        <w:pStyle w:val="Heading2"/>
-        <w:jc w:val="both"/>
         <w:rPr>
-          <w:rFonts w:ascii="Times New Roman" w:eastAsia="Times New Roman" w:hAnsi="Times New Roman" w:cs="Times New Roman"/>
-          <w:color w:val="auto"/>
-          <w:sz w:val="24"/>
-          <w:szCs w:val="24"/>
           <w:lang w:val="en-GB" w:eastAsia="en-GB"/>
         </w:rPr>
       </w:pPr>
       <w:r>
         <w:rPr>
-          <w:rFonts w:ascii="Times New Roman" w:eastAsia="Times New Roman" w:hAnsi="Times New Roman" w:cs="Times New Roman"/>
           <w:noProof/>
-          <w:color w:val="auto"/>
-          <w:sz w:val="24"/>
-          <w:szCs w:val="24"/>
           <w:lang w:val="en-GB" w:eastAsia="en-GB"/>
         </w:rPr>
         <w:drawing>
@@ -7583,42 +7097,25 @@
     </w:p>
     <w:p>
       <w:pPr>
-        <w:pStyle w:val="Heading2"/>
-        <w:jc w:val="both"/>
         <w:rPr>
-          <w:rFonts w:ascii="Times New Roman" w:eastAsia="Times New Roman" w:hAnsi="Times New Roman" w:cs="Times New Roman"/>
-          <w:color w:val="auto"/>
-          <w:sz w:val="24"/>
-          <w:szCs w:val="24"/>
           <w:lang w:val="en-GB" w:eastAsia="en-GB"/>
         </w:rPr>
       </w:pPr>
       <w:r>
         <w:rPr>
-          <w:rFonts w:ascii="Times New Roman" w:eastAsia="Times New Roman" w:hAnsi="Times New Roman" w:cs="Times New Roman"/>
-          <w:color w:val="auto"/>
-          <w:sz w:val="24"/>
-          <w:szCs w:val="24"/>
           <w:lang w:val="en-GB" w:eastAsia="en-GB"/>
         </w:rPr>
+        <w:lastRenderedPageBreak/>
         <w:t>Figure 4.1.</w:t>
       </w:r>
       <w:r>
         <w:rPr>
-          <w:rFonts w:ascii="Times New Roman" w:eastAsia="Times New Roman" w:hAnsi="Times New Roman" w:cs="Times New Roman"/>
-          <w:color w:val="auto"/>
-          <w:sz w:val="24"/>
-          <w:szCs w:val="24"/>
           <w:lang w:val="en-GB" w:eastAsia="en-GB"/>
         </w:rPr>
         <w:t>2</w:t>
       </w:r>
       <w:r>
         <w:rPr>
-          <w:rFonts w:ascii="Times New Roman" w:eastAsia="Times New Roman" w:hAnsi="Times New Roman" w:cs="Times New Roman"/>
-          <w:color w:val="auto"/>
-          <w:sz w:val="24"/>
-          <w:szCs w:val="24"/>
           <w:lang w:val="en-GB" w:eastAsia="en-GB"/>
         </w:rPr>
         <w:t xml:space="preserve"> Terminology Mapping Chain</w:t>
@@ -7626,22 +7123,12 @@
     </w:p>
     <w:p>
       <w:pPr>
-        <w:pStyle w:val="Heading2"/>
-        <w:jc w:val="both"/>
         <w:rPr>
-          <w:rFonts w:ascii="Times New Roman" w:eastAsia="Times New Roman" w:hAnsi="Times New Roman" w:cs="Times New Roman"/>
-          <w:color w:val="auto"/>
-          <w:sz w:val="24"/>
-          <w:szCs w:val="24"/>
           <w:lang w:val="en-GB" w:eastAsia="en-GB"/>
         </w:rPr>
       </w:pPr>
       <w:r>
         <w:rPr>
-          <w:rFonts w:ascii="Times New Roman" w:eastAsia="Times New Roman" w:hAnsi="Times New Roman" w:cs="Times New Roman"/>
-          <w:color w:val="auto"/>
-          <w:sz w:val="24"/>
-          <w:szCs w:val="24"/>
           <w:lang w:val="en-GB" w:eastAsia="en-GB"/>
         </w:rPr>
         <w:t xml:space="preserve">Test execution layer performs normal, negative and degraded scenarios. These involve successful message exchange, malformed data, slow responses and dropped connections. The response from test execution layer is evaluated according to the expected outcome and stored for future analysis. Simulated connector layer provides simulated EMR integrations relevant to MedTalk Connect, which will allow testing connector </w:t>
@@ -7649,10 +7136,6 @@
       <w:proofErr w:type="spellStart"/>
       <w:r>
         <w:rPr>
-          <w:rFonts w:ascii="Times New Roman" w:eastAsia="Times New Roman" w:hAnsi="Times New Roman" w:cs="Times New Roman"/>
-          <w:color w:val="auto"/>
-          <w:sz w:val="24"/>
-          <w:szCs w:val="24"/>
           <w:lang w:val="en-GB" w:eastAsia="en-GB"/>
         </w:rPr>
         <w:t>behavior</w:t>
@@ -7660,10 +7143,6 @@
       <w:proofErr w:type="spellEnd"/>
       <w:r>
         <w:rPr>
-          <w:rFonts w:ascii="Times New Roman" w:eastAsia="Times New Roman" w:hAnsi="Times New Roman" w:cs="Times New Roman"/>
-          <w:color w:val="auto"/>
-          <w:sz w:val="24"/>
-          <w:szCs w:val="24"/>
           <w:lang w:val="en-GB" w:eastAsia="en-GB"/>
         </w:rPr>
         <w:t xml:space="preserve"> without having to connect the test harness to production clinical systems.</w:t>
@@ -7671,22 +7150,12 @@
     </w:p>
     <w:p>
       <w:pPr>
-        <w:pStyle w:val="Heading2"/>
-        <w:jc w:val="both"/>
         <w:rPr>
-          <w:rFonts w:ascii="Times New Roman" w:eastAsia="Times New Roman" w:hAnsi="Times New Roman" w:cs="Times New Roman"/>
-          <w:color w:val="auto"/>
-          <w:sz w:val="24"/>
-          <w:szCs w:val="24"/>
           <w:lang w:val="en-GB" w:eastAsia="en-GB"/>
         </w:rPr>
       </w:pPr>
       <w:r>
         <w:rPr>
-          <w:rFonts w:ascii="Times New Roman" w:eastAsia="Times New Roman" w:hAnsi="Times New Roman" w:cs="Times New Roman"/>
-          <w:color w:val="auto"/>
-          <w:sz w:val="24"/>
-          <w:szCs w:val="24"/>
           <w:lang w:val="en-GB" w:eastAsia="en-GB"/>
         </w:rPr>
         <w:t>The primary trust boundaries are thus established between the authorized user and the test harness, between unvalidated and validated synthetic data and between internal test environment and simulated connectors. The authentication, access control, data validation, connector isolation and secure communication are proposed as a protection measure at these trust boundaries. Such design allows implementing all the necessary requirements of the project directly.</w:t>
@@ -7695,35 +7164,19 @@
     <w:p>
       <w:pPr>
         <w:pStyle w:val="Heading2"/>
-        <w:jc w:val="both"/>
+      </w:pPr>
+      <w:r>
+        <w:t>4.2 Technology Stack and Justification</w:t>
+      </w:r>
+    </w:p>
+    <w:p>
+      <w:pPr>
         <w:rPr>
-          <w:rFonts w:ascii="Times New Roman" w:eastAsia="Times New Roman" w:hAnsi="Times New Roman" w:cs="Times New Roman"/>
-          <w:color w:val="auto"/>
-          <w:sz w:val="24"/>
-          <w:szCs w:val="24"/>
           <w:lang w:val="en-GB" w:eastAsia="en-GB"/>
         </w:rPr>
       </w:pPr>
-    </w:p>
-    <w:p>
-      <w:pPr>
-        <w:pStyle w:val="Heading2"/>
-      </w:pPr>
-      <w:r>
-        <w:t>4.2 Technology Stack and Justification</w:t>
-      </w:r>
-    </w:p>
-    <w:p>
-      <w:pPr>
-        <w:jc w:val="both"/>
+      <w:r>
         <w:rPr>
-          <w:rFonts w:ascii="Times New Roman" w:eastAsia="Times New Roman" w:hAnsi="Times New Roman" w:cs="Times New Roman"/>
-          <w:lang w:val="en-GB" w:eastAsia="en-GB"/>
-        </w:rPr>
-      </w:pPr>
-      <w:r>
-        <w:rPr>
-          <w:rFonts w:ascii="Times New Roman" w:eastAsia="Times New Roman" w:hAnsi="Times New Roman" w:cs="Times New Roman"/>
           <w:lang w:val="en-GB" w:eastAsia="en-GB"/>
         </w:rPr>
         <w:t>The technology stack is chosen taking into consideration interoperability standards, needs of Australian healthcare system, security and cheapness of implementation. The selected technologies will enable implementing the Stage 1 architecture, laying a foundation for the Stage 2.</w:t>
@@ -7731,15 +7184,12 @@
     </w:p>
     <w:p>
       <w:pPr>
-        <w:jc w:val="both"/>
         <w:rPr>
-          <w:rFonts w:ascii="Times New Roman" w:eastAsia="Times New Roman" w:hAnsi="Times New Roman" w:cs="Times New Roman"/>
           <w:lang w:val="en-GB" w:eastAsia="en-GB"/>
         </w:rPr>
       </w:pPr>
       <w:r>
         <w:rPr>
-          <w:rFonts w:ascii="Times New Roman" w:eastAsia="Times New Roman" w:hAnsi="Times New Roman" w:cs="Times New Roman"/>
           <w:lang w:val="en-GB" w:eastAsia="en-GB"/>
         </w:rPr>
         <w:t>React technology is used as the frontend framework because of the requirement to use the stateful and component-based interface (scenario builder, results of the live test, connector statuses) instead of several static pages; React technology, along with its ecosystem, will enable developing such an interface without paying license costs, which is possible due to the limitations of the project budget.  There are both Python (</w:t>
@@ -7747,7 +7197,6 @@
       <w:proofErr w:type="spellStart"/>
       <w:r>
         <w:rPr>
-          <w:rFonts w:ascii="Times New Roman" w:eastAsia="Times New Roman" w:hAnsi="Times New Roman" w:cs="Times New Roman"/>
           <w:lang w:val="en-GB" w:eastAsia="en-GB"/>
         </w:rPr>
         <w:t>FastAPI</w:t>
@@ -7755,7 +7204,6 @@
       <w:proofErr w:type="spellEnd"/>
       <w:r>
         <w:rPr>
-          <w:rFonts w:ascii="Times New Roman" w:eastAsia="Times New Roman" w:hAnsi="Times New Roman" w:cs="Times New Roman"/>
           <w:lang w:val="en-GB" w:eastAsia="en-GB"/>
         </w:rPr>
         <w:t>) and Node.js (Express) suggested as the backend languages, not as the single option, because any of these frameworks will be able to implement the sandbox FHIR API with equal level of efficiency and community; the actual choice will be decided by the knowledge of the team, not by any technological requirement.</w:t>
@@ -7767,17 +7215,8 @@
     <w:p>
       <w:pPr>
         <w:pStyle w:val="NormalWeb"/>
-        <w:jc w:val="both"/>
-        <w:rPr>
-          <w:b/>
-          <w:bCs/>
-        </w:rPr>
-      </w:pPr>
-      <w:r>
-        <w:rPr>
-          <w:b/>
-          <w:bCs/>
-        </w:rPr>
+      </w:pPr>
+      <w:r>
         <w:lastRenderedPageBreak/>
         <w:t>Table: 4.2.1: Technology Stack and Justification</w:t>
       </w:r>
@@ -7798,44 +7237,61 @@
         <w:tc>
           <w:tcPr>
             <w:tcW w:w="0" w:type="auto"/>
+            <w:shd w:val="clear" w:color="auto" w:fill="92D050"/>
             <w:hideMark/>
           </w:tcPr>
           <w:p>
-            <w:pPr>
-              <w:jc w:val="both"/>
-              <w:rPr>
-                <w:b/>
-                <w:bCs/>
-              </w:rPr>
-            </w:pPr>
-            <w:r>
-              <w:rPr>
-                <w:b/>
-                <w:bCs/>
-              </w:rPr>
+            <w:r>
               <w:t>Layer / Standard</w:t>
             </w:r>
           </w:p>
         </w:tc>
+        <w:tc>
+          <w:tcPr>
+            <w:tcW w:w="0" w:type="auto"/>
+            <w:shd w:val="clear" w:color="auto" w:fill="92D050"/>
+            <w:hideMark/>
+          </w:tcPr>
+          <w:p>
+            <w:r>
+              <w:t>Technology / Tool</w:t>
+            </w:r>
+          </w:p>
+        </w:tc>
+        <w:tc>
+          <w:tcPr>
+            <w:tcW w:w="0" w:type="auto"/>
+            <w:shd w:val="clear" w:color="auto" w:fill="92D050"/>
+            <w:hideMark/>
+          </w:tcPr>
+          <w:p>
+            <w:r>
+              <w:t>Purpose</w:t>
+            </w:r>
+          </w:p>
+        </w:tc>
+        <w:tc>
+          <w:tcPr>
+            <w:tcW w:w="3635" w:type="dxa"/>
+            <w:shd w:val="clear" w:color="auto" w:fill="92D050"/>
+            <w:hideMark/>
+          </w:tcPr>
+          <w:p>
+            <w:r>
+              <w:t>Justification (vs. alternative)</w:t>
+            </w:r>
+          </w:p>
+        </w:tc>
+      </w:tr>
+      <w:tr>
         <w:tc>
           <w:tcPr>
             <w:tcW w:w="0" w:type="auto"/>
             <w:hideMark/>
           </w:tcPr>
           <w:p>
-            <w:pPr>
-              <w:jc w:val="both"/>
-              <w:rPr>
-                <w:b/>
-                <w:bCs/>
-              </w:rPr>
-            </w:pPr>
-            <w:r>
-              <w:rPr>
-                <w:b/>
-                <w:bCs/>
-              </w:rPr>
-              <w:t>Technology / Tool</w:t>
+            <w:r>
+              <w:t>Backend / API</w:t>
             </w:r>
           </w:p>
         </w:tc>
@@ -7845,19 +7301,24 @@
             <w:hideMark/>
           </w:tcPr>
           <w:p>
-            <w:pPr>
-              <w:jc w:val="both"/>
-              <w:rPr>
-                <w:b/>
-                <w:bCs/>
-              </w:rPr>
-            </w:pPr>
-            <w:r>
-              <w:rPr>
-                <w:b/>
-                <w:bCs/>
-              </w:rPr>
-              <w:t>Purpose</w:t>
+            <w:proofErr w:type="spellStart"/>
+            <w:r>
+              <w:t>FastAPI</w:t>
+            </w:r>
+            <w:proofErr w:type="spellEnd"/>
+            <w:r>
+              <w:t xml:space="preserve"> (Python) or Express (Node.js)</w:t>
+            </w:r>
+          </w:p>
+        </w:tc>
+        <w:tc>
+          <w:tcPr>
+            <w:tcW w:w="0" w:type="auto"/>
+            <w:hideMark/>
+          </w:tcPr>
+          <w:p>
+            <w:r>
+              <w:t>Implements the sandbox FHIR API and test-harness logic</w:t>
             </w:r>
           </w:p>
         </w:tc>
@@ -7867,19 +7328,8 @@
             <w:hideMark/>
           </w:tcPr>
           <w:p>
-            <w:pPr>
-              <w:jc w:val="both"/>
-              <w:rPr>
-                <w:b/>
-                <w:bCs/>
-              </w:rPr>
-            </w:pPr>
-            <w:r>
-              <w:rPr>
-                <w:b/>
-                <w:bCs/>
-              </w:rPr>
-              <w:t>Justification (vs. alternative)</w:t>
+            <w:r>
+              <w:t>Mature, well-documented frameworks with strong REST support; either is fine as a starting point</w:t>
             </w:r>
           </w:p>
         </w:tc>
@@ -7891,11 +7341,8 @@
             <w:hideMark/>
           </w:tcPr>
           <w:p>
-            <w:pPr>
-              <w:jc w:val="both"/>
-            </w:pPr>
-            <w:r>
-              <w:t>Backend / API</w:t>
+            <w:r>
+              <w:t>FHIR test server</w:t>
             </w:r>
           </w:p>
         </w:tc>
@@ -7905,16 +7352,8 @@
             <w:hideMark/>
           </w:tcPr>
           <w:p>
-            <w:pPr>
-              <w:jc w:val="both"/>
-            </w:pPr>
-            <w:proofErr w:type="spellStart"/>
-            <w:r>
-              <w:t>FastAPI</w:t>
-            </w:r>
-            <w:proofErr w:type="spellEnd"/>
-            <w:r>
-              <w:t xml:space="preserve"> (Python) or Express (Node.js)</w:t>
+            <w:r>
+              <w:t>HAPI FHIR (open source)</w:t>
             </w:r>
           </w:p>
         </w:tc>
@@ -7924,11 +7363,8 @@
             <w:hideMark/>
           </w:tcPr>
           <w:p>
-            <w:pPr>
-              <w:jc w:val="both"/>
-            </w:pPr>
-            <w:r>
-              <w:t>Implements the sandbox FHIR API and test-harness logic</w:t>
+            <w:r>
+              <w:t>Reference server to bootstrap the mock FHIR endpoints</w:t>
             </w:r>
           </w:p>
         </w:tc>
@@ -7938,11 +7374,8 @@
             <w:hideMark/>
           </w:tcPr>
           <w:p>
-            <w:pPr>
-              <w:jc w:val="both"/>
-            </w:pPr>
-            <w:r>
-              <w:t>Mature, well-documented frameworks with strong REST support; either is fine as a starting point</w:t>
+            <w:r>
+              <w:t>Saves building a FHIR server from scratch; widely used, well-supported reference implementation</w:t>
             </w:r>
           </w:p>
         </w:tc>
@@ -7954,11 +7387,8 @@
             <w:hideMark/>
           </w:tcPr>
           <w:p>
-            <w:pPr>
-              <w:jc w:val="both"/>
-            </w:pPr>
-            <w:r>
-              <w:t>FHIR test server</w:t>
+            <w:r>
+              <w:t>Data exchange standard</w:t>
             </w:r>
           </w:p>
         </w:tc>
@@ -7968,11 +7398,8 @@
             <w:hideMark/>
           </w:tcPr>
           <w:p>
-            <w:pPr>
-              <w:jc w:val="both"/>
-            </w:pPr>
-            <w:r>
-              <w:t>HAPI FHIR (open source)</w:t>
+            <w:r>
+              <w:t>FHIR R4 (REST/JSON)</w:t>
             </w:r>
           </w:p>
         </w:tc>
@@ -7982,11 +7409,8 @@
             <w:hideMark/>
           </w:tcPr>
           <w:p>
-            <w:pPr>
-              <w:jc w:val="both"/>
-            </w:pPr>
-            <w:r>
-              <w:t>Reference server to bootstrap the mock FHIR endpoints</w:t>
+            <w:r>
+              <w:t>Primary standard for healthcare data exchange and interoperability testing</w:t>
             </w:r>
           </w:p>
         </w:tc>
@@ -7996,11 +7420,8 @@
             <w:hideMark/>
           </w:tcPr>
           <w:p>
-            <w:pPr>
-              <w:jc w:val="both"/>
-            </w:pPr>
-            <w:r>
-              <w:t>Saves building a FHIR server from scratch; widely used, well-supported reference implementation</w:t>
+            <w:r>
+              <w:t>Required for REST/JSON-based interoperability testing; HL7 v2 alone doesn't support this</w:t>
             </w:r>
           </w:p>
         </w:tc>
@@ -8012,11 +7433,8 @@
             <w:hideMark/>
           </w:tcPr>
           <w:p>
-            <w:pPr>
-              <w:jc w:val="both"/>
-            </w:pPr>
-            <w:r>
-              <w:t>Data exchange standard</w:t>
+            <w:r>
+              <w:t>Implementation guide</w:t>
             </w:r>
           </w:p>
         </w:tc>
@@ -8026,11 +7444,8 @@
             <w:hideMark/>
           </w:tcPr>
           <w:p>
-            <w:pPr>
-              <w:jc w:val="both"/>
-            </w:pPr>
-            <w:r>
-              <w:t>FHIR R4 (REST/JSON)</w:t>
+            <w:r>
+              <w:t>AU Core</w:t>
             </w:r>
           </w:p>
         </w:tc>
@@ -8040,11 +7455,8 @@
             <w:hideMark/>
           </w:tcPr>
           <w:p>
-            <w:pPr>
-              <w:jc w:val="both"/>
-            </w:pPr>
-            <w:r>
-              <w:t>Primary standard for healthcare data exchange and interoperability testing</w:t>
+            <w:r>
+              <w:t>Shapes FHIR resources to the Australian context</w:t>
             </w:r>
           </w:p>
         </w:tc>
@@ -8054,11 +7466,8 @@
             <w:hideMark/>
           </w:tcPr>
           <w:p>
-            <w:pPr>
-              <w:jc w:val="both"/>
-            </w:pPr>
-            <w:r>
-              <w:t>Required for REST/JSON-based interoperability testing; HL7 v2 alone doesn't support this</w:t>
+            <w:r>
+              <w:t>Generic FHIR lacks Australian-specific alignment</w:t>
             </w:r>
           </w:p>
         </w:tc>
@@ -8070,11 +7479,8 @@
             <w:hideMark/>
           </w:tcPr>
           <w:p>
-            <w:pPr>
-              <w:jc w:val="both"/>
-            </w:pPr>
-            <w:r>
-              <w:t>Implementation guide</w:t>
+            <w:r>
+              <w:t>Legacy messaging</w:t>
             </w:r>
           </w:p>
         </w:tc>
@@ -8084,11 +7490,8 @@
             <w:hideMark/>
           </w:tcPr>
           <w:p>
-            <w:pPr>
-              <w:jc w:val="both"/>
-            </w:pPr>
-            <w:r>
-              <w:t>AU Core</w:t>
+            <w:r>
+              <w:t>HL7 v2</w:t>
             </w:r>
           </w:p>
         </w:tc>
@@ -8098,11 +7501,8 @@
             <w:hideMark/>
           </w:tcPr>
           <w:p>
-            <w:pPr>
-              <w:jc w:val="both"/>
-            </w:pPr>
-            <w:r>
-              <w:t>Shapes FHIR resources to the Australian context</w:t>
+            <w:r>
+              <w:t>Simulates applicable legacy messaging scenarios</w:t>
             </w:r>
           </w:p>
         </w:tc>
@@ -8112,11 +7512,8 @@
             <w:hideMark/>
           </w:tcPr>
           <w:p>
-            <w:pPr>
-              <w:jc w:val="both"/>
-            </w:pPr>
-            <w:r>
-              <w:t>Generic FHIR lacks Australian-specific alignment</w:t>
+            <w:r>
+              <w:t>Retained only where relevant; FHIR R4 is preferred for the primary workflow</w:t>
             </w:r>
           </w:p>
         </w:tc>
@@ -8125,28 +7522,53 @@
         <w:tc>
           <w:tcPr>
             <w:tcW w:w="0" w:type="auto"/>
-            <w:hideMark/>
-          </w:tcPr>
-          <w:p>
-            <w:pPr>
-              <w:jc w:val="both"/>
-            </w:pPr>
-            <w:r>
-              <w:t>Legacy messaging</w:t>
-            </w:r>
-          </w:p>
-        </w:tc>
+          </w:tcPr>
+          <w:p>
+            <w:r>
+              <w:t xml:space="preserve">Frontend </w:t>
+            </w:r>
+          </w:p>
+        </w:tc>
+        <w:tc>
+          <w:tcPr>
+            <w:tcW w:w="0" w:type="auto"/>
+          </w:tcPr>
+          <w:p>
+            <w:r>
+              <w:t>React</w:t>
+            </w:r>
+          </w:p>
+        </w:tc>
+        <w:tc>
+          <w:tcPr>
+            <w:tcW w:w="0" w:type="auto"/>
+          </w:tcPr>
+          <w:p>
+            <w:r>
+              <w:t>Builds the test-harness UI (scenario builder, results dashboard, connector configuration)</w:t>
+            </w:r>
+          </w:p>
+        </w:tc>
+        <w:tc>
+          <w:tcPr>
+            <w:tcW w:w="3635" w:type="dxa"/>
+          </w:tcPr>
+          <w:p>
+            <w:r>
+              <w:t>Component-based structure suits a dashboard with repeating elements (test cards, result rows); large ecosystem and free tooling keep it within the no-budget constraint; plain HTML/JS would require more manual work for the same interactivity</w:t>
+            </w:r>
+          </w:p>
+        </w:tc>
+      </w:tr>
+      <w:tr>
         <w:tc>
           <w:tcPr>
             <w:tcW w:w="0" w:type="auto"/>
             <w:hideMark/>
           </w:tcPr>
           <w:p>
-            <w:pPr>
-              <w:jc w:val="both"/>
-            </w:pPr>
-            <w:r>
-              <w:t>HL7 v2</w:t>
+            <w:r>
+              <w:t>Terminology</w:t>
             </w:r>
           </w:p>
         </w:tc>
@@ -8156,11 +7578,19 @@
             <w:hideMark/>
           </w:tcPr>
           <w:p>
-            <w:pPr>
-              <w:jc w:val="both"/>
-            </w:pPr>
-            <w:r>
-              <w:t>Simulates applicable legacy messaging scenarios</w:t>
+            <w:r>
+              <w:t>SNOMED CT-AU, ICD-10-AM / MBS</w:t>
+            </w:r>
+          </w:p>
+        </w:tc>
+        <w:tc>
+          <w:tcPr>
+            <w:tcW w:w="0" w:type="auto"/>
+            <w:hideMark/>
+          </w:tcPr>
+          <w:p>
+            <w:r>
+              <w:t>Clinical terminology and Medicare/billing mapping scenarios</w:t>
             </w:r>
           </w:p>
         </w:tc>
@@ -8170,11 +7600,8 @@
             <w:hideMark/>
           </w:tcPr>
           <w:p>
-            <w:pPr>
-              <w:jc w:val="both"/>
-            </w:pPr>
-            <w:r>
-              <w:t>Retained only where relevant; FHIR R4 is preferred for the primary workflow</w:t>
+            <w:r>
+              <w:t>Required for Australian clinical/billing context; non-AU code sets wouldn't meet project requirements</w:t>
             </w:r>
           </w:p>
         </w:tc>
@@ -8183,52 +7610,44 @@
         <w:tc>
           <w:tcPr>
             <w:tcW w:w="0" w:type="auto"/>
-          </w:tcPr>
-          <w:p>
-            <w:pPr>
-              <w:jc w:val="both"/>
-            </w:pPr>
-            <w:r>
-              <w:t xml:space="preserve">Frontend </w:t>
+            <w:hideMark/>
+          </w:tcPr>
+          <w:p>
+            <w:r>
+              <w:t>Auth</w:t>
             </w:r>
           </w:p>
         </w:tc>
         <w:tc>
           <w:tcPr>
             <w:tcW w:w="0" w:type="auto"/>
-          </w:tcPr>
-          <w:p>
-            <w:pPr>
-              <w:jc w:val="both"/>
-            </w:pPr>
-            <w:r>
-              <w:t>React</w:t>
+            <w:hideMark/>
+          </w:tcPr>
+          <w:p>
+            <w:r>
+              <w:t>SMART on FHIR / OAuth 2.0</w:t>
             </w:r>
           </w:p>
         </w:tc>
         <w:tc>
           <w:tcPr>
             <w:tcW w:w="0" w:type="auto"/>
-          </w:tcPr>
-          <w:p>
-            <w:pPr>
-              <w:jc w:val="both"/>
-            </w:pPr>
-            <w:r>
-              <w:t>Builds the test-harness UI (scenario builder, results dashboard, connector configuration)</w:t>
+            <w:hideMark/>
+          </w:tcPr>
+          <w:p>
+            <w:r>
+              <w:t>Authentication and authorisation for FHIR interfaces</w:t>
             </w:r>
           </w:p>
         </w:tc>
         <w:tc>
           <w:tcPr>
             <w:tcW w:w="3635" w:type="dxa"/>
-          </w:tcPr>
-          <w:p>
-            <w:pPr>
-              <w:jc w:val="both"/>
-            </w:pPr>
-            <w:r>
-              <w:t>Component-based structure suits a dashboard with repeating elements (test cards, result rows); large ecosystem and free tooling keep it within the no-budget constraint; plain HTML/JS would require more manual work for the same interactivity</w:t>
+            <w:hideMark/>
+          </w:tcPr>
+          <w:p>
+            <w:r>
+              <w:t>More granular access control than static API keys</w:t>
             </w:r>
           </w:p>
         </w:tc>
@@ -8240,11 +7659,8 @@
             <w:hideMark/>
           </w:tcPr>
           <w:p>
-            <w:pPr>
-              <w:jc w:val="both"/>
-            </w:pPr>
-            <w:r>
-              <w:t>Terminology</w:t>
+            <w:r>
+              <w:t>Database</w:t>
             </w:r>
           </w:p>
         </w:tc>
@@ -8254,11 +7670,8 @@
             <w:hideMark/>
           </w:tcPr>
           <w:p>
-            <w:pPr>
-              <w:jc w:val="both"/>
-            </w:pPr>
-            <w:r>
-              <w:t>SNOMED CT-AU, ICD-10-AM / MBS</w:t>
+            <w:r>
+              <w:t>PostgreSQL</w:t>
             </w:r>
           </w:p>
         </w:tc>
@@ -8268,11 +7681,8 @@
             <w:hideMark/>
           </w:tcPr>
           <w:p>
-            <w:pPr>
-              <w:jc w:val="both"/>
-            </w:pPr>
-            <w:r>
-              <w:t>Clinical terminology and Medicare/billing mapping scenarios</w:t>
+            <w:r>
+              <w:t>Stores synthetic patients, conditions, and mappings</w:t>
             </w:r>
           </w:p>
         </w:tc>
@@ -8282,11 +7692,8 @@
             <w:hideMark/>
           </w:tcPr>
           <w:p>
-            <w:pPr>
-              <w:jc w:val="both"/>
-            </w:pPr>
-            <w:r>
-              <w:t>Required for Australian clinical/billing context; non-AU code sets wouldn't meet project requirements</w:t>
+            <w:r>
+              <w:t>Relational integrity suits structured, linked clinical data</w:t>
             </w:r>
           </w:p>
         </w:tc>
@@ -8298,11 +7705,8 @@
             <w:hideMark/>
           </w:tcPr>
           <w:p>
-            <w:pPr>
-              <w:jc w:val="both"/>
-            </w:pPr>
-            <w:r>
-              <w:t>Auth</w:t>
+            <w:r>
+              <w:t>Test data</w:t>
             </w:r>
           </w:p>
         </w:tc>
@@ -8312,11 +7716,8 @@
             <w:hideMark/>
           </w:tcPr>
           <w:p>
-            <w:pPr>
-              <w:jc w:val="both"/>
-            </w:pPr>
-            <w:r>
-              <w:t>SMART on FHIR / OAuth 2.0</w:t>
+            <w:r>
+              <w:t>Synthetic data only</w:t>
             </w:r>
           </w:p>
         </w:tc>
@@ -8326,11 +7727,8 @@
             <w:hideMark/>
           </w:tcPr>
           <w:p>
-            <w:pPr>
-              <w:jc w:val="both"/>
-            </w:pPr>
-            <w:r>
-              <w:t>Authentication and authorisation for FHIR interfaces</w:t>
+            <w:r>
+              <w:t>All test records</w:t>
             </w:r>
           </w:p>
         </w:tc>
@@ -8340,125 +7738,6 @@
             <w:hideMark/>
           </w:tcPr>
           <w:p>
-            <w:pPr>
-              <w:jc w:val="both"/>
-            </w:pPr>
-            <w:r>
-              <w:t>More granular access control than static API keys</w:t>
-            </w:r>
-          </w:p>
-        </w:tc>
-      </w:tr>
-      <w:tr>
-        <w:tc>
-          <w:tcPr>
-            <w:tcW w:w="0" w:type="auto"/>
-            <w:hideMark/>
-          </w:tcPr>
-          <w:p>
-            <w:pPr>
-              <w:jc w:val="both"/>
-            </w:pPr>
-            <w:r>
-              <w:t>Database</w:t>
-            </w:r>
-          </w:p>
-        </w:tc>
-        <w:tc>
-          <w:tcPr>
-            <w:tcW w:w="0" w:type="auto"/>
-            <w:hideMark/>
-          </w:tcPr>
-          <w:p>
-            <w:pPr>
-              <w:jc w:val="both"/>
-            </w:pPr>
-            <w:r>
-              <w:t>PostgreSQL</w:t>
-            </w:r>
-          </w:p>
-        </w:tc>
-        <w:tc>
-          <w:tcPr>
-            <w:tcW w:w="0" w:type="auto"/>
-            <w:hideMark/>
-          </w:tcPr>
-          <w:p>
-            <w:pPr>
-              <w:jc w:val="both"/>
-            </w:pPr>
-            <w:r>
-              <w:t>Stores synthetic patients, conditions, and mappings</w:t>
-            </w:r>
-          </w:p>
-        </w:tc>
-        <w:tc>
-          <w:tcPr>
-            <w:tcW w:w="3635" w:type="dxa"/>
-            <w:hideMark/>
-          </w:tcPr>
-          <w:p>
-            <w:pPr>
-              <w:jc w:val="both"/>
-            </w:pPr>
-            <w:r>
-              <w:t>Relational integrity suits structured, linked clinical data</w:t>
-            </w:r>
-          </w:p>
-        </w:tc>
-      </w:tr>
-      <w:tr>
-        <w:tc>
-          <w:tcPr>
-            <w:tcW w:w="0" w:type="auto"/>
-            <w:hideMark/>
-          </w:tcPr>
-          <w:p>
-            <w:pPr>
-              <w:jc w:val="both"/>
-            </w:pPr>
-            <w:r>
-              <w:t>Test data</w:t>
-            </w:r>
-          </w:p>
-        </w:tc>
-        <w:tc>
-          <w:tcPr>
-            <w:tcW w:w="0" w:type="auto"/>
-            <w:hideMark/>
-          </w:tcPr>
-          <w:p>
-            <w:pPr>
-              <w:jc w:val="both"/>
-            </w:pPr>
-            <w:r>
-              <w:t>Synthetic data only</w:t>
-            </w:r>
-          </w:p>
-        </w:tc>
-        <w:tc>
-          <w:tcPr>
-            <w:tcW w:w="0" w:type="auto"/>
-            <w:hideMark/>
-          </w:tcPr>
-          <w:p>
-            <w:pPr>
-              <w:jc w:val="both"/>
-            </w:pPr>
-            <w:r>
-              <w:t>All test records</w:t>
-            </w:r>
-          </w:p>
-        </w:tc>
-        <w:tc>
-          <w:tcPr>
-            <w:tcW w:w="3635" w:type="dxa"/>
-            <w:hideMark/>
-          </w:tcPr>
-          <w:p>
-            <w:pPr>
-              <w:jc w:val="both"/>
-            </w:pPr>
             <w:r>
               <w:t>Prevents exposure of real patient data; enables safe, repeatable testing</w:t>
             </w:r>
@@ -8468,114 +7747,49 @@
     </w:tbl>
     <w:p>
       <w:pPr>
-        <w:pStyle w:val="Heading2"/>
-        <w:jc w:val="both"/>
         <w:rPr>
-          <w:rFonts w:ascii="Times New Roman" w:eastAsia="Times New Roman" w:hAnsi="Times New Roman" w:cs="Times New Roman"/>
-          <w:color w:val="auto"/>
-          <w:sz w:val="24"/>
-          <w:szCs w:val="24"/>
           <w:lang w:val="en-GB" w:eastAsia="en-GB"/>
         </w:rPr>
       </w:pPr>
       <w:r>
         <w:rPr>
-          <w:rFonts w:ascii="Times New Roman" w:eastAsia="Times New Roman" w:hAnsi="Times New Roman" w:cs="Times New Roman"/>
-          <w:color w:val="auto"/>
-          <w:sz w:val="24"/>
-          <w:szCs w:val="24"/>
           <w:lang w:val="en-GB" w:eastAsia="en-GB"/>
         </w:rPr>
-        <w:lastRenderedPageBreak/>
         <w:t>The combination of FHIR R4 and AU Core is right since the solution needs to check the interoperability in an Australian healthcare environment</w:t>
       </w:r>
       <w:r>
         <w:rPr>
-          <w:rFonts w:ascii="Times New Roman" w:eastAsia="Times New Roman" w:hAnsi="Times New Roman" w:cs="Times New Roman"/>
-          <w:color w:val="auto"/>
-          <w:sz w:val="24"/>
-          <w:szCs w:val="24"/>
           <w:lang w:val="en-GB" w:eastAsia="en-GB"/>
         </w:rPr>
-        <w:t xml:space="preserve"> </w:t>
+        <w:t xml:space="preserve"> (HL7 Australia, n.d.). </w:t>
       </w:r>
       <w:r>
         <w:rPr>
-          <w:rFonts w:ascii="Times New Roman" w:eastAsia="Times New Roman" w:hAnsi="Times New Roman" w:cs="Times New Roman"/>
-          <w:color w:val="auto"/>
-          <w:sz w:val="24"/>
-          <w:szCs w:val="24"/>
-          <w:lang w:val="en-GB" w:eastAsia="en-GB"/>
-        </w:rPr>
-        <w:t xml:space="preserve">(HL7 Australia, n.d.). </w:t>
-      </w:r>
-      <w:r>
-        <w:rPr>
-          <w:rFonts w:ascii="Times New Roman" w:eastAsia="Times New Roman" w:hAnsi="Times New Roman" w:cs="Times New Roman"/>
-          <w:color w:val="auto"/>
-          <w:sz w:val="24"/>
-          <w:szCs w:val="24"/>
           <w:lang w:val="en-GB" w:eastAsia="en-GB"/>
         </w:rPr>
         <w:t xml:space="preserve"> HL7 v2 remains part of the complementary simulation capabilities but not a substitute for FHIR. The terminology standards (SNOMED CT-AU, ICD-10-AM, MBS) serve as the foundation for clinical and billing mapping testing, whereas SMART on FHIR and OAuth 2.0 become the proposed authentication </w:t>
       </w:r>
       <w:r>
         <w:rPr>
-          <w:rFonts w:ascii="Times New Roman" w:eastAsia="Times New Roman" w:hAnsi="Times New Roman" w:cs="Times New Roman"/>
-          <w:color w:val="auto"/>
-          <w:sz w:val="24"/>
-          <w:szCs w:val="24"/>
           <w:lang w:val="en-GB" w:eastAsia="en-GB"/>
         </w:rPr>
-        <w:t xml:space="preserve">approach </w:t>
+        <w:t xml:space="preserve">approach (SMART Health IT, n.d.). </w:t>
       </w:r>
       <w:r>
         <w:rPr>
-          <w:rFonts w:ascii="Times New Roman" w:eastAsia="Times New Roman" w:hAnsi="Times New Roman" w:cs="Times New Roman"/>
-          <w:color w:val="auto"/>
-          <w:sz w:val="24"/>
-          <w:szCs w:val="24"/>
-          <w:lang w:val="en-GB" w:eastAsia="en-GB"/>
-        </w:rPr>
-        <w:t xml:space="preserve">(SMART Health IT, n.d.). </w:t>
-      </w:r>
-      <w:r>
-        <w:rPr>
-          <w:rFonts w:ascii="Times New Roman" w:eastAsia="Times New Roman" w:hAnsi="Times New Roman" w:cs="Times New Roman"/>
-          <w:color w:val="auto"/>
-          <w:sz w:val="24"/>
-          <w:szCs w:val="24"/>
           <w:lang w:val="en-GB" w:eastAsia="en-GB"/>
         </w:rPr>
         <w:t>Docker becomes a Stage 2 implementation technology and not the pre-existing solution due to the scope of work, where no test harness implementation takes place in Stage 1. Postman/Newman becomes part of the solution besides the unit-testing platform since the API validation comes from an external protocol level that the unit testing cannot handle</w:t>
       </w:r>
       <w:r>
         <w:rPr>
-          <w:rFonts w:ascii="Times New Roman" w:eastAsia="Times New Roman" w:hAnsi="Times New Roman" w:cs="Times New Roman"/>
-          <w:color w:val="auto"/>
-          <w:sz w:val="24"/>
-          <w:szCs w:val="24"/>
           <w:lang w:val="en-GB" w:eastAsia="en-GB"/>
         </w:rPr>
-        <w:t xml:space="preserve"> </w:t>
-      </w:r>
+        <w:t xml:space="preserve"> (</w:t>
+      </w:r>
+      <w:proofErr w:type="spellStart"/>
       <w:r>
         <w:rPr>
-          <w:rFonts w:ascii="Times New Roman" w:eastAsia="Times New Roman" w:hAnsi="Times New Roman" w:cs="Times New Roman"/>
-          <w:color w:val="auto"/>
-          <w:sz w:val="24"/>
-          <w:szCs w:val="24"/>
-          <w:lang w:val="en-GB" w:eastAsia="en-GB"/>
-        </w:rPr>
-        <w:t>(</w:t>
-      </w:r>
-      <w:proofErr w:type="spellStart"/>
-      <w:r>
-        <w:rPr>
-          <w:rFonts w:ascii="Times New Roman" w:eastAsia="Times New Roman" w:hAnsi="Times New Roman" w:cs="Times New Roman"/>
-          <w:color w:val="auto"/>
-          <w:sz w:val="24"/>
-          <w:szCs w:val="24"/>
           <w:lang w:val="en-GB" w:eastAsia="en-GB"/>
         </w:rPr>
         <w:t>Gruendner</w:t>
@@ -8583,10 +7797,6 @@
       <w:proofErr w:type="spellEnd"/>
       <w:r>
         <w:rPr>
-          <w:rFonts w:ascii="Times New Roman" w:eastAsia="Times New Roman" w:hAnsi="Times New Roman" w:cs="Times New Roman"/>
-          <w:color w:val="auto"/>
-          <w:sz w:val="24"/>
-          <w:szCs w:val="24"/>
           <w:lang w:val="en-GB" w:eastAsia="en-GB"/>
         </w:rPr>
         <w:t xml:space="preserve"> et al., 2021).</w:t>
@@ -8595,12 +7805,8 @@
     <w:p>
       <w:pPr>
         <w:pStyle w:val="Heading2"/>
-        <w:jc w:val="both"/>
         <w:rPr>
-          <w:rFonts w:ascii="Times New Roman" w:eastAsia="Times New Roman" w:hAnsi="Times New Roman" w:cs="Times New Roman"/>
-          <w:color w:val="auto"/>
-          <w:sz w:val="24"/>
-          <w:szCs w:val="24"/>
+          <w:rFonts w:eastAsia="Times New Roman"/>
           <w:lang w:val="en-GB" w:eastAsia="en-GB"/>
         </w:rPr>
       </w:pPr>
@@ -8616,7 +7822,6 @@
     <w:p>
       <w:pPr>
         <w:pStyle w:val="NormalWeb"/>
-        <w:jc w:val="both"/>
       </w:pPr>
       <w:r>
         <w:t xml:space="preserve">Security will be integrated in the recommended solution using preventive, protective and monitoring controls. </w:t>
@@ -8628,7 +7833,6 @@
     <w:p>
       <w:pPr>
         <w:pStyle w:val="NormalWeb"/>
-        <w:jc w:val="both"/>
       </w:pPr>
       <w:r>
         <w:t xml:space="preserve">Authentication will be employed for authorised users of the test harness. This would restrict who could define test scenarios, run tests and access their results. Authentication and delegation for FHIR interfaces would be achieved using SMART on FHIR and OAuth 2.0. Secure transfer should be implemented for implemented interfaces to ensure the security of data in transit.  Moreover, logical separation is also needed for connectors and test environments. This helps to minimize chances that the test data or results corresponding to one connector is accessed by another connector. Input validation needs to be performed for the FHIR resources and other message formats to identify any mal-formed input data. Test log will help in providing traceability. </w:t>
@@ -8637,7 +7841,6 @@
     <w:p>
       <w:pPr>
         <w:pStyle w:val="NormalWeb"/>
-        <w:jc w:val="both"/>
       </w:pPr>
       <w:r>
         <w:t>For Stage 2, the vulnerability management process should cover the dependency and container checking, secure configuration and updating of the deployed components. The incident response plan will be necessary to specify the containment, investigation and documentation process of any suspicious security events. Backup and recovery controls will be needed for important configuration and test result data.</w:t>
@@ -8646,7 +7849,6 @@
     <w:p>
       <w:pPr>
         <w:pStyle w:val="NormalWeb"/>
-        <w:jc w:val="both"/>
       </w:pPr>
       <w:r>
         <w:t xml:space="preserve">These controls have been mainly mapped to NIST Cybersecurity Framework (CSF) since its functions of Identify, Protect, Detect, Respond and Recover help establish a definite framework for the suggested cybersecurity </w:t>
@@ -8655,10 +7857,7 @@
         <w:t>controls</w:t>
       </w:r>
       <w:r>
-        <w:t xml:space="preserve"> (</w:t>
-      </w:r>
-      <w:r>
-        <w:t>National Institute of Standards and Technology, 2024).</w:t>
+        <w:t xml:space="preserve"> (National Institute of Standards and Technology, 2024).</w:t>
       </w:r>
       <w:r>
         <w:br w:type="page"/>
@@ -8667,7 +7866,6 @@
     <w:p>
       <w:pPr>
         <w:pStyle w:val="NormalWeb"/>
-        <w:jc w:val="both"/>
       </w:pPr>
       <w:r>
         <w:lastRenderedPageBreak/>
@@ -8679,36 +7877,93 @@
     </w:p>
     <w:tbl>
       <w:tblPr>
-        <w:tblStyle w:val="PlainTable1"/>
+        <w:tblStyle w:val="TableGridLight"/>
         <w:tblW w:w="0" w:type="auto"/>
         <w:tblLook w:val="04A0" w:firstRow="1" w:lastRow="0" w:firstColumn="1" w:lastColumn="0" w:noHBand="0" w:noVBand="1"/>
       </w:tblPr>
       <w:tblGrid>
-        <w:gridCol w:w="2374"/>
-        <w:gridCol w:w="3268"/>
-        <w:gridCol w:w="1186"/>
-        <w:gridCol w:w="2188"/>
+        <w:gridCol w:w="2261"/>
+        <w:gridCol w:w="3346"/>
+        <w:gridCol w:w="1197"/>
+        <w:gridCol w:w="2212"/>
       </w:tblGrid>
       <w:tr>
-        <w:trPr>
-          <w:cnfStyle w:val="100000000000" w:firstRow="1" w:lastRow="0" w:firstColumn="0" w:lastColumn="0" w:oddVBand="0" w:evenVBand="0" w:oddHBand="0" w:evenHBand="0" w:firstRowFirstColumn="0" w:firstRowLastColumn="0" w:lastRowFirstColumn="0" w:lastRowLastColumn="0"/>
-        </w:trPr>
-        <w:tc>
-          <w:tcPr>
-            <w:cnfStyle w:val="001000000000" w:firstRow="0" w:lastRow="0" w:firstColumn="1" w:lastColumn="0" w:oddVBand="0" w:evenVBand="0" w:oddHBand="0" w:evenHBand="0" w:firstRowFirstColumn="0" w:firstRowLastColumn="0" w:lastRowFirstColumn="0" w:lastRowLastColumn="0"/>
+        <w:tc>
+          <w:tcPr>
+            <w:tcW w:w="0" w:type="auto"/>
+            <w:shd w:val="clear" w:color="auto" w:fill="92D050"/>
+            <w:hideMark/>
+          </w:tcPr>
+          <w:p>
+            <w:r>
+              <w:t>Security Control</w:t>
+            </w:r>
+          </w:p>
+        </w:tc>
+        <w:tc>
+          <w:tcPr>
+            <w:tcW w:w="0" w:type="auto"/>
+            <w:shd w:val="clear" w:color="auto" w:fill="92D050"/>
+            <w:hideMark/>
+          </w:tcPr>
+          <w:p>
+            <w:pPr>
+              <w:rPr>
+                <w:b/>
+                <w:bCs/>
+              </w:rPr>
+            </w:pPr>
+            <w:r>
+              <w:t>Proposed Design</w:t>
+            </w:r>
+          </w:p>
+        </w:tc>
+        <w:tc>
+          <w:tcPr>
+            <w:tcW w:w="0" w:type="auto"/>
+            <w:shd w:val="clear" w:color="auto" w:fill="92D050"/>
+            <w:hideMark/>
+          </w:tcPr>
+          <w:p>
+            <w:pPr>
+              <w:rPr>
+                <w:b/>
+                <w:bCs/>
+              </w:rPr>
+            </w:pPr>
+            <w:r>
+              <w:t>NIST CSF Mapping</w:t>
+            </w:r>
+          </w:p>
+        </w:tc>
+        <w:tc>
+          <w:tcPr>
+            <w:tcW w:w="0" w:type="auto"/>
+            <w:shd w:val="clear" w:color="auto" w:fill="92D050"/>
+            <w:hideMark/>
+          </w:tcPr>
+          <w:p>
+            <w:pPr>
+              <w:rPr>
+                <w:b/>
+                <w:bCs/>
+              </w:rPr>
+            </w:pPr>
+            <w:r>
+              <w:t>Status</w:t>
+            </w:r>
+          </w:p>
+        </w:tc>
+      </w:tr>
+      <w:tr>
+        <w:tc>
+          <w:tcPr>
             <w:tcW w:w="0" w:type="auto"/>
             <w:hideMark/>
           </w:tcPr>
           <w:p>
-            <w:pPr>
-              <w:jc w:val="center"/>
-            </w:pPr>
-            <w:r>
-              <w:rPr>
-                <w:b w:val="0"/>
-                <w:bCs w:val="0"/>
-              </w:rPr>
-              <w:t>Security Control</w:t>
+            <w:r>
+              <w:t>Authentication</w:t>
             </w:r>
           </w:p>
         </w:tc>
@@ -8718,20 +7973,8 @@
             <w:hideMark/>
           </w:tcPr>
           <w:p>
-            <w:pPr>
-              <w:jc w:val="center"/>
-              <w:cnfStyle w:val="100000000000" w:firstRow="1" w:lastRow="0" w:firstColumn="0" w:lastColumn="0" w:oddVBand="0" w:evenVBand="0" w:oddHBand="0" w:evenHBand="0" w:firstRowFirstColumn="0" w:firstRowLastColumn="0" w:lastRowFirstColumn="0" w:lastRowLastColumn="0"/>
-              <w:rPr>
-                <w:b w:val="0"/>
-                <w:bCs w:val="0"/>
-              </w:rPr>
-            </w:pPr>
-            <w:r>
-              <w:rPr>
-                <w:b w:val="0"/>
-                <w:bCs w:val="0"/>
-              </w:rPr>
-              <w:t>Proposed Design</w:t>
+            <w:r>
+              <w:t>Basic OAuth 2.0 / SMART on FHIR token-based access for FHIR interfaces</w:t>
             </w:r>
           </w:p>
         </w:tc>
@@ -8741,20 +7984,8 @@
             <w:hideMark/>
           </w:tcPr>
           <w:p>
-            <w:pPr>
-              <w:jc w:val="center"/>
-              <w:cnfStyle w:val="100000000000" w:firstRow="1" w:lastRow="0" w:firstColumn="0" w:lastColumn="0" w:oddVBand="0" w:evenVBand="0" w:oddHBand="0" w:evenHBand="0" w:firstRowFirstColumn="0" w:firstRowLastColumn="0" w:lastRowFirstColumn="0" w:lastRowLastColumn="0"/>
-              <w:rPr>
-                <w:b w:val="0"/>
-                <w:bCs w:val="0"/>
-              </w:rPr>
-            </w:pPr>
-            <w:r>
-              <w:rPr>
-                <w:b w:val="0"/>
-                <w:bCs w:val="0"/>
-              </w:rPr>
-              <w:t>NIST CSF Mapping</w:t>
+            <w:r>
+              <w:t>Protect</w:t>
             </w:r>
           </w:p>
         </w:tc>
@@ -8764,43 +7995,21 @@
             <w:hideMark/>
           </w:tcPr>
           <w:p>
-            <w:pPr>
-              <w:jc w:val="center"/>
-              <w:cnfStyle w:val="100000000000" w:firstRow="1" w:lastRow="0" w:firstColumn="0" w:lastColumn="0" w:oddVBand="0" w:evenVBand="0" w:oddHBand="0" w:evenHBand="0" w:firstRowFirstColumn="0" w:firstRowLastColumn="0" w:lastRowFirstColumn="0" w:lastRowLastColumn="0"/>
-              <w:rPr>
-                <w:b w:val="0"/>
-                <w:bCs w:val="0"/>
-              </w:rPr>
-            </w:pPr>
-            <w:r>
-              <w:rPr>
-                <w:b w:val="0"/>
-                <w:bCs w:val="0"/>
-              </w:rPr>
-              <w:t>Status</w:t>
+            <w:r>
+              <w:t>Implemented (basic)</w:t>
             </w:r>
           </w:p>
         </w:tc>
       </w:tr>
       <w:tr>
-        <w:trPr>
-          <w:cnfStyle w:val="000000100000" w:firstRow="0" w:lastRow="0" w:firstColumn="0" w:lastColumn="0" w:oddVBand="0" w:evenVBand="0" w:oddHBand="1" w:evenHBand="0" w:firstRowFirstColumn="0" w:firstRowLastColumn="0" w:lastRowFirstColumn="0" w:lastRowLastColumn="0"/>
-        </w:trPr>
-        <w:tc>
-          <w:tcPr>
-            <w:cnfStyle w:val="001000000000" w:firstRow="0" w:lastRow="0" w:firstColumn="1" w:lastColumn="0" w:oddVBand="0" w:evenVBand="0" w:oddHBand="0" w:evenHBand="0" w:firstRowFirstColumn="0" w:firstRowLastColumn="0" w:lastRowFirstColumn="0" w:lastRowLastColumn="0"/>
+        <w:tc>
+          <w:tcPr>
             <w:tcW w:w="0" w:type="auto"/>
             <w:hideMark/>
           </w:tcPr>
           <w:p>
-            <w:pPr>
-              <w:rPr>
-                <w:b w:val="0"/>
-                <w:bCs w:val="0"/>
-              </w:rPr>
-            </w:pPr>
-            <w:r>
-              <w:t>Authentication</w:t>
+            <w:r>
+              <w:t>Data protection</w:t>
             </w:r>
           </w:p>
         </w:tc>
@@ -8810,11 +8019,8 @@
             <w:hideMark/>
           </w:tcPr>
           <w:p>
-            <w:pPr>
-              <w:cnfStyle w:val="000000100000" w:firstRow="0" w:lastRow="0" w:firstColumn="0" w:lastColumn="0" w:oddVBand="0" w:evenVBand="0" w:oddHBand="1" w:evenHBand="0" w:firstRowFirstColumn="0" w:firstRowLastColumn="0" w:lastRowFirstColumn="0" w:lastRowLastColumn="0"/>
-            </w:pPr>
-            <w:r>
-              <w:t>Basic OAuth 2.0 / SMART on FHIR token-based access for FHIR interfaces</w:t>
+            <w:r>
+              <w:t>Synthetic data only; real-identifier prefix rejection (e.g. IHI '800360') at input</w:t>
             </w:r>
           </w:p>
         </w:tc>
@@ -8824,9 +8030,6 @@
             <w:hideMark/>
           </w:tcPr>
           <w:p>
-            <w:pPr>
-              <w:cnfStyle w:val="000000100000" w:firstRow="0" w:lastRow="0" w:firstColumn="0" w:lastColumn="0" w:oddVBand="0" w:evenVBand="0" w:oddHBand="1" w:evenHBand="0" w:firstRowFirstColumn="0" w:firstRowLastColumn="0" w:lastRowFirstColumn="0" w:lastRowLastColumn="0"/>
-            </w:pPr>
             <w:r>
               <w:t>Protect</w:t>
             </w:r>
@@ -8838,9 +8041,6 @@
             <w:hideMark/>
           </w:tcPr>
           <w:p>
-            <w:pPr>
-              <w:cnfStyle w:val="000000100000" w:firstRow="0" w:lastRow="0" w:firstColumn="0" w:lastColumn="0" w:oddVBand="0" w:evenVBand="0" w:oddHBand="1" w:evenHBand="0" w:firstRowFirstColumn="0" w:firstRowLastColumn="0" w:lastRowFirstColumn="0" w:lastRowLastColumn="0"/>
-            </w:pPr>
             <w:r>
               <w:t>Implemented (basic)</w:t>
             </w:r>
@@ -8850,13 +8050,12 @@
       <w:tr>
         <w:tc>
           <w:tcPr>
-            <w:cnfStyle w:val="001000000000" w:firstRow="0" w:lastRow="0" w:firstColumn="1" w:lastColumn="0" w:oddVBand="0" w:evenVBand="0" w:oddHBand="0" w:evenHBand="0" w:firstRowFirstColumn="0" w:firstRowLastColumn="0" w:lastRowFirstColumn="0" w:lastRowLastColumn="0"/>
             <w:tcW w:w="0" w:type="auto"/>
             <w:hideMark/>
           </w:tcPr>
           <w:p>
             <w:r>
-              <w:t>Data protection</w:t>
+              <w:t>Encryption</w:t>
             </w:r>
           </w:p>
         </w:tc>
@@ -8866,11 +8065,8 @@
             <w:hideMark/>
           </w:tcPr>
           <w:p>
-            <w:pPr>
-              <w:cnfStyle w:val="000000000000" w:firstRow="0" w:lastRow="0" w:firstColumn="0" w:lastColumn="0" w:oddVBand="0" w:evenVBand="0" w:oddHBand="0" w:evenHBand="0" w:firstRowFirstColumn="0" w:firstRowLastColumn="0" w:lastRowFirstColumn="0" w:lastRowLastColumn="0"/>
-            </w:pPr>
-            <w:r>
-              <w:t>Synthetic data only; real-identifier prefix rejection (e.g. IHI '800360') at input</w:t>
+            <w:r>
+              <w:t>Encrypted transport (HTTPS/TLS) for implemented interfaces</w:t>
             </w:r>
           </w:p>
         </w:tc>
@@ -8880,9 +8076,6 @@
             <w:hideMark/>
           </w:tcPr>
           <w:p>
-            <w:pPr>
-              <w:cnfStyle w:val="000000000000" w:firstRow="0" w:lastRow="0" w:firstColumn="0" w:lastColumn="0" w:oddVBand="0" w:evenVBand="0" w:oddHBand="0" w:evenHBand="0" w:firstRowFirstColumn="0" w:firstRowLastColumn="0" w:lastRowFirstColumn="0" w:lastRowLastColumn="0"/>
-            </w:pPr>
             <w:r>
               <w:t>Protect</w:t>
             </w:r>
@@ -8894,9 +8087,6 @@
             <w:hideMark/>
           </w:tcPr>
           <w:p>
-            <w:pPr>
-              <w:cnfStyle w:val="000000000000" w:firstRow="0" w:lastRow="0" w:firstColumn="0" w:lastColumn="0" w:oddVBand="0" w:evenVBand="0" w:oddHBand="0" w:evenHBand="0" w:firstRowFirstColumn="0" w:firstRowLastColumn="0" w:lastRowFirstColumn="0" w:lastRowLastColumn="0"/>
-            </w:pPr>
             <w:r>
               <w:t>Implemented (basic)</w:t>
             </w:r>
@@ -8904,18 +8094,14 @@
         </w:tc>
       </w:tr>
       <w:tr>
-        <w:trPr>
-          <w:cnfStyle w:val="000000100000" w:firstRow="0" w:lastRow="0" w:firstColumn="0" w:lastColumn="0" w:oddVBand="0" w:evenVBand="0" w:oddHBand="1" w:evenHBand="0" w:firstRowFirstColumn="0" w:firstRowLastColumn="0" w:lastRowFirstColumn="0" w:lastRowLastColumn="0"/>
-        </w:trPr>
-        <w:tc>
-          <w:tcPr>
-            <w:cnfStyle w:val="001000000000" w:firstRow="0" w:lastRow="0" w:firstColumn="1" w:lastColumn="0" w:oddVBand="0" w:evenVBand="0" w:oddHBand="0" w:evenHBand="0" w:firstRowFirstColumn="0" w:firstRowLastColumn="0" w:lastRowFirstColumn="0" w:lastRowLastColumn="0"/>
+        <w:tc>
+          <w:tcPr>
             <w:tcW w:w="0" w:type="auto"/>
             <w:hideMark/>
           </w:tcPr>
           <w:p>
             <w:r>
-              <w:t>Encryption</w:t>
+              <w:t>Input validation</w:t>
             </w:r>
           </w:p>
         </w:tc>
@@ -8925,11 +8111,8 @@
             <w:hideMark/>
           </w:tcPr>
           <w:p>
-            <w:pPr>
-              <w:cnfStyle w:val="000000100000" w:firstRow="0" w:lastRow="0" w:firstColumn="0" w:lastColumn="0" w:oddVBand="0" w:evenVBand="0" w:oddHBand="1" w:evenHBand="0" w:firstRowFirstColumn="0" w:firstRowLastColumn="0" w:lastRowFirstColumn="0" w:lastRowLastColumn="0"/>
-            </w:pPr>
-            <w:r>
-              <w:t>Encrypted transport (HTTPS/TLS) for implemented interfaces</w:t>
+            <w:r>
+              <w:t>FHIR resource/message format validation before processing</w:t>
             </w:r>
           </w:p>
         </w:tc>
@@ -8939,9 +8122,6 @@
             <w:hideMark/>
           </w:tcPr>
           <w:p>
-            <w:pPr>
-              <w:cnfStyle w:val="000000100000" w:firstRow="0" w:lastRow="0" w:firstColumn="0" w:lastColumn="0" w:oddVBand="0" w:evenVBand="0" w:oddHBand="1" w:evenHBand="0" w:firstRowFirstColumn="0" w:firstRowLastColumn="0" w:lastRowFirstColumn="0" w:lastRowLastColumn="0"/>
-            </w:pPr>
             <w:r>
               <w:t>Protect</w:t>
             </w:r>
@@ -8953,9 +8133,6 @@
             <w:hideMark/>
           </w:tcPr>
           <w:p>
-            <w:pPr>
-              <w:cnfStyle w:val="000000100000" w:firstRow="0" w:lastRow="0" w:firstColumn="0" w:lastColumn="0" w:oddVBand="0" w:evenVBand="0" w:oddHBand="1" w:evenHBand="0" w:firstRowFirstColumn="0" w:firstRowLastColumn="0" w:lastRowFirstColumn="0" w:lastRowLastColumn="0"/>
-            </w:pPr>
             <w:r>
               <w:t>Implemented (basic)</w:t>
             </w:r>
@@ -8965,13 +8142,12 @@
       <w:tr>
         <w:tc>
           <w:tcPr>
-            <w:cnfStyle w:val="001000000000" w:firstRow="0" w:lastRow="0" w:firstColumn="1" w:lastColumn="0" w:oddVBand="0" w:evenVBand="0" w:oddHBand="0" w:evenHBand="0" w:firstRowFirstColumn="0" w:firstRowLastColumn="0" w:lastRowFirstColumn="0" w:lastRowLastColumn="0"/>
             <w:tcW w:w="0" w:type="auto"/>
             <w:hideMark/>
           </w:tcPr>
           <w:p>
             <w:r>
-              <w:t>Input validation</w:t>
+              <w:t>Logging and monitoring</w:t>
             </w:r>
           </w:p>
         </w:tc>
@@ -8981,11 +8157,8 @@
             <w:hideMark/>
           </w:tcPr>
           <w:p>
-            <w:pPr>
-              <w:cnfStyle w:val="000000000000" w:firstRow="0" w:lastRow="0" w:firstColumn="0" w:lastColumn="0" w:oddVBand="0" w:evenVBand="0" w:oddHBand="0" w:evenHBand="0" w:firstRowFirstColumn="0" w:firstRowLastColumn="0" w:lastRowFirstColumn="0" w:lastRowLastColumn="0"/>
-            </w:pPr>
-            <w:r>
-              <w:t>FHIR resource/message format validation before processing</w:t>
+            <w:r>
+              <w:t>Test execution and security-event logging for traceability</w:t>
             </w:r>
           </w:p>
         </w:tc>
@@ -8995,11 +8168,8 @@
             <w:hideMark/>
           </w:tcPr>
           <w:p>
-            <w:pPr>
-              <w:cnfStyle w:val="000000000000" w:firstRow="0" w:lastRow="0" w:firstColumn="0" w:lastColumn="0" w:oddVBand="0" w:evenVBand="0" w:oddHBand="0" w:evenHBand="0" w:firstRowFirstColumn="0" w:firstRowLastColumn="0" w:lastRowFirstColumn="0" w:lastRowLastColumn="0"/>
-            </w:pPr>
-            <w:r>
-              <w:t>Protect</w:t>
+            <w:r>
+              <w:t>Detect</w:t>
             </w:r>
           </w:p>
         </w:tc>
@@ -9009,9 +8179,6 @@
             <w:hideMark/>
           </w:tcPr>
           <w:p>
-            <w:pPr>
-              <w:cnfStyle w:val="000000000000" w:firstRow="0" w:lastRow="0" w:firstColumn="0" w:lastColumn="0" w:oddVBand="0" w:evenVBand="0" w:oddHBand="0" w:evenHBand="0" w:firstRowFirstColumn="0" w:firstRowLastColumn="0" w:lastRowFirstColumn="0" w:lastRowLastColumn="0"/>
-            </w:pPr>
             <w:r>
               <w:t>Implemented (basic)</w:t>
             </w:r>
@@ -9019,18 +8186,14 @@
         </w:tc>
       </w:tr>
       <w:tr>
-        <w:trPr>
-          <w:cnfStyle w:val="000000100000" w:firstRow="0" w:lastRow="0" w:firstColumn="0" w:lastColumn="0" w:oddVBand="0" w:evenVBand="0" w:oddHBand="1" w:evenHBand="0" w:firstRowFirstColumn="0" w:firstRowLastColumn="0" w:lastRowFirstColumn="0" w:lastRowLastColumn="0"/>
-        </w:trPr>
-        <w:tc>
-          <w:tcPr>
-            <w:cnfStyle w:val="001000000000" w:firstRow="0" w:lastRow="0" w:firstColumn="1" w:lastColumn="0" w:oddVBand="0" w:evenVBand="0" w:oddHBand="0" w:evenHBand="0" w:firstRowFirstColumn="0" w:firstRowLastColumn="0" w:lastRowFirstColumn="0" w:lastRowLastColumn="0"/>
+        <w:tc>
+          <w:tcPr>
             <w:tcW w:w="0" w:type="auto"/>
             <w:hideMark/>
           </w:tcPr>
           <w:p>
             <w:r>
-              <w:t>Logging and monitoring</w:t>
+              <w:t>Secure configuration</w:t>
             </w:r>
           </w:p>
         </w:tc>
@@ -9040,11 +8203,8 @@
             <w:hideMark/>
           </w:tcPr>
           <w:p>
-            <w:pPr>
-              <w:cnfStyle w:val="000000100000" w:firstRow="0" w:lastRow="0" w:firstColumn="0" w:lastColumn="0" w:oddVBand="0" w:evenVBand="0" w:oddHBand="1" w:evenHBand="0" w:firstRowFirstColumn="0" w:firstRowLastColumn="0" w:lastRowFirstColumn="0" w:lastRowLastColumn="0"/>
-            </w:pPr>
-            <w:r>
-              <w:t>Test execution and security-event logging for traceability</w:t>
+            <w:r>
+              <w:t>Baseline hardened configuration for application/containers</w:t>
             </w:r>
           </w:p>
         </w:tc>
@@ -9054,11 +8214,8 @@
             <w:hideMark/>
           </w:tcPr>
           <w:p>
-            <w:pPr>
-              <w:cnfStyle w:val="000000100000" w:firstRow="0" w:lastRow="0" w:firstColumn="0" w:lastColumn="0" w:oddVBand="0" w:evenVBand="0" w:oddHBand="1" w:evenHBand="0" w:firstRowFirstColumn="0" w:firstRowLastColumn="0" w:lastRowFirstColumn="0" w:lastRowLastColumn="0"/>
-            </w:pPr>
-            <w:r>
-              <w:t>Detect</w:t>
+            <w:r>
+              <w:t>Protect</w:t>
             </w:r>
           </w:p>
         </w:tc>
@@ -9068,9 +8225,6 @@
             <w:hideMark/>
           </w:tcPr>
           <w:p>
-            <w:pPr>
-              <w:cnfStyle w:val="000000100000" w:firstRow="0" w:lastRow="0" w:firstColumn="0" w:lastColumn="0" w:oddVBand="0" w:evenVBand="0" w:oddHBand="1" w:evenHBand="0" w:firstRowFirstColumn="0" w:firstRowLastColumn="0" w:lastRowFirstColumn="0" w:lastRowLastColumn="0"/>
-            </w:pPr>
             <w:r>
               <w:t>Implemented (basic)</w:t>
             </w:r>
@@ -9080,13 +8234,12 @@
       <w:tr>
         <w:tc>
           <w:tcPr>
-            <w:cnfStyle w:val="001000000000" w:firstRow="0" w:lastRow="0" w:firstColumn="1" w:lastColumn="0" w:oddVBand="0" w:evenVBand="0" w:oddHBand="0" w:evenHBand="0" w:firstRowFirstColumn="0" w:firstRowLastColumn="0" w:lastRowFirstColumn="0" w:lastRowLastColumn="0"/>
             <w:tcW w:w="0" w:type="auto"/>
             <w:hideMark/>
           </w:tcPr>
           <w:p>
             <w:r>
-              <w:t>Secure configuration</w:t>
+              <w:t>Vulnerability management</w:t>
             </w:r>
           </w:p>
         </w:tc>
@@ -9096,11 +8249,8 @@
             <w:hideMark/>
           </w:tcPr>
           <w:p>
-            <w:pPr>
-              <w:cnfStyle w:val="000000000000" w:firstRow="0" w:lastRow="0" w:firstColumn="0" w:lastColumn="0" w:oddVBand="0" w:evenVBand="0" w:oddHBand="0" w:evenHBand="0" w:firstRowFirstColumn="0" w:firstRowLastColumn="0" w:lastRowFirstColumn="0" w:lastRowLastColumn="0"/>
-            </w:pPr>
-            <w:r>
-              <w:t>Baseline hardened configuration for application/containers</w:t>
+            <w:r>
+              <w:t>Dependency and container security checks</w:t>
             </w:r>
           </w:p>
         </w:tc>
@@ -9110,11 +8260,8 @@
             <w:hideMark/>
           </w:tcPr>
           <w:p>
-            <w:pPr>
-              <w:cnfStyle w:val="000000000000" w:firstRow="0" w:lastRow="0" w:firstColumn="0" w:lastColumn="0" w:oddVBand="0" w:evenVBand="0" w:oddHBand="0" w:evenHBand="0" w:firstRowFirstColumn="0" w:firstRowLastColumn="0" w:lastRowFirstColumn="0" w:lastRowLastColumn="0"/>
-            </w:pPr>
-            <w:r>
-              <w:t>Protect</w:t>
+            <w:r>
+              <w:t>Identify / Protect</w:t>
             </w:r>
           </w:p>
         </w:tc>
@@ -9124,28 +8271,21 @@
             <w:hideMark/>
           </w:tcPr>
           <w:p>
-            <w:pPr>
-              <w:cnfStyle w:val="000000000000" w:firstRow="0" w:lastRow="0" w:firstColumn="0" w:lastColumn="0" w:oddVBand="0" w:evenVBand="0" w:oddHBand="0" w:evenHBand="0" w:firstRowFirstColumn="0" w:firstRowLastColumn="0" w:lastRowFirstColumn="0" w:lastRowLastColumn="0"/>
-            </w:pPr>
-            <w:r>
-              <w:t>Implemented (basic)</w:t>
+            <w:r>
+              <w:t>Planned — Stage 2</w:t>
             </w:r>
           </w:p>
         </w:tc>
       </w:tr>
       <w:tr>
-        <w:trPr>
-          <w:cnfStyle w:val="000000100000" w:firstRow="0" w:lastRow="0" w:firstColumn="0" w:lastColumn="0" w:oddVBand="0" w:evenVBand="0" w:oddHBand="1" w:evenHBand="0" w:firstRowFirstColumn="0" w:firstRowLastColumn="0" w:lastRowFirstColumn="0" w:lastRowLastColumn="0"/>
-        </w:trPr>
-        <w:tc>
-          <w:tcPr>
-            <w:cnfStyle w:val="001000000000" w:firstRow="0" w:lastRow="0" w:firstColumn="1" w:lastColumn="0" w:oddVBand="0" w:evenVBand="0" w:oddHBand="0" w:evenHBand="0" w:firstRowFirstColumn="0" w:firstRowLastColumn="0" w:lastRowFirstColumn="0" w:lastRowLastColumn="0"/>
+        <w:tc>
+          <w:tcPr>
             <w:tcW w:w="0" w:type="auto"/>
             <w:hideMark/>
           </w:tcPr>
           <w:p>
             <w:r>
-              <w:t>Vulnerability management</w:t>
+              <w:t>Backup and recovery</w:t>
             </w:r>
           </w:p>
         </w:tc>
@@ -9155,11 +8295,8 @@
             <w:hideMark/>
           </w:tcPr>
           <w:p>
-            <w:pPr>
-              <w:cnfStyle w:val="000000100000" w:firstRow="0" w:lastRow="0" w:firstColumn="0" w:lastColumn="0" w:oddVBand="0" w:evenVBand="0" w:oddHBand="1" w:evenHBand="0" w:firstRowFirstColumn="0" w:firstRowLastColumn="0" w:lastRowFirstColumn="0" w:lastRowLastColumn="0"/>
-            </w:pPr>
-            <w:r>
-              <w:t>Dependency and container security checks</w:t>
+            <w:r>
+              <w:t>Backup of configuration and test-result data</w:t>
             </w:r>
           </w:p>
         </w:tc>
@@ -9169,11 +8306,8 @@
             <w:hideMark/>
           </w:tcPr>
           <w:p>
-            <w:pPr>
-              <w:cnfStyle w:val="000000100000" w:firstRow="0" w:lastRow="0" w:firstColumn="0" w:lastColumn="0" w:oddVBand="0" w:evenVBand="0" w:oddHBand="1" w:evenHBand="0" w:firstRowFirstColumn="0" w:firstRowLastColumn="0" w:lastRowFirstColumn="0" w:lastRowLastColumn="0"/>
-            </w:pPr>
-            <w:r>
-              <w:t>Identify / Protect</w:t>
+            <w:r>
+              <w:t>Recover</w:t>
             </w:r>
           </w:p>
         </w:tc>
@@ -9183,9 +8317,6 @@
             <w:hideMark/>
           </w:tcPr>
           <w:p>
-            <w:pPr>
-              <w:cnfStyle w:val="000000100000" w:firstRow="0" w:lastRow="0" w:firstColumn="0" w:lastColumn="0" w:oddVBand="0" w:evenVBand="0" w:oddHBand="1" w:evenHBand="0" w:firstRowFirstColumn="0" w:firstRowLastColumn="0" w:lastRowFirstColumn="0" w:lastRowLastColumn="0"/>
-            </w:pPr>
             <w:r>
               <w:t>Planned — Stage 2</w:t>
             </w:r>
@@ -9195,13 +8326,12 @@
       <w:tr>
         <w:tc>
           <w:tcPr>
-            <w:cnfStyle w:val="001000000000" w:firstRow="0" w:lastRow="0" w:firstColumn="1" w:lastColumn="0" w:oddVBand="0" w:evenVBand="0" w:oddHBand="0" w:evenHBand="0" w:firstRowFirstColumn="0" w:firstRowLastColumn="0" w:lastRowFirstColumn="0" w:lastRowLastColumn="0"/>
             <w:tcW w:w="0" w:type="auto"/>
             <w:hideMark/>
           </w:tcPr>
           <w:p>
             <w:r>
-              <w:t>Backup and recovery</w:t>
+              <w:t>Incident response</w:t>
             </w:r>
           </w:p>
         </w:tc>
@@ -9211,11 +8341,8 @@
             <w:hideMark/>
           </w:tcPr>
           <w:p>
-            <w:pPr>
-              <w:cnfStyle w:val="000000000000" w:firstRow="0" w:lastRow="0" w:firstColumn="0" w:lastColumn="0" w:oddVBand="0" w:evenVBand="0" w:oddHBand="0" w:evenHBand="0" w:firstRowFirstColumn="0" w:firstRowLastColumn="0" w:lastRowFirstColumn="0" w:lastRowLastColumn="0"/>
-            </w:pPr>
-            <w:r>
-              <w:t>Backup of configuration and test-result data</w:t>
+            <w:r>
+              <w:t>Defined containment, investigation and reporting process</w:t>
             </w:r>
           </w:p>
         </w:tc>
@@ -9225,11 +8352,8 @@
             <w:hideMark/>
           </w:tcPr>
           <w:p>
-            <w:pPr>
-              <w:cnfStyle w:val="000000000000" w:firstRow="0" w:lastRow="0" w:firstColumn="0" w:lastColumn="0" w:oddVBand="0" w:evenVBand="0" w:oddHBand="0" w:evenHBand="0" w:firstRowFirstColumn="0" w:firstRowLastColumn="0" w:lastRowFirstColumn="0" w:lastRowLastColumn="0"/>
-            </w:pPr>
-            <w:r>
-              <w:t>Recover</w:t>
+            <w:r>
+              <w:t>Respond</w:t>
             </w:r>
           </w:p>
         </w:tc>
@@ -9239,28 +8363,21 @@
             <w:hideMark/>
           </w:tcPr>
           <w:p>
-            <w:pPr>
-              <w:cnfStyle w:val="000000000000" w:firstRow="0" w:lastRow="0" w:firstColumn="0" w:lastColumn="0" w:oddVBand="0" w:evenVBand="0" w:oddHBand="0" w:evenHBand="0" w:firstRowFirstColumn="0" w:firstRowLastColumn="0" w:lastRowFirstColumn="0" w:lastRowLastColumn="0"/>
-            </w:pPr>
-            <w:r>
-              <w:t>Planned — Stage 2</w:t>
+            <w:r>
+              <w:t>Documented only (process, not tooling)</w:t>
             </w:r>
           </w:p>
         </w:tc>
       </w:tr>
       <w:tr>
-        <w:trPr>
-          <w:cnfStyle w:val="000000100000" w:firstRow="0" w:lastRow="0" w:firstColumn="0" w:lastColumn="0" w:oddVBand="0" w:evenVBand="0" w:oddHBand="1" w:evenHBand="0" w:firstRowFirstColumn="0" w:firstRowLastColumn="0" w:lastRowFirstColumn="0" w:lastRowLastColumn="0"/>
-        </w:trPr>
-        <w:tc>
-          <w:tcPr>
-            <w:cnfStyle w:val="001000000000" w:firstRow="0" w:lastRow="0" w:firstColumn="1" w:lastColumn="0" w:oddVBand="0" w:evenVBand="0" w:oddHBand="0" w:evenHBand="0" w:firstRowFirstColumn="0" w:firstRowLastColumn="0" w:lastRowFirstColumn="0" w:lastRowLastColumn="0"/>
+        <w:tc>
+          <w:tcPr>
             <w:tcW w:w="0" w:type="auto"/>
             <w:hideMark/>
           </w:tcPr>
           <w:p>
             <w:r>
-              <w:t>Incident response</w:t>
+              <w:t>Identity verification (production)</w:t>
             </w:r>
           </w:p>
         </w:tc>
@@ -9270,11 +8387,8 @@
             <w:hideMark/>
           </w:tcPr>
           <w:p>
-            <w:pPr>
-              <w:cnfStyle w:val="000000100000" w:firstRow="0" w:lastRow="0" w:firstColumn="0" w:lastColumn="0" w:oddVBand="0" w:evenVBand="0" w:oddHBand="1" w:evenHBand="0" w:firstRowFirstColumn="0" w:firstRowLastColumn="0" w:lastRowFirstColumn="0" w:lastRowLastColumn="0"/>
-            </w:pPr>
-            <w:r>
-              <w:t>Defined containment, investigation and reporting process</w:t>
+            <w:r>
+              <w:t>DVS-style real-time verification against issuing records (e.g. Medicare/Services Australia)</w:t>
             </w:r>
           </w:p>
         </w:tc>
@@ -9284,11 +8398,8 @@
             <w:hideMark/>
           </w:tcPr>
           <w:p>
-            <w:pPr>
-              <w:cnfStyle w:val="000000100000" w:firstRow="0" w:lastRow="0" w:firstColumn="0" w:lastColumn="0" w:oddVBand="0" w:evenVBand="0" w:oddHBand="1" w:evenHBand="0" w:firstRowFirstColumn="0" w:firstRowLastColumn="0" w:lastRowFirstColumn="0" w:lastRowLastColumn="0"/>
-            </w:pPr>
-            <w:r>
-              <w:t>Respond</w:t>
+            <w:r>
+              <w:t>Protect</w:t>
             </w:r>
           </w:p>
         </w:tc>
@@ -9298,11 +8409,8 @@
             <w:hideMark/>
           </w:tcPr>
           <w:p>
-            <w:pPr>
-              <w:cnfStyle w:val="000000100000" w:firstRow="0" w:lastRow="0" w:firstColumn="0" w:lastColumn="0" w:oddVBand="0" w:evenVBand="0" w:oddHBand="1" w:evenHBand="0" w:firstRowFirstColumn="0" w:firstRowLastColumn="0" w:lastRowFirstColumn="0" w:lastRowLastColumn="0"/>
-            </w:pPr>
-            <w:r>
-              <w:t>Documented only (process, not tooling)</w:t>
+            <w:r>
+              <w:t>Out of scope — future/production only</w:t>
             </w:r>
           </w:p>
         </w:tc>
@@ -9310,13 +8418,12 @@
       <w:tr>
         <w:tc>
           <w:tcPr>
-            <w:cnfStyle w:val="001000000000" w:firstRow="0" w:lastRow="0" w:firstColumn="1" w:lastColumn="0" w:oddVBand="0" w:evenVBand="0" w:oddHBand="0" w:evenHBand="0" w:firstRowFirstColumn="0" w:firstRowLastColumn="0" w:lastRowFirstColumn="0" w:lastRowLastColumn="0"/>
             <w:tcW w:w="0" w:type="auto"/>
             <w:hideMark/>
           </w:tcPr>
           <w:p>
             <w:r>
-              <w:t>Identity verification (production)</w:t>
+              <w:t>Privacy/compliance</w:t>
             </w:r>
           </w:p>
         </w:tc>
@@ -9326,11 +8433,8 @@
             <w:hideMark/>
           </w:tcPr>
           <w:p>
-            <w:pPr>
-              <w:cnfStyle w:val="000000000000" w:firstRow="0" w:lastRow="0" w:firstColumn="0" w:lastColumn="0" w:oddVBand="0" w:evenVBand="0" w:oddHBand="0" w:evenHBand="0" w:firstRowFirstColumn="0" w:firstRowLastColumn="0" w:lastRowFirstColumn="0" w:lastRowLastColumn="0"/>
-            </w:pPr>
-            <w:r>
-              <w:t>DVS-style real-time verification against issuing records (e.g. Medicare/Services Australia)</w:t>
+            <w:r>
+              <w:t>No real patient data; alignment with Privacy Act 1988, My Health Records Act 2012, AU Core</w:t>
             </w:r>
           </w:p>
         </w:tc>
@@ -9340,11 +8444,8 @@
             <w:hideMark/>
           </w:tcPr>
           <w:p>
-            <w:pPr>
-              <w:cnfStyle w:val="000000000000" w:firstRow="0" w:lastRow="0" w:firstColumn="0" w:lastColumn="0" w:oddVBand="0" w:evenVBand="0" w:oddHBand="0" w:evenHBand="0" w:firstRowFirstColumn="0" w:firstRowLastColumn="0" w:lastRowFirstColumn="0" w:lastRowLastColumn="0"/>
-            </w:pPr>
-            <w:r>
-              <w:t>Protect</w:t>
+            <w:r>
+              <w:t>Identify / Protect</w:t>
             </w:r>
           </w:p>
         </w:tc>
@@ -9354,68 +8455,6 @@
             <w:hideMark/>
           </w:tcPr>
           <w:p>
-            <w:pPr>
-              <w:cnfStyle w:val="000000000000" w:firstRow="0" w:lastRow="0" w:firstColumn="0" w:lastColumn="0" w:oddVBand="0" w:evenVBand="0" w:oddHBand="0" w:evenHBand="0" w:firstRowFirstColumn="0" w:firstRowLastColumn="0" w:lastRowFirstColumn="0" w:lastRowLastColumn="0"/>
-            </w:pPr>
-            <w:r>
-              <w:t>Out of scope — future/production only</w:t>
-            </w:r>
-          </w:p>
-        </w:tc>
-      </w:tr>
-      <w:tr>
-        <w:trPr>
-          <w:cnfStyle w:val="000000100000" w:firstRow="0" w:lastRow="0" w:firstColumn="0" w:lastColumn="0" w:oddVBand="0" w:evenVBand="0" w:oddHBand="1" w:evenHBand="0" w:firstRowFirstColumn="0" w:firstRowLastColumn="0" w:lastRowFirstColumn="0" w:lastRowLastColumn="0"/>
-        </w:trPr>
-        <w:tc>
-          <w:tcPr>
-            <w:cnfStyle w:val="001000000000" w:firstRow="0" w:lastRow="0" w:firstColumn="1" w:lastColumn="0" w:oddVBand="0" w:evenVBand="0" w:oddHBand="0" w:evenHBand="0" w:firstRowFirstColumn="0" w:firstRowLastColumn="0" w:lastRowFirstColumn="0" w:lastRowLastColumn="0"/>
-            <w:tcW w:w="0" w:type="auto"/>
-            <w:hideMark/>
-          </w:tcPr>
-          <w:p>
-            <w:r>
-              <w:t>Privacy/compliance</w:t>
-            </w:r>
-          </w:p>
-        </w:tc>
-        <w:tc>
-          <w:tcPr>
-            <w:tcW w:w="0" w:type="auto"/>
-            <w:hideMark/>
-          </w:tcPr>
-          <w:p>
-            <w:pPr>
-              <w:cnfStyle w:val="000000100000" w:firstRow="0" w:lastRow="0" w:firstColumn="0" w:lastColumn="0" w:oddVBand="0" w:evenVBand="0" w:oddHBand="1" w:evenHBand="0" w:firstRowFirstColumn="0" w:firstRowLastColumn="0" w:lastRowFirstColumn="0" w:lastRowLastColumn="0"/>
-            </w:pPr>
-            <w:r>
-              <w:t>No real patient data; alignment with Privacy Act 1988, My Health Records Act 2012, AU Core</w:t>
-            </w:r>
-          </w:p>
-        </w:tc>
-        <w:tc>
-          <w:tcPr>
-            <w:tcW w:w="0" w:type="auto"/>
-            <w:hideMark/>
-          </w:tcPr>
-          <w:p>
-            <w:pPr>
-              <w:cnfStyle w:val="000000100000" w:firstRow="0" w:lastRow="0" w:firstColumn="0" w:lastColumn="0" w:oddVBand="0" w:evenVBand="0" w:oddHBand="1" w:evenHBand="0" w:firstRowFirstColumn="0" w:firstRowLastColumn="0" w:lastRowFirstColumn="0" w:lastRowLastColumn="0"/>
-            </w:pPr>
-            <w:r>
-              <w:t>Identify / Protect</w:t>
-            </w:r>
-          </w:p>
-        </w:tc>
-        <w:tc>
-          <w:tcPr>
-            <w:tcW w:w="0" w:type="auto"/>
-            <w:hideMark/>
-          </w:tcPr>
-          <w:p>
-            <w:pPr>
-              <w:cnfStyle w:val="000000100000" w:firstRow="0" w:lastRow="0" w:firstColumn="0" w:lastColumn="0" w:oddVBand="0" w:evenVBand="0" w:oddHBand="1" w:evenHBand="0" w:firstRowFirstColumn="0" w:firstRowLastColumn="0" w:lastRowFirstColumn="0" w:lastRowLastColumn="0"/>
-            </w:pPr>
             <w:r>
               <w:t>Implemented (basic)</w:t>
             </w:r>
@@ -9426,7 +8465,6 @@
     <w:p>
       <w:pPr>
         <w:pStyle w:val="NormalWeb"/>
-        <w:jc w:val="both"/>
       </w:pPr>
       <w:r>
         <w:t>These controls support the project's stated privacy and compliance objectives, including alignment with the Privacy Act 1988 (</w:t>
@@ -9440,10 +8478,7 @@
         <w:t>)</w:t>
       </w:r>
       <w:r>
-        <w:t xml:space="preserve"> </w:t>
-      </w:r>
-      <w:r>
-        <w:t>(Australian Government, 1988)</w:t>
+        <w:t xml:space="preserve"> (Australian Government, 1988)</w:t>
       </w:r>
       <w:r>
         <w:t>, My Health Records Act 2012 (</w:t>
@@ -9457,16 +8492,12 @@
         <w:t>) and AU Core requirements</w:t>
       </w:r>
       <w:r>
-        <w:t xml:space="preserve"> </w:t>
-      </w:r>
-      <w:r>
-        <w:t>(HL7 Australia, n.d.).</w:t>
+        <w:t xml:space="preserve"> (HL7 Australia, n.d.).</w:t>
       </w:r>
     </w:p>
     <w:p>
       <w:pPr>
         <w:pStyle w:val="NormalWeb"/>
-        <w:jc w:val="both"/>
       </w:pPr>
     </w:p>
     <w:p>
@@ -9495,15 +8526,12 @@
     </w:p>
     <w:p>
       <w:pPr>
-        <w:jc w:val="both"/>
         <w:rPr>
-          <w:rFonts w:ascii="Times New Roman" w:eastAsia="Times New Roman" w:hAnsi="Times New Roman" w:cs="Times New Roman"/>
           <w:lang w:val="en-GB" w:eastAsia="en-GB"/>
         </w:rPr>
       </w:pPr>
       <w:r>
         <w:rPr>
-          <w:rFonts w:ascii="Times New Roman" w:eastAsia="Times New Roman" w:hAnsi="Times New Roman" w:cs="Times New Roman"/>
           <w:lang w:val="en-GB" w:eastAsia="en-GB"/>
         </w:rPr>
         <w:t>The solution suggested has an indirect financial impact as stage 1 is related to design, and it can be implemented using only free-tier and open-source tools, according to the report. As stated in the report, there is no budget allocated for any client or College, and there is also no allocation of cloud services, so students must use free-tier and open-source software.</w:t>
@@ -9511,19 +8539,12 @@
     </w:p>
     <w:p>
       <w:pPr>
-        <w:jc w:val="both"/>
         <w:rPr>
-          <w:rFonts w:ascii="Times New Roman" w:eastAsia="Times New Roman" w:hAnsi="Times New Roman" w:cs="Times New Roman"/>
-          <w:b/>
-          <w:bCs/>
           <w:lang w:val="en-GB" w:eastAsia="en-GB"/>
         </w:rPr>
       </w:pPr>
       <w:r>
         <w:rPr>
-          <w:rFonts w:ascii="Times New Roman" w:eastAsia="Times New Roman" w:hAnsi="Times New Roman" w:cs="Times New Roman"/>
-          <w:b/>
-          <w:bCs/>
           <w:lang w:val="en-GB" w:eastAsia="en-GB"/>
         </w:rPr>
         <w:t>Table 4.4.1: Cost category and estimation</w:t>
@@ -9531,36 +8552,93 @@
     </w:p>
     <w:tbl>
       <w:tblPr>
-        <w:tblStyle w:val="PlainTable1"/>
+        <w:tblStyle w:val="TableGridLight"/>
         <w:tblW w:w="0" w:type="auto"/>
         <w:tblLook w:val="04A0" w:firstRow="1" w:lastRow="0" w:firstColumn="1" w:lastColumn="0" w:noHBand="0" w:noVBand="1"/>
       </w:tblPr>
       <w:tblGrid>
-        <w:gridCol w:w="2890"/>
-        <w:gridCol w:w="1348"/>
-        <w:gridCol w:w="2251"/>
-        <w:gridCol w:w="2527"/>
+        <w:gridCol w:w="2799"/>
+        <w:gridCol w:w="1361"/>
+        <w:gridCol w:w="2281"/>
+        <w:gridCol w:w="2575"/>
       </w:tblGrid>
       <w:tr>
-        <w:trPr>
-          <w:cnfStyle w:val="100000000000" w:firstRow="1" w:lastRow="0" w:firstColumn="0" w:lastColumn="0" w:oddVBand="0" w:evenVBand="0" w:oddHBand="0" w:evenHBand="0" w:firstRowFirstColumn="0" w:firstRowLastColumn="0" w:lastRowFirstColumn="0" w:lastRowLastColumn="0"/>
-        </w:trPr>
-        <w:tc>
-          <w:tcPr>
-            <w:cnfStyle w:val="001000000000" w:firstRow="0" w:lastRow="0" w:firstColumn="1" w:lastColumn="0" w:oddVBand="0" w:evenVBand="0" w:oddHBand="0" w:evenHBand="0" w:firstRowFirstColumn="0" w:firstRowLastColumn="0" w:lastRowFirstColumn="0" w:lastRowLastColumn="0"/>
+        <w:tc>
+          <w:tcPr>
+            <w:tcW w:w="0" w:type="auto"/>
+            <w:shd w:val="clear" w:color="auto" w:fill="92D050"/>
+            <w:hideMark/>
+          </w:tcPr>
+          <w:p>
+            <w:r>
+              <w:t>Cost Category</w:t>
+            </w:r>
+          </w:p>
+        </w:tc>
+        <w:tc>
+          <w:tcPr>
+            <w:tcW w:w="0" w:type="auto"/>
+            <w:shd w:val="clear" w:color="auto" w:fill="92D050"/>
+            <w:hideMark/>
+          </w:tcPr>
+          <w:p>
+            <w:pPr>
+              <w:rPr>
+                <w:b/>
+                <w:bCs/>
+              </w:rPr>
+            </w:pPr>
+            <w:r>
+              <w:t>Stage 1 Estimate (AUD)</w:t>
+            </w:r>
+          </w:p>
+        </w:tc>
+        <w:tc>
+          <w:tcPr>
+            <w:tcW w:w="0" w:type="auto"/>
+            <w:shd w:val="clear" w:color="auto" w:fill="92D050"/>
+            <w:hideMark/>
+          </w:tcPr>
+          <w:p>
+            <w:pPr>
+              <w:rPr>
+                <w:b/>
+                <w:bCs/>
+              </w:rPr>
+            </w:pPr>
+            <w:r>
+              <w:t>Future / Stage 2 Consideration</w:t>
+            </w:r>
+          </w:p>
+        </w:tc>
+        <w:tc>
+          <w:tcPr>
+            <w:tcW w:w="0" w:type="auto"/>
+            <w:shd w:val="clear" w:color="auto" w:fill="92D050"/>
+            <w:hideMark/>
+          </w:tcPr>
+          <w:p>
+            <w:pPr>
+              <w:rPr>
+                <w:b/>
+                <w:bCs/>
+              </w:rPr>
+            </w:pPr>
+            <w:r>
+              <w:t>Basis</w:t>
+            </w:r>
+          </w:p>
+        </w:tc>
+      </w:tr>
+      <w:tr>
+        <w:tc>
+          <w:tcPr>
             <w:tcW w:w="0" w:type="auto"/>
             <w:hideMark/>
           </w:tcPr>
           <w:p>
-            <w:pPr>
-              <w:jc w:val="center"/>
-            </w:pPr>
-            <w:r>
-              <w:rPr>
-                <w:b w:val="0"/>
-                <w:bCs w:val="0"/>
-              </w:rPr>
-              <w:t>Cost Category</w:t>
+            <w:r>
+              <w:t>Development hardware</w:t>
             </w:r>
           </w:p>
         </w:tc>
@@ -9570,20 +8648,8 @@
             <w:hideMark/>
           </w:tcPr>
           <w:p>
-            <w:pPr>
-              <w:jc w:val="center"/>
-              <w:cnfStyle w:val="100000000000" w:firstRow="1" w:lastRow="0" w:firstColumn="0" w:lastColumn="0" w:oddVBand="0" w:evenVBand="0" w:oddHBand="0" w:evenHBand="0" w:firstRowFirstColumn="0" w:firstRowLastColumn="0" w:lastRowFirstColumn="0" w:lastRowLastColumn="0"/>
-              <w:rPr>
-                <w:b w:val="0"/>
-                <w:bCs w:val="0"/>
-              </w:rPr>
-            </w:pPr>
-            <w:r>
-              <w:rPr>
-                <w:b w:val="0"/>
-                <w:bCs w:val="0"/>
-              </w:rPr>
-              <w:t>Stage 1 Estimate (AUD)</w:t>
+            <w:r>
+              <w:t>$0</w:t>
             </w:r>
           </w:p>
         </w:tc>
@@ -9593,20 +8659,8 @@
             <w:hideMark/>
           </w:tcPr>
           <w:p>
-            <w:pPr>
-              <w:jc w:val="center"/>
-              <w:cnfStyle w:val="100000000000" w:firstRow="1" w:lastRow="0" w:firstColumn="0" w:lastColumn="0" w:oddVBand="0" w:evenVBand="0" w:oddHBand="0" w:evenHBand="0" w:firstRowFirstColumn="0" w:firstRowLastColumn="0" w:lastRowFirstColumn="0" w:lastRowLastColumn="0"/>
-              <w:rPr>
-                <w:b w:val="0"/>
-                <w:bCs w:val="0"/>
-              </w:rPr>
-            </w:pPr>
-            <w:r>
-              <w:rPr>
-                <w:b w:val="0"/>
-                <w:bCs w:val="0"/>
-              </w:rPr>
-              <w:t>Future / Stage 2 Consideration</w:t>
+            <w:r>
+              <w:t>$0–$2,000 if dedicated hardware is required</w:t>
             </w:r>
           </w:p>
         </w:tc>
@@ -9616,43 +8670,21 @@
             <w:hideMark/>
           </w:tcPr>
           <w:p>
-            <w:pPr>
-              <w:jc w:val="center"/>
-              <w:cnfStyle w:val="100000000000" w:firstRow="1" w:lastRow="0" w:firstColumn="0" w:lastColumn="0" w:oddVBand="0" w:evenVBand="0" w:oddHBand="0" w:evenHBand="0" w:firstRowFirstColumn="0" w:firstRowLastColumn="0" w:lastRowFirstColumn="0" w:lastRowLastColumn="0"/>
-              <w:rPr>
-                <w:b w:val="0"/>
-                <w:bCs w:val="0"/>
-              </w:rPr>
-            </w:pPr>
-            <w:r>
-              <w:rPr>
-                <w:b w:val="0"/>
-                <w:bCs w:val="0"/>
-              </w:rPr>
-              <w:t>Basis</w:t>
+            <w:r>
+              <w:t>Existing team equipment</w:t>
             </w:r>
           </w:p>
         </w:tc>
       </w:tr>
       <w:tr>
-        <w:trPr>
-          <w:cnfStyle w:val="000000100000" w:firstRow="0" w:lastRow="0" w:firstColumn="0" w:lastColumn="0" w:oddVBand="0" w:evenVBand="0" w:oddHBand="1" w:evenHBand="0" w:firstRowFirstColumn="0" w:firstRowLastColumn="0" w:lastRowFirstColumn="0" w:lastRowLastColumn="0"/>
-        </w:trPr>
-        <w:tc>
-          <w:tcPr>
-            <w:cnfStyle w:val="001000000000" w:firstRow="0" w:lastRow="0" w:firstColumn="1" w:lastColumn="0" w:oddVBand="0" w:evenVBand="0" w:oddHBand="0" w:evenHBand="0" w:firstRowFirstColumn="0" w:firstRowLastColumn="0" w:lastRowFirstColumn="0" w:lastRowLastColumn="0"/>
+        <w:tc>
+          <w:tcPr>
             <w:tcW w:w="0" w:type="auto"/>
             <w:hideMark/>
           </w:tcPr>
           <w:p>
-            <w:pPr>
-              <w:rPr>
-                <w:b w:val="0"/>
-                <w:bCs w:val="0"/>
-              </w:rPr>
-            </w:pPr>
-            <w:r>
-              <w:t>Development hardware</w:t>
+            <w:r>
+              <w:t>Software &amp; platform tools (stack, GitHub, Docker)</w:t>
             </w:r>
           </w:p>
         </w:tc>
@@ -9662,9 +8694,6 @@
             <w:hideMark/>
           </w:tcPr>
           <w:p>
-            <w:pPr>
-              <w:cnfStyle w:val="000000100000" w:firstRow="0" w:lastRow="0" w:firstColumn="0" w:lastColumn="0" w:oddVBand="0" w:evenVBand="0" w:oddHBand="1" w:evenHBand="0" w:firstRowFirstColumn="0" w:firstRowLastColumn="0" w:lastRowFirstColumn="0" w:lastRowLastColumn="0"/>
-            </w:pPr>
             <w:r>
               <w:t>$0</w:t>
             </w:r>
@@ -9676,11 +8705,8 @@
             <w:hideMark/>
           </w:tcPr>
           <w:p>
-            <w:pPr>
-              <w:cnfStyle w:val="000000100000" w:firstRow="0" w:lastRow="0" w:firstColumn="0" w:lastColumn="0" w:oddVBand="0" w:evenVBand="0" w:oddHBand="1" w:evenHBand="0" w:firstRowFirstColumn="0" w:firstRowLastColumn="0" w:lastRowFirstColumn="0" w:lastRowLastColumn="0"/>
-            </w:pPr>
-            <w:r>
-              <w:t>$0–$2,000 if dedicated hardware is required</w:t>
+            <w:r>
+              <w:t>$0, or vendor-dependent if paid tiers are needed</w:t>
             </w:r>
           </w:p>
         </w:tc>
@@ -9690,11 +8716,8 @@
             <w:hideMark/>
           </w:tcPr>
           <w:p>
-            <w:pPr>
-              <w:cnfStyle w:val="000000100000" w:firstRow="0" w:lastRow="0" w:firstColumn="0" w:lastColumn="0" w:oddVBand="0" w:evenVBand="0" w:oddHBand="1" w:evenHBand="0" w:firstRowFirstColumn="0" w:firstRowLastColumn="0" w:lastRowFirstColumn="0" w:lastRowLastColumn="0"/>
-            </w:pPr>
-            <w:r>
-              <w:t>Existing team equipment</w:t>
+            <w:r>
+              <w:t>Open-source technologies preferred throughout</w:t>
             </w:r>
           </w:p>
         </w:tc>
@@ -9702,13 +8725,12 @@
       <w:tr>
         <w:tc>
           <w:tcPr>
-            <w:cnfStyle w:val="001000000000" w:firstRow="0" w:lastRow="0" w:firstColumn="1" w:lastColumn="0" w:oddVBand="0" w:evenVBand="0" w:oddHBand="0" w:evenHBand="0" w:firstRowFirstColumn="0" w:firstRowLastColumn="0" w:lastRowFirstColumn="0" w:lastRowLastColumn="0"/>
             <w:tcW w:w="0" w:type="auto"/>
             <w:hideMark/>
           </w:tcPr>
           <w:p>
             <w:r>
-              <w:t>Software &amp; platform tools (stack, GitHub, Docker)</w:t>
+              <w:t>Cloud / hosting services</w:t>
             </w:r>
           </w:p>
         </w:tc>
@@ -9718,9 +8740,6 @@
             <w:hideMark/>
           </w:tcPr>
           <w:p>
-            <w:pPr>
-              <w:cnfStyle w:val="000000000000" w:firstRow="0" w:lastRow="0" w:firstColumn="0" w:lastColumn="0" w:oddVBand="0" w:evenVBand="0" w:oddHBand="0" w:evenHBand="0" w:firstRowFirstColumn="0" w:firstRowLastColumn="0" w:lastRowFirstColumn="0" w:lastRowLastColumn="0"/>
-            </w:pPr>
             <w:r>
               <w:t>$0</w:t>
             </w:r>
@@ -9732,11 +8751,8 @@
             <w:hideMark/>
           </w:tcPr>
           <w:p>
-            <w:pPr>
-              <w:cnfStyle w:val="000000000000" w:firstRow="0" w:lastRow="0" w:firstColumn="0" w:lastColumn="0" w:oddVBand="0" w:evenVBand="0" w:oddHBand="0" w:evenHBand="0" w:firstRowFirstColumn="0" w:firstRowLastColumn="0" w:lastRowFirstColumn="0" w:lastRowLastColumn="0"/>
-            </w:pPr>
-            <w:r>
-              <w:t>$0, or vendor-dependent if paid tiers are needed</w:t>
+            <w:r>
+              <w:t>TBD</w:t>
             </w:r>
           </w:p>
         </w:tc>
@@ -9746,28 +8762,21 @@
             <w:hideMark/>
           </w:tcPr>
           <w:p>
-            <w:pPr>
-              <w:cnfStyle w:val="000000000000" w:firstRow="0" w:lastRow="0" w:firstColumn="0" w:lastColumn="0" w:oddVBand="0" w:evenVBand="0" w:oddHBand="0" w:evenHBand="0" w:firstRowFirstColumn="0" w:firstRowLastColumn="0" w:lastRowFirstColumn="0" w:lastRowLastColumn="0"/>
-            </w:pPr>
-            <w:r>
-              <w:t>Open-source technologies preferred throughout</w:t>
+            <w:r>
+              <w:t>Not required for Stage 1; dependent on Stage 2 deployment model</w:t>
             </w:r>
           </w:p>
         </w:tc>
       </w:tr>
       <w:tr>
-        <w:trPr>
-          <w:cnfStyle w:val="000000100000" w:firstRow="0" w:lastRow="0" w:firstColumn="0" w:lastColumn="0" w:oddVBand="0" w:evenVBand="0" w:oddHBand="1" w:evenHBand="0" w:firstRowFirstColumn="0" w:firstRowLastColumn="0" w:lastRowFirstColumn="0" w:lastRowLastColumn="0"/>
-        </w:trPr>
-        <w:tc>
-          <w:tcPr>
-            <w:cnfStyle w:val="001000000000" w:firstRow="0" w:lastRow="0" w:firstColumn="1" w:lastColumn="0" w:oddVBand="0" w:evenVBand="0" w:oddHBand="0" w:evenHBand="0" w:firstRowFirstColumn="0" w:firstRowLastColumn="0" w:lastRowFirstColumn="0" w:lastRowLastColumn="0"/>
+        <w:tc>
+          <w:tcPr>
             <w:tcW w:w="0" w:type="auto"/>
             <w:hideMark/>
           </w:tcPr>
           <w:p>
             <w:r>
-              <w:t>Cloud / hosting services</w:t>
+              <w:t>Labor</w:t>
             </w:r>
           </w:p>
         </w:tc>
@@ -9777,11 +8786,8 @@
             <w:hideMark/>
           </w:tcPr>
           <w:p>
-            <w:pPr>
-              <w:cnfStyle w:val="000000100000" w:firstRow="0" w:lastRow="0" w:firstColumn="0" w:lastColumn="0" w:oddVBand="0" w:evenVBand="0" w:oddHBand="1" w:evenHBand="0" w:firstRowFirstColumn="0" w:firstRowLastColumn="0" w:lastRowFirstColumn="0" w:lastRowLastColumn="0"/>
-            </w:pPr>
-            <w:r>
-              <w:t>$0</w:t>
+            <w:r>
+              <w:t>$0*</w:t>
             </w:r>
           </w:p>
         </w:tc>
@@ -9791,9 +8797,6 @@
             <w:hideMark/>
           </w:tcPr>
           <w:p>
-            <w:pPr>
-              <w:cnfStyle w:val="000000100000" w:firstRow="0" w:lastRow="0" w:firstColumn="0" w:lastColumn="0" w:oddVBand="0" w:evenVBand="0" w:oddHBand="1" w:evenHBand="0" w:firstRowFirstColumn="0" w:firstRowLastColumn="0" w:lastRowFirstColumn="0" w:lastRowLastColumn="0"/>
-            </w:pPr>
             <w:r>
               <w:t>TBD</w:t>
             </w:r>
@@ -9805,11 +8808,8 @@
             <w:hideMark/>
           </w:tcPr>
           <w:p>
-            <w:pPr>
-              <w:cnfStyle w:val="000000100000" w:firstRow="0" w:lastRow="0" w:firstColumn="0" w:lastColumn="0" w:oddVBand="0" w:evenVBand="0" w:oddHBand="1" w:evenHBand="0" w:firstRowFirstColumn="0" w:firstRowLastColumn="0" w:lastRowFirstColumn="0" w:lastRowLastColumn="0"/>
-            </w:pPr>
-            <w:r>
-              <w:t>Not required for Stage 1; dependent on Stage 2 deployment model</w:t>
+            <w:r>
+              <w:t>Student project labour excluded from direct expenditure</w:t>
             </w:r>
           </w:p>
         </w:tc>
@@ -9817,13 +8817,12 @@
       <w:tr>
         <w:tc>
           <w:tcPr>
-            <w:cnfStyle w:val="001000000000" w:firstRow="0" w:lastRow="0" w:firstColumn="1" w:lastColumn="0" w:oddVBand="0" w:evenVBand="0" w:oddHBand="0" w:evenHBand="0" w:firstRowFirstColumn="0" w:firstRowLastColumn="0" w:lastRowFirstColumn="0" w:lastRowLastColumn="0"/>
             <w:tcW w:w="0" w:type="auto"/>
             <w:hideMark/>
           </w:tcPr>
           <w:p>
             <w:r>
-              <w:t>Labor</w:t>
+              <w:t>Post-deployment (training, maintenance, operational support, scalability)</w:t>
             </w:r>
           </w:p>
         </w:tc>
@@ -9833,11 +8832,8 @@
             <w:hideMark/>
           </w:tcPr>
           <w:p>
-            <w:pPr>
-              <w:cnfStyle w:val="000000000000" w:firstRow="0" w:lastRow="0" w:firstColumn="0" w:lastColumn="0" w:oddVBand="0" w:evenVBand="0" w:oddHBand="0" w:evenHBand="0" w:firstRowFirstColumn="0" w:firstRowLastColumn="0" w:lastRowFirstColumn="0" w:lastRowLastColumn="0"/>
-            </w:pPr>
-            <w:r>
-              <w:t>$0*</w:t>
+            <w:r>
+              <w:t>$0</w:t>
             </w:r>
           </w:p>
         </w:tc>
@@ -9847,9 +8843,6 @@
             <w:hideMark/>
           </w:tcPr>
           <w:p>
-            <w:pPr>
-              <w:cnfStyle w:val="000000000000" w:firstRow="0" w:lastRow="0" w:firstColumn="0" w:lastColumn="0" w:oddVBand="0" w:evenVBand="0" w:oddHBand="0" w:evenHBand="0" w:firstRowFirstColumn="0" w:firstRowLastColumn="0" w:lastRowFirstColumn="0" w:lastRowLastColumn="0"/>
-            </w:pPr>
             <w:r>
               <w:t>TBD</w:t>
             </w:r>
@@ -9861,68 +8854,6 @@
             <w:hideMark/>
           </w:tcPr>
           <w:p>
-            <w:pPr>
-              <w:cnfStyle w:val="000000000000" w:firstRow="0" w:lastRow="0" w:firstColumn="0" w:lastColumn="0" w:oddVBand="0" w:evenVBand="0" w:oddHBand="0" w:evenHBand="0" w:firstRowFirstColumn="0" w:firstRowLastColumn="0" w:lastRowFirstColumn="0" w:lastRowLastColumn="0"/>
-            </w:pPr>
-            <w:r>
-              <w:t>Student project labour excluded from direct expenditure</w:t>
-            </w:r>
-          </w:p>
-        </w:tc>
-      </w:tr>
-      <w:tr>
-        <w:trPr>
-          <w:cnfStyle w:val="000000100000" w:firstRow="0" w:lastRow="0" w:firstColumn="0" w:lastColumn="0" w:oddVBand="0" w:evenVBand="0" w:oddHBand="1" w:evenHBand="0" w:firstRowFirstColumn="0" w:firstRowLastColumn="0" w:lastRowFirstColumn="0" w:lastRowLastColumn="0"/>
-        </w:trPr>
-        <w:tc>
-          <w:tcPr>
-            <w:cnfStyle w:val="001000000000" w:firstRow="0" w:lastRow="0" w:firstColumn="1" w:lastColumn="0" w:oddVBand="0" w:evenVBand="0" w:oddHBand="0" w:evenHBand="0" w:firstRowFirstColumn="0" w:firstRowLastColumn="0" w:lastRowFirstColumn="0" w:lastRowLastColumn="0"/>
-            <w:tcW w:w="0" w:type="auto"/>
-            <w:hideMark/>
-          </w:tcPr>
-          <w:p>
-            <w:r>
-              <w:t>Post-deployment (training, maintenance, operational support, scalability)</w:t>
-            </w:r>
-          </w:p>
-        </w:tc>
-        <w:tc>
-          <w:tcPr>
-            <w:tcW w:w="0" w:type="auto"/>
-            <w:hideMark/>
-          </w:tcPr>
-          <w:p>
-            <w:pPr>
-              <w:cnfStyle w:val="000000100000" w:firstRow="0" w:lastRow="0" w:firstColumn="0" w:lastColumn="0" w:oddVBand="0" w:evenVBand="0" w:oddHBand="1" w:evenHBand="0" w:firstRowFirstColumn="0" w:firstRowLastColumn="0" w:lastRowFirstColumn="0" w:lastRowLastColumn="0"/>
-            </w:pPr>
-            <w:r>
-              <w:t>$0</w:t>
-            </w:r>
-          </w:p>
-        </w:tc>
-        <w:tc>
-          <w:tcPr>
-            <w:tcW w:w="0" w:type="auto"/>
-            <w:hideMark/>
-          </w:tcPr>
-          <w:p>
-            <w:pPr>
-              <w:cnfStyle w:val="000000100000" w:firstRow="0" w:lastRow="0" w:firstColumn="0" w:lastColumn="0" w:oddVBand="0" w:evenVBand="0" w:oddHBand="1" w:evenHBand="0" w:firstRowFirstColumn="0" w:firstRowLastColumn="0" w:lastRowFirstColumn="0" w:lastRowLastColumn="0"/>
-            </w:pPr>
-            <w:r>
-              <w:t>TBD</w:t>
-            </w:r>
-          </w:p>
-        </w:tc>
-        <w:tc>
-          <w:tcPr>
-            <w:tcW w:w="0" w:type="auto"/>
-            <w:hideMark/>
-          </w:tcPr>
-          <w:p>
-            <w:pPr>
-              <w:cnfStyle w:val="000000100000" w:firstRow="0" w:lastRow="0" w:firstColumn="0" w:lastColumn="0" w:oddVBand="0" w:evenVBand="0" w:oddHBand="1" w:evenHBand="0" w:firstRowFirstColumn="0" w:firstRowLastColumn="0" w:lastRowFirstColumn="0" w:lastRowLastColumn="0"/>
-            </w:pPr>
             <w:r>
               <w:t>Only relevant after production adoption; not applicable at Stage 1</w:t>
             </w:r>
@@ -9932,36 +8863,27 @@
     </w:tbl>
     <w:p>
       <w:pPr>
-        <w:jc w:val="both"/>
         <w:rPr>
-          <w:rFonts w:ascii="Times New Roman" w:eastAsia="Times New Roman" w:hAnsi="Times New Roman" w:cs="Times New Roman"/>
           <w:lang w:val="en-GB" w:eastAsia="en-GB"/>
         </w:rPr>
       </w:pPr>
     </w:p>
     <w:p>
       <w:pPr>
-        <w:jc w:val="both"/>
         <w:rPr>
-          <w:rFonts w:ascii="Times New Roman" w:eastAsia="Times New Roman" w:hAnsi="Times New Roman" w:cs="Times New Roman"/>
           <w:lang w:val="en-GB" w:eastAsia="en-GB"/>
         </w:rPr>
       </w:pPr>
       <w:r>
         <w:rPr>
-          <w:rFonts w:ascii="Times New Roman" w:eastAsia="Times New Roman" w:hAnsi="Times New Roman" w:cs="Times New Roman"/>
           <w:lang w:val="en-GB" w:eastAsia="en-GB"/>
         </w:rPr>
         <w:t>Labour is not considered as part of the expense for the student project; an organisational implementation will require accounting for labour associated with engineering and support.</w:t>
       </w:r>
     </w:p>
     <w:p>
-      <w:pPr>
-        <w:jc w:val="both"/>
-      </w:pPr>
       <w:r>
         <w:rPr>
-          <w:rFonts w:ascii="Times New Roman" w:eastAsia="Times New Roman" w:hAnsi="Times New Roman" w:cs="Times New Roman"/>
           <w:lang w:val="en-GB" w:eastAsia="en-GB"/>
         </w:rPr>
         <w:t>The solution will have a number of cost advantages beyond its low cost to implement. For instance, the creation of a synthetic reusable testing environment can limit testing near production and make repeat testing of the connectors possible, while reducing risks of privacy incidents or unknown issues of interoperability. It might also help to decrease testing efforts with the addition of new connectors. But it is not possible to determine a reliable financial return on investment or break-even point, as there is no information about the costs related to testing or incidents in the available project data, labour rates or expected savings of the implementation – the invention of such a number would be inappropriate.</w:t>
@@ -10054,9 +8976,6 @@
       </w:r>
     </w:p>
     <w:p>
-      <w:pPr>
-        <w:ind w:left="720" w:hanging="720"/>
-      </w:pPr>
       <w:r>
         <w:t xml:space="preserve">Attorney-General's Department. (n.d.). Document Verification Service (DVS). Australian Government. </w:t>
       </w:r>
@@ -10070,89 +8989,37 @@
       </w:hyperlink>
     </w:p>
     <w:p>
-      <w:pPr>
-        <w:ind w:left="720" w:hanging="720"/>
-      </w:pPr>
-      <w:r>
-        <w:t>Australian Government. (1988). Privacy Act 1988 (</w:t>
-      </w:r>
-      <w:proofErr w:type="spellStart"/>
-      <w:r>
-        <w:t>Cth</w:t>
-      </w:r>
-      <w:proofErr w:type="spellEnd"/>
-      <w:r>
-        <w:t xml:space="preserve">). </w:t>
+      <w:r>
+        <w:t xml:space="preserve">Australian Government. (1988). Privacy Act 1988 (Cth). </w:t>
       </w:r>
       <w:hyperlink r:id="rId12" w:history="1">
         <w:r>
           <w:rPr>
             <w:rStyle w:val="Hyperlink"/>
           </w:rPr>
-          <w:t>https://www.legislation.gov.au/Detail</w:t>
-        </w:r>
-        <w:r>
-          <w:rPr>
-            <w:rStyle w:val="Hyperlink"/>
-          </w:rPr>
-          <w:t>s</w:t>
-        </w:r>
-        <w:r>
-          <w:rPr>
-            <w:rStyle w:val="Hyperlink"/>
-          </w:rPr>
-          <w:t>/C2022C00361</w:t>
+          <w:t>https://www.legislation.gov.au/Details/C2022C00361</w:t>
         </w:r>
       </w:hyperlink>
     </w:p>
     <w:p>
-      <w:pPr>
-        <w:ind w:left="720" w:hanging="720"/>
-      </w:pPr>
-      <w:r>
-        <w:t>Australian Government. (2012). My Health Records Act 2012 (</w:t>
-      </w:r>
-      <w:proofErr w:type="spellStart"/>
-      <w:r>
-        <w:t>Cth</w:t>
-      </w:r>
-      <w:proofErr w:type="spellEnd"/>
-      <w:r>
-        <w:t xml:space="preserve">). </w:t>
+      <w:r>
+        <w:t xml:space="preserve">Australian Government. (2012). My Health Records Act 2012 (Cth). </w:t>
       </w:r>
       <w:hyperlink r:id="rId13" w:history="1">
         <w:r>
           <w:rPr>
             <w:rStyle w:val="Hyperlink"/>
           </w:rPr>
-          <w:t>https://www.legislation.gov.au/Details/C2017C</w:t>
-        </w:r>
-        <w:r>
-          <w:rPr>
-            <w:rStyle w:val="Hyperlink"/>
-          </w:rPr>
-          <w:t>0</w:t>
-        </w:r>
-        <w:r>
-          <w:rPr>
-            <w:rStyle w:val="Hyperlink"/>
-          </w:rPr>
-          <w:t>0313</w:t>
+          <w:t>https://www.legislation.gov.au/Details/C2017C00313</w:t>
         </w:r>
       </w:hyperlink>
     </w:p>
     <w:p>
-      <w:pPr>
-        <w:ind w:left="720" w:hanging="720"/>
-      </w:pPr>
       <w:r>
         <w:t>FAZ Australia. (n.d.). Project brief and requirements specification [Unpublished internal document].</w:t>
       </w:r>
     </w:p>
     <w:p>
-      <w:pPr>
-        <w:ind w:left="720" w:hanging="720"/>
-      </w:pPr>
       <w:proofErr w:type="spellStart"/>
       <w:r>
         <w:t>Giannangelo</w:t>
@@ -10174,9 +9041,6 @@
       </w:hyperlink>
     </w:p>
     <w:p>
-      <w:pPr>
-        <w:ind w:left="720" w:hanging="720"/>
-      </w:pPr>
       <w:proofErr w:type="spellStart"/>
       <w:r>
         <w:t>Gruendner</w:t>
@@ -10190,38 +9054,11 @@
           <w:rPr>
             <w:rStyle w:val="Hyperlink"/>
           </w:rPr>
-          <w:t>https://doi.org</w:t>
-        </w:r>
-        <w:r>
-          <w:rPr>
-            <w:rStyle w:val="Hyperlink"/>
-          </w:rPr>
-          <w:t>/</w:t>
-        </w:r>
-        <w:r>
-          <w:rPr>
-            <w:rStyle w:val="Hyperlink"/>
-          </w:rPr>
-          <w:t>10.2</w:t>
-        </w:r>
-        <w:r>
-          <w:rPr>
-            <w:rStyle w:val="Hyperlink"/>
-          </w:rPr>
-          <w:t>1</w:t>
-        </w:r>
-        <w:r>
-          <w:rPr>
-            <w:rStyle w:val="Hyperlink"/>
-          </w:rPr>
-          <w:t>96/25645</w:t>
+          <w:t>https://doi.org/10.2196/25645</w:t>
         </w:r>
       </w:hyperlink>
     </w:p>
     <w:p>
-      <w:pPr>
-        <w:ind w:left="720" w:hanging="720"/>
-      </w:pPr>
       <w:r>
         <w:t xml:space="preserve">HL7 Australia. (n.d.). AU Core Implementation Guide (v1.0.0). HL7 International. </w:t>
       </w:r>
@@ -10230,26 +9067,11 @@
           <w:rPr>
             <w:rStyle w:val="Hyperlink"/>
           </w:rPr>
-          <w:t>http://hl7.org.a</w:t>
-        </w:r>
-        <w:r>
-          <w:rPr>
-            <w:rStyle w:val="Hyperlink"/>
-          </w:rPr>
-          <w:t>u</w:t>
-        </w:r>
-        <w:r>
-          <w:rPr>
-            <w:rStyle w:val="Hyperlink"/>
-          </w:rPr>
-          <w:t>/fhir/core/</w:t>
+          <w:t>http://hl7.org.au/fhir/core/</w:t>
         </w:r>
       </w:hyperlink>
     </w:p>
     <w:p>
-      <w:pPr>
-        <w:ind w:left="720" w:hanging="720"/>
-      </w:pPr>
       <w:r>
         <w:t xml:space="preserve">HL7 International. (2019). HL7 FHIR Release 4 (R4). </w:t>
       </w:r>
@@ -10258,26 +9080,11 @@
           <w:rPr>
             <w:rStyle w:val="Hyperlink"/>
           </w:rPr>
-          <w:t>https://hl</w:t>
-        </w:r>
-        <w:r>
-          <w:rPr>
-            <w:rStyle w:val="Hyperlink"/>
-          </w:rPr>
-          <w:t>7</w:t>
-        </w:r>
-        <w:r>
-          <w:rPr>
-            <w:rStyle w:val="Hyperlink"/>
-          </w:rPr>
-          <w:t>.org/fhir/R4/</w:t>
+          <w:t>https://hl7.org/fhir/R4/</w:t>
         </w:r>
       </w:hyperlink>
     </w:p>
     <w:p>
-      <w:pPr>
-        <w:ind w:left="720" w:hanging="720"/>
-      </w:pPr>
       <w:r>
         <w:t xml:space="preserve">National Institute of Standards and Technology. (2024). The NIST Cybersecurity Framework (CSF) 2.0 (NIST CSWP 29). U.S. Department of Commerce. </w:t>
       </w:r>
@@ -10286,26 +9093,11 @@
           <w:rPr>
             <w:rStyle w:val="Hyperlink"/>
           </w:rPr>
-          <w:t>https://doi.org/10.60</w:t>
-        </w:r>
-        <w:r>
-          <w:rPr>
-            <w:rStyle w:val="Hyperlink"/>
-          </w:rPr>
-          <w:t>2</w:t>
-        </w:r>
-        <w:r>
-          <w:rPr>
-            <w:rStyle w:val="Hyperlink"/>
-          </w:rPr>
-          <w:t>8/NIST.CSWP.29</w:t>
+          <w:t>https://doi.org/10.6028/NIST.CSWP.29</w:t>
         </w:r>
       </w:hyperlink>
     </w:p>
     <w:p>
-      <w:pPr>
-        <w:ind w:left="720" w:hanging="720"/>
-      </w:pPr>
       <w:r>
         <w:t xml:space="preserve">SMART Health IT. (n.d.). SMART App Launch Framework. HL7 International. </w:t>
       </w:r>
@@ -10314,26 +9106,11 @@
           <w:rPr>
             <w:rStyle w:val="Hyperlink"/>
           </w:rPr>
-          <w:t>https://hl7.org/fhir/</w:t>
-        </w:r>
-        <w:r>
-          <w:rPr>
-            <w:rStyle w:val="Hyperlink"/>
-          </w:rPr>
-          <w:t>s</w:t>
-        </w:r>
-        <w:r>
-          <w:rPr>
-            <w:rStyle w:val="Hyperlink"/>
-          </w:rPr>
-          <w:t>mart-app-launch/</w:t>
+          <w:t>https://hl7.org/fhir/smart-app-launch/</w:t>
         </w:r>
       </w:hyperlink>
     </w:p>
     <w:p>
-      <w:pPr>
-        <w:ind w:left="720" w:hanging="720"/>
-      </w:pPr>
       <w:r>
         <w:t xml:space="preserve">Walonoski, J., Kramer, M., Nichols, J., Quina, A., </w:t>
       </w:r>
@@ -10343,30 +9120,14 @@
       </w:r>
       <w:proofErr w:type="spellEnd"/>
       <w:r>
-        <w:t xml:space="preserve">, C., Hall, D., Duffett, C., Dube, K., Gallagher, T., &amp; McLachlan, S. (2018). Synthea: An approach, method, and software mechanism for generating synthetic patients and the synthetic electronic health care </w:t>
-      </w:r>
-      <w:r>
-        <w:lastRenderedPageBreak/>
-        <w:t xml:space="preserve">record. Journal of the American Medical Informatics Association, 25(3), 230–238. </w:t>
+        <w:t xml:space="preserve">, C., Hall, D., Duffett, C., Dube, K., Gallagher, T., &amp; McLachlan, S. (2018). Synthea: An approach, method, and software mechanism for generating synthetic patients and the synthetic electronic health care record. Journal of the American Medical Informatics Association, 25(3), 230–238. </w:t>
       </w:r>
       <w:hyperlink r:id="rId20" w:history="1">
         <w:r>
           <w:rPr>
             <w:rStyle w:val="Hyperlink"/>
           </w:rPr>
-          <w:t>https://doi.org/10.10</w:t>
-        </w:r>
-        <w:r>
-          <w:rPr>
-            <w:rStyle w:val="Hyperlink"/>
-          </w:rPr>
-          <w:t>9</w:t>
-        </w:r>
-        <w:r>
-          <w:rPr>
-            <w:rStyle w:val="Hyperlink"/>
-          </w:rPr>
-          <w:t>3/jamia/ocx079</w:t>
+          <w:t>https://doi.org/10.1093/jamia/ocx079</w:t>
         </w:r>
       </w:hyperlink>
     </w:p>
@@ -10396,7 +9157,7 @@
 </file>
 
 <file path=word/endnotes.xml><?xml version="1.0" encoding="utf-8"?>
-<w:endnotes xmlns:wpc="http://schemas.microsoft.com/office/word/2010/wordprocessingCanvas" xmlns:cx="http://schemas.microsoft.com/office/drawing/2014/chartex" xmlns:cx1="http://schemas.microsoft.com/office/drawing/2015/9/8/chartex" xmlns:cx2="http://schemas.microsoft.com/office/drawing/2015/10/21/chartex" xmlns:cx3="http://schemas.microsoft.com/office/drawing/2016/5/9/chartex" xmlns:cx4="http://schemas.microsoft.com/office/drawing/2016/5/10/chartex" xmlns:cx5="http://schemas.microsoft.com/office/drawing/2016/5/11/chartex" xmlns:cx6="http://schemas.microsoft.com/office/drawing/2016/5/12/chartex" xmlns:cx7="http://schemas.microsoft.com/office/drawing/2016/5/13/chartex" xmlns:cx8="http://schemas.microsoft.com/office/drawing/2016/5/14/chartex" xmlns:mc="http://schemas.openxmlformats.org/markup-compatibility/2006" xmlns:m="http://schemas.openxmlformats.org/officeDocument/2006/math" xmlns:aink="http://schemas.microsoft.com/office/drawing/2016/ink" xmlns:am3d="http://schemas.microsoft.com/office/drawing/2017/model3d" xmlns:oel="http://schemas.microsoft.com/office/2019/extlst" xmlns:r="http://schemas.openxmlformats.org/officeDocument/2006/relationships" xmlns:wp14="http://schemas.microsoft.com/office/word/2010/wordprocessingDrawing" xmlns:wp="http://schemas.openxmlformats.org/drawingml/2006/wordprocessingDrawing" xmlns:wpg="http://schemas.microsoft.com/office/word/2010/wordprocessingGroup" xmlns:wpi="http://schemas.microsoft.com/office/word/2010/wordprocessingInk" xmlns:wps="http://schemas.microsoft.com/office/word/2010/wordprocessingShape" xmlns:o="urn:schemas-microsoft-com:office:office" xmlns:v="urn:schemas-microsoft-com:vml" xmlns:w10="urn:schemas-microsoft-com:office:word" xmlns:w="http://schemas.openxmlformats.org/wordprocessingml/2006/main" xmlns:w14="http://schemas.microsoft.com/office/word/2010/wordml" xmlns:w15="http://schemas.microsoft.com/office/word/2012/wordml" xmlns:w16cex="http://schemas.microsoft.com/office/word/2018/wordml/cex" xmlns:w16cid="http://schemas.microsoft.com/office/word/2016/wordml/cid" xmlns:w16="http://schemas.microsoft.com/office/word/2018/wordml" xmlns:w16sdtdh="http://schemas.microsoft.com/office/word/2020/wordml/sdtdatahash" xmlns:w16sdtfl="http://schemas.microsoft.com/office/word/2024/wordml/sdtformatlock" xmlns:w16se="http://schemas.microsoft.com/office/word/2015/wordml/symex" xmlns:w16du="http://schemas.microsoft.com/office/word/2023/wordml/word16du" xmlns:wne="http://schemas.microsoft.com/office/word/2006/wordml" mc:Ignorable="w14 w15 w16se w16cid w16 w16cex w16sdtdh w16sdtfl w16du wp14">
+<w:endnotes xmlns:wpc="http://schemas.microsoft.com/office/word/2010/wordprocessingCanvas" xmlns:cx="http://schemas.microsoft.com/office/drawing/2014/chartex" xmlns:cx1="http://schemas.microsoft.com/office/drawing/2015/9/8/chartex" xmlns:cx2="http://schemas.microsoft.com/office/drawing/2015/10/21/chartex" xmlns:cx3="http://schemas.microsoft.com/office/drawing/2016/5/9/chartex" xmlns:cx4="http://schemas.microsoft.com/office/drawing/2016/5/10/chartex" xmlns:cx5="http://schemas.microsoft.com/office/drawing/2016/5/11/chartex" xmlns:cx6="http://schemas.microsoft.com/office/drawing/2016/5/12/chartex" xmlns:cx7="http://schemas.microsoft.com/office/drawing/2016/5/13/chartex" xmlns:cx8="http://schemas.microsoft.com/office/drawing/2016/5/14/chartex" xmlns:mc="http://schemas.openxmlformats.org/markup-compatibility/2006" xmlns:aink="http://schemas.microsoft.com/office/drawing/2016/ink" xmlns:am3d="http://schemas.microsoft.com/office/drawing/2017/model3d" xmlns:o="urn:schemas-microsoft-com:office:office" xmlns:oel="http://schemas.microsoft.com/office/2019/extlst" xmlns:r="http://schemas.openxmlformats.org/officeDocument/2006/relationships" xmlns:m="http://schemas.openxmlformats.org/officeDocument/2006/math" xmlns:v="urn:schemas-microsoft-com:vml" xmlns:wp14="http://schemas.microsoft.com/office/word/2010/wordprocessingDrawing" xmlns:wp="http://schemas.openxmlformats.org/drawingml/2006/wordprocessingDrawing" xmlns:w10="urn:schemas-microsoft-com:office:word" xmlns:w="http://schemas.openxmlformats.org/wordprocessingml/2006/main" xmlns:w14="http://schemas.microsoft.com/office/word/2010/wordml" xmlns:w15="http://schemas.microsoft.com/office/word/2012/wordml" xmlns:w16cex="http://schemas.microsoft.com/office/word/2018/wordml/cex" xmlns:w16cid="http://schemas.microsoft.com/office/word/2016/wordml/cid" xmlns:w16="http://schemas.microsoft.com/office/word/2018/wordml" xmlns:w16du="http://schemas.microsoft.com/office/word/2023/wordml/word16du" xmlns:w16sdtdh="http://schemas.microsoft.com/office/word/2020/wordml/sdtdatahash" xmlns:w16sdtfl="http://schemas.microsoft.com/office/word/2024/wordml/sdtformatlock" xmlns:w16se="http://schemas.microsoft.com/office/word/2015/wordml/symex" xmlns:wpg="http://schemas.microsoft.com/office/word/2010/wordprocessingGroup" xmlns:wpi="http://schemas.microsoft.com/office/word/2010/wordprocessingInk" xmlns:wne="http://schemas.microsoft.com/office/word/2006/wordml" xmlns:wps="http://schemas.microsoft.com/office/word/2010/wordprocessingShape" mc:Ignorable="w14 w15 w16se w16cid w16 w16cex w16sdtdh w16sdtfl w16du wp14">
   <w:endnote w:type="separator" w:id="-1">
     <w:p>
       <w:r>
@@ -10415,7 +9176,7 @@
 </file>
 
 <file path=word/footnotes.xml><?xml version="1.0" encoding="utf-8"?>
-<w:footnotes xmlns:wpc="http://schemas.microsoft.com/office/word/2010/wordprocessingCanvas" xmlns:cx="http://schemas.microsoft.com/office/drawing/2014/chartex" xmlns:cx1="http://schemas.microsoft.com/office/drawing/2015/9/8/chartex" xmlns:cx2="http://schemas.microsoft.com/office/drawing/2015/10/21/chartex" xmlns:cx3="http://schemas.microsoft.com/office/drawing/2016/5/9/chartex" xmlns:cx4="http://schemas.microsoft.com/office/drawing/2016/5/10/chartex" xmlns:cx5="http://schemas.microsoft.com/office/drawing/2016/5/11/chartex" xmlns:cx6="http://schemas.microsoft.com/office/drawing/2016/5/12/chartex" xmlns:cx7="http://schemas.microsoft.com/office/drawing/2016/5/13/chartex" xmlns:cx8="http://schemas.microsoft.com/office/drawing/2016/5/14/chartex" xmlns:mc="http://schemas.openxmlformats.org/markup-compatibility/2006" xmlns:m="http://schemas.openxmlformats.org/officeDocument/2006/math" xmlns:aink="http://schemas.microsoft.com/office/drawing/2016/ink" xmlns:am3d="http://schemas.microsoft.com/office/drawing/2017/model3d" xmlns:oel="http://schemas.microsoft.com/office/2019/extlst" xmlns:r="http://schemas.openxmlformats.org/officeDocument/2006/relationships" xmlns:wp14="http://schemas.microsoft.com/office/word/2010/wordprocessingDrawing" xmlns:wp="http://schemas.openxmlformats.org/drawingml/2006/wordprocessingDrawing" xmlns:wpg="http://schemas.microsoft.com/office/word/2010/wordprocessingGroup" xmlns:wpi="http://schemas.microsoft.com/office/word/2010/wordprocessingInk" xmlns:wps="http://schemas.microsoft.com/office/word/2010/wordprocessingShape" xmlns:o="urn:schemas-microsoft-com:office:office" xmlns:v="urn:schemas-microsoft-com:vml" xmlns:w10="urn:schemas-microsoft-com:office:word" xmlns:w="http://schemas.openxmlformats.org/wordprocessingml/2006/main" xmlns:w14="http://schemas.microsoft.com/office/word/2010/wordml" xmlns:w15="http://schemas.microsoft.com/office/word/2012/wordml" xmlns:w16cex="http://schemas.microsoft.com/office/word/2018/wordml/cex" xmlns:w16cid="http://schemas.microsoft.com/office/word/2016/wordml/cid" xmlns:w16="http://schemas.microsoft.com/office/word/2018/wordml" xmlns:w16sdtdh="http://schemas.microsoft.com/office/word/2020/wordml/sdtdatahash" xmlns:w16sdtfl="http://schemas.microsoft.com/office/word/2024/wordml/sdtformatlock" xmlns:w16se="http://schemas.microsoft.com/office/word/2015/wordml/symex" xmlns:w16du="http://schemas.microsoft.com/office/word/2023/wordml/word16du" xmlns:wne="http://schemas.microsoft.com/office/word/2006/wordml" mc:Ignorable="w14 w15 w16se w16cid w16 w16cex w16sdtdh w16sdtfl w16du wp14">
+<w:footnotes xmlns:wpc="http://schemas.microsoft.com/office/word/2010/wordprocessingCanvas" xmlns:cx="http://schemas.microsoft.com/office/drawing/2014/chartex" xmlns:cx1="http://schemas.microsoft.com/office/drawing/2015/9/8/chartex" xmlns:cx2="http://schemas.microsoft.com/office/drawing/2015/10/21/chartex" xmlns:cx3="http://schemas.microsoft.com/office/drawing/2016/5/9/chartex" xmlns:cx4="http://schemas.microsoft.com/office/drawing/2016/5/10/chartex" xmlns:cx5="http://schemas.microsoft.com/office/drawing/2016/5/11/chartex" xmlns:cx6="http://schemas.microsoft.com/office/drawing/2016/5/12/chartex" xmlns:cx7="http://schemas.microsoft.com/office/drawing/2016/5/13/chartex" xmlns:cx8="http://schemas.microsoft.com/office/drawing/2016/5/14/chartex" xmlns:mc="http://schemas.openxmlformats.org/markup-compatibility/2006" xmlns:aink="http://schemas.microsoft.com/office/drawing/2016/ink" xmlns:am3d="http://schemas.microsoft.com/office/drawing/2017/model3d" xmlns:o="urn:schemas-microsoft-com:office:office" xmlns:oel="http://schemas.microsoft.com/office/2019/extlst" xmlns:r="http://schemas.openxmlformats.org/officeDocument/2006/relationships" xmlns:m="http://schemas.openxmlformats.org/officeDocument/2006/math" xmlns:v="urn:schemas-microsoft-com:vml" xmlns:wp14="http://schemas.microsoft.com/office/word/2010/wordprocessingDrawing" xmlns:wp="http://schemas.openxmlformats.org/drawingml/2006/wordprocessingDrawing" xmlns:w10="urn:schemas-microsoft-com:office:word" xmlns:w="http://schemas.openxmlformats.org/wordprocessingml/2006/main" xmlns:w14="http://schemas.microsoft.com/office/word/2010/wordml" xmlns:w15="http://schemas.microsoft.com/office/word/2012/wordml" xmlns:w16cex="http://schemas.microsoft.com/office/word/2018/wordml/cex" xmlns:w16cid="http://schemas.microsoft.com/office/word/2016/wordml/cid" xmlns:w16="http://schemas.microsoft.com/office/word/2018/wordml" xmlns:w16du="http://schemas.microsoft.com/office/word/2023/wordml/word16du" xmlns:w16sdtdh="http://schemas.microsoft.com/office/word/2020/wordml/sdtdatahash" xmlns:w16sdtfl="http://schemas.microsoft.com/office/word/2024/wordml/sdtformatlock" xmlns:w16se="http://schemas.microsoft.com/office/word/2015/wordml/symex" xmlns:wpg="http://schemas.microsoft.com/office/word/2010/wordprocessingGroup" xmlns:wpi="http://schemas.microsoft.com/office/word/2010/wordprocessingInk" xmlns:wne="http://schemas.microsoft.com/office/word/2006/wordml" xmlns:wps="http://schemas.microsoft.com/office/word/2010/wordprocessingShape" mc:Ignorable="w14 w15 w16se w16cid w16 w16cex w16sdtdh w16sdtfl w16du wp14">
   <w:footnote w:type="separator" w:id="-1">
     <w:p>
       <w:r>
@@ -10434,7 +9195,7 @@
 </file>
 
 <file path=word/numbering.xml><?xml version="1.0" encoding="utf-8"?>
-<w:numbering xmlns:wpc="http://schemas.microsoft.com/office/word/2010/wordprocessingCanvas" xmlns:cx="http://schemas.microsoft.com/office/drawing/2014/chartex" xmlns:cx1="http://schemas.microsoft.com/office/drawing/2015/9/8/chartex" xmlns:cx2="http://schemas.microsoft.com/office/drawing/2015/10/21/chartex" xmlns:cx3="http://schemas.microsoft.com/office/drawing/2016/5/9/chartex" xmlns:cx4="http://schemas.microsoft.com/office/drawing/2016/5/10/chartex" xmlns:cx5="http://schemas.microsoft.com/office/drawing/2016/5/11/chartex" xmlns:cx6="http://schemas.microsoft.com/office/drawing/2016/5/12/chartex" xmlns:cx7="http://schemas.microsoft.com/office/drawing/2016/5/13/chartex" xmlns:cx8="http://schemas.microsoft.com/office/drawing/2016/5/14/chartex" xmlns:mc="http://schemas.openxmlformats.org/markup-compatibility/2006" xmlns:m="http://schemas.openxmlformats.org/officeDocument/2006/math" xmlns:aink="http://schemas.microsoft.com/office/drawing/2016/ink" xmlns:am3d="http://schemas.microsoft.com/office/drawing/2017/model3d" xmlns:oel="http://schemas.microsoft.com/office/2019/extlst" xmlns:r="http://schemas.openxmlformats.org/officeDocument/2006/relationships" xmlns:wp14="http://schemas.microsoft.com/office/word/2010/wordprocessingDrawing" xmlns:wp="http://schemas.openxmlformats.org/drawingml/2006/wordprocessingDrawing" xmlns:wpg="http://schemas.microsoft.com/office/word/2010/wordprocessingGroup" xmlns:wpi="http://schemas.microsoft.com/office/word/2010/wordprocessingInk" xmlns:wps="http://schemas.microsoft.com/office/word/2010/wordprocessingShape" xmlns:o="urn:schemas-microsoft-com:office:office" xmlns:v="urn:schemas-microsoft-com:vml" xmlns:w10="urn:schemas-microsoft-com:office:word" xmlns:w="http://schemas.openxmlformats.org/wordprocessingml/2006/main" xmlns:w14="http://schemas.microsoft.com/office/word/2010/wordml" xmlns:w15="http://schemas.microsoft.com/office/word/2012/wordml" xmlns:w16cex="http://schemas.microsoft.com/office/word/2018/wordml/cex" xmlns:w16cid="http://schemas.microsoft.com/office/word/2016/wordml/cid" xmlns:w16="http://schemas.microsoft.com/office/word/2018/wordml" xmlns:w16sdtdh="http://schemas.microsoft.com/office/word/2020/wordml/sdtdatahash" xmlns:w16sdtfl="http://schemas.microsoft.com/office/word/2024/wordml/sdtformatlock" xmlns:w16se="http://schemas.microsoft.com/office/word/2015/wordml/symex" xmlns:w16du="http://schemas.microsoft.com/office/word/2023/wordml/word16du" xmlns:wne="http://schemas.microsoft.com/office/word/2006/wordml" mc:Ignorable="w14 w15 w16se w16cid w16 w16cex w16sdtdh w16sdtfl w16du wp14">
+<w:numbering xmlns:wpc="http://schemas.microsoft.com/office/word/2010/wordprocessingCanvas" xmlns:cx="http://schemas.microsoft.com/office/drawing/2014/chartex" xmlns:cx1="http://schemas.microsoft.com/office/drawing/2015/9/8/chartex" xmlns:cx2="http://schemas.microsoft.com/office/drawing/2015/10/21/chartex" xmlns:cx3="http://schemas.microsoft.com/office/drawing/2016/5/9/chartex" xmlns:cx4="http://schemas.microsoft.com/office/drawing/2016/5/10/chartex" xmlns:cx5="http://schemas.microsoft.com/office/drawing/2016/5/11/chartex" xmlns:cx6="http://schemas.microsoft.com/office/drawing/2016/5/12/chartex" xmlns:cx7="http://schemas.microsoft.com/office/drawing/2016/5/13/chartex" xmlns:cx8="http://schemas.microsoft.com/office/drawing/2016/5/14/chartex" xmlns:mc="http://schemas.openxmlformats.org/markup-compatibility/2006" xmlns:aink="http://schemas.microsoft.com/office/drawing/2016/ink" xmlns:am3d="http://schemas.microsoft.com/office/drawing/2017/model3d" xmlns:o="urn:schemas-microsoft-com:office:office" xmlns:oel="http://schemas.microsoft.com/office/2019/extlst" xmlns:r="http://schemas.openxmlformats.org/officeDocument/2006/relationships" xmlns:m="http://schemas.openxmlformats.org/officeDocument/2006/math" xmlns:v="urn:schemas-microsoft-com:vml" xmlns:wp14="http://schemas.microsoft.com/office/word/2010/wordprocessingDrawing" xmlns:wp="http://schemas.openxmlformats.org/drawingml/2006/wordprocessingDrawing" xmlns:w10="urn:schemas-microsoft-com:office:word" xmlns:w="http://schemas.openxmlformats.org/wordprocessingml/2006/main" xmlns:w14="http://schemas.microsoft.com/office/word/2010/wordml" xmlns:w15="http://schemas.microsoft.com/office/word/2012/wordml" xmlns:w16cex="http://schemas.microsoft.com/office/word/2018/wordml/cex" xmlns:w16cid="http://schemas.microsoft.com/office/word/2016/wordml/cid" xmlns:w16="http://schemas.microsoft.com/office/word/2018/wordml" xmlns:w16du="http://schemas.microsoft.com/office/word/2023/wordml/word16du" xmlns:w16sdtdh="http://schemas.microsoft.com/office/word/2020/wordml/sdtdatahash" xmlns:w16sdtfl="http://schemas.microsoft.com/office/word/2024/wordml/sdtformatlock" xmlns:w16se="http://schemas.microsoft.com/office/word/2015/wordml/symex" xmlns:wpg="http://schemas.microsoft.com/office/word/2010/wordprocessingGroup" xmlns:wpi="http://schemas.microsoft.com/office/word/2010/wordprocessingInk" xmlns:wne="http://schemas.microsoft.com/office/word/2006/wordml" xmlns:wps="http://schemas.microsoft.com/office/word/2010/wordprocessingShape" mc:Ignorable="w14 w15 w16se w16cid w16 w16cex w16sdtdh w16sdtfl w16du wp14">
   <w:abstractNum w:abstractNumId="0" w15:restartNumberingAfterBreak="0">
     <w:nsid w:val="01E30731"/>
     <w:multiLevelType w:val="hybridMultilevel"/>
@@ -13269,7 +12030,7 @@
 </file>
 
 <file path=word/styles.xml><?xml version="1.0" encoding="utf-8"?>
-<w:styles xmlns:mc="http://schemas.openxmlformats.org/markup-compatibility/2006" xmlns:r="http://schemas.openxmlformats.org/officeDocument/2006/relationships" xmlns:w="http://schemas.openxmlformats.org/wordprocessingml/2006/main" xmlns:w14="http://schemas.microsoft.com/office/word/2010/wordml" xmlns:w15="http://schemas.microsoft.com/office/word/2012/wordml" xmlns:w16cex="http://schemas.microsoft.com/office/word/2018/wordml/cex" xmlns:w16cid="http://schemas.microsoft.com/office/word/2016/wordml/cid" xmlns:w16="http://schemas.microsoft.com/office/word/2018/wordml" xmlns:w16sdtdh="http://schemas.microsoft.com/office/word/2020/wordml/sdtdatahash" xmlns:w16sdtfl="http://schemas.microsoft.com/office/word/2024/wordml/sdtformatlock" xmlns:w16se="http://schemas.microsoft.com/office/word/2015/wordml/symex" xmlns:w16du="http://schemas.microsoft.com/office/word/2023/wordml/word16du" mc:Ignorable="w14 w15 w16se w16cid w16 w16cex w16sdtdh w16sdtfl w16du">
+<w:styles xmlns:mc="http://schemas.openxmlformats.org/markup-compatibility/2006" xmlns:r="http://schemas.openxmlformats.org/officeDocument/2006/relationships" xmlns:w="http://schemas.openxmlformats.org/wordprocessingml/2006/main" xmlns:w14="http://schemas.microsoft.com/office/word/2010/wordml" xmlns:w15="http://schemas.microsoft.com/office/word/2012/wordml" xmlns:w16cex="http://schemas.microsoft.com/office/word/2018/wordml/cex" xmlns:w16cid="http://schemas.microsoft.com/office/word/2016/wordml/cid" xmlns:w16="http://schemas.microsoft.com/office/word/2018/wordml" xmlns:w16du="http://schemas.microsoft.com/office/word/2023/wordml/word16du" xmlns:w16sdtdh="http://schemas.microsoft.com/office/word/2020/wordml/sdtdatahash" xmlns:w16sdtfl="http://schemas.microsoft.com/office/word/2024/wordml/sdtformatlock" xmlns:w16se="http://schemas.microsoft.com/office/word/2015/wordml/symex" mc:Ignorable="w14 w15 w16se w16cid w16 w16cex w16sdtdh w16sdtfl w16du">
   <w:docDefaults>
     <w:rPrDefault>
       <w:rPr>
@@ -13668,7 +12429,10 @@
   <w:style w:type="paragraph" w:default="1" w:styleId="Normal">
     <w:name w:val="Normal"/>
     <w:qFormat/>
-    <w:rsid w:val="000F16A6"/>
+    <w:rsid w:val="00C366C5"/>
+    <w:pPr>
+      <w:jc w:val="both"/>
+    </w:pPr>
   </w:style>
   <w:style w:type="paragraph" w:styleId="Heading1">
     <w:name w:val="heading 1"/>
@@ -13872,6 +12636,7 @@
   <w:style w:type="character" w:default="1" w:styleId="DefaultParagraphFont">
     <w:name w:val="Default Paragraph Font"/>
     <w:uiPriority w:val="1"/>
+    <w:semiHidden/>
     <w:unhideWhenUsed/>
   </w:style>
   <w:style w:type="table" w:default="1" w:styleId="TableNormal">

</xml_diff>